<commit_message>
Se comenzo la implementacion de las cuentas regresivas, rounds, pregunta de continuacion y movimiento de los enemigos
</commit_message>
<xml_diff>
--- a/ReporteActividades.docx
+++ b/ReporteActividades.docx
@@ -468,11 +468,9 @@
       <w:r>
         <w:t xml:space="preserve">” podía ser algo </w:t>
       </w:r>
-      <w:proofErr w:type="spellStart"/>
-      <w:r>
-        <w:t>compliacado</w:t>
-      </w:r>
-      <w:proofErr w:type="spellEnd"/>
+      <w:r>
+        <w:t>complicado</w:t>
+      </w:r>
       <w:r>
         <w:t xml:space="preserve"> para los pacientes, así que el jugador ya no tendría que disparar, solo con tocar a los enemigos. El 13 de </w:t>
       </w:r>
@@ -491,12 +489,82 @@
       <w:proofErr w:type="spellEnd"/>
       <w:r>
         <w:t xml:space="preserve"> tracking, pero que desaparezcan si no lo hace en un tiempo determinado.</w:t>
+      </w:r>
+      <w:r>
+        <w:t xml:space="preserve"> </w:t>
+      </w:r>
+    </w:p>
+    <w:p>
+      <w:pPr>
+        <w:jc w:val="both"/>
+        <w:rPr>
+          <w:b/>
+        </w:rPr>
+      </w:pPr>
+      <w:r>
+        <w:rPr>
+          <w:b/>
+        </w:rPr>
+        <w:t xml:space="preserve">Semana 6 (17 de </w:t>
+      </w:r>
+      <w:proofErr w:type="gramStart"/>
+      <w:r>
+        <w:rPr>
+          <w:b/>
+        </w:rPr>
+        <w:t>Marzo</w:t>
+      </w:r>
+      <w:proofErr w:type="gramEnd"/>
+      <w:r>
+        <w:rPr>
+          <w:b/>
+        </w:rPr>
+        <w:t xml:space="preserve"> del 2026 a 20 de Marzo del 2026)</w:t>
+      </w:r>
+    </w:p>
+    <w:p>
+      <w:pPr>
+        <w:jc w:val="both"/>
+      </w:pPr>
+      <w:r>
+        <w:t xml:space="preserve">El 17 de </w:t>
+      </w:r>
+      <w:proofErr w:type="gramStart"/>
+      <w:r>
+        <w:t>Marzo</w:t>
+      </w:r>
+      <w:proofErr w:type="gramEnd"/>
+      <w:r>
+        <w:t xml:space="preserve"> se comenzó con la implementación de un sistema de cuenta regresiva para el comienzo de las rondas de enemigos; la idea es hacer que se inicie con una cuenta regresiva </w:t>
+      </w:r>
+      <w:r>
+        <w:lastRenderedPageBreak/>
+        <w:t>para que después aparezcan 10 enemigos, una vez destruidos ya sea por su tiempo de vida o por las acciones del jugador, se pregunta si se quiere continuar para de nuevo pasar a la cuenta regresiva y pasar a la siguiente ronda, se espera que sean 10 rondas.</w:t>
+      </w:r>
+      <w:r>
+        <w:t xml:space="preserve"> También se comenzó a ver el aumento en la dificultad en base al porcentaje de éxito. Para </w:t>
+      </w:r>
+      <w:proofErr w:type="spellStart"/>
+      <w:r>
+        <w:t>EnemySpawner</w:t>
+      </w:r>
+      <w:proofErr w:type="spellEnd"/>
+      <w:r>
+        <w:t xml:space="preserve"> o </w:t>
+      </w:r>
+      <w:proofErr w:type="spellStart"/>
+      <w:r>
+        <w:t>EnemyMovement</w:t>
+      </w:r>
+      <w:proofErr w:type="spellEnd"/>
+      <w:r>
+        <w:t xml:space="preserve"> se podría usar el patrón Factory, ya que su tiempo de vida y el tiempo entre cada cubo varía en base a la dificultad.</w:t>
+      </w:r>
+      <w:r>
+        <w:t xml:space="preserve"> En todo caso, no sé si entre objetos puedan alternar su script.</w:t>
       </w:r>
       <w:bookmarkStart w:id="0" w:name="_GoBack"/>
       <w:bookmarkEnd w:id="0"/>
-      <w:r>
-        <w:t xml:space="preserve"> </w:t>
-      </w:r>
     </w:p>
     <w:sectPr>
       <w:pgSz w:w="11906" w:h="16838"/>

</xml_diff>

<commit_message>
Se limpiaron las escenas del juego
</commit_message>
<xml_diff>
--- a/ReporteActividades.docx
+++ b/ReporteActividades.docx
@@ -525,6 +525,9 @@
     <w:p>
       <w:pPr>
         <w:jc w:val="both"/>
+        <w:rPr>
+          <w:u w:val="single"/>
+        </w:rPr>
       </w:pPr>
       <w:r>
         <w:t xml:space="preserve">El 17 de </w:t>
@@ -539,10 +542,19 @@
       </w:r>
       <w:r>
         <w:lastRenderedPageBreak/>
-        <w:t>para que después aparezcan 10 enemigos, una vez destruidos ya sea por su tiempo de vida o por las acciones del jugador, se pregunta si se quiere continuar para de nuevo pasar a la cuenta regresiva y pasar a la siguiente ronda, se espera que sean 10 rondas.</w:t>
-      </w:r>
-      <w:r>
-        <w:t xml:space="preserve"> También se comenzó a ver el aumento en la dificultad en base al porcentaje de éxito. Para </w:t>
+        <w:t>para que después aparezcan 10 enemigos, una vez destruidos ya sea por su tiempo de vida o por las acciones del jugador, se pregunta si se quiere continuar para de nuevo pasar a la cuenta regresiva y pasar a la siguiente ronda.</w:t>
+      </w:r>
+      <w:r>
+        <w:t xml:space="preserve"> También se comenzó a ver el aumento en la dificultad en base al porcentaje de éxito</w:t>
+      </w:r>
+      <w:r>
+        <w:t>, este se mide en base a cuantos enemigos hayan sido destruidos por el usuario y no por su tiempo de vida</w:t>
+      </w:r>
+      <w:r>
+        <w:t>. No estoy muy seguro, pero p</w:t>
+      </w:r>
+      <w:r>
+        <w:t xml:space="preserve">ara </w:t>
       </w:r>
       <w:proofErr w:type="spellStart"/>
       <w:r>
@@ -558,7 +570,13 @@
       </w:r>
       <w:proofErr w:type="spellEnd"/>
       <w:r>
-        <w:t xml:space="preserve"> se podría usar el patrón Factory, ya que su tiempo de vida y el tiempo entre cada cubo varía en base a la dificultad.</w:t>
+        <w:t xml:space="preserve"> se podría usar el patrón Factory</w:t>
+      </w:r>
+      <w:r>
+        <w:t xml:space="preserve"> para hacer diferentes scripts</w:t>
+      </w:r>
+      <w:r>
+        <w:t>, ya que su tiempo de vida y el tiempo entre cada cubo varía en base a la dificultad.</w:t>
       </w:r>
       <w:r>
         <w:t xml:space="preserve"> En todo caso, no sé si entre objetos puedan alternar su script.</w:t>

</xml_diff>

<commit_message>
Modificaciones en Solicitud de Tesis y Reporte de Actividades
</commit_message>
<xml_diff>
--- a/ReporteActividades.docx
+++ b/ReporteActividades.docx
@@ -525,9 +525,6 @@
     <w:p>
       <w:pPr>
         <w:jc w:val="both"/>
-        <w:rPr>
-          <w:u w:val="single"/>
-        </w:rPr>
       </w:pPr>
       <w:r>
         <w:t xml:space="preserve">El 17 de </w:t>
@@ -580,6 +577,17 @@
       </w:r>
       <w:r>
         <w:t xml:space="preserve"> En todo caso, no sé si entre objetos puedan alternar su script.</w:t>
+      </w:r>
+      <w:r>
+        <w:t xml:space="preserve"> El 18 de </w:t>
+      </w:r>
+      <w:proofErr w:type="gramStart"/>
+      <w:r>
+        <w:t>Marzo</w:t>
+      </w:r>
+      <w:proofErr w:type="gramEnd"/>
+      <w:r>
+        <w:t xml:space="preserve"> me encargué de juntar las escenas y completar la implementación del panel de “Continuar”, pero ahora habrá que arreglar el comportamiento de los enemigos.</w:t>
       </w:r>
       <w:bookmarkStart w:id="0" w:name="_GoBack"/>
       <w:bookmarkEnd w:id="0"/>

</xml_diff>

<commit_message>
Se agrega un sub menu para la seleccion de los ejercicios
</commit_message>
<xml_diff>
--- a/ReporteActividades.docx
+++ b/ReporteActividades.docx
@@ -548,38 +548,10 @@
         <w:t>, este se mide en base a cuantos enemigos hayan sido destruidos por el usuario y no por su tiempo de vida</w:t>
       </w:r>
       <w:r>
-        <w:t>. No estoy muy seguro, pero p</w:t>
-      </w:r>
-      <w:r>
-        <w:t xml:space="preserve">ara </w:t>
-      </w:r>
-      <w:proofErr w:type="spellStart"/>
-      <w:r>
-        <w:t>EnemySpawner</w:t>
-      </w:r>
-      <w:proofErr w:type="spellEnd"/>
-      <w:r>
-        <w:t xml:space="preserve"> o </w:t>
-      </w:r>
-      <w:proofErr w:type="spellStart"/>
-      <w:r>
-        <w:t>EnemyMovement</w:t>
-      </w:r>
-      <w:proofErr w:type="spellEnd"/>
-      <w:r>
-        <w:t xml:space="preserve"> se podría usar el patrón Factory</w:t>
-      </w:r>
-      <w:r>
-        <w:t xml:space="preserve"> para hacer diferentes scripts</w:t>
-      </w:r>
-      <w:r>
-        <w:t>, ya que su tiempo de vida y el tiempo entre cada cubo varía en base a la dificultad.</w:t>
-      </w:r>
-      <w:r>
-        <w:t xml:space="preserve"> En todo caso, no sé si entre objetos puedan alternar su script.</w:t>
-      </w:r>
-      <w:r>
-        <w:t xml:space="preserve"> El 18 de </w:t>
+        <w:t xml:space="preserve">. </w:t>
+      </w:r>
+      <w:r>
+        <w:t xml:space="preserve">El 18 de </w:t>
       </w:r>
       <w:proofErr w:type="gramStart"/>
       <w:r>
@@ -587,7 +559,37 @@
       </w:r>
       <w:proofErr w:type="gramEnd"/>
       <w:r>
-        <w:t xml:space="preserve"> me encargué de juntar las escenas y completar la implementación del panel de “Continuar”, pero ahora habrá que arreglar el comportamiento de los enemigos.</w:t>
+        <w:t xml:space="preserve"> me encargué de juntar las escenas y completar la implementación del panel de “Continuar”</w:t>
+      </w:r>
+      <w:r>
+        <w:t xml:space="preserve">. El 19 de </w:t>
+      </w:r>
+      <w:proofErr w:type="gramStart"/>
+      <w:r>
+        <w:t>Marzo</w:t>
+      </w:r>
+      <w:proofErr w:type="gramEnd"/>
+      <w:r>
+        <w:t xml:space="preserve"> mejoré el comportamiento y los </w:t>
+      </w:r>
+      <w:proofErr w:type="spellStart"/>
+      <w:r>
+        <w:t>Spawners</w:t>
+      </w:r>
+      <w:proofErr w:type="spellEnd"/>
+      <w:r>
+        <w:t xml:space="preserve"> de los enemigos. El 20 de </w:t>
+      </w:r>
+      <w:proofErr w:type="gramStart"/>
+      <w:r>
+        <w:t>Marzo</w:t>
+      </w:r>
+      <w:proofErr w:type="gramEnd"/>
+      <w:r>
+        <w:t>,</w:t>
+      </w:r>
+      <w:r>
+        <w:t xml:space="preserve"> comencé a implementar diferentes niveles en caso de que el paciente necesite hacer ejercicios específicos.</w:t>
       </w:r>
       <w:bookmarkStart w:id="0" w:name="_GoBack"/>
       <w:bookmarkEnd w:id="0"/>

</xml_diff>

<commit_message>
Se comienza la implementacion del menu de seleccion de enemigos
</commit_message>
<xml_diff>
--- a/ReporteActividades.docx
+++ b/ReporteActividades.docx
@@ -13,85 +13,322 @@
         <w:rPr>
           <w:b/>
         </w:rPr>
-        <w:t>Semana 1 (09 de Febrero de 2026 a 13 de Febrero de 2026)</w:t>
-      </w:r>
-    </w:p>
-    <w:p>
-      <w:pPr>
-        <w:jc w:val="both"/>
-      </w:pPr>
-      <w:r>
-        <w:t>El primer día se inició con el desarrollo de un Roll A Ball, principalmente para familiarizarse con el entorno de Unity. El mismo día se terminó el tutorial, pero al día siguiente se volvió a iniciar, ya que la versión utilizada</w:t>
-      </w:r>
-      <w:r>
-        <w:t xml:space="preserve"> de Unity no era la solicitada por Yoá</w:t>
-      </w:r>
-      <w:r>
-        <w:t xml:space="preserve">s. </w:t>
-      </w:r>
-      <w:r>
-        <w:t>El 11 de Febrero se comenzó con el desarrollo de la segunda escena, que era casi la primera escena pero se tenían que implementar enemigos, plataformas, vidas, monedas, spawners y plataformas. El 12 de Febrero se implementó la Lava, la cual tenía que cambiar de color cada 5 segundos. El 13 de Febrero se estuvo haciendo en los spawners de enemigos y monedas.</w:t>
-      </w:r>
-    </w:p>
-    <w:p>
-      <w:pPr>
-        <w:jc w:val="both"/>
-        <w:rPr>
-          <w:b/>
-        </w:rPr>
-      </w:pPr>
-      <w:r>
-        <w:rPr>
-          <w:b/>
-        </w:rPr>
-        <w:t>Semana 2 (16 de Febrero de 2026 a 20 de Febrero de 2026)</w:t>
-      </w:r>
-    </w:p>
-    <w:p>
-      <w:pPr>
-        <w:jc w:val="both"/>
-      </w:pPr>
-      <w:r>
-        <w:t>El 16 de Febrero se comenzó con la implementación de las escenas, los menús de pausa y cambios de escenas. Se completó el desarrollo de Roll A Ball. El 17 de Febrero Yoás le dio visto bueno al demo y pasé a familiarizarme con el e</w:t>
-      </w:r>
-      <w:r>
-        <w:t>ntorno de Meta Quest 3S. Si bien el 17 y 18 de Febrero estuve trabajando en un demo para saber como funcionan los controles, por problemas de hardware en el equipo donde estaba trabajando en el LANR, no podía probar lo que había hecho. El 19 de Febrero comencé a trabajar en el Anexo, ya que había un equipo disponible con una tarjeta gráfica compatible con el software de Meta Horizon Link, después de configurar el entorno, finalmente pude probar lo que había desarrollado los días pasados. El 19 de Febrero comencé a experimentar con los Building Blocks de Hand Tracking, algo necesario para evitar la necesidad de usar los controles de los lentes, solo interacción con las manos.</w:t>
-      </w:r>
-    </w:p>
-    <w:p>
-      <w:pPr>
-        <w:jc w:val="both"/>
-        <w:rPr>
-          <w:b/>
-        </w:rPr>
-      </w:pPr>
-      <w:r>
-        <w:rPr>
-          <w:b/>
-        </w:rPr>
-        <w:t>Semana 3 (23 de Febrero de 2026 a 27 de Febrero de 2026)</w:t>
-      </w:r>
-    </w:p>
-    <w:p>
-      <w:pPr>
-        <w:jc w:val="both"/>
-      </w:pPr>
-      <w:r>
-        <w:t>Lesly, una compañera que trabajaba en el Anexo iba a ocupar la computadora donde iba a estar trabajando, así que no asistí hasta el Jueves 26 de Febrero. Los días restantes de la semana me dediqué a terminar el demo y prácticar el cambio de escenas con interacción en UI haciendo uso de Hand Tracking.</w:t>
-      </w:r>
-    </w:p>
-    <w:p>
-      <w:pPr>
-        <w:jc w:val="both"/>
-        <w:rPr>
-          <w:b/>
-        </w:rPr>
-      </w:pPr>
-      <w:r>
-        <w:rPr>
-          <w:b/>
-        </w:rPr>
-        <w:t xml:space="preserve">Semana 4 (02 de Marzo del 2026 a </w:t>
+        <w:t xml:space="preserve">Semana 1 (09 de </w:t>
+      </w:r>
+      <w:proofErr w:type="gramStart"/>
+      <w:r>
+        <w:rPr>
+          <w:b/>
+        </w:rPr>
+        <w:t>Febrero</w:t>
+      </w:r>
+      <w:proofErr w:type="gramEnd"/>
+      <w:r>
+        <w:rPr>
+          <w:b/>
+        </w:rPr>
+        <w:t xml:space="preserve"> de 2026 a 13 de Febrero de 2026)</w:t>
+      </w:r>
+    </w:p>
+    <w:p>
+      <w:pPr>
+        <w:jc w:val="both"/>
+      </w:pPr>
+      <w:r>
+        <w:t xml:space="preserve">El primer día se inició con el desarrollo de un Roll A </w:t>
+      </w:r>
+      <w:proofErr w:type="spellStart"/>
+      <w:r>
+        <w:t>Ball</w:t>
+      </w:r>
+      <w:proofErr w:type="spellEnd"/>
+      <w:r>
+        <w:t xml:space="preserve">, principalmente para familiarizarse con el entorno de </w:t>
+      </w:r>
+      <w:proofErr w:type="spellStart"/>
+      <w:r>
+        <w:t>Unity</w:t>
+      </w:r>
+      <w:proofErr w:type="spellEnd"/>
+      <w:r>
+        <w:t>. El mismo día se terminó el tutorial, pero al día siguiente se volvió a iniciar, ya que la versión utilizada</w:t>
+      </w:r>
+      <w:r>
+        <w:t xml:space="preserve"> de </w:t>
+      </w:r>
+      <w:proofErr w:type="spellStart"/>
+      <w:r>
+        <w:t>Unity</w:t>
+      </w:r>
+      <w:proofErr w:type="spellEnd"/>
+      <w:r>
+        <w:t xml:space="preserve"> no era la solicitada por </w:t>
+      </w:r>
+      <w:proofErr w:type="spellStart"/>
+      <w:r>
+        <w:t>Yoá</w:t>
+      </w:r>
+      <w:r>
+        <w:t>s</w:t>
+      </w:r>
+      <w:proofErr w:type="spellEnd"/>
+      <w:r>
+        <w:t xml:space="preserve">. </w:t>
+      </w:r>
+      <w:r>
+        <w:t xml:space="preserve">El 11 de </w:t>
+      </w:r>
+      <w:proofErr w:type="gramStart"/>
+      <w:r>
+        <w:t>Febrero</w:t>
+      </w:r>
+      <w:proofErr w:type="gramEnd"/>
+      <w:r>
+        <w:t xml:space="preserve"> se comenzó con el desarrollo de la segunda escena, que era casi la primera escena pero se tenían que implementar enemigos, plataformas, vidas, monedas, </w:t>
+      </w:r>
+      <w:proofErr w:type="spellStart"/>
+      <w:r>
+        <w:t>spawners</w:t>
+      </w:r>
+      <w:proofErr w:type="spellEnd"/>
+      <w:r>
+        <w:t xml:space="preserve"> y plataformas. El 12 de </w:t>
+      </w:r>
+      <w:proofErr w:type="gramStart"/>
+      <w:r>
+        <w:t>Febrero</w:t>
+      </w:r>
+      <w:proofErr w:type="gramEnd"/>
+      <w:r>
+        <w:t xml:space="preserve"> se implementó la Lava, la cual tenía que cambiar de color cada 5 segundos. El 13 de </w:t>
+      </w:r>
+      <w:proofErr w:type="gramStart"/>
+      <w:r>
+        <w:t>Febrero</w:t>
+      </w:r>
+      <w:proofErr w:type="gramEnd"/>
+      <w:r>
+        <w:t xml:space="preserve"> se estuvo haciendo en los </w:t>
+      </w:r>
+      <w:proofErr w:type="spellStart"/>
+      <w:r>
+        <w:t>spawners</w:t>
+      </w:r>
+      <w:proofErr w:type="spellEnd"/>
+      <w:r>
+        <w:t xml:space="preserve"> de enemigos y monedas.</w:t>
+      </w:r>
+    </w:p>
+    <w:p>
+      <w:pPr>
+        <w:jc w:val="both"/>
+        <w:rPr>
+          <w:b/>
+        </w:rPr>
+      </w:pPr>
+      <w:r>
+        <w:rPr>
+          <w:b/>
+        </w:rPr>
+        <w:t xml:space="preserve">Semana 2 (16 de </w:t>
+      </w:r>
+      <w:proofErr w:type="gramStart"/>
+      <w:r>
+        <w:rPr>
+          <w:b/>
+        </w:rPr>
+        <w:t>Febrero</w:t>
+      </w:r>
+      <w:proofErr w:type="gramEnd"/>
+      <w:r>
+        <w:rPr>
+          <w:b/>
+        </w:rPr>
+        <w:t xml:space="preserve"> de 2026 a 20 de Febrero de 2026)</w:t>
+      </w:r>
+    </w:p>
+    <w:p>
+      <w:pPr>
+        <w:jc w:val="both"/>
+      </w:pPr>
+      <w:r>
+        <w:t xml:space="preserve">El 16 de </w:t>
+      </w:r>
+      <w:proofErr w:type="gramStart"/>
+      <w:r>
+        <w:t>Febrero</w:t>
+      </w:r>
+      <w:proofErr w:type="gramEnd"/>
+      <w:r>
+        <w:t xml:space="preserve"> se comenzó con la implementación de las escenas, los menús de pausa y cambios de escenas. Se completó el desarrollo de Roll A </w:t>
+      </w:r>
+      <w:proofErr w:type="spellStart"/>
+      <w:r>
+        <w:t>Ball</w:t>
+      </w:r>
+      <w:proofErr w:type="spellEnd"/>
+      <w:r>
+        <w:t xml:space="preserve">. El 17 de </w:t>
+      </w:r>
+      <w:proofErr w:type="gramStart"/>
+      <w:r>
+        <w:t>Febrero</w:t>
+      </w:r>
+      <w:proofErr w:type="gramEnd"/>
+      <w:r>
+        <w:t xml:space="preserve"> </w:t>
+      </w:r>
+      <w:proofErr w:type="spellStart"/>
+      <w:r>
+        <w:t>Yoás</w:t>
+      </w:r>
+      <w:proofErr w:type="spellEnd"/>
+      <w:r>
+        <w:t xml:space="preserve"> le dio visto bueno al demo y pasé a familiarizarme con el e</w:t>
+      </w:r>
+      <w:r>
+        <w:t xml:space="preserve">ntorno de Meta </w:t>
+      </w:r>
+      <w:proofErr w:type="spellStart"/>
+      <w:r>
+        <w:t>Quest</w:t>
+      </w:r>
+      <w:proofErr w:type="spellEnd"/>
+      <w:r>
+        <w:t xml:space="preserve"> 3S. Si bien el 17 y 18 de </w:t>
+      </w:r>
+      <w:proofErr w:type="gramStart"/>
+      <w:r>
+        <w:t>Febrero</w:t>
+      </w:r>
+      <w:proofErr w:type="gramEnd"/>
+      <w:r>
+        <w:t xml:space="preserve"> estuve trabajando en un demo para saber </w:t>
+      </w:r>
+      <w:proofErr w:type="spellStart"/>
+      <w:r>
+        <w:t>como</w:t>
+      </w:r>
+      <w:proofErr w:type="spellEnd"/>
+      <w:r>
+        <w:t xml:space="preserve"> funcionan los controles, por problemas de hardware en el equipo donde estaba trabajando en el LANR, no podía probar lo que había hecho. El 19 de </w:t>
+      </w:r>
+      <w:proofErr w:type="gramStart"/>
+      <w:r>
+        <w:t>Febrero</w:t>
+      </w:r>
+      <w:proofErr w:type="gramEnd"/>
+      <w:r>
+        <w:t xml:space="preserve"> comencé a trabajar en el Anexo, ya que había un equipo disponible con una tarjeta gráfica compatible con el software de Meta </w:t>
+      </w:r>
+      <w:proofErr w:type="spellStart"/>
+      <w:r>
+        <w:t>Horizon</w:t>
+      </w:r>
+      <w:proofErr w:type="spellEnd"/>
+      <w:r>
+        <w:t xml:space="preserve"> Link, después de configurar el entorno, finalmente pude probar lo que había desarrollado los días pasados. El 19 de </w:t>
+      </w:r>
+      <w:proofErr w:type="gramStart"/>
+      <w:r>
+        <w:t>Febrero</w:t>
+      </w:r>
+      <w:proofErr w:type="gramEnd"/>
+      <w:r>
+        <w:t xml:space="preserve"> comencé a experimentar con los </w:t>
+      </w:r>
+      <w:proofErr w:type="spellStart"/>
+      <w:r>
+        <w:t>Building</w:t>
+      </w:r>
+      <w:proofErr w:type="spellEnd"/>
+      <w:r>
+        <w:t xml:space="preserve"> Blocks de Hand Tracking, algo necesario para evitar la necesidad de usar los controles de los lentes, solo interacción con las manos.</w:t>
+      </w:r>
+    </w:p>
+    <w:p>
+      <w:pPr>
+        <w:jc w:val="both"/>
+        <w:rPr>
+          <w:b/>
+        </w:rPr>
+      </w:pPr>
+      <w:r>
+        <w:rPr>
+          <w:b/>
+        </w:rPr>
+        <w:t xml:space="preserve">Semana 3 (23 de </w:t>
+      </w:r>
+      <w:proofErr w:type="gramStart"/>
+      <w:r>
+        <w:rPr>
+          <w:b/>
+        </w:rPr>
+        <w:t>Febrero</w:t>
+      </w:r>
+      <w:proofErr w:type="gramEnd"/>
+      <w:r>
+        <w:rPr>
+          <w:b/>
+        </w:rPr>
+        <w:t xml:space="preserve"> de 2026 a 27 de Febrero de 2026)</w:t>
+      </w:r>
+    </w:p>
+    <w:p>
+      <w:pPr>
+        <w:jc w:val="both"/>
+      </w:pPr>
+      <w:proofErr w:type="spellStart"/>
+      <w:r>
+        <w:t>Lesly</w:t>
+      </w:r>
+      <w:proofErr w:type="spellEnd"/>
+      <w:r>
+        <w:t xml:space="preserve">, una compañera que trabajaba en el Anexo iba a ocupar la computadora donde iba a estar trabajando, así que no asistí hasta el </w:t>
+      </w:r>
+      <w:proofErr w:type="gramStart"/>
+      <w:r>
+        <w:t>Jueves</w:t>
+      </w:r>
+      <w:proofErr w:type="gramEnd"/>
+      <w:r>
+        <w:t xml:space="preserve"> 26 de Febrero. Los días restantes de la semana me dediqué a terminar el demo y </w:t>
+      </w:r>
+      <w:proofErr w:type="spellStart"/>
+      <w:r>
+        <w:t>prácticar</w:t>
+      </w:r>
+      <w:proofErr w:type="spellEnd"/>
+      <w:r>
+        <w:t xml:space="preserve"> el cambio de escenas con interacción en UI haciendo uso de Hand Tracking.</w:t>
+      </w:r>
+    </w:p>
+    <w:p>
+      <w:pPr>
+        <w:jc w:val="both"/>
+        <w:rPr>
+          <w:b/>
+        </w:rPr>
+      </w:pPr>
+      <w:r>
+        <w:rPr>
+          <w:b/>
+        </w:rPr>
+        <w:t xml:space="preserve">Semana 4 (02 de </w:t>
+      </w:r>
+      <w:proofErr w:type="gramStart"/>
+      <w:r>
+        <w:rPr>
+          <w:b/>
+        </w:rPr>
+        <w:t>Marzo</w:t>
+      </w:r>
+      <w:proofErr w:type="gramEnd"/>
+      <w:r>
+        <w:rPr>
+          <w:b/>
+        </w:rPr>
+        <w:t xml:space="preserve"> del 2026 a </w:t>
       </w:r>
       <w:r>
         <w:rPr>
@@ -105,35 +342,153 @@
         <w:jc w:val="both"/>
       </w:pPr>
       <w:r>
-        <w:t>El 02 de Marzo, Yoás revisó los avances de la semana pasada y me platicó la idea que tenía para la implementación del proyecto, un juego espacial. El 04 de Marzo, después de estar viendo ejemplos de como mover un objeto con hand tracking, Yoás me comentó que la idea era que el paciente o jugador disparen desde sus manos para naves enemigas. El 05 y 06 de Febrero estuve trabajando para que cuando se hiciera la acción de “Pinch”, se disparen diferentes tipos de disparos, también estuve trabajando en los comportamientos de los enemigos, un medidor de supinación, flexión, extensión y pronación.</w:t>
-      </w:r>
-    </w:p>
-    <w:p>
-      <w:pPr>
-        <w:jc w:val="both"/>
-        <w:rPr>
-          <w:b/>
-        </w:rPr>
-      </w:pPr>
-      <w:r>
-        <w:rPr>
-          <w:b/>
-        </w:rPr>
-        <w:t>Semana 5 (09 de Marzo del 2026 a 13 de Febrero de 2026)</w:t>
-      </w:r>
-    </w:p>
-    <w:p>
-      <w:pPr>
-        <w:jc w:val="both"/>
-      </w:pPr>
-      <w:r>
-        <w:t xml:space="preserve">Del 09 de Marzo al 12 de Marzo estuve ajustando el comportamiento del contador de Puntuación, el 12 de Marzo Yoás asistió al Anexo para revisar avances, me comentó que el movimiento de “Pinch” podía ser algo </w:t>
+        <w:t xml:space="preserve">El 02 de </w:t>
+      </w:r>
+      <w:proofErr w:type="gramStart"/>
+      <w:r>
+        <w:t>Marzo</w:t>
+      </w:r>
+      <w:proofErr w:type="gramEnd"/>
+      <w:r>
+        <w:t xml:space="preserve">, </w:t>
+      </w:r>
+      <w:proofErr w:type="spellStart"/>
+      <w:r>
+        <w:t>Yoás</w:t>
+      </w:r>
+      <w:proofErr w:type="spellEnd"/>
+      <w:r>
+        <w:t xml:space="preserve"> revisó los avances de la semana pasada y me platicó la idea que tenía para la implementación del proyecto, un juego espacial. El 04 de </w:t>
+      </w:r>
+      <w:proofErr w:type="gramStart"/>
+      <w:r>
+        <w:t>Marzo</w:t>
+      </w:r>
+      <w:proofErr w:type="gramEnd"/>
+      <w:r>
+        <w:t xml:space="preserve">, después de estar viendo ejemplos de </w:t>
+      </w:r>
+      <w:proofErr w:type="spellStart"/>
+      <w:r>
+        <w:t>como</w:t>
+      </w:r>
+      <w:proofErr w:type="spellEnd"/>
+      <w:r>
+        <w:t xml:space="preserve"> mover un objeto con </w:t>
+      </w:r>
+      <w:proofErr w:type="spellStart"/>
+      <w:r>
+        <w:t>hand</w:t>
+      </w:r>
+      <w:proofErr w:type="spellEnd"/>
+      <w:r>
+        <w:t xml:space="preserve"> tracking, </w:t>
+      </w:r>
+      <w:proofErr w:type="spellStart"/>
+      <w:r>
+        <w:t>Yoás</w:t>
+      </w:r>
+      <w:proofErr w:type="spellEnd"/>
+      <w:r>
+        <w:t xml:space="preserve"> me comentó que la idea era que el paciente o jugador disparen desde sus manos para naves enemigas. El 05 y 06 de </w:t>
+      </w:r>
+      <w:proofErr w:type="gramStart"/>
+      <w:r>
+        <w:t>Febrero</w:t>
+      </w:r>
+      <w:proofErr w:type="gramEnd"/>
+      <w:r>
+        <w:t xml:space="preserve"> estuve trabajando para que cuando se hiciera la acción de “</w:t>
+      </w:r>
+      <w:proofErr w:type="spellStart"/>
+      <w:r>
+        <w:t>Pinch</w:t>
+      </w:r>
+      <w:proofErr w:type="spellEnd"/>
+      <w:r>
+        <w:t>”, se disparen diferentes tipos de disparos, también estuve trabajando en los comportamientos de los enemigos, un medidor de supinación, flexión, extensión y pronación.</w:t>
+      </w:r>
+    </w:p>
+    <w:p>
+      <w:pPr>
+        <w:jc w:val="both"/>
+        <w:rPr>
+          <w:b/>
+        </w:rPr>
+      </w:pPr>
+      <w:r>
+        <w:rPr>
+          <w:b/>
+        </w:rPr>
+        <w:t xml:space="preserve">Semana 5 (09 de </w:t>
+      </w:r>
+      <w:proofErr w:type="gramStart"/>
+      <w:r>
+        <w:rPr>
+          <w:b/>
+        </w:rPr>
+        <w:t>Marzo</w:t>
+      </w:r>
+      <w:proofErr w:type="gramEnd"/>
+      <w:r>
+        <w:rPr>
+          <w:b/>
+        </w:rPr>
+        <w:t xml:space="preserve"> del 2026 a 13 de Febrero de 2026)</w:t>
+      </w:r>
+    </w:p>
+    <w:p>
+      <w:pPr>
+        <w:jc w:val="both"/>
+      </w:pPr>
+      <w:r>
+        <w:t xml:space="preserve">Del 09 de </w:t>
+      </w:r>
+      <w:proofErr w:type="gramStart"/>
+      <w:r>
+        <w:t>Marzo</w:t>
+      </w:r>
+      <w:proofErr w:type="gramEnd"/>
+      <w:r>
+        <w:t xml:space="preserve"> al 12 de Marzo estuve ajustando el comportamiento del contador de Puntuación, el 12 de Marzo </w:t>
+      </w:r>
+      <w:proofErr w:type="spellStart"/>
+      <w:r>
+        <w:t>Yoás</w:t>
+      </w:r>
+      <w:proofErr w:type="spellEnd"/>
+      <w:r>
+        <w:t xml:space="preserve"> asistió al Anexo para revisar avances, me comentó que el movimiento de “</w:t>
+      </w:r>
+      <w:proofErr w:type="spellStart"/>
+      <w:r>
+        <w:t>Pinch</w:t>
+      </w:r>
+      <w:proofErr w:type="spellEnd"/>
+      <w:r>
+        <w:t xml:space="preserve">” podía ser algo </w:t>
       </w:r>
       <w:r>
         <w:t>complicado</w:t>
       </w:r>
       <w:r>
-        <w:t xml:space="preserve"> para los pacientes, así que el jugador ya no tendría que disparar, solo con tocar a los enemigos. El 13 de Marzo me dediqué a que los enemigos se detengan a una distancia del jugador para que este los toque con las manos de hand tracking, pero que desaparezcan si no lo hace en un tiempo determinado.</w:t>
+        <w:t xml:space="preserve"> para los pacientes, así que el jugador ya no tendría que disparar, solo con tocar a los enemigos. El 13 de </w:t>
+      </w:r>
+      <w:proofErr w:type="gramStart"/>
+      <w:r>
+        <w:t>Marzo</w:t>
+      </w:r>
+      <w:proofErr w:type="gramEnd"/>
+      <w:r>
+        <w:t xml:space="preserve"> me dediqué a que los enemigos se detengan a una distancia del jugador para que este los toque con las manos de </w:t>
+      </w:r>
+      <w:proofErr w:type="spellStart"/>
+      <w:r>
+        <w:t>hand</w:t>
+      </w:r>
+      <w:proofErr w:type="spellEnd"/>
+      <w:r>
+        <w:t xml:space="preserve"> tracking, pero que desaparezcan si no lo hace en un tiempo determinado.</w:t>
       </w:r>
       <w:r>
         <w:t xml:space="preserve"> </w:t>
@@ -150,15 +505,37 @@
         <w:rPr>
           <w:b/>
         </w:rPr>
-        <w:t>Semana 6 (17 de Marzo del 2026 a 20 de Marzo del 2026)</w:t>
-      </w:r>
-    </w:p>
-    <w:p>
-      <w:pPr>
-        <w:jc w:val="both"/>
-      </w:pPr>
-      <w:r>
-        <w:t xml:space="preserve">El 17 de Marzo se comenzó con la implementación de un sistema de cuenta regresiva para el comienzo de las rondas de enemigos; la idea es hacer que se inicie con una cuenta regresiva </w:t>
+        <w:t xml:space="preserve">Semana 6 (17 de </w:t>
+      </w:r>
+      <w:proofErr w:type="gramStart"/>
+      <w:r>
+        <w:rPr>
+          <w:b/>
+        </w:rPr>
+        <w:t>Marzo</w:t>
+      </w:r>
+      <w:proofErr w:type="gramEnd"/>
+      <w:r>
+        <w:rPr>
+          <w:b/>
+        </w:rPr>
+        <w:t xml:space="preserve"> del 2026 a 20 de Marzo del 2026)</w:t>
+      </w:r>
+    </w:p>
+    <w:p>
+      <w:pPr>
+        <w:jc w:val="both"/>
+      </w:pPr>
+      <w:r>
+        <w:t xml:space="preserve">El 17 de </w:t>
+      </w:r>
+      <w:proofErr w:type="gramStart"/>
+      <w:r>
+        <w:t>Marzo</w:t>
+      </w:r>
+      <w:proofErr w:type="gramEnd"/>
+      <w:r>
+        <w:t xml:space="preserve"> se comenzó con la implementación de un sistema de cuenta regresiva para el comienzo de las rondas de enemigos; la idea es hacer que se inicie con una cuenta regresiva </w:t>
       </w:r>
       <w:r>
         <w:lastRenderedPageBreak/>
@@ -174,10 +551,42 @@
         <w:t xml:space="preserve">. </w:t>
       </w:r>
       <w:r>
-        <w:t>El 18 de Marzo me encargué de juntar las escenas y completar la implementación del panel de “Continuar”</w:t>
-      </w:r>
-      <w:r>
-        <w:t>. El 19 de Marzo mejoré el comportamiento y los Spawners de los enemigos. El 20 de Marzo,</w:t>
+        <w:t xml:space="preserve">El 18 de </w:t>
+      </w:r>
+      <w:proofErr w:type="gramStart"/>
+      <w:r>
+        <w:t>Marzo</w:t>
+      </w:r>
+      <w:proofErr w:type="gramEnd"/>
+      <w:r>
+        <w:t xml:space="preserve"> me encargué de juntar las escenas y completar la implementación del panel de “Continuar”</w:t>
+      </w:r>
+      <w:r>
+        <w:t xml:space="preserve">. El 19 de </w:t>
+      </w:r>
+      <w:proofErr w:type="gramStart"/>
+      <w:r>
+        <w:t>Marzo</w:t>
+      </w:r>
+      <w:proofErr w:type="gramEnd"/>
+      <w:r>
+        <w:t xml:space="preserve"> mejoré el comportamiento y los </w:t>
+      </w:r>
+      <w:proofErr w:type="spellStart"/>
+      <w:r>
+        <w:t>Spawners</w:t>
+      </w:r>
+      <w:proofErr w:type="spellEnd"/>
+      <w:r>
+        <w:t xml:space="preserve"> de los enemigos. El 20 de </w:t>
+      </w:r>
+      <w:proofErr w:type="gramStart"/>
+      <w:r>
+        <w:t>Marzo</w:t>
+      </w:r>
+      <w:proofErr w:type="gramEnd"/>
+      <w:r>
+        <w:t>,</w:t>
       </w:r>
       <w:r>
         <w:t xml:space="preserve"> comencé a implementar diferentes niveles en caso de que el paciente necesite hacer ejercicios específicos.</w:t>
@@ -194,24 +603,158 @@
         <w:rPr>
           <w:b/>
         </w:rPr>
-        <w:t>Semana 7 (23 de Marzo del 2026 a 28 de Marzo del 2026)</w:t>
-      </w:r>
-    </w:p>
-    <w:p>
-      <w:pPr>
-        <w:jc w:val="both"/>
-      </w:pPr>
-      <w:r>
-        <w:t>El 23 de Marzo, por indicaciones de Yoás, se cambió el enfoque de los enemigos. Estos aparecerán y rodearán al Jugador como si estuvieran en un domo o semicírculo; dicho semicírculo variará su tamaño en base a la distancia máxima que el Jugador pueda estirar su brazo sano. Esa lógica también se implementó.</w:t>
-      </w:r>
-      <w:r>
-        <w:t xml:space="preserve"> El 24 de Marzo me dediqué a hacer la solicitud de tesis.</w:t>
-      </w:r>
-      <w:r>
-        <w:t xml:space="preserve"> El 25 de Marzo, Yoás revisó los avances, donde debo cambiar la orientación del domo y agregar más parámetros a ser modificados por el terapeuta, así como un flujo de trabajo.</w:t>
+        <w:t xml:space="preserve">Semana 7 (23 de </w:t>
+      </w:r>
+      <w:proofErr w:type="gramStart"/>
+      <w:r>
+        <w:rPr>
+          <w:b/>
+        </w:rPr>
+        <w:t>Marzo</w:t>
+      </w:r>
+      <w:proofErr w:type="gramEnd"/>
+      <w:r>
+        <w:rPr>
+          <w:b/>
+        </w:rPr>
+        <w:t xml:space="preserve"> del 2026 a 28 de Marzo del 2026)</w:t>
+      </w:r>
+    </w:p>
+    <w:p>
+      <w:pPr>
+        <w:jc w:val="both"/>
+      </w:pPr>
+      <w:r>
+        <w:t xml:space="preserve">El 23 de </w:t>
+      </w:r>
+      <w:proofErr w:type="gramStart"/>
+      <w:r>
+        <w:t>Marzo</w:t>
+      </w:r>
+      <w:proofErr w:type="gramEnd"/>
+      <w:r>
+        <w:t xml:space="preserve">, por indicaciones de </w:t>
+      </w:r>
+      <w:proofErr w:type="spellStart"/>
+      <w:r>
+        <w:t>Yoás</w:t>
+      </w:r>
+      <w:proofErr w:type="spellEnd"/>
+      <w:r>
+        <w:t>, se cambió el enfoque de los enemigos. Estos aparecerán y rodearán al Jugador como si estuvieran en un domo o semicírculo;</w:t>
       </w:r>
       <w:bookmarkStart w:id="0" w:name="_GoBack"/>
       <w:bookmarkEnd w:id="0"/>
+      <w:r>
+        <w:t xml:space="preserve"> dicho semicírculo variará su tamaño en base a la distancia máxima que el Jugador pueda estirar su brazo sano. Esa lógica también se implementó.</w:t>
+      </w:r>
+      <w:r>
+        <w:t xml:space="preserve"> El 24 de </w:t>
+      </w:r>
+      <w:proofErr w:type="gramStart"/>
+      <w:r>
+        <w:t>Marzo</w:t>
+      </w:r>
+      <w:proofErr w:type="gramEnd"/>
+      <w:r>
+        <w:t xml:space="preserve"> me dediqué a hacer la solicitud de tesis.</w:t>
+      </w:r>
+      <w:r>
+        <w:t xml:space="preserve"> El 25 de </w:t>
+      </w:r>
+      <w:proofErr w:type="gramStart"/>
+      <w:r>
+        <w:t>Marzo</w:t>
+      </w:r>
+      <w:proofErr w:type="gramEnd"/>
+      <w:r>
+        <w:t xml:space="preserve">, </w:t>
+      </w:r>
+      <w:proofErr w:type="spellStart"/>
+      <w:r>
+        <w:t>Yoás</w:t>
+      </w:r>
+      <w:proofErr w:type="spellEnd"/>
+      <w:r>
+        <w:t xml:space="preserve"> revisó los avances, donde debo cambiar la orientación del domo y agregar más parámetros a ser modificados por el terapeuta, así como un flujo de trabajo.</w:t>
+      </w:r>
+      <w:r>
+        <w:t xml:space="preserve"> 26 y 27 de </w:t>
+      </w:r>
+      <w:proofErr w:type="gramStart"/>
+      <w:r>
+        <w:t>Marzo</w:t>
+      </w:r>
+      <w:proofErr w:type="gramEnd"/>
+      <w:r>
+        <w:t xml:space="preserve"> estuve configurando la nueva orientación del domo y el comportamiento de los enemigos.</w:t>
+      </w:r>
+      <w:r>
+        <w:t xml:space="preserve"> El 28 de </w:t>
+      </w:r>
+      <w:proofErr w:type="gramStart"/>
+      <w:r>
+        <w:t>Marzo</w:t>
+      </w:r>
+      <w:proofErr w:type="gramEnd"/>
+      <w:r>
+        <w:t xml:space="preserve"> conecté las escenas.</w:t>
+      </w:r>
+    </w:p>
+    <w:p>
+      <w:pPr>
+        <w:jc w:val="both"/>
+        <w:rPr>
+          <w:b/>
+        </w:rPr>
+      </w:pPr>
+      <w:r>
+        <w:rPr>
+          <w:b/>
+        </w:rPr>
+        <w:t xml:space="preserve">Semana 8 (06 de </w:t>
+      </w:r>
+      <w:proofErr w:type="gramStart"/>
+      <w:r>
+        <w:rPr>
+          <w:b/>
+        </w:rPr>
+        <w:t>Abril</w:t>
+      </w:r>
+      <w:proofErr w:type="gramEnd"/>
+      <w:r>
+        <w:rPr>
+          <w:b/>
+        </w:rPr>
+        <w:t xml:space="preserve"> del 2026 a 10 de Abril del 2026)</w:t>
+      </w:r>
+    </w:p>
+    <w:p>
+      <w:pPr>
+        <w:jc w:val="both"/>
+      </w:pPr>
+      <w:r>
+        <w:t xml:space="preserve">El 06 de </w:t>
+      </w:r>
+      <w:proofErr w:type="gramStart"/>
+      <w:r>
+        <w:t>Abril</w:t>
+      </w:r>
+      <w:proofErr w:type="gramEnd"/>
+      <w:r>
+        <w:t xml:space="preserve"> comencé con la implementación </w:t>
+      </w:r>
+      <w:r>
+        <w:t xml:space="preserve">de la selección de los enemigos; </w:t>
+      </w:r>
+      <w:proofErr w:type="spellStart"/>
+      <w:r>
+        <w:t>Yoas</w:t>
+      </w:r>
+      <w:proofErr w:type="spellEnd"/>
+      <w:r>
+        <w:t xml:space="preserve"> me encomendó hacer un modo de realidad mixta.</w:t>
+      </w:r>
     </w:p>
     <w:sectPr>
       <w:pgSz w:w="11906" w:h="16838"/>

</xml_diff>

<commit_message>
Se completa la primera version para la seleccion de Enemigos, ahora queda esperar los modelos para hacerlos prefabs
</commit_message>
<xml_diff>
--- a/ReporteActividades.docx
+++ b/ReporteActividades.docx
@@ -249,6 +249,23 @@
       </w:r>
       <w:r>
         <w:t>El 08 de Abril, después de registrar el Meta Quest 3S a la cuenta de desarrollador y arreglar un problema con el Canvas, se pudo conectar y completar la Realidad Mixta.</w:t>
+      </w:r>
+      <w:r>
+        <w:t xml:space="preserve"> El 10 de Abril se continuó con la implementación del seleccionador de Enemigos, ahora falta esperar por los modelos.</w:t>
+      </w:r>
+    </w:p>
+    <w:p>
+      <w:pPr>
+        <w:jc w:val="both"/>
+        <w:rPr>
+          <w:b/>
+        </w:rPr>
+      </w:pPr>
+      <w:r>
+        <w:rPr>
+          <w:b/>
+        </w:rPr>
+        <w:t>Semana 9 (13 de Abril del 2026 al 18 de Abril del 2026)</w:t>
       </w:r>
       <w:bookmarkStart w:id="0" w:name="_GoBack"/>
       <w:bookmarkEnd w:id="0"/>

</xml_diff>

<commit_message>
Se comienza la configuracion de los modelos de Naves
</commit_message>
<xml_diff>
--- a/ReporteActividades.docx
+++ b/ReporteActividades.docx
@@ -266,6 +266,14 @@
           <w:b/>
         </w:rPr>
         <w:t>Semana 9 (13 de Abril del 2026 al 18 de Abril del 2026)</w:t>
+      </w:r>
+    </w:p>
+    <w:p>
+      <w:pPr>
+        <w:jc w:val="both"/>
+      </w:pPr>
+      <w:r>
+        <w:t>El 13 de Abril, comencé a trabajar con los modelos de las naves; debo configurarlos para una actividad que se tendrá por parte de Amerike.</w:t>
       </w:r>
       <w:bookmarkStart w:id="0" w:name="_GoBack"/>
       <w:bookmarkEnd w:id="0"/>

</xml_diff>

<commit_message>
Se vuelve a ajustar la camara
</commit_message>
<xml_diff>
--- a/ReporteActividades.docx
+++ b/ReporteActividades.docx
@@ -13,85 +13,322 @@
         <w:rPr>
           <w:b/>
         </w:rPr>
-        <w:t>Semana 1 (09 de Febrero de 2026 a 13 de Febrero de 2026)</w:t>
-      </w:r>
-    </w:p>
-    <w:p>
-      <w:pPr>
-        <w:jc w:val="both"/>
-      </w:pPr>
-      <w:r>
-        <w:t>El primer día se inició con el desarrollo de un Roll A Ball, principalmente para familiarizarse con el entorno de Unity. El mismo día se terminó el tutorial, pero al día siguiente se volvió a iniciar, ya que la versión utilizada</w:t>
-      </w:r>
-      <w:r>
-        <w:t xml:space="preserve"> de Unity no era la solicitada por Yoá</w:t>
-      </w:r>
-      <w:r>
-        <w:t xml:space="preserve">s. </w:t>
-      </w:r>
-      <w:r>
-        <w:t>El 11 de Febrero se comenzó con el desarrollo de la segunda escena, que era casi la primera escena pero se tenían que implementar enemigos, plataformas, vidas, monedas, spawners y plataformas. El 12 de Febrero se implementó la Lava, la cual tenía que cambiar de color cada 5 segundos. El 13 de Febrero se estuvo haciendo en los spawners de enemigos y monedas.</w:t>
-      </w:r>
-    </w:p>
-    <w:p>
-      <w:pPr>
-        <w:jc w:val="both"/>
-        <w:rPr>
-          <w:b/>
-        </w:rPr>
-      </w:pPr>
-      <w:r>
-        <w:rPr>
-          <w:b/>
-        </w:rPr>
-        <w:t>Semana 2 (16 de Febrero de 2026 a 20 de Febrero de 2026)</w:t>
-      </w:r>
-    </w:p>
-    <w:p>
-      <w:pPr>
-        <w:jc w:val="both"/>
-      </w:pPr>
-      <w:r>
-        <w:t>El 16 de Febrero se comenzó con la implementación de las escenas, los menús de pausa y cambios de escenas. Se completó el desarrollo de Roll A Ball. El 17 de Febrero Yoás le dio visto bueno al demo y pasé a familiarizarme con el e</w:t>
-      </w:r>
-      <w:r>
-        <w:t>ntorno de Meta Quest 3S. Si bien el 17 y 18 de Febrero estuve trabajando en un demo para saber como funcionan los controles, por problemas de hardware en el equipo donde estaba trabajando en el LANR, no podía probar lo que había hecho. El 19 de Febrero comencé a trabajar en el Anexo, ya que había un equipo disponible con una tarjeta gráfica compatible con el software de Meta Horizon Link, después de configurar el entorno, finalmente pude probar lo que había desarrollado los días pasados. El 19 de Febrero comencé a experimentar con los Building Blocks de Hand Tracking, algo necesario para evitar la necesidad de usar los controles de los lentes, solo interacción con las manos.</w:t>
-      </w:r>
-    </w:p>
-    <w:p>
-      <w:pPr>
-        <w:jc w:val="both"/>
-        <w:rPr>
-          <w:b/>
-        </w:rPr>
-      </w:pPr>
-      <w:r>
-        <w:rPr>
-          <w:b/>
-        </w:rPr>
-        <w:t>Semana 3 (23 de Febrero de 2026 a 27 de Febrero de 2026)</w:t>
-      </w:r>
-    </w:p>
-    <w:p>
-      <w:pPr>
-        <w:jc w:val="both"/>
-      </w:pPr>
-      <w:r>
-        <w:t>Lesly, una compañera que trabajaba en el Anexo iba a ocupar la computadora donde iba a estar trabajando, así que no asistí hasta el Jueves 26 de Febrero. Los días restantes de la semana me dediqué a terminar el demo y prácticar el cambio de escenas con interacción en UI haciendo uso de Hand Tracking.</w:t>
-      </w:r>
-    </w:p>
-    <w:p>
-      <w:pPr>
-        <w:jc w:val="both"/>
-        <w:rPr>
-          <w:b/>
-        </w:rPr>
-      </w:pPr>
-      <w:r>
-        <w:rPr>
-          <w:b/>
-        </w:rPr>
-        <w:t xml:space="preserve">Semana 4 (02 de Marzo del 2026 a </w:t>
+        <w:t xml:space="preserve">Semana 1 (09 de </w:t>
+      </w:r>
+      <w:proofErr w:type="gramStart"/>
+      <w:r>
+        <w:rPr>
+          <w:b/>
+        </w:rPr>
+        <w:t>Febrero</w:t>
+      </w:r>
+      <w:proofErr w:type="gramEnd"/>
+      <w:r>
+        <w:rPr>
+          <w:b/>
+        </w:rPr>
+        <w:t xml:space="preserve"> de 2026 a 13 de Febrero de 2026)</w:t>
+      </w:r>
+    </w:p>
+    <w:p>
+      <w:pPr>
+        <w:jc w:val="both"/>
+      </w:pPr>
+      <w:r>
+        <w:t xml:space="preserve">El primer día se inició con el desarrollo de un Roll A </w:t>
+      </w:r>
+      <w:proofErr w:type="spellStart"/>
+      <w:r>
+        <w:t>Ball</w:t>
+      </w:r>
+      <w:proofErr w:type="spellEnd"/>
+      <w:r>
+        <w:t xml:space="preserve">, principalmente para familiarizarse con el entorno de </w:t>
+      </w:r>
+      <w:proofErr w:type="spellStart"/>
+      <w:r>
+        <w:t>Unity</w:t>
+      </w:r>
+      <w:proofErr w:type="spellEnd"/>
+      <w:r>
+        <w:t>. El mismo día se terminó el tutorial, pero al día siguiente se volvió a iniciar, ya que la versión utilizada</w:t>
+      </w:r>
+      <w:r>
+        <w:t xml:space="preserve"> de </w:t>
+      </w:r>
+      <w:proofErr w:type="spellStart"/>
+      <w:r>
+        <w:t>Unity</w:t>
+      </w:r>
+      <w:proofErr w:type="spellEnd"/>
+      <w:r>
+        <w:t xml:space="preserve"> no era la solicitada por </w:t>
+      </w:r>
+      <w:proofErr w:type="spellStart"/>
+      <w:r>
+        <w:t>Yoá</w:t>
+      </w:r>
+      <w:r>
+        <w:t>s</w:t>
+      </w:r>
+      <w:proofErr w:type="spellEnd"/>
+      <w:r>
+        <w:t xml:space="preserve">. </w:t>
+      </w:r>
+      <w:r>
+        <w:t xml:space="preserve">El 11 de </w:t>
+      </w:r>
+      <w:proofErr w:type="gramStart"/>
+      <w:r>
+        <w:t>Febrero</w:t>
+      </w:r>
+      <w:proofErr w:type="gramEnd"/>
+      <w:r>
+        <w:t xml:space="preserve"> se comenzó con el desarrollo de la segunda escena, que era casi la primera escena pero se tenían que implementar enemigos, plataformas, vidas, monedas, </w:t>
+      </w:r>
+      <w:proofErr w:type="spellStart"/>
+      <w:r>
+        <w:t>spawners</w:t>
+      </w:r>
+      <w:proofErr w:type="spellEnd"/>
+      <w:r>
+        <w:t xml:space="preserve"> y plataformas. El 12 de </w:t>
+      </w:r>
+      <w:proofErr w:type="gramStart"/>
+      <w:r>
+        <w:t>Febrero</w:t>
+      </w:r>
+      <w:proofErr w:type="gramEnd"/>
+      <w:r>
+        <w:t xml:space="preserve"> se implementó la Lava, la cual tenía que cambiar de color cada 5 segundos. El 13 de </w:t>
+      </w:r>
+      <w:proofErr w:type="gramStart"/>
+      <w:r>
+        <w:t>Febrero</w:t>
+      </w:r>
+      <w:proofErr w:type="gramEnd"/>
+      <w:r>
+        <w:t xml:space="preserve"> se estuvo haciendo en los </w:t>
+      </w:r>
+      <w:proofErr w:type="spellStart"/>
+      <w:r>
+        <w:t>spawners</w:t>
+      </w:r>
+      <w:proofErr w:type="spellEnd"/>
+      <w:r>
+        <w:t xml:space="preserve"> de enemigos y monedas.</w:t>
+      </w:r>
+    </w:p>
+    <w:p>
+      <w:pPr>
+        <w:jc w:val="both"/>
+        <w:rPr>
+          <w:b/>
+        </w:rPr>
+      </w:pPr>
+      <w:r>
+        <w:rPr>
+          <w:b/>
+        </w:rPr>
+        <w:t xml:space="preserve">Semana 2 (16 de </w:t>
+      </w:r>
+      <w:proofErr w:type="gramStart"/>
+      <w:r>
+        <w:rPr>
+          <w:b/>
+        </w:rPr>
+        <w:t>Febrero</w:t>
+      </w:r>
+      <w:proofErr w:type="gramEnd"/>
+      <w:r>
+        <w:rPr>
+          <w:b/>
+        </w:rPr>
+        <w:t xml:space="preserve"> de 2026 a 20 de Febrero de 2026)</w:t>
+      </w:r>
+    </w:p>
+    <w:p>
+      <w:pPr>
+        <w:jc w:val="both"/>
+      </w:pPr>
+      <w:r>
+        <w:t xml:space="preserve">El 16 de </w:t>
+      </w:r>
+      <w:proofErr w:type="gramStart"/>
+      <w:r>
+        <w:t>Febrero</w:t>
+      </w:r>
+      <w:proofErr w:type="gramEnd"/>
+      <w:r>
+        <w:t xml:space="preserve"> se comenzó con la implementación de las escenas, los menús de pausa y cambios de escenas. Se completó el desarrollo de Roll A </w:t>
+      </w:r>
+      <w:proofErr w:type="spellStart"/>
+      <w:r>
+        <w:t>Ball</w:t>
+      </w:r>
+      <w:proofErr w:type="spellEnd"/>
+      <w:r>
+        <w:t xml:space="preserve">. El 17 de </w:t>
+      </w:r>
+      <w:proofErr w:type="gramStart"/>
+      <w:r>
+        <w:t>Febrero</w:t>
+      </w:r>
+      <w:proofErr w:type="gramEnd"/>
+      <w:r>
+        <w:t xml:space="preserve"> </w:t>
+      </w:r>
+      <w:proofErr w:type="spellStart"/>
+      <w:r>
+        <w:t>Yoás</w:t>
+      </w:r>
+      <w:proofErr w:type="spellEnd"/>
+      <w:r>
+        <w:t xml:space="preserve"> le dio visto bueno al demo y pasé a familiarizarme con el e</w:t>
+      </w:r>
+      <w:r>
+        <w:t xml:space="preserve">ntorno de Meta </w:t>
+      </w:r>
+      <w:proofErr w:type="spellStart"/>
+      <w:r>
+        <w:t>Quest</w:t>
+      </w:r>
+      <w:proofErr w:type="spellEnd"/>
+      <w:r>
+        <w:t xml:space="preserve"> 3S. Si bien el 17 y 18 de </w:t>
+      </w:r>
+      <w:proofErr w:type="gramStart"/>
+      <w:r>
+        <w:t>Febrero</w:t>
+      </w:r>
+      <w:proofErr w:type="gramEnd"/>
+      <w:r>
+        <w:t xml:space="preserve"> estuve trabajando en un demo para saber </w:t>
+      </w:r>
+      <w:proofErr w:type="spellStart"/>
+      <w:r>
+        <w:t>como</w:t>
+      </w:r>
+      <w:proofErr w:type="spellEnd"/>
+      <w:r>
+        <w:t xml:space="preserve"> funcionan los controles, por problemas de hardware en el equipo donde estaba trabajando en el LANR, no podía probar lo que había hecho. El 19 de </w:t>
+      </w:r>
+      <w:proofErr w:type="gramStart"/>
+      <w:r>
+        <w:t>Febrero</w:t>
+      </w:r>
+      <w:proofErr w:type="gramEnd"/>
+      <w:r>
+        <w:t xml:space="preserve"> comencé a trabajar en el Anexo, ya que había un equipo disponible con una tarjeta gráfica compatible con el software de Meta </w:t>
+      </w:r>
+      <w:proofErr w:type="spellStart"/>
+      <w:r>
+        <w:t>Horizon</w:t>
+      </w:r>
+      <w:proofErr w:type="spellEnd"/>
+      <w:r>
+        <w:t xml:space="preserve"> Link, después de configurar el entorno, finalmente pude probar lo que había desarrollado los días pasados. El 19 de </w:t>
+      </w:r>
+      <w:proofErr w:type="gramStart"/>
+      <w:r>
+        <w:t>Febrero</w:t>
+      </w:r>
+      <w:proofErr w:type="gramEnd"/>
+      <w:r>
+        <w:t xml:space="preserve"> comencé a experimentar con los </w:t>
+      </w:r>
+      <w:proofErr w:type="spellStart"/>
+      <w:r>
+        <w:t>Building</w:t>
+      </w:r>
+      <w:proofErr w:type="spellEnd"/>
+      <w:r>
+        <w:t xml:space="preserve"> Blocks de Hand Tracking, algo necesario para evitar la necesidad de usar los controles de los lentes, solo interacción con las manos.</w:t>
+      </w:r>
+    </w:p>
+    <w:p>
+      <w:pPr>
+        <w:jc w:val="both"/>
+        <w:rPr>
+          <w:b/>
+        </w:rPr>
+      </w:pPr>
+      <w:r>
+        <w:rPr>
+          <w:b/>
+        </w:rPr>
+        <w:t xml:space="preserve">Semana 3 (23 de </w:t>
+      </w:r>
+      <w:proofErr w:type="gramStart"/>
+      <w:r>
+        <w:rPr>
+          <w:b/>
+        </w:rPr>
+        <w:t>Febrero</w:t>
+      </w:r>
+      <w:proofErr w:type="gramEnd"/>
+      <w:r>
+        <w:rPr>
+          <w:b/>
+        </w:rPr>
+        <w:t xml:space="preserve"> de 2026 a 27 de Febrero de 2026)</w:t>
+      </w:r>
+    </w:p>
+    <w:p>
+      <w:pPr>
+        <w:jc w:val="both"/>
+      </w:pPr>
+      <w:proofErr w:type="spellStart"/>
+      <w:r>
+        <w:t>Lesly</w:t>
+      </w:r>
+      <w:proofErr w:type="spellEnd"/>
+      <w:r>
+        <w:t xml:space="preserve">, una compañera que trabajaba en el Anexo iba a ocupar la computadora donde iba a estar trabajando, así que no asistí hasta el </w:t>
+      </w:r>
+      <w:proofErr w:type="gramStart"/>
+      <w:r>
+        <w:t>Jueves</w:t>
+      </w:r>
+      <w:proofErr w:type="gramEnd"/>
+      <w:r>
+        <w:t xml:space="preserve"> 26 de Febrero. Los días restantes de la semana me dediqué a terminar el demo y </w:t>
+      </w:r>
+      <w:proofErr w:type="spellStart"/>
+      <w:r>
+        <w:t>prácticar</w:t>
+      </w:r>
+      <w:proofErr w:type="spellEnd"/>
+      <w:r>
+        <w:t xml:space="preserve"> el cambio de escenas con interacción en UI haciendo uso de Hand Tracking.</w:t>
+      </w:r>
+    </w:p>
+    <w:p>
+      <w:pPr>
+        <w:jc w:val="both"/>
+        <w:rPr>
+          <w:b/>
+        </w:rPr>
+      </w:pPr>
+      <w:r>
+        <w:rPr>
+          <w:b/>
+        </w:rPr>
+        <w:t xml:space="preserve">Semana 4 (02 de </w:t>
+      </w:r>
+      <w:proofErr w:type="gramStart"/>
+      <w:r>
+        <w:rPr>
+          <w:b/>
+        </w:rPr>
+        <w:t>Marzo</w:t>
+      </w:r>
+      <w:proofErr w:type="gramEnd"/>
+      <w:r>
+        <w:rPr>
+          <w:b/>
+        </w:rPr>
+        <w:t xml:space="preserve"> del 2026 a </w:t>
       </w:r>
       <w:r>
         <w:rPr>
@@ -105,35 +342,153 @@
         <w:jc w:val="both"/>
       </w:pPr>
       <w:r>
-        <w:t>El 02 de Marzo, Yoás revisó los avances de la semana pasada y me platicó la idea que tenía para la implementación del proyecto, un juego espacial. El 04 de Marzo, después de estar viendo ejemplos de como mover un objeto con hand tracking, Yoás me comentó que la idea era que el paciente o jugador disparen desde sus manos para naves enemigas. El 05 y 06 de Febrero estuve trabajando para que cuando se hiciera la acción de “Pinch”, se disparen diferentes tipos de disparos, también estuve trabajando en los comportamientos de los enemigos, un medidor de supinación, flexión, extensión y pronación.</w:t>
-      </w:r>
-    </w:p>
-    <w:p>
-      <w:pPr>
-        <w:jc w:val="both"/>
-        <w:rPr>
-          <w:b/>
-        </w:rPr>
-      </w:pPr>
-      <w:r>
-        <w:rPr>
-          <w:b/>
-        </w:rPr>
-        <w:t>Semana 5 (09 de Marzo del 2026 a 13 de Febrero de 2026)</w:t>
-      </w:r>
-    </w:p>
-    <w:p>
-      <w:pPr>
-        <w:jc w:val="both"/>
-      </w:pPr>
-      <w:r>
-        <w:t xml:space="preserve">Del 09 de Marzo al 12 de Marzo estuve ajustando el comportamiento del contador de Puntuación, el 12 de Marzo Yoás asistió al Anexo para revisar avances, me comentó que el movimiento de “Pinch” podía ser algo </w:t>
+        <w:t xml:space="preserve">El 02 de </w:t>
+      </w:r>
+      <w:proofErr w:type="gramStart"/>
+      <w:r>
+        <w:t>Marzo</w:t>
+      </w:r>
+      <w:proofErr w:type="gramEnd"/>
+      <w:r>
+        <w:t xml:space="preserve">, </w:t>
+      </w:r>
+      <w:proofErr w:type="spellStart"/>
+      <w:r>
+        <w:t>Yoás</w:t>
+      </w:r>
+      <w:proofErr w:type="spellEnd"/>
+      <w:r>
+        <w:t xml:space="preserve"> revisó los avances de la semana pasada y me platicó la idea que tenía para la implementación del proyecto, un juego espacial. El 04 de </w:t>
+      </w:r>
+      <w:proofErr w:type="gramStart"/>
+      <w:r>
+        <w:t>Marzo</w:t>
+      </w:r>
+      <w:proofErr w:type="gramEnd"/>
+      <w:r>
+        <w:t xml:space="preserve">, después de estar viendo ejemplos de </w:t>
+      </w:r>
+      <w:proofErr w:type="spellStart"/>
+      <w:r>
+        <w:t>como</w:t>
+      </w:r>
+      <w:proofErr w:type="spellEnd"/>
+      <w:r>
+        <w:t xml:space="preserve"> mover un objeto con </w:t>
+      </w:r>
+      <w:proofErr w:type="spellStart"/>
+      <w:r>
+        <w:t>hand</w:t>
+      </w:r>
+      <w:proofErr w:type="spellEnd"/>
+      <w:r>
+        <w:t xml:space="preserve"> tracking, </w:t>
+      </w:r>
+      <w:proofErr w:type="spellStart"/>
+      <w:r>
+        <w:t>Yoás</w:t>
+      </w:r>
+      <w:proofErr w:type="spellEnd"/>
+      <w:r>
+        <w:t xml:space="preserve"> me comentó que la idea era que el paciente o jugador disparen desde sus manos para naves enemigas. El 05 y 06 de </w:t>
+      </w:r>
+      <w:proofErr w:type="gramStart"/>
+      <w:r>
+        <w:t>Febrero</w:t>
+      </w:r>
+      <w:proofErr w:type="gramEnd"/>
+      <w:r>
+        <w:t xml:space="preserve"> estuve trabajando para que cuando se hiciera la acción de “</w:t>
+      </w:r>
+      <w:proofErr w:type="spellStart"/>
+      <w:r>
+        <w:t>Pinch</w:t>
+      </w:r>
+      <w:proofErr w:type="spellEnd"/>
+      <w:r>
+        <w:t>”, se disparen diferentes tipos de disparos, también estuve trabajando en los comportamientos de los enemigos, un medidor de supinación, flexión, extensión y pronación.</w:t>
+      </w:r>
+    </w:p>
+    <w:p>
+      <w:pPr>
+        <w:jc w:val="both"/>
+        <w:rPr>
+          <w:b/>
+        </w:rPr>
+      </w:pPr>
+      <w:r>
+        <w:rPr>
+          <w:b/>
+        </w:rPr>
+        <w:t xml:space="preserve">Semana 5 (09 de </w:t>
+      </w:r>
+      <w:proofErr w:type="gramStart"/>
+      <w:r>
+        <w:rPr>
+          <w:b/>
+        </w:rPr>
+        <w:t>Marzo</w:t>
+      </w:r>
+      <w:proofErr w:type="gramEnd"/>
+      <w:r>
+        <w:rPr>
+          <w:b/>
+        </w:rPr>
+        <w:t xml:space="preserve"> del 2026 a 13 de Febrero de 2026)</w:t>
+      </w:r>
+    </w:p>
+    <w:p>
+      <w:pPr>
+        <w:jc w:val="both"/>
+      </w:pPr>
+      <w:r>
+        <w:t xml:space="preserve">Del 09 de </w:t>
+      </w:r>
+      <w:proofErr w:type="gramStart"/>
+      <w:r>
+        <w:t>Marzo</w:t>
+      </w:r>
+      <w:proofErr w:type="gramEnd"/>
+      <w:r>
+        <w:t xml:space="preserve"> al 12 de Marzo estuve ajustando el comportamiento del contador de Puntuación, el 12 de Marzo </w:t>
+      </w:r>
+      <w:proofErr w:type="spellStart"/>
+      <w:r>
+        <w:t>Yoás</w:t>
+      </w:r>
+      <w:proofErr w:type="spellEnd"/>
+      <w:r>
+        <w:t xml:space="preserve"> asistió al Anexo para revisar avances, me comentó que el movimiento de “</w:t>
+      </w:r>
+      <w:proofErr w:type="spellStart"/>
+      <w:r>
+        <w:t>Pinch</w:t>
+      </w:r>
+      <w:proofErr w:type="spellEnd"/>
+      <w:r>
+        <w:t xml:space="preserve">” podía ser algo </w:t>
       </w:r>
       <w:r>
         <w:t>complicado</w:t>
       </w:r>
       <w:r>
-        <w:t xml:space="preserve"> para los pacientes, así que el jugador ya no tendría que disparar, solo con tocar a los enemigos. El 13 de Marzo me dediqué a que los enemigos se detengan a una distancia del jugador para que este los toque con las manos de hand tracking, pero que desaparezcan si no lo hace en un tiempo determinado.</w:t>
+        <w:t xml:space="preserve"> para los pacientes, así que el jugador ya no tendría que disparar, solo con tocar a los enemigos. El 13 de </w:t>
+      </w:r>
+      <w:proofErr w:type="gramStart"/>
+      <w:r>
+        <w:t>Marzo</w:t>
+      </w:r>
+      <w:proofErr w:type="gramEnd"/>
+      <w:r>
+        <w:t xml:space="preserve"> me dediqué a que los enemigos se detengan a una distancia del jugador para que este los toque con las manos de </w:t>
+      </w:r>
+      <w:proofErr w:type="spellStart"/>
+      <w:r>
+        <w:t>hand</w:t>
+      </w:r>
+      <w:proofErr w:type="spellEnd"/>
+      <w:r>
+        <w:t xml:space="preserve"> tracking, pero que desaparezcan si no lo hace en un tiempo determinado.</w:t>
       </w:r>
       <w:r>
         <w:t xml:space="preserve"> </w:t>
@@ -150,15 +505,37 @@
         <w:rPr>
           <w:b/>
         </w:rPr>
-        <w:t>Semana 6 (17 de Marzo del 2026 a 20 de Marzo del 2026)</w:t>
-      </w:r>
-    </w:p>
-    <w:p>
-      <w:pPr>
-        <w:jc w:val="both"/>
-      </w:pPr>
-      <w:r>
-        <w:t xml:space="preserve">El 17 de Marzo se comenzó con la implementación de un sistema de cuenta regresiva para el comienzo de las rondas de enemigos; la idea es hacer que se inicie con una cuenta regresiva </w:t>
+        <w:t xml:space="preserve">Semana 6 (17 de </w:t>
+      </w:r>
+      <w:proofErr w:type="gramStart"/>
+      <w:r>
+        <w:rPr>
+          <w:b/>
+        </w:rPr>
+        <w:t>Marzo</w:t>
+      </w:r>
+      <w:proofErr w:type="gramEnd"/>
+      <w:r>
+        <w:rPr>
+          <w:b/>
+        </w:rPr>
+        <w:t xml:space="preserve"> del 2026 a 20 de Marzo del 2026)</w:t>
+      </w:r>
+    </w:p>
+    <w:p>
+      <w:pPr>
+        <w:jc w:val="both"/>
+      </w:pPr>
+      <w:r>
+        <w:t xml:space="preserve">El 17 de </w:t>
+      </w:r>
+      <w:proofErr w:type="gramStart"/>
+      <w:r>
+        <w:t>Marzo</w:t>
+      </w:r>
+      <w:proofErr w:type="gramEnd"/>
+      <w:r>
+        <w:t xml:space="preserve"> se comenzó con la implementación de un sistema de cuenta regresiva para el comienzo de las rondas de enemigos; la idea es hacer que se inicie con una cuenta regresiva </w:t>
       </w:r>
       <w:r>
         <w:lastRenderedPageBreak/>
@@ -174,10 +551,42 @@
         <w:t xml:space="preserve">. </w:t>
       </w:r>
       <w:r>
-        <w:t>El 18 de Marzo me encargué de juntar las escenas y completar la implementación del panel de “Continuar”</w:t>
-      </w:r>
-      <w:r>
-        <w:t>. El 19 de Marzo mejoré el comportamiento y los Spawners de los enemigos. El 20 de Marzo,</w:t>
+        <w:t xml:space="preserve">El 18 de </w:t>
+      </w:r>
+      <w:proofErr w:type="gramStart"/>
+      <w:r>
+        <w:t>Marzo</w:t>
+      </w:r>
+      <w:proofErr w:type="gramEnd"/>
+      <w:r>
+        <w:t xml:space="preserve"> me encargué de juntar las escenas y completar la implementación del panel de “Continuar”</w:t>
+      </w:r>
+      <w:r>
+        <w:t xml:space="preserve">. El 19 de </w:t>
+      </w:r>
+      <w:proofErr w:type="gramStart"/>
+      <w:r>
+        <w:t>Marzo</w:t>
+      </w:r>
+      <w:proofErr w:type="gramEnd"/>
+      <w:r>
+        <w:t xml:space="preserve"> mejoré el comportamiento y los </w:t>
+      </w:r>
+      <w:proofErr w:type="spellStart"/>
+      <w:r>
+        <w:t>Spawners</w:t>
+      </w:r>
+      <w:proofErr w:type="spellEnd"/>
+      <w:r>
+        <w:t xml:space="preserve"> de los enemigos. El 20 de </w:t>
+      </w:r>
+      <w:proofErr w:type="gramStart"/>
+      <w:r>
+        <w:t>Marzo</w:t>
+      </w:r>
+      <w:proofErr w:type="gramEnd"/>
+      <w:r>
+        <w:t>,</w:t>
       </w:r>
       <w:r>
         <w:t xml:space="preserve"> comencé a implementar diferentes niveles en caso de que el paciente necesite hacer ejercicios específicos.</w:t>
@@ -194,92 +603,314 @@
         <w:rPr>
           <w:b/>
         </w:rPr>
-        <w:t>Semana 7 (23 de Marzo del 2026 a 28 de Marzo del 2026)</w:t>
-      </w:r>
-    </w:p>
-    <w:p>
-      <w:pPr>
-        <w:jc w:val="both"/>
-      </w:pPr>
-      <w:r>
-        <w:t>El 23 de Marzo, por indicaciones de Yoás, se cambió el enfoque de los enemigos. Estos aparecerán y rodearán al Jugador como si estuvieran en un domo o semicírculo; dicho semicírculo variará su tamaño en base a la distancia máxima que el Jugador pueda estirar su brazo sano. Esa lógica también se implementó.</w:t>
-      </w:r>
-      <w:r>
-        <w:t xml:space="preserve"> El 24 de Marzo me dediqué a hacer la solicitud de tesis.</w:t>
-      </w:r>
-      <w:r>
-        <w:t xml:space="preserve"> El 25 de Marzo, Yoás revisó los avances, donde debo cambiar la orientación del domo y agregar más parámetros a ser modificados por el terapeuta, así como un flujo de trabajo.</w:t>
-      </w:r>
-      <w:r>
-        <w:t xml:space="preserve"> 26 y 27 de Marzo estuve configurando la nueva orientación del domo y el comportamiento de los enemigos.</w:t>
-      </w:r>
-      <w:r>
-        <w:t xml:space="preserve"> El 28 de Marzo conecté las escenas.</w:t>
-      </w:r>
-    </w:p>
-    <w:p>
-      <w:pPr>
-        <w:jc w:val="both"/>
-        <w:rPr>
-          <w:b/>
-        </w:rPr>
-      </w:pPr>
-      <w:r>
-        <w:rPr>
-          <w:b/>
-        </w:rPr>
-        <w:t>Semana 8 (06 de Abril del 2026 a 10 de Abril del 2026)</w:t>
-      </w:r>
-    </w:p>
-    <w:p>
-      <w:pPr>
-        <w:jc w:val="both"/>
-      </w:pPr>
-      <w:r>
-        <w:t xml:space="preserve">El 06 de Abril comencé con la implementación </w:t>
-      </w:r>
-      <w:r>
-        <w:t>de la selección de los enemigos; Yoas me encomendó hacer un modo de realidad mixta.</w:t>
-      </w:r>
-      <w:r>
-        <w:t xml:space="preserve"> 07 de Abril detecté que hay problemas con el cable de conexión, debo buscar un USB 3.0.</w:t>
+        <w:t xml:space="preserve">Semana 7 (23 de </w:t>
+      </w:r>
+      <w:proofErr w:type="gramStart"/>
+      <w:r>
+        <w:rPr>
+          <w:b/>
+        </w:rPr>
+        <w:t>Marzo</w:t>
+      </w:r>
+      <w:proofErr w:type="gramEnd"/>
+      <w:r>
+        <w:rPr>
+          <w:b/>
+        </w:rPr>
+        <w:t xml:space="preserve"> del 2026 a 28 de Marzo del 2026)</w:t>
+      </w:r>
+    </w:p>
+    <w:p>
+      <w:pPr>
+        <w:jc w:val="both"/>
+      </w:pPr>
+      <w:r>
+        <w:t xml:space="preserve">El 23 de </w:t>
+      </w:r>
+      <w:proofErr w:type="gramStart"/>
+      <w:r>
+        <w:t>Marzo</w:t>
+      </w:r>
+      <w:proofErr w:type="gramEnd"/>
+      <w:r>
+        <w:t xml:space="preserve">, por indicaciones de </w:t>
+      </w:r>
+      <w:proofErr w:type="spellStart"/>
+      <w:r>
+        <w:t>Yoás</w:t>
+      </w:r>
+      <w:proofErr w:type="spellEnd"/>
+      <w:r>
+        <w:t>, se cambió el enfoque de los enemigos. Estos aparecerán y rodearán al Jugador como si estuvieran en un domo o semicírculo; dicho semicírculo variará su tamaño en base a la distancia máxima que el Jugador pueda estirar su brazo sano. Esa lógica también se implementó.</w:t>
+      </w:r>
+      <w:r>
+        <w:t xml:space="preserve"> El 24 de </w:t>
+      </w:r>
+      <w:proofErr w:type="gramStart"/>
+      <w:r>
+        <w:t>Marzo</w:t>
+      </w:r>
+      <w:proofErr w:type="gramEnd"/>
+      <w:r>
+        <w:t xml:space="preserve"> me dediqué a hacer la solicitud de tesis.</w:t>
+      </w:r>
+      <w:r>
+        <w:t xml:space="preserve"> El 25 de </w:t>
+      </w:r>
+      <w:proofErr w:type="gramStart"/>
+      <w:r>
+        <w:t>Marzo</w:t>
+      </w:r>
+      <w:proofErr w:type="gramEnd"/>
+      <w:r>
+        <w:t xml:space="preserve">, </w:t>
+      </w:r>
+      <w:proofErr w:type="spellStart"/>
+      <w:r>
+        <w:t>Yoás</w:t>
+      </w:r>
+      <w:proofErr w:type="spellEnd"/>
+      <w:r>
+        <w:t xml:space="preserve"> revisó los avances, donde debo cambiar la orientación del domo y agregar más parámetros a ser modificados por el terapeuta, así como un flujo de trabajo.</w:t>
+      </w:r>
+      <w:r>
+        <w:t xml:space="preserve"> 26 y 27 de </w:t>
+      </w:r>
+      <w:proofErr w:type="gramStart"/>
+      <w:r>
+        <w:t>Marzo</w:t>
+      </w:r>
+      <w:proofErr w:type="gramEnd"/>
+      <w:r>
+        <w:t xml:space="preserve"> estuve configurando la nueva orientación del domo y el comportamiento de los enemigos.</w:t>
+      </w:r>
+      <w:r>
+        <w:t xml:space="preserve"> El 28 de </w:t>
+      </w:r>
+      <w:proofErr w:type="gramStart"/>
+      <w:r>
+        <w:t>Marzo</w:t>
+      </w:r>
+      <w:proofErr w:type="gramEnd"/>
+      <w:r>
+        <w:t xml:space="preserve"> conecté las escenas.</w:t>
+      </w:r>
+    </w:p>
+    <w:p>
+      <w:pPr>
+        <w:jc w:val="both"/>
+        <w:rPr>
+          <w:b/>
+        </w:rPr>
+      </w:pPr>
+      <w:r>
+        <w:rPr>
+          <w:b/>
+        </w:rPr>
+        <w:t xml:space="preserve">Semana 8 (06 de </w:t>
+      </w:r>
+      <w:proofErr w:type="gramStart"/>
+      <w:r>
+        <w:rPr>
+          <w:b/>
+        </w:rPr>
+        <w:t>Abril</w:t>
+      </w:r>
+      <w:proofErr w:type="gramEnd"/>
+      <w:r>
+        <w:rPr>
+          <w:b/>
+        </w:rPr>
+        <w:t xml:space="preserve"> del 2026 a 10 de Abril del 2026)</w:t>
+      </w:r>
+    </w:p>
+    <w:p>
+      <w:pPr>
+        <w:jc w:val="both"/>
+      </w:pPr>
+      <w:r>
+        <w:t xml:space="preserve">El 06 de </w:t>
+      </w:r>
+      <w:proofErr w:type="gramStart"/>
+      <w:r>
+        <w:t>Abril</w:t>
+      </w:r>
+      <w:proofErr w:type="gramEnd"/>
+      <w:r>
+        <w:t xml:space="preserve"> comencé con la implementación </w:t>
+      </w:r>
+      <w:r>
+        <w:t xml:space="preserve">de la selección de los enemigos; </w:t>
+      </w:r>
+      <w:proofErr w:type="spellStart"/>
+      <w:r>
+        <w:t>Yoas</w:t>
+      </w:r>
+      <w:proofErr w:type="spellEnd"/>
+      <w:r>
+        <w:t xml:space="preserve"> me encomendó hacer un modo de realidad mixta.</w:t>
+      </w:r>
+      <w:r>
+        <w:t xml:space="preserve"> 07 de </w:t>
+      </w:r>
+      <w:proofErr w:type="gramStart"/>
+      <w:r>
+        <w:t>Abril</w:t>
+      </w:r>
+      <w:proofErr w:type="gramEnd"/>
+      <w:r>
+        <w:t xml:space="preserve"> detecté que hay problemas con el cable de conexión, debo buscar un USB 3.0.</w:t>
       </w:r>
       <w:r>
         <w:t xml:space="preserve"> </w:t>
       </w:r>
       <w:r>
-        <w:t>El 08 de Abril, después de registrar el Meta Quest 3S a la cuenta de desarrollador y arreglar un problema con el Canvas, se pudo conectar y completar la Realidad Mixta.</w:t>
-      </w:r>
-      <w:r>
-        <w:t xml:space="preserve"> El 10 de Abril se continuó con la implementación del seleccionador de Enemigos, ahora falta esperar por los modelos.</w:t>
-      </w:r>
-    </w:p>
-    <w:p>
-      <w:pPr>
-        <w:jc w:val="both"/>
-        <w:rPr>
-          <w:b/>
-        </w:rPr>
-      </w:pPr>
-      <w:r>
-        <w:rPr>
-          <w:b/>
-        </w:rPr>
-        <w:t>Semana 9 (13 de Abril del 2026 al 18 de Abril del 2026)</w:t>
-      </w:r>
-    </w:p>
-    <w:p>
-      <w:pPr>
-        <w:jc w:val="both"/>
-      </w:pPr>
-      <w:r>
-        <w:t>El 13 de Abril, comencé a trabajar con los modelos de las naves; debo configurarlos para una actividad que se tendrá por parte de Amerike.</w:t>
-      </w:r>
-      <w:r>
-        <w:t xml:space="preserve"> El 14 de Abril terminé de configurar los modelos y limpié un poco el código y los Assets para la muestra del día siguiente.</w:t>
+        <w:t xml:space="preserve">El 08 de </w:t>
+      </w:r>
+      <w:proofErr w:type="gramStart"/>
+      <w:r>
+        <w:t>Abril</w:t>
+      </w:r>
+      <w:proofErr w:type="gramEnd"/>
+      <w:r>
+        <w:t xml:space="preserve">, después de registrar el Meta </w:t>
+      </w:r>
+      <w:proofErr w:type="spellStart"/>
+      <w:r>
+        <w:t>Quest</w:t>
+      </w:r>
+      <w:proofErr w:type="spellEnd"/>
+      <w:r>
+        <w:t xml:space="preserve"> 3S a la cuenta de desarrollador y arreglar un </w:t>
+      </w:r>
+      <w:r>
+        <w:t>problem</w:t>
       </w:r>
       <w:bookmarkStart w:id="0" w:name="_GoBack"/>
       <w:bookmarkEnd w:id="0"/>
+      <w:r>
+        <w:t>a</w:t>
+      </w:r>
+      <w:r>
+        <w:t xml:space="preserve"> con el </w:t>
+      </w:r>
+      <w:proofErr w:type="spellStart"/>
+      <w:r>
+        <w:t>Canvas</w:t>
+      </w:r>
+      <w:proofErr w:type="spellEnd"/>
+      <w:r>
+        <w:t>, se pudo conectar y completar la Realidad Mixta.</w:t>
+      </w:r>
+      <w:r>
+        <w:t xml:space="preserve"> El 10 de </w:t>
+      </w:r>
+      <w:proofErr w:type="gramStart"/>
+      <w:r>
+        <w:t>Abril</w:t>
+      </w:r>
+      <w:proofErr w:type="gramEnd"/>
+      <w:r>
+        <w:t xml:space="preserve"> se continuó con la implementación del seleccionador de Enemigos, ahora falta esperar por los modelos.</w:t>
+      </w:r>
+    </w:p>
+    <w:p>
+      <w:pPr>
+        <w:jc w:val="both"/>
+        <w:rPr>
+          <w:b/>
+        </w:rPr>
+      </w:pPr>
+      <w:r>
+        <w:rPr>
+          <w:b/>
+        </w:rPr>
+        <w:t xml:space="preserve">Semana 9 (13 de </w:t>
+      </w:r>
+      <w:proofErr w:type="gramStart"/>
+      <w:r>
+        <w:rPr>
+          <w:b/>
+        </w:rPr>
+        <w:t>Abril</w:t>
+      </w:r>
+      <w:proofErr w:type="gramEnd"/>
+      <w:r>
+        <w:rPr>
+          <w:b/>
+        </w:rPr>
+        <w:t xml:space="preserve"> del 2026 al 18 de Abril del 2026)</w:t>
+      </w:r>
+    </w:p>
+    <w:p>
+      <w:pPr>
+        <w:jc w:val="both"/>
+      </w:pPr>
+      <w:r>
+        <w:t xml:space="preserve">El 13 de </w:t>
+      </w:r>
+      <w:proofErr w:type="gramStart"/>
+      <w:r>
+        <w:t>Abril</w:t>
+      </w:r>
+      <w:proofErr w:type="gramEnd"/>
+      <w:r>
+        <w:t xml:space="preserve">, comencé a trabajar con los modelos de las naves; debo configurarlos para una actividad que se tendrá por parte de </w:t>
+      </w:r>
+      <w:proofErr w:type="spellStart"/>
+      <w:r>
+        <w:t>Amerike</w:t>
+      </w:r>
+      <w:proofErr w:type="spellEnd"/>
+      <w:r>
+        <w:t>.</w:t>
+      </w:r>
+      <w:r>
+        <w:t xml:space="preserve"> El 14 de </w:t>
+      </w:r>
+      <w:proofErr w:type="gramStart"/>
+      <w:r>
+        <w:t>Abril</w:t>
+      </w:r>
+      <w:proofErr w:type="gramEnd"/>
+      <w:r>
+        <w:t xml:space="preserve"> terminé de configurar los modelos y limpié un poco el código y los </w:t>
+      </w:r>
+      <w:proofErr w:type="spellStart"/>
+      <w:r>
+        <w:t>Assets</w:t>
+      </w:r>
+      <w:proofErr w:type="spellEnd"/>
+      <w:r>
+        <w:t xml:space="preserve"> para la muestra del día siguiente.</w:t>
+      </w:r>
+      <w:r>
+        <w:t xml:space="preserve"> El 15 de </w:t>
+      </w:r>
+      <w:proofErr w:type="gramStart"/>
+      <w:r>
+        <w:t>Abril</w:t>
+      </w:r>
+      <w:proofErr w:type="gramEnd"/>
+      <w:r>
+        <w:t xml:space="preserve"> realicé unos ajustes a la cámara del jugador y alisté todo para la muestra de </w:t>
+      </w:r>
+      <w:proofErr w:type="spellStart"/>
+      <w:r>
+        <w:t>Amerike</w:t>
+      </w:r>
+      <w:proofErr w:type="spellEnd"/>
+      <w:r>
+        <w:t xml:space="preserve">. El 16 de </w:t>
+      </w:r>
+      <w:proofErr w:type="gramStart"/>
+      <w:r>
+        <w:t>Abril</w:t>
+      </w:r>
+      <w:proofErr w:type="gramEnd"/>
+      <w:r>
+        <w:t xml:space="preserve"> fue la muestra.</w:t>
+      </w:r>
     </w:p>
     <w:sectPr>
       <w:pgSz w:w="11906" w:h="16838"/>

</xml_diff>

<commit_message>
Ajustes en el juego de Naves y continuamos con la configuracion del juego de puzzle
</commit_message>
<xml_diff>
--- a/ReporteActividades.docx
+++ b/ReporteActividades.docx
@@ -301,6 +301,28 @@
       </w:r>
       <w:r>
         <w:t>. El 16 de Abril fue la muestra, hubo problemas con la Etiqueta Player, ya fue solucionado pero al menos en la muestra se tuvo ese problema. El 17 de Abril se comenzó a probar las mecánicas del segundo minijuego, este toma en cuenta la rotación de la muñeca del jugador para poder rotar las piezas del rompecabezas.</w:t>
+      </w:r>
+    </w:p>
+    <w:p>
+      <w:pPr>
+        <w:jc w:val="both"/>
+        <w:rPr>
+          <w:b/>
+        </w:rPr>
+      </w:pPr>
+      <w:r>
+        <w:rPr>
+          <w:b/>
+        </w:rPr>
+        <w:t>Semana 10 (20 de Abril del 2026 al 24 de Abril del 2026)</w:t>
+      </w:r>
+    </w:p>
+    <w:p>
+      <w:pPr>
+        <w:jc w:val="both"/>
+      </w:pPr>
+      <w:r>
+        <w:t>El 20 de Abril, comencé a trabajar en el sistema para confirmar que el rompecabezas esté formado, pero por los modelos que estoy usando, no sé exactamente si está funcionando hasta que tenga los modelos correctos.</w:t>
       </w:r>
       <w:bookmarkStart w:id="0" w:name="_GoBack"/>
       <w:bookmarkEnd w:id="0"/>

</xml_diff>

<commit_message>
Se comienza la implementacion de un timer
</commit_message>
<xml_diff>
--- a/ReporteActividades.docx
+++ b/ReporteActividades.docx
@@ -326,6 +326,12 @@
       </w:r>
       <w:r>
         <w:t xml:space="preserve"> El 21 de Abril hubo retroalimentación por parte de Yoás, para las runas no hay que aplicar los botones, pero el sistema de victoria está bien, ahora hay que idear una forma para implementar las puertas.</w:t>
+      </w:r>
+      <w:r>
+        <w:t xml:space="preserve"> El 22 de Abril se comenzó la implementación de las puertas, las cuales funcionarán como forma de medir el progreso del jugador.</w:t>
+      </w:r>
+      <w:r>
+        <w:t xml:space="preserve"> El 23 de Abril se comenzó a implementar el contador para finalizar el nivel.</w:t>
       </w:r>
       <w:bookmarkStart w:id="0" w:name="_GoBack"/>
       <w:bookmarkEnd w:id="0"/>

</xml_diff>

<commit_message>
Se arregla el contador
</commit_message>
<xml_diff>
--- a/ReporteActividades.docx
+++ b/ReporteActividades.docx
@@ -13,85 +13,322 @@
         <w:rPr>
           <w:b/>
         </w:rPr>
-        <w:t>Semana 1 (09 de Febrero de 2026 a 13 de Febrero de 2026)</w:t>
-      </w:r>
-    </w:p>
-    <w:p>
-      <w:pPr>
-        <w:jc w:val="both"/>
-      </w:pPr>
-      <w:r>
-        <w:t>El primer día se inició con el desarrollo de un Roll A Ball, principalmente para familiarizarse con el entorno de Unity. El mismo día se terminó el tutorial, pero al día siguiente se volvió a iniciar, ya que la versión utilizada</w:t>
-      </w:r>
-      <w:r>
-        <w:t xml:space="preserve"> de Unity no era la solicitada por Yoá</w:t>
-      </w:r>
-      <w:r>
-        <w:t xml:space="preserve">s. </w:t>
-      </w:r>
-      <w:r>
-        <w:t>El 11 de Febrero se comenzó con el desarrollo de la segunda escena, que era casi la primera escena pero se tenían que implementar enemigos, plataformas, vidas, monedas, spawners y plataformas. El 12 de Febrero se implementó la Lava, la cual tenía que cambiar de color cada 5 segundos. El 13 de Febrero se estuvo haciendo en los spawners de enemigos y monedas.</w:t>
-      </w:r>
-    </w:p>
-    <w:p>
-      <w:pPr>
-        <w:jc w:val="both"/>
-        <w:rPr>
-          <w:b/>
-        </w:rPr>
-      </w:pPr>
-      <w:r>
-        <w:rPr>
-          <w:b/>
-        </w:rPr>
-        <w:t>Semana 2 (16 de Febrero de 2026 a 20 de Febrero de 2026)</w:t>
-      </w:r>
-    </w:p>
-    <w:p>
-      <w:pPr>
-        <w:jc w:val="both"/>
-      </w:pPr>
-      <w:r>
-        <w:t>El 16 de Febrero se comenzó con la implementación de las escenas, los menús de pausa y cambios de escenas. Se completó el desarrollo de Roll A Ball. El 17 de Febrero Yoás le dio visto bueno al demo y pasé a familiarizarme con el e</w:t>
-      </w:r>
-      <w:r>
-        <w:t>ntorno de Meta Quest 3S. Si bien el 17 y 18 de Febrero estuve trabajando en un demo para saber como funcionan los controles, por problemas de hardware en el equipo donde estaba trabajando en el LANR, no podía probar lo que había hecho. El 19 de Febrero comencé a trabajar en el Anexo, ya que había un equipo disponible con una tarjeta gráfica compatible con el software de Meta Horizon Link, después de configurar el entorno, finalmente pude probar lo que había desarrollado los días pasados. El 19 de Febrero comencé a experimentar con los Building Blocks de Hand Tracking, algo necesario para evitar la necesidad de usar los controles de los lentes, solo interacción con las manos.</w:t>
-      </w:r>
-    </w:p>
-    <w:p>
-      <w:pPr>
-        <w:jc w:val="both"/>
-        <w:rPr>
-          <w:b/>
-        </w:rPr>
-      </w:pPr>
-      <w:r>
-        <w:rPr>
-          <w:b/>
-        </w:rPr>
-        <w:t>Semana 3 (23 de Febrero de 2026 a 27 de Febrero de 2026)</w:t>
-      </w:r>
-    </w:p>
-    <w:p>
-      <w:pPr>
-        <w:jc w:val="both"/>
-      </w:pPr>
-      <w:r>
-        <w:t>Lesly, una compañera que trabajaba en el Anexo iba a ocupar la computadora donde iba a estar trabajando, así que no asistí hasta el Jueves 26 de Febrero. Los días restantes de la semana me dediqué a terminar el demo y prácticar el cambio de escenas con interacción en UI haciendo uso de Hand Tracking.</w:t>
-      </w:r>
-    </w:p>
-    <w:p>
-      <w:pPr>
-        <w:jc w:val="both"/>
-        <w:rPr>
-          <w:b/>
-        </w:rPr>
-      </w:pPr>
-      <w:r>
-        <w:rPr>
-          <w:b/>
-        </w:rPr>
-        <w:t xml:space="preserve">Semana 4 (02 de Marzo del 2026 a </w:t>
+        <w:t xml:space="preserve">Semana 1 (09 de </w:t>
+      </w:r>
+      <w:proofErr w:type="gramStart"/>
+      <w:r>
+        <w:rPr>
+          <w:b/>
+        </w:rPr>
+        <w:t>Febrero</w:t>
+      </w:r>
+      <w:proofErr w:type="gramEnd"/>
+      <w:r>
+        <w:rPr>
+          <w:b/>
+        </w:rPr>
+        <w:t xml:space="preserve"> de 2026 a 13 de Febrero de 2026)</w:t>
+      </w:r>
+    </w:p>
+    <w:p>
+      <w:pPr>
+        <w:jc w:val="both"/>
+      </w:pPr>
+      <w:r>
+        <w:t xml:space="preserve">El primer día se inició con el desarrollo de un Roll A </w:t>
+      </w:r>
+      <w:proofErr w:type="spellStart"/>
+      <w:r>
+        <w:t>Ball</w:t>
+      </w:r>
+      <w:proofErr w:type="spellEnd"/>
+      <w:r>
+        <w:t xml:space="preserve">, principalmente para familiarizarse con el entorno de </w:t>
+      </w:r>
+      <w:proofErr w:type="spellStart"/>
+      <w:r>
+        <w:t>Unity</w:t>
+      </w:r>
+      <w:proofErr w:type="spellEnd"/>
+      <w:r>
+        <w:t>. El mismo día se terminó el tutorial, pero al día siguiente se volvió a iniciar, ya que la versión utilizada</w:t>
+      </w:r>
+      <w:r>
+        <w:t xml:space="preserve"> de </w:t>
+      </w:r>
+      <w:proofErr w:type="spellStart"/>
+      <w:r>
+        <w:t>Unity</w:t>
+      </w:r>
+      <w:proofErr w:type="spellEnd"/>
+      <w:r>
+        <w:t xml:space="preserve"> no era la solicitada por </w:t>
+      </w:r>
+      <w:proofErr w:type="spellStart"/>
+      <w:r>
+        <w:t>Yoá</w:t>
+      </w:r>
+      <w:r>
+        <w:t>s</w:t>
+      </w:r>
+      <w:proofErr w:type="spellEnd"/>
+      <w:r>
+        <w:t xml:space="preserve">. </w:t>
+      </w:r>
+      <w:r>
+        <w:t xml:space="preserve">El 11 de </w:t>
+      </w:r>
+      <w:proofErr w:type="gramStart"/>
+      <w:r>
+        <w:t>Febrero</w:t>
+      </w:r>
+      <w:proofErr w:type="gramEnd"/>
+      <w:r>
+        <w:t xml:space="preserve"> se comenzó con el desarrollo de la segunda escena, que era casi la primera escena pero se tenían que implementar enemigos, plataformas, vidas, monedas, </w:t>
+      </w:r>
+      <w:proofErr w:type="spellStart"/>
+      <w:r>
+        <w:t>spawners</w:t>
+      </w:r>
+      <w:proofErr w:type="spellEnd"/>
+      <w:r>
+        <w:t xml:space="preserve"> y plataformas. El 12 de </w:t>
+      </w:r>
+      <w:proofErr w:type="gramStart"/>
+      <w:r>
+        <w:t>Febrero</w:t>
+      </w:r>
+      <w:proofErr w:type="gramEnd"/>
+      <w:r>
+        <w:t xml:space="preserve"> se implementó la Lava, la cual tenía que cambiar de color cada 5 segundos. El 13 de </w:t>
+      </w:r>
+      <w:proofErr w:type="gramStart"/>
+      <w:r>
+        <w:t>Febrero</w:t>
+      </w:r>
+      <w:proofErr w:type="gramEnd"/>
+      <w:r>
+        <w:t xml:space="preserve"> se estuvo haciendo en los </w:t>
+      </w:r>
+      <w:proofErr w:type="spellStart"/>
+      <w:r>
+        <w:t>spawners</w:t>
+      </w:r>
+      <w:proofErr w:type="spellEnd"/>
+      <w:r>
+        <w:t xml:space="preserve"> de enemigos y monedas.</w:t>
+      </w:r>
+    </w:p>
+    <w:p>
+      <w:pPr>
+        <w:jc w:val="both"/>
+        <w:rPr>
+          <w:b/>
+        </w:rPr>
+      </w:pPr>
+      <w:r>
+        <w:rPr>
+          <w:b/>
+        </w:rPr>
+        <w:t xml:space="preserve">Semana 2 (16 de </w:t>
+      </w:r>
+      <w:proofErr w:type="gramStart"/>
+      <w:r>
+        <w:rPr>
+          <w:b/>
+        </w:rPr>
+        <w:t>Febrero</w:t>
+      </w:r>
+      <w:proofErr w:type="gramEnd"/>
+      <w:r>
+        <w:rPr>
+          <w:b/>
+        </w:rPr>
+        <w:t xml:space="preserve"> de 2026 a 20 de Febrero de 2026)</w:t>
+      </w:r>
+    </w:p>
+    <w:p>
+      <w:pPr>
+        <w:jc w:val="both"/>
+      </w:pPr>
+      <w:r>
+        <w:t xml:space="preserve">El 16 de </w:t>
+      </w:r>
+      <w:proofErr w:type="gramStart"/>
+      <w:r>
+        <w:t>Febrero</w:t>
+      </w:r>
+      <w:proofErr w:type="gramEnd"/>
+      <w:r>
+        <w:t xml:space="preserve"> se comenzó con la implementación de las escenas, los menús de pausa y cambios de escenas. Se completó el desarrollo de Roll A </w:t>
+      </w:r>
+      <w:proofErr w:type="spellStart"/>
+      <w:r>
+        <w:t>Ball</w:t>
+      </w:r>
+      <w:proofErr w:type="spellEnd"/>
+      <w:r>
+        <w:t xml:space="preserve">. El 17 de </w:t>
+      </w:r>
+      <w:proofErr w:type="gramStart"/>
+      <w:r>
+        <w:t>Febrero</w:t>
+      </w:r>
+      <w:proofErr w:type="gramEnd"/>
+      <w:r>
+        <w:t xml:space="preserve"> </w:t>
+      </w:r>
+      <w:proofErr w:type="spellStart"/>
+      <w:r>
+        <w:t>Yoás</w:t>
+      </w:r>
+      <w:proofErr w:type="spellEnd"/>
+      <w:r>
+        <w:t xml:space="preserve"> le dio visto bueno al demo y pasé a familiarizarme con el e</w:t>
+      </w:r>
+      <w:r>
+        <w:t xml:space="preserve">ntorno de Meta </w:t>
+      </w:r>
+      <w:proofErr w:type="spellStart"/>
+      <w:r>
+        <w:t>Quest</w:t>
+      </w:r>
+      <w:proofErr w:type="spellEnd"/>
+      <w:r>
+        <w:t xml:space="preserve"> 3S. Si bien el 17 y 18 de </w:t>
+      </w:r>
+      <w:proofErr w:type="gramStart"/>
+      <w:r>
+        <w:t>Febrero</w:t>
+      </w:r>
+      <w:proofErr w:type="gramEnd"/>
+      <w:r>
+        <w:t xml:space="preserve"> estuve trabajando en un demo para saber </w:t>
+      </w:r>
+      <w:proofErr w:type="spellStart"/>
+      <w:r>
+        <w:t>como</w:t>
+      </w:r>
+      <w:proofErr w:type="spellEnd"/>
+      <w:r>
+        <w:t xml:space="preserve"> funcionan los controles, por problemas de hardware en el equipo donde estaba trabajando en el LANR, no podía probar lo que había hecho. El 19 de </w:t>
+      </w:r>
+      <w:proofErr w:type="gramStart"/>
+      <w:r>
+        <w:t>Febrero</w:t>
+      </w:r>
+      <w:proofErr w:type="gramEnd"/>
+      <w:r>
+        <w:t xml:space="preserve"> comencé a trabajar en el Anexo, ya que había un equipo disponible con una tarjeta gráfica compatible con el software de Meta </w:t>
+      </w:r>
+      <w:proofErr w:type="spellStart"/>
+      <w:r>
+        <w:t>Horizon</w:t>
+      </w:r>
+      <w:proofErr w:type="spellEnd"/>
+      <w:r>
+        <w:t xml:space="preserve"> Link, después de configurar el entorno, finalmente pude probar lo que había desarrollado los días pasados. El 19 de </w:t>
+      </w:r>
+      <w:proofErr w:type="gramStart"/>
+      <w:r>
+        <w:t>Febrero</w:t>
+      </w:r>
+      <w:proofErr w:type="gramEnd"/>
+      <w:r>
+        <w:t xml:space="preserve"> comencé a experimentar con los </w:t>
+      </w:r>
+      <w:proofErr w:type="spellStart"/>
+      <w:r>
+        <w:t>Building</w:t>
+      </w:r>
+      <w:proofErr w:type="spellEnd"/>
+      <w:r>
+        <w:t xml:space="preserve"> Blocks de Hand Tracking, algo necesario para evitar la necesidad de usar los controles de los lentes, solo interacción con las manos.</w:t>
+      </w:r>
+    </w:p>
+    <w:p>
+      <w:pPr>
+        <w:jc w:val="both"/>
+        <w:rPr>
+          <w:b/>
+        </w:rPr>
+      </w:pPr>
+      <w:r>
+        <w:rPr>
+          <w:b/>
+        </w:rPr>
+        <w:t xml:space="preserve">Semana 3 (23 de </w:t>
+      </w:r>
+      <w:proofErr w:type="gramStart"/>
+      <w:r>
+        <w:rPr>
+          <w:b/>
+        </w:rPr>
+        <w:t>Febrero</w:t>
+      </w:r>
+      <w:proofErr w:type="gramEnd"/>
+      <w:r>
+        <w:rPr>
+          <w:b/>
+        </w:rPr>
+        <w:t xml:space="preserve"> de 2026 a 27 de Febrero de 2026)</w:t>
+      </w:r>
+    </w:p>
+    <w:p>
+      <w:pPr>
+        <w:jc w:val="both"/>
+      </w:pPr>
+      <w:proofErr w:type="spellStart"/>
+      <w:r>
+        <w:t>Lesly</w:t>
+      </w:r>
+      <w:proofErr w:type="spellEnd"/>
+      <w:r>
+        <w:t xml:space="preserve">, una compañera que trabajaba en el Anexo iba a ocupar la computadora donde iba a estar trabajando, así que no asistí hasta el </w:t>
+      </w:r>
+      <w:proofErr w:type="gramStart"/>
+      <w:r>
+        <w:t>Jueves</w:t>
+      </w:r>
+      <w:proofErr w:type="gramEnd"/>
+      <w:r>
+        <w:t xml:space="preserve"> 26 de Febrero. Los días restantes de la semana me dediqué a terminar el demo y </w:t>
+      </w:r>
+      <w:proofErr w:type="spellStart"/>
+      <w:r>
+        <w:t>prácticar</w:t>
+      </w:r>
+      <w:proofErr w:type="spellEnd"/>
+      <w:r>
+        <w:t xml:space="preserve"> el cambio de escenas con interacción en UI haciendo uso de Hand Tracking.</w:t>
+      </w:r>
+    </w:p>
+    <w:p>
+      <w:pPr>
+        <w:jc w:val="both"/>
+        <w:rPr>
+          <w:b/>
+        </w:rPr>
+      </w:pPr>
+      <w:r>
+        <w:rPr>
+          <w:b/>
+        </w:rPr>
+        <w:t xml:space="preserve">Semana 4 (02 de </w:t>
+      </w:r>
+      <w:proofErr w:type="gramStart"/>
+      <w:r>
+        <w:rPr>
+          <w:b/>
+        </w:rPr>
+        <w:t>Marzo</w:t>
+      </w:r>
+      <w:proofErr w:type="gramEnd"/>
+      <w:r>
+        <w:rPr>
+          <w:b/>
+        </w:rPr>
+        <w:t xml:space="preserve"> del 2026 a </w:t>
       </w:r>
       <w:r>
         <w:rPr>
@@ -105,35 +342,153 @@
         <w:jc w:val="both"/>
       </w:pPr>
       <w:r>
-        <w:t>El 02 de Marzo, Yoás revisó los avances de la semana pasada y me platicó la idea que tenía para la implementación del proyecto, un juego espacial. El 04 de Marzo, después de estar viendo ejemplos de como mover un objeto con hand tracking, Yoás me comentó que la idea era que el paciente o jugador disparen desde sus manos para naves enemigas. El 05 y 06 de Febrero estuve trabajando para que cuando se hiciera la acción de “Pinch”, se disparen diferentes tipos de disparos, también estuve trabajando en los comportamientos de los enemigos, un medidor de supinación, flexión, extensión y pronación.</w:t>
-      </w:r>
-    </w:p>
-    <w:p>
-      <w:pPr>
-        <w:jc w:val="both"/>
-        <w:rPr>
-          <w:b/>
-        </w:rPr>
-      </w:pPr>
-      <w:r>
-        <w:rPr>
-          <w:b/>
-        </w:rPr>
-        <w:t>Semana 5 (09 de Marzo del 2026 a 13 de Febrero de 2026)</w:t>
-      </w:r>
-    </w:p>
-    <w:p>
-      <w:pPr>
-        <w:jc w:val="both"/>
-      </w:pPr>
-      <w:r>
-        <w:t xml:space="preserve">Del 09 de Marzo al 12 de Marzo estuve ajustando el comportamiento del contador de Puntuación, el 12 de Marzo Yoás asistió al Anexo para revisar avances, me comentó que el movimiento de “Pinch” podía ser algo </w:t>
+        <w:t xml:space="preserve">El 02 de </w:t>
+      </w:r>
+      <w:proofErr w:type="gramStart"/>
+      <w:r>
+        <w:t>Marzo</w:t>
+      </w:r>
+      <w:proofErr w:type="gramEnd"/>
+      <w:r>
+        <w:t xml:space="preserve">, </w:t>
+      </w:r>
+      <w:proofErr w:type="spellStart"/>
+      <w:r>
+        <w:t>Yoás</w:t>
+      </w:r>
+      <w:proofErr w:type="spellEnd"/>
+      <w:r>
+        <w:t xml:space="preserve"> revisó los avances de la semana pasada y me platicó la idea que tenía para la implementación del proyecto, un juego espacial. El 04 de </w:t>
+      </w:r>
+      <w:proofErr w:type="gramStart"/>
+      <w:r>
+        <w:t>Marzo</w:t>
+      </w:r>
+      <w:proofErr w:type="gramEnd"/>
+      <w:r>
+        <w:t xml:space="preserve">, después de estar viendo ejemplos de </w:t>
+      </w:r>
+      <w:proofErr w:type="spellStart"/>
+      <w:r>
+        <w:t>como</w:t>
+      </w:r>
+      <w:proofErr w:type="spellEnd"/>
+      <w:r>
+        <w:t xml:space="preserve"> mover un objeto con </w:t>
+      </w:r>
+      <w:proofErr w:type="spellStart"/>
+      <w:r>
+        <w:t>hand</w:t>
+      </w:r>
+      <w:proofErr w:type="spellEnd"/>
+      <w:r>
+        <w:t xml:space="preserve"> tracking, </w:t>
+      </w:r>
+      <w:proofErr w:type="spellStart"/>
+      <w:r>
+        <w:t>Yoás</w:t>
+      </w:r>
+      <w:proofErr w:type="spellEnd"/>
+      <w:r>
+        <w:t xml:space="preserve"> me comentó que la idea era que el paciente o jugador disparen desde sus manos para naves enemigas. El 05 y 06 de </w:t>
+      </w:r>
+      <w:proofErr w:type="gramStart"/>
+      <w:r>
+        <w:t>Febrero</w:t>
+      </w:r>
+      <w:proofErr w:type="gramEnd"/>
+      <w:r>
+        <w:t xml:space="preserve"> estuve trabajando para que cuando se hiciera la acción de “</w:t>
+      </w:r>
+      <w:proofErr w:type="spellStart"/>
+      <w:r>
+        <w:t>Pinch</w:t>
+      </w:r>
+      <w:proofErr w:type="spellEnd"/>
+      <w:r>
+        <w:t>”, se disparen diferentes tipos de disparos, también estuve trabajando en los comportamientos de los enemigos, un medidor de supinación, flexión, extensión y pronación.</w:t>
+      </w:r>
+    </w:p>
+    <w:p>
+      <w:pPr>
+        <w:jc w:val="both"/>
+        <w:rPr>
+          <w:b/>
+        </w:rPr>
+      </w:pPr>
+      <w:r>
+        <w:rPr>
+          <w:b/>
+        </w:rPr>
+        <w:t xml:space="preserve">Semana 5 (09 de </w:t>
+      </w:r>
+      <w:proofErr w:type="gramStart"/>
+      <w:r>
+        <w:rPr>
+          <w:b/>
+        </w:rPr>
+        <w:t>Marzo</w:t>
+      </w:r>
+      <w:proofErr w:type="gramEnd"/>
+      <w:r>
+        <w:rPr>
+          <w:b/>
+        </w:rPr>
+        <w:t xml:space="preserve"> del 2026 a 13 de Febrero de 2026)</w:t>
+      </w:r>
+    </w:p>
+    <w:p>
+      <w:pPr>
+        <w:jc w:val="both"/>
+      </w:pPr>
+      <w:r>
+        <w:t xml:space="preserve">Del 09 de </w:t>
+      </w:r>
+      <w:proofErr w:type="gramStart"/>
+      <w:r>
+        <w:t>Marzo</w:t>
+      </w:r>
+      <w:proofErr w:type="gramEnd"/>
+      <w:r>
+        <w:t xml:space="preserve"> al 12 de Marzo estuve ajustando el comportamiento del contador de Puntuación, el 12 de Marzo </w:t>
+      </w:r>
+      <w:proofErr w:type="spellStart"/>
+      <w:r>
+        <w:t>Yoás</w:t>
+      </w:r>
+      <w:proofErr w:type="spellEnd"/>
+      <w:r>
+        <w:t xml:space="preserve"> asistió al Anexo para revisar avances, me comentó que el movimiento de “</w:t>
+      </w:r>
+      <w:proofErr w:type="spellStart"/>
+      <w:r>
+        <w:t>Pinch</w:t>
+      </w:r>
+      <w:proofErr w:type="spellEnd"/>
+      <w:r>
+        <w:t xml:space="preserve">” podía ser algo </w:t>
       </w:r>
       <w:r>
         <w:t>complicado</w:t>
       </w:r>
       <w:r>
-        <w:t xml:space="preserve"> para los pacientes, así que el jugador ya no tendría que disparar, solo con tocar a los enemigos. El 13 de Marzo me dediqué a que los enemigos se detengan a una distancia del jugador para que este los toque con las manos de hand tracking, pero que desaparezcan si no lo hace en un tiempo determinado.</w:t>
+        <w:t xml:space="preserve"> para los pacientes, así que el jugador ya no tendría que disparar, solo con tocar a los enemigos. El 13 de </w:t>
+      </w:r>
+      <w:proofErr w:type="gramStart"/>
+      <w:r>
+        <w:t>Marzo</w:t>
+      </w:r>
+      <w:proofErr w:type="gramEnd"/>
+      <w:r>
+        <w:t xml:space="preserve"> me dediqué a que los enemigos se detengan a una distancia del jugador para que este los toque con las manos de </w:t>
+      </w:r>
+      <w:proofErr w:type="spellStart"/>
+      <w:r>
+        <w:t>hand</w:t>
+      </w:r>
+      <w:proofErr w:type="spellEnd"/>
+      <w:r>
+        <w:t xml:space="preserve"> tracking, pero que desaparezcan si no lo hace en un tiempo determinado.</w:t>
       </w:r>
       <w:r>
         <w:t xml:space="preserve"> </w:t>
@@ -150,15 +505,37 @@
         <w:rPr>
           <w:b/>
         </w:rPr>
-        <w:t>Semana 6 (17 de Marzo del 2026 a 20 de Marzo del 2026)</w:t>
-      </w:r>
-    </w:p>
-    <w:p>
-      <w:pPr>
-        <w:jc w:val="both"/>
-      </w:pPr>
-      <w:r>
-        <w:t xml:space="preserve">El 17 de Marzo se comenzó con la implementación de un sistema de cuenta regresiva para el comienzo de las rondas de enemigos; la idea es hacer que se inicie con una cuenta regresiva </w:t>
+        <w:t xml:space="preserve">Semana 6 (17 de </w:t>
+      </w:r>
+      <w:proofErr w:type="gramStart"/>
+      <w:r>
+        <w:rPr>
+          <w:b/>
+        </w:rPr>
+        <w:t>Marzo</w:t>
+      </w:r>
+      <w:proofErr w:type="gramEnd"/>
+      <w:r>
+        <w:rPr>
+          <w:b/>
+        </w:rPr>
+        <w:t xml:space="preserve"> del 2026 a 20 de Marzo del 2026)</w:t>
+      </w:r>
+    </w:p>
+    <w:p>
+      <w:pPr>
+        <w:jc w:val="both"/>
+      </w:pPr>
+      <w:r>
+        <w:t xml:space="preserve">El 17 de </w:t>
+      </w:r>
+      <w:proofErr w:type="gramStart"/>
+      <w:r>
+        <w:t>Marzo</w:t>
+      </w:r>
+      <w:proofErr w:type="gramEnd"/>
+      <w:r>
+        <w:t xml:space="preserve"> se comenzó con la implementación de un sistema de cuenta regresiva para el comienzo de las rondas de enemigos; la idea es hacer que se inicie con una cuenta regresiva </w:t>
       </w:r>
       <w:r>
         <w:lastRenderedPageBreak/>
@@ -174,10 +551,42 @@
         <w:t xml:space="preserve">. </w:t>
       </w:r>
       <w:r>
-        <w:t>El 18 de Marzo me encargué de juntar las escenas y completar la implementación del panel de “Continuar”</w:t>
-      </w:r>
-      <w:r>
-        <w:t>. El 19 de Marzo mejoré el comportamiento y los Spawners de los enemigos. El 20 de Marzo,</w:t>
+        <w:t xml:space="preserve">El 18 de </w:t>
+      </w:r>
+      <w:proofErr w:type="gramStart"/>
+      <w:r>
+        <w:t>Marzo</w:t>
+      </w:r>
+      <w:proofErr w:type="gramEnd"/>
+      <w:r>
+        <w:t xml:space="preserve"> me encargué de juntar las escenas y completar la implementación del panel de “Continuar”</w:t>
+      </w:r>
+      <w:r>
+        <w:t xml:space="preserve">. El 19 de </w:t>
+      </w:r>
+      <w:proofErr w:type="gramStart"/>
+      <w:r>
+        <w:t>Marzo</w:t>
+      </w:r>
+      <w:proofErr w:type="gramEnd"/>
+      <w:r>
+        <w:t xml:space="preserve"> mejoré el comportamiento y los </w:t>
+      </w:r>
+      <w:proofErr w:type="spellStart"/>
+      <w:r>
+        <w:t>Spawners</w:t>
+      </w:r>
+      <w:proofErr w:type="spellEnd"/>
+      <w:r>
+        <w:t xml:space="preserve"> de los enemigos. El 20 de </w:t>
+      </w:r>
+      <w:proofErr w:type="gramStart"/>
+      <w:r>
+        <w:t>Marzo</w:t>
+      </w:r>
+      <w:proofErr w:type="gramEnd"/>
+      <w:r>
+        <w:t>,</w:t>
       </w:r>
       <w:r>
         <w:t xml:space="preserve"> comencé a implementar diferentes niveles en caso de que el paciente necesite hacer ejercicios específicos.</w:t>
@@ -194,70 +603,210 @@
         <w:rPr>
           <w:b/>
         </w:rPr>
-        <w:t>Semana 7 (23 de Marzo del 2026 a 28 de Marzo del 2026)</w:t>
-      </w:r>
-    </w:p>
-    <w:p>
-      <w:pPr>
-        <w:jc w:val="both"/>
-      </w:pPr>
-      <w:r>
-        <w:t>El 23 de Marzo, por indicaciones de Yoás, se cambió el enfoque de los enemigos. Estos aparecerán y rodearán al Jugador como si estuvieran en un domo o semicírculo; dicho semicírculo variará su tamaño en base a la distancia máxima que el Jugador pueda estirar su brazo sano. Esa lógica también se implementó.</w:t>
-      </w:r>
-      <w:r>
-        <w:t xml:space="preserve"> El 24 de Marzo me dediqué a hacer la solicitud de tesis.</w:t>
-      </w:r>
-      <w:r>
-        <w:t xml:space="preserve"> El 25 de Marzo, Yoás revisó los avances, donde debo cambiar la orientación del domo y agregar más parámetros a ser modificados por el terapeuta, así como un flujo de trabajo.</w:t>
-      </w:r>
-      <w:r>
-        <w:t xml:space="preserve"> 26 y 27 de Marzo estuve configurando la nueva orientación del domo y el comportamiento de los enemigos.</w:t>
-      </w:r>
-      <w:r>
-        <w:t xml:space="preserve"> El 28 de Marzo conecté las escenas.</w:t>
-      </w:r>
-    </w:p>
-    <w:p>
-      <w:pPr>
-        <w:jc w:val="both"/>
-        <w:rPr>
-          <w:b/>
-        </w:rPr>
-      </w:pPr>
-      <w:r>
-        <w:rPr>
-          <w:b/>
-        </w:rPr>
-        <w:t>Semana 8 (06 de Abril del 2026 a 10 de Abril del 2026)</w:t>
-      </w:r>
-    </w:p>
-    <w:p>
-      <w:pPr>
-        <w:jc w:val="both"/>
-      </w:pPr>
-      <w:r>
-        <w:t xml:space="preserve">El 06 de Abril comencé con la implementación </w:t>
-      </w:r>
-      <w:r>
-        <w:t>de la selección de los enemigos; Yoas me encomendó hacer un modo de realidad mixta.</w:t>
-      </w:r>
-      <w:r>
-        <w:t xml:space="preserve"> 07 de Abril detecté que hay problemas con el cable de conexión, debo buscar un USB 3.0.</w:t>
+        <w:t xml:space="preserve">Semana 7 (23 de </w:t>
+      </w:r>
+      <w:proofErr w:type="gramStart"/>
+      <w:r>
+        <w:rPr>
+          <w:b/>
+        </w:rPr>
+        <w:t>Marzo</w:t>
+      </w:r>
+      <w:proofErr w:type="gramEnd"/>
+      <w:r>
+        <w:rPr>
+          <w:b/>
+        </w:rPr>
+        <w:t xml:space="preserve"> del 2026 a 28 de Marzo del 2026)</w:t>
+      </w:r>
+    </w:p>
+    <w:p>
+      <w:pPr>
+        <w:jc w:val="both"/>
+      </w:pPr>
+      <w:r>
+        <w:t xml:space="preserve">El 23 de </w:t>
+      </w:r>
+      <w:proofErr w:type="gramStart"/>
+      <w:r>
+        <w:t>Marzo</w:t>
+      </w:r>
+      <w:proofErr w:type="gramEnd"/>
+      <w:r>
+        <w:t xml:space="preserve">, por indicaciones de </w:t>
+      </w:r>
+      <w:proofErr w:type="spellStart"/>
+      <w:r>
+        <w:t>Yoás</w:t>
+      </w:r>
+      <w:proofErr w:type="spellEnd"/>
+      <w:r>
+        <w:t>, se cambió el enfoque de los enemigos. Estos aparecerán y rodearán al Jugador como si estuvieran en un domo o semicírculo; dicho semicírculo variará su tamaño en base a la distancia máxima que el Jugador pueda estirar su brazo sano. Esa lógica también se implementó.</w:t>
+      </w:r>
+      <w:r>
+        <w:t xml:space="preserve"> El 24 de </w:t>
+      </w:r>
+      <w:proofErr w:type="gramStart"/>
+      <w:r>
+        <w:t>Marzo</w:t>
+      </w:r>
+      <w:proofErr w:type="gramEnd"/>
+      <w:r>
+        <w:t xml:space="preserve"> me dediqué a hacer la solicitud de tesis.</w:t>
+      </w:r>
+      <w:r>
+        <w:t xml:space="preserve"> El 25 de </w:t>
+      </w:r>
+      <w:proofErr w:type="gramStart"/>
+      <w:r>
+        <w:t>Marzo</w:t>
+      </w:r>
+      <w:proofErr w:type="gramEnd"/>
+      <w:r>
+        <w:t xml:space="preserve">, </w:t>
+      </w:r>
+      <w:proofErr w:type="spellStart"/>
+      <w:r>
+        <w:t>Yoás</w:t>
+      </w:r>
+      <w:proofErr w:type="spellEnd"/>
+      <w:r>
+        <w:t xml:space="preserve"> revisó los avances, donde debo cambiar la orientación del domo y agregar más parámetros a ser modificados por el terapeuta, así como un flujo de trabajo.</w:t>
+      </w:r>
+      <w:r>
+        <w:t xml:space="preserve"> 26 y 27 de </w:t>
+      </w:r>
+      <w:proofErr w:type="gramStart"/>
+      <w:r>
+        <w:t>Marzo</w:t>
+      </w:r>
+      <w:proofErr w:type="gramEnd"/>
+      <w:r>
+        <w:t xml:space="preserve"> estuve configurando la nueva orientación del domo y el comportamiento de los enemigos.</w:t>
+      </w:r>
+      <w:r>
+        <w:t xml:space="preserve"> El 28 de </w:t>
+      </w:r>
+      <w:proofErr w:type="gramStart"/>
+      <w:r>
+        <w:t>Marzo</w:t>
+      </w:r>
+      <w:proofErr w:type="gramEnd"/>
+      <w:r>
+        <w:t xml:space="preserve"> conecté las escenas.</w:t>
+      </w:r>
+    </w:p>
+    <w:p>
+      <w:pPr>
+        <w:jc w:val="both"/>
+        <w:rPr>
+          <w:b/>
+        </w:rPr>
+      </w:pPr>
+      <w:r>
+        <w:rPr>
+          <w:b/>
+        </w:rPr>
+        <w:t xml:space="preserve">Semana 8 (06 de </w:t>
+      </w:r>
+      <w:proofErr w:type="gramStart"/>
+      <w:r>
+        <w:rPr>
+          <w:b/>
+        </w:rPr>
+        <w:t>Abril</w:t>
+      </w:r>
+      <w:proofErr w:type="gramEnd"/>
+      <w:r>
+        <w:rPr>
+          <w:b/>
+        </w:rPr>
+        <w:t xml:space="preserve"> del 2026 a 10 de Abril del 2026)</w:t>
+      </w:r>
+    </w:p>
+    <w:p>
+      <w:pPr>
+        <w:jc w:val="both"/>
+      </w:pPr>
+      <w:r>
+        <w:t xml:space="preserve">El 06 de </w:t>
+      </w:r>
+      <w:proofErr w:type="gramStart"/>
+      <w:r>
+        <w:t>Abril</w:t>
+      </w:r>
+      <w:proofErr w:type="gramEnd"/>
+      <w:r>
+        <w:t xml:space="preserve"> comencé con la implementación </w:t>
+      </w:r>
+      <w:r>
+        <w:t xml:space="preserve">de la selección de los enemigos; </w:t>
+      </w:r>
+      <w:proofErr w:type="spellStart"/>
+      <w:r>
+        <w:t>Yoas</w:t>
+      </w:r>
+      <w:proofErr w:type="spellEnd"/>
+      <w:r>
+        <w:t xml:space="preserve"> me encomendó hacer un modo de realidad mixta.</w:t>
+      </w:r>
+      <w:r>
+        <w:t xml:space="preserve"> 07 de </w:t>
+      </w:r>
+      <w:proofErr w:type="gramStart"/>
+      <w:r>
+        <w:t>Abril</w:t>
+      </w:r>
+      <w:proofErr w:type="gramEnd"/>
+      <w:r>
+        <w:t xml:space="preserve"> detecté que hay problemas con el cable de conexión, debo buscar un USB 3.0.</w:t>
       </w:r>
       <w:r>
         <w:t xml:space="preserve"> </w:t>
       </w:r>
       <w:r>
-        <w:t xml:space="preserve">El 08 de Abril, después de registrar el Meta Quest 3S a la cuenta de desarrollador y arreglar un </w:t>
+        <w:t xml:space="preserve">El 08 de </w:t>
+      </w:r>
+      <w:proofErr w:type="gramStart"/>
+      <w:r>
+        <w:t>Abril</w:t>
+      </w:r>
+      <w:proofErr w:type="gramEnd"/>
+      <w:r>
+        <w:t xml:space="preserve">, después de registrar el Meta </w:t>
+      </w:r>
+      <w:proofErr w:type="spellStart"/>
+      <w:r>
+        <w:t>Quest</w:t>
+      </w:r>
+      <w:proofErr w:type="spellEnd"/>
+      <w:r>
+        <w:t xml:space="preserve"> 3S a la cuenta de desarrollador y arreglar un </w:t>
       </w:r>
       <w:r>
         <w:t>problema</w:t>
       </w:r>
       <w:r>
-        <w:t xml:space="preserve"> con el Canvas, se pudo conectar y completar la Realidad Mixta.</w:t>
-      </w:r>
-      <w:r>
-        <w:t xml:space="preserve"> El 10 de Abril se continuó con la implementación del seleccionador de Enemigos, ahora falta esperar por los modelos.</w:t>
+        <w:t xml:space="preserve"> con el </w:t>
+      </w:r>
+      <w:proofErr w:type="spellStart"/>
+      <w:r>
+        <w:t>Canvas</w:t>
+      </w:r>
+      <w:proofErr w:type="spellEnd"/>
+      <w:r>
+        <w:t>, se pudo conectar y completar la Realidad Mixta.</w:t>
+      </w:r>
+      <w:r>
+        <w:t xml:space="preserve"> El 10 de </w:t>
+      </w:r>
+      <w:proofErr w:type="gramStart"/>
+      <w:r>
+        <w:t>Abril</w:t>
+      </w:r>
+      <w:proofErr w:type="gramEnd"/>
+      <w:r>
+        <w:t xml:space="preserve"> se continuó con la implementación del seleccionador de Enemigos, ahora falta esperar por los modelos.</w:t>
       </w:r>
     </w:p>
     <w:p>
@@ -277,7 +826,21 @@
         <w:rPr>
           <w:b/>
         </w:rPr>
-        <w:t>na 9 (13 de Abril del 2026 al 17</w:t>
+        <w:t xml:space="preserve">na 9 (13 de </w:t>
+      </w:r>
+      <w:proofErr w:type="gramStart"/>
+      <w:r>
+        <w:rPr>
+          <w:b/>
+        </w:rPr>
+        <w:t>Abril</w:t>
+      </w:r>
+      <w:proofErr w:type="gramEnd"/>
+      <w:r>
+        <w:rPr>
+          <w:b/>
+        </w:rPr>
+        <w:t xml:space="preserve"> del 2026 al 17</w:t>
       </w:r>
       <w:r>
         <w:rPr>
@@ -291,47 +854,185 @@
         <w:jc w:val="both"/>
       </w:pPr>
       <w:r>
-        <w:t>El 13 de Abril, comencé a trabajar con los modelos de las naves; debo configurarlos para una actividad que se tendrá por parte de Amerike.</w:t>
-      </w:r>
-      <w:r>
-        <w:t xml:space="preserve"> El 14 de Abril terminé de configurar los modelos y limpié un poco el código y los Assets para la muestra del día siguiente.</w:t>
-      </w:r>
-      <w:r>
-        <w:t xml:space="preserve"> El 15 de Abril realicé unos ajustes a la cámara del jugador y alisté todo para la muestra de Amerike</w:t>
-      </w:r>
-      <w:r>
-        <w:t>. El 16 de Abril fue la muestra, hubo problemas con la Etiqueta Player, ya fue solucionado pero al menos en la muestra se tuvo ese problema. El 17 de Abril se comenzó a probar las mecánicas del segundo minijuego, este toma en cuenta la rotación de la muñeca del jugador para poder rotar las piezas del rompecabezas.</w:t>
-      </w:r>
-    </w:p>
-    <w:p>
-      <w:pPr>
-        <w:jc w:val="both"/>
-        <w:rPr>
-          <w:b/>
-        </w:rPr>
-      </w:pPr>
-      <w:r>
-        <w:rPr>
-          <w:b/>
-        </w:rPr>
-        <w:t>Semana 10 (20 de Abril del 2026 al 24 de Abril del 2026)</w:t>
-      </w:r>
-    </w:p>
-    <w:p>
-      <w:pPr>
-        <w:jc w:val="both"/>
-      </w:pPr>
-      <w:r>
-        <w:t>El 20 de Abril, comencé a trabajar en el sistema para confirmar que el rompecabezas esté formado, pero por los modelos que estoy usando, no sé exactamente si está funcionando hasta que tenga los modelos correctos.</w:t>
-      </w:r>
-      <w:r>
-        <w:t xml:space="preserve"> El 21 de Abril hubo retroalimentación por parte de Yoás, para las runas no hay que aplicar los botones, pero el sistema de victoria está bien, ahora hay que idear una forma para implementar las puertas.</w:t>
-      </w:r>
-      <w:r>
-        <w:t xml:space="preserve"> El 22 de Abril se comenzó la implementación de las puertas, las cuales funcionarán como forma de medir el progreso del jugador.</w:t>
-      </w:r>
-      <w:r>
-        <w:t xml:space="preserve"> El 23 de Abril se comenzó a implementar el contador para finalizar el nivel.</w:t>
+        <w:t xml:space="preserve">El 13 de </w:t>
+      </w:r>
+      <w:proofErr w:type="gramStart"/>
+      <w:r>
+        <w:t>Abril</w:t>
+      </w:r>
+      <w:proofErr w:type="gramEnd"/>
+      <w:r>
+        <w:t xml:space="preserve">, comencé a trabajar con los modelos de las naves; debo configurarlos para una actividad que se tendrá por parte de </w:t>
+      </w:r>
+      <w:proofErr w:type="spellStart"/>
+      <w:r>
+        <w:t>Amerike</w:t>
+      </w:r>
+      <w:proofErr w:type="spellEnd"/>
+      <w:r>
+        <w:t>.</w:t>
+      </w:r>
+      <w:r>
+        <w:t xml:space="preserve"> El 14 de </w:t>
+      </w:r>
+      <w:proofErr w:type="gramStart"/>
+      <w:r>
+        <w:t>Abril</w:t>
+      </w:r>
+      <w:proofErr w:type="gramEnd"/>
+      <w:r>
+        <w:t xml:space="preserve"> terminé de configurar los modelos y limpié un poco el código y los </w:t>
+      </w:r>
+      <w:proofErr w:type="spellStart"/>
+      <w:r>
+        <w:t>Assets</w:t>
+      </w:r>
+      <w:proofErr w:type="spellEnd"/>
+      <w:r>
+        <w:t xml:space="preserve"> para la muestra del día siguiente.</w:t>
+      </w:r>
+      <w:r>
+        <w:t xml:space="preserve"> El 15 de </w:t>
+      </w:r>
+      <w:proofErr w:type="gramStart"/>
+      <w:r>
+        <w:t>Abril</w:t>
+      </w:r>
+      <w:proofErr w:type="gramEnd"/>
+      <w:r>
+        <w:t xml:space="preserve"> realicé unos ajustes a la cámara del jugador y alisté todo para la muestra de </w:t>
+      </w:r>
+      <w:proofErr w:type="spellStart"/>
+      <w:r>
+        <w:t>Amerike</w:t>
+      </w:r>
+      <w:proofErr w:type="spellEnd"/>
+      <w:r>
+        <w:t xml:space="preserve">. El 16 de </w:t>
+      </w:r>
+      <w:proofErr w:type="gramStart"/>
+      <w:r>
+        <w:t>Abril</w:t>
+      </w:r>
+      <w:proofErr w:type="gramEnd"/>
+      <w:r>
+        <w:t xml:space="preserve"> fue la muestra, hubo problemas con la Etiqueta Player, ya fue solucionado pero al menos en la muestra se tuvo ese problema. El 17 de </w:t>
+      </w:r>
+      <w:proofErr w:type="gramStart"/>
+      <w:r>
+        <w:t>Abril</w:t>
+      </w:r>
+      <w:proofErr w:type="gramEnd"/>
+      <w:r>
+        <w:t xml:space="preserve"> se comenzó a probar las mecánicas del segundo </w:t>
+      </w:r>
+      <w:proofErr w:type="spellStart"/>
+      <w:r>
+        <w:t>minijuego</w:t>
+      </w:r>
+      <w:proofErr w:type="spellEnd"/>
+      <w:r>
+        <w:t>, este toma en cuenta la rotación de la muñeca del jugador para poder rotar las piezas del rompecabezas.</w:t>
+      </w:r>
+    </w:p>
+    <w:p>
+      <w:pPr>
+        <w:jc w:val="both"/>
+        <w:rPr>
+          <w:b/>
+        </w:rPr>
+      </w:pPr>
+      <w:r>
+        <w:rPr>
+          <w:b/>
+        </w:rPr>
+        <w:t xml:space="preserve">Semana 10 (20 de </w:t>
+      </w:r>
+      <w:proofErr w:type="gramStart"/>
+      <w:r>
+        <w:rPr>
+          <w:b/>
+        </w:rPr>
+        <w:t>Abril</w:t>
+      </w:r>
+      <w:proofErr w:type="gramEnd"/>
+      <w:r>
+        <w:rPr>
+          <w:b/>
+        </w:rPr>
+        <w:t xml:space="preserve"> del 2026 al 24 de Abril del 2026)</w:t>
+      </w:r>
+    </w:p>
+    <w:p>
+      <w:pPr>
+        <w:jc w:val="both"/>
+      </w:pPr>
+      <w:r>
+        <w:t xml:space="preserve">El 20 de </w:t>
+      </w:r>
+      <w:proofErr w:type="gramStart"/>
+      <w:r>
+        <w:t>Abril</w:t>
+      </w:r>
+      <w:proofErr w:type="gramEnd"/>
+      <w:r>
+        <w:t>, comencé a trabajar en el sistema para confirmar que el rompecabezas esté formado, pero por los modelos que estoy usando, no sé exactamente si está funcionando hasta que tenga los modelos correctos.</w:t>
+      </w:r>
+      <w:r>
+        <w:t xml:space="preserve"> El 21 de </w:t>
+      </w:r>
+      <w:proofErr w:type="gramStart"/>
+      <w:r>
+        <w:t>Abril</w:t>
+      </w:r>
+      <w:proofErr w:type="gramEnd"/>
+      <w:r>
+        <w:t xml:space="preserve"> hubo retroalimentación por parte de </w:t>
+      </w:r>
+      <w:proofErr w:type="spellStart"/>
+      <w:r>
+        <w:t>Yoás</w:t>
+      </w:r>
+      <w:proofErr w:type="spellEnd"/>
+      <w:r>
+        <w:t>, para las runas no hay que aplicar los botones, pero el sistema de victoria está bien, ahora hay que idear una forma para implementar las puertas.</w:t>
+      </w:r>
+      <w:r>
+        <w:t xml:space="preserve"> El 22 de </w:t>
+      </w:r>
+      <w:proofErr w:type="gramStart"/>
+      <w:r>
+        <w:t>Abril</w:t>
+      </w:r>
+      <w:proofErr w:type="gramEnd"/>
+      <w:r>
+        <w:t xml:space="preserve"> se comenzó la implementación de las puertas, las cuales funcionarán como forma de medir el progreso del jugador.</w:t>
+      </w:r>
+      <w:r>
+        <w:t xml:space="preserve"> El 23 de </w:t>
+      </w:r>
+      <w:proofErr w:type="gramStart"/>
+      <w:r>
+        <w:t>Abril</w:t>
+      </w:r>
+      <w:proofErr w:type="gramEnd"/>
+      <w:r>
+        <w:t xml:space="preserve"> se comenzó a implementar el contador para finalizar el nivel.</w:t>
+      </w:r>
+      <w:r>
+        <w:t xml:space="preserve"> El 24 de </w:t>
+      </w:r>
+      <w:proofErr w:type="gramStart"/>
+      <w:r>
+        <w:t>Abril</w:t>
+      </w:r>
+      <w:proofErr w:type="gramEnd"/>
+      <w:r>
+        <w:t xml:space="preserve"> se arregló la funcionalidad del contador, además de que se activan interfaces en base al resultado de las rotaciones. La siguiente semana comienzo a implementar un objeto que aumente la intensidad </w:t>
+      </w:r>
+      <w:r>
+        <w:lastRenderedPageBreak/>
+        <w:t>de su brillo en base a la apertura de las puertas, también se debe ver el avance de los niveles e intercalar la aparición de los rompecabezas de 3 piezas y 4 piezas.</w:t>
       </w:r>
       <w:bookmarkStart w:id="0" w:name="_GoBack"/>
       <w:bookmarkEnd w:id="0"/>

</xml_diff>

<commit_message>
Se agregan cambios para las runas
</commit_message>
<xml_diff>
--- a/ReporteActividades.docx
+++ b/ReporteActividades.docx
@@ -352,7 +352,19 @@
         <w:rPr>
           <w:b/>
         </w:rPr>
-        <w:t>Semana 11 (27 de Abril del 2026 al 30 de Abril)</w:t>
+        <w:t>Semana 11 (27 de Abril del 2026 al 30 de Abril</w:t>
+      </w:r>
+      <w:r>
+        <w:rPr>
+          <w:b/>
+        </w:rPr>
+        <w:t xml:space="preserve"> del 2026</w:t>
+      </w:r>
+      <w:r>
+        <w:rPr>
+          <w:b/>
+        </w:rPr>
+        <w:t>)</w:t>
       </w:r>
     </w:p>
     <w:p>
@@ -361,6 +373,12 @@
       </w:pPr>
       <w:r>
         <w:t>El 27 de Abril, comencé a implementar la iluminación de un objeto para darle un efecto de premio.</w:t>
+      </w:r>
+      <w:r>
+        <w:t xml:space="preserve"> El 28 de Abril, comencé a hacer ajustes para la interfaz, en la semana debo ver si cuando el jugador pierda, se reinicia toda la partida o solo el escenario.</w:t>
+      </w:r>
+      <w:r>
+        <w:t xml:space="preserve"> El 30 de Abril recibí comentarios de Yoas para continuar con mi implementación de las piezas del rompecabezas por separada en lugar de juntas, así como poner limitaciones para las piezas.</w:t>
       </w:r>
       <w:bookmarkStart w:id="0" w:name="_GoBack"/>
       <w:bookmarkEnd w:id="0"/>

</xml_diff>

<commit_message>
Se agregan las funcionalidades de los botones de inicio
</commit_message>
<xml_diff>
--- a/ReporteActividades.docx
+++ b/ReporteActividades.docx
@@ -379,6 +379,28 @@
       </w:r>
       <w:r>
         <w:t xml:space="preserve"> El 30 de Abril recibí comentarios de Yoas para continuar con mi implementación de las piezas del rompecabezas por separada en lugar de juntas, así como poner limitaciones para las piezas.</w:t>
+      </w:r>
+    </w:p>
+    <w:p>
+      <w:pPr>
+        <w:jc w:val="both"/>
+        <w:rPr>
+          <w:b/>
+        </w:rPr>
+      </w:pPr>
+      <w:r>
+        <w:rPr>
+          <w:b/>
+        </w:rPr>
+        <w:t>Semana 12 (04 de Mayo del 2026 al 08 de Mayo del 2026)</w:t>
+      </w:r>
+    </w:p>
+    <w:p>
+      <w:pPr>
+        <w:jc w:val="both"/>
+      </w:pPr>
+      <w:r>
+        <w:t>El 04 de Mayo implementé los botones para continuar la partida o reiniciar el nivel en caso de que termine el tiempo.</w:t>
       </w:r>
       <w:bookmarkStart w:id="0" w:name="_GoBack"/>
       <w:bookmarkEnd w:id="0"/>

</xml_diff>

<commit_message>
Se agrega un boton para realidad mixta en el menu general y todos los puzzles se agrupan en un objeto con un solo script
</commit_message>
<xml_diff>
--- a/ReporteActividades.docx
+++ b/ReporteActividades.docx
@@ -13,85 +13,322 @@
         <w:rPr>
           <w:b/>
         </w:rPr>
-        <w:t>Semana 1 (09 de Febrero de 2026 a 13 de Febrero de 2026)</w:t>
-      </w:r>
-    </w:p>
-    <w:p>
-      <w:pPr>
-        <w:jc w:val="both"/>
-      </w:pPr>
-      <w:r>
-        <w:t>El primer día se inició con el desarrollo de un Roll A Ball, principalmente para familiarizarse con el entorno de Unity. El mismo día se terminó el tutorial, pero al día siguiente se volvió a iniciar, ya que la versión utilizada</w:t>
-      </w:r>
-      <w:r>
-        <w:t xml:space="preserve"> de Unity no era la solicitada por Yoá</w:t>
-      </w:r>
-      <w:r>
-        <w:t xml:space="preserve">s. </w:t>
-      </w:r>
-      <w:r>
-        <w:t>El 11 de Febrero se comenzó con el desarrollo de la segunda escena, que era casi la primera escena pero se tenían que implementar enemigos, plataformas, vidas, monedas, spawners y plataformas. El 12 de Febrero se implementó la Lava, la cual tenía que cambiar de color cada 5 segundos. El 13 de Febrero se estuvo haciendo en los spawners de enemigos y monedas.</w:t>
-      </w:r>
-    </w:p>
-    <w:p>
-      <w:pPr>
-        <w:jc w:val="both"/>
-        <w:rPr>
-          <w:b/>
-        </w:rPr>
-      </w:pPr>
-      <w:r>
-        <w:rPr>
-          <w:b/>
-        </w:rPr>
-        <w:t>Semana 2 (16 de Febrero de 2026 a 20 de Febrero de 2026)</w:t>
-      </w:r>
-    </w:p>
-    <w:p>
-      <w:pPr>
-        <w:jc w:val="both"/>
-      </w:pPr>
-      <w:r>
-        <w:t>El 16 de Febrero se comenzó con la implementación de las escenas, los menús de pausa y cambios de escenas. Se completó el desarrollo de Roll A Ball. El 17 de Febrero Yoás le dio visto bueno al demo y pasé a familiarizarme con el e</w:t>
-      </w:r>
-      <w:r>
-        <w:t>ntorno de Meta Quest 3S. Si bien el 17 y 18 de Febrero estuve trabajando en un demo para saber como funcionan los controles, por problemas de hardware en el equipo donde estaba trabajando en el LANR, no podía probar lo que había hecho. El 19 de Febrero comencé a trabajar en el Anexo, ya que había un equipo disponible con una tarjeta gráfica compatible con el software de Meta Horizon Link, después de configurar el entorno, finalmente pude probar lo que había desarrollado los días pasados. El 19 de Febrero comencé a experimentar con los Building Blocks de Hand Tracking, algo necesario para evitar la necesidad de usar los controles de los lentes, solo interacción con las manos.</w:t>
-      </w:r>
-    </w:p>
-    <w:p>
-      <w:pPr>
-        <w:jc w:val="both"/>
-        <w:rPr>
-          <w:b/>
-        </w:rPr>
-      </w:pPr>
-      <w:r>
-        <w:rPr>
-          <w:b/>
-        </w:rPr>
-        <w:t>Semana 3 (23 de Febrero de 2026 a 27 de Febrero de 2026)</w:t>
-      </w:r>
-    </w:p>
-    <w:p>
-      <w:pPr>
-        <w:jc w:val="both"/>
-      </w:pPr>
-      <w:r>
-        <w:t>Lesly, una compañera que trabajaba en el Anexo iba a ocupar la computadora donde iba a estar trabajando, así que no asistí hasta el Jueves 26 de Febrero. Los días restantes de la semana me dediqué a terminar el demo y prácticar el cambio de escenas con interacción en UI haciendo uso de Hand Tracking.</w:t>
-      </w:r>
-    </w:p>
-    <w:p>
-      <w:pPr>
-        <w:jc w:val="both"/>
-        <w:rPr>
-          <w:b/>
-        </w:rPr>
-      </w:pPr>
-      <w:r>
-        <w:rPr>
-          <w:b/>
-        </w:rPr>
-        <w:t xml:space="preserve">Semana 4 (02 de Marzo del 2026 a </w:t>
+        <w:t xml:space="preserve">Semana 1 (09 de </w:t>
+      </w:r>
+      <w:proofErr w:type="gramStart"/>
+      <w:r>
+        <w:rPr>
+          <w:b/>
+        </w:rPr>
+        <w:t>Febrero</w:t>
+      </w:r>
+      <w:proofErr w:type="gramEnd"/>
+      <w:r>
+        <w:rPr>
+          <w:b/>
+        </w:rPr>
+        <w:t xml:space="preserve"> de 2026 a 13 de Febrero de 2026)</w:t>
+      </w:r>
+    </w:p>
+    <w:p>
+      <w:pPr>
+        <w:jc w:val="both"/>
+      </w:pPr>
+      <w:r>
+        <w:t xml:space="preserve">El primer día se inició con el desarrollo de un Roll A </w:t>
+      </w:r>
+      <w:proofErr w:type="spellStart"/>
+      <w:r>
+        <w:t>Ball</w:t>
+      </w:r>
+      <w:proofErr w:type="spellEnd"/>
+      <w:r>
+        <w:t xml:space="preserve">, principalmente para familiarizarse con el entorno de </w:t>
+      </w:r>
+      <w:proofErr w:type="spellStart"/>
+      <w:r>
+        <w:t>Unity</w:t>
+      </w:r>
+      <w:proofErr w:type="spellEnd"/>
+      <w:r>
+        <w:t>. El mismo día se terminó el tutorial, pero al día siguiente se volvió a iniciar, ya que la versión utilizada</w:t>
+      </w:r>
+      <w:r>
+        <w:t xml:space="preserve"> de </w:t>
+      </w:r>
+      <w:proofErr w:type="spellStart"/>
+      <w:r>
+        <w:t>Unity</w:t>
+      </w:r>
+      <w:proofErr w:type="spellEnd"/>
+      <w:r>
+        <w:t xml:space="preserve"> no era la solicitada por </w:t>
+      </w:r>
+      <w:proofErr w:type="spellStart"/>
+      <w:r>
+        <w:t>Yoá</w:t>
+      </w:r>
+      <w:r>
+        <w:t>s</w:t>
+      </w:r>
+      <w:proofErr w:type="spellEnd"/>
+      <w:r>
+        <w:t xml:space="preserve">. </w:t>
+      </w:r>
+      <w:r>
+        <w:t xml:space="preserve">El 11 de </w:t>
+      </w:r>
+      <w:proofErr w:type="gramStart"/>
+      <w:r>
+        <w:t>Febrero</w:t>
+      </w:r>
+      <w:proofErr w:type="gramEnd"/>
+      <w:r>
+        <w:t xml:space="preserve"> se comenzó con el desarrollo de la segunda escena, que era casi la primera escena pero se tenían que implementar enemigos, plataformas, vidas, monedas, </w:t>
+      </w:r>
+      <w:proofErr w:type="spellStart"/>
+      <w:r>
+        <w:t>spawners</w:t>
+      </w:r>
+      <w:proofErr w:type="spellEnd"/>
+      <w:r>
+        <w:t xml:space="preserve"> y plataformas. El 12 de </w:t>
+      </w:r>
+      <w:proofErr w:type="gramStart"/>
+      <w:r>
+        <w:t>Febrero</w:t>
+      </w:r>
+      <w:proofErr w:type="gramEnd"/>
+      <w:r>
+        <w:t xml:space="preserve"> se implementó la Lava, la cual tenía que cambiar de color cada 5 segundos. El 13 de </w:t>
+      </w:r>
+      <w:proofErr w:type="gramStart"/>
+      <w:r>
+        <w:t>Febrero</w:t>
+      </w:r>
+      <w:proofErr w:type="gramEnd"/>
+      <w:r>
+        <w:t xml:space="preserve"> se estuvo haciendo en los </w:t>
+      </w:r>
+      <w:proofErr w:type="spellStart"/>
+      <w:r>
+        <w:t>spawners</w:t>
+      </w:r>
+      <w:proofErr w:type="spellEnd"/>
+      <w:r>
+        <w:t xml:space="preserve"> de enemigos y monedas.</w:t>
+      </w:r>
+    </w:p>
+    <w:p>
+      <w:pPr>
+        <w:jc w:val="both"/>
+        <w:rPr>
+          <w:b/>
+        </w:rPr>
+      </w:pPr>
+      <w:r>
+        <w:rPr>
+          <w:b/>
+        </w:rPr>
+        <w:t xml:space="preserve">Semana 2 (16 de </w:t>
+      </w:r>
+      <w:proofErr w:type="gramStart"/>
+      <w:r>
+        <w:rPr>
+          <w:b/>
+        </w:rPr>
+        <w:t>Febrero</w:t>
+      </w:r>
+      <w:proofErr w:type="gramEnd"/>
+      <w:r>
+        <w:rPr>
+          <w:b/>
+        </w:rPr>
+        <w:t xml:space="preserve"> de 2026 a 20 de Febrero de 2026)</w:t>
+      </w:r>
+    </w:p>
+    <w:p>
+      <w:pPr>
+        <w:jc w:val="both"/>
+      </w:pPr>
+      <w:r>
+        <w:t xml:space="preserve">El 16 de </w:t>
+      </w:r>
+      <w:proofErr w:type="gramStart"/>
+      <w:r>
+        <w:t>Febrero</w:t>
+      </w:r>
+      <w:proofErr w:type="gramEnd"/>
+      <w:r>
+        <w:t xml:space="preserve"> se comenzó con la implementación de las escenas, los menús de pausa y cambios de escenas. Se completó el desarrollo de Roll A </w:t>
+      </w:r>
+      <w:proofErr w:type="spellStart"/>
+      <w:r>
+        <w:t>Ball</w:t>
+      </w:r>
+      <w:proofErr w:type="spellEnd"/>
+      <w:r>
+        <w:t xml:space="preserve">. El 17 de </w:t>
+      </w:r>
+      <w:proofErr w:type="gramStart"/>
+      <w:r>
+        <w:t>Febrero</w:t>
+      </w:r>
+      <w:proofErr w:type="gramEnd"/>
+      <w:r>
+        <w:t xml:space="preserve"> </w:t>
+      </w:r>
+      <w:proofErr w:type="spellStart"/>
+      <w:r>
+        <w:t>Yoás</w:t>
+      </w:r>
+      <w:proofErr w:type="spellEnd"/>
+      <w:r>
+        <w:t xml:space="preserve"> le dio visto bueno al demo y pasé a familiarizarme con el e</w:t>
+      </w:r>
+      <w:r>
+        <w:t xml:space="preserve">ntorno de Meta </w:t>
+      </w:r>
+      <w:proofErr w:type="spellStart"/>
+      <w:r>
+        <w:t>Quest</w:t>
+      </w:r>
+      <w:proofErr w:type="spellEnd"/>
+      <w:r>
+        <w:t xml:space="preserve"> 3S. Si bien el 17 y 18 de </w:t>
+      </w:r>
+      <w:proofErr w:type="gramStart"/>
+      <w:r>
+        <w:t>Febrero</w:t>
+      </w:r>
+      <w:proofErr w:type="gramEnd"/>
+      <w:r>
+        <w:t xml:space="preserve"> estuve trabajando en un demo para saber </w:t>
+      </w:r>
+      <w:proofErr w:type="spellStart"/>
+      <w:r>
+        <w:t>como</w:t>
+      </w:r>
+      <w:proofErr w:type="spellEnd"/>
+      <w:r>
+        <w:t xml:space="preserve"> funcionan los controles, por problemas de hardware en el equipo donde estaba trabajando en el LANR, no podía probar lo que había hecho. El 19 de </w:t>
+      </w:r>
+      <w:proofErr w:type="gramStart"/>
+      <w:r>
+        <w:t>Febrero</w:t>
+      </w:r>
+      <w:proofErr w:type="gramEnd"/>
+      <w:r>
+        <w:t xml:space="preserve"> comencé a trabajar en el Anexo, ya que había un equipo disponible con una tarjeta gráfica compatible con el software de Meta </w:t>
+      </w:r>
+      <w:proofErr w:type="spellStart"/>
+      <w:r>
+        <w:t>Horizon</w:t>
+      </w:r>
+      <w:proofErr w:type="spellEnd"/>
+      <w:r>
+        <w:t xml:space="preserve"> Link, después de configurar el entorno, finalmente pude probar lo que había desarrollado los días pasados. El 19 de </w:t>
+      </w:r>
+      <w:proofErr w:type="gramStart"/>
+      <w:r>
+        <w:t>Febrero</w:t>
+      </w:r>
+      <w:proofErr w:type="gramEnd"/>
+      <w:r>
+        <w:t xml:space="preserve"> comencé a experimentar con los </w:t>
+      </w:r>
+      <w:proofErr w:type="spellStart"/>
+      <w:r>
+        <w:t>Building</w:t>
+      </w:r>
+      <w:proofErr w:type="spellEnd"/>
+      <w:r>
+        <w:t xml:space="preserve"> Blocks de Hand Tracking, algo necesario para evitar la necesidad de usar los controles de los lentes, solo interacción con las manos.</w:t>
+      </w:r>
+    </w:p>
+    <w:p>
+      <w:pPr>
+        <w:jc w:val="both"/>
+        <w:rPr>
+          <w:b/>
+        </w:rPr>
+      </w:pPr>
+      <w:r>
+        <w:rPr>
+          <w:b/>
+        </w:rPr>
+        <w:t xml:space="preserve">Semana 3 (23 de </w:t>
+      </w:r>
+      <w:proofErr w:type="gramStart"/>
+      <w:r>
+        <w:rPr>
+          <w:b/>
+        </w:rPr>
+        <w:t>Febrero</w:t>
+      </w:r>
+      <w:proofErr w:type="gramEnd"/>
+      <w:r>
+        <w:rPr>
+          <w:b/>
+        </w:rPr>
+        <w:t xml:space="preserve"> de 2026 a 27 de Febrero de 2026)</w:t>
+      </w:r>
+    </w:p>
+    <w:p>
+      <w:pPr>
+        <w:jc w:val="both"/>
+      </w:pPr>
+      <w:proofErr w:type="spellStart"/>
+      <w:r>
+        <w:t>Lesly</w:t>
+      </w:r>
+      <w:proofErr w:type="spellEnd"/>
+      <w:r>
+        <w:t xml:space="preserve">, una compañera que trabajaba en el Anexo iba a ocupar la computadora donde iba a estar trabajando, así que no asistí hasta el </w:t>
+      </w:r>
+      <w:proofErr w:type="gramStart"/>
+      <w:r>
+        <w:t>Jueves</w:t>
+      </w:r>
+      <w:proofErr w:type="gramEnd"/>
+      <w:r>
+        <w:t xml:space="preserve"> 26 de Febrero. Los días restantes de la semana me dediqué a terminar el demo y </w:t>
+      </w:r>
+      <w:proofErr w:type="spellStart"/>
+      <w:r>
+        <w:t>prácticar</w:t>
+      </w:r>
+      <w:proofErr w:type="spellEnd"/>
+      <w:r>
+        <w:t xml:space="preserve"> el cambio de escenas con interacción en UI haciendo uso de Hand Tracking.</w:t>
+      </w:r>
+    </w:p>
+    <w:p>
+      <w:pPr>
+        <w:jc w:val="both"/>
+        <w:rPr>
+          <w:b/>
+        </w:rPr>
+      </w:pPr>
+      <w:r>
+        <w:rPr>
+          <w:b/>
+        </w:rPr>
+        <w:t xml:space="preserve">Semana 4 (02 de </w:t>
+      </w:r>
+      <w:proofErr w:type="gramStart"/>
+      <w:r>
+        <w:rPr>
+          <w:b/>
+        </w:rPr>
+        <w:t>Marzo</w:t>
+      </w:r>
+      <w:proofErr w:type="gramEnd"/>
+      <w:r>
+        <w:rPr>
+          <w:b/>
+        </w:rPr>
+        <w:t xml:space="preserve"> del 2026 a </w:t>
       </w:r>
       <w:r>
         <w:rPr>
@@ -105,35 +342,153 @@
         <w:jc w:val="both"/>
       </w:pPr>
       <w:r>
-        <w:t>El 02 de Marzo, Yoás revisó los avances de la semana pasada y me platicó la idea que tenía para la implementación del proyecto, un juego espacial. El 04 de Marzo, después de estar viendo ejemplos de como mover un objeto con hand tracking, Yoás me comentó que la idea era que el paciente o jugador disparen desde sus manos para naves enemigas. El 05 y 06 de Febrero estuve trabajando para que cuando se hiciera la acción de “Pinch”, se disparen diferentes tipos de disparos, también estuve trabajando en los comportamientos de los enemigos, un medidor de supinación, flexión, extensión y pronación.</w:t>
-      </w:r>
-    </w:p>
-    <w:p>
-      <w:pPr>
-        <w:jc w:val="both"/>
-        <w:rPr>
-          <w:b/>
-        </w:rPr>
-      </w:pPr>
-      <w:r>
-        <w:rPr>
-          <w:b/>
-        </w:rPr>
-        <w:t>Semana 5 (09 de Marzo del 2026 a 13 de Febrero de 2026)</w:t>
-      </w:r>
-    </w:p>
-    <w:p>
-      <w:pPr>
-        <w:jc w:val="both"/>
-      </w:pPr>
-      <w:r>
-        <w:t xml:space="preserve">Del 09 de Marzo al 12 de Marzo estuve ajustando el comportamiento del contador de Puntuación, el 12 de Marzo Yoás asistió al Anexo para revisar avances, me comentó que el movimiento de “Pinch” podía ser algo </w:t>
+        <w:t xml:space="preserve">El 02 de </w:t>
+      </w:r>
+      <w:proofErr w:type="gramStart"/>
+      <w:r>
+        <w:t>Marzo</w:t>
+      </w:r>
+      <w:proofErr w:type="gramEnd"/>
+      <w:r>
+        <w:t xml:space="preserve">, </w:t>
+      </w:r>
+      <w:proofErr w:type="spellStart"/>
+      <w:r>
+        <w:t>Yoás</w:t>
+      </w:r>
+      <w:proofErr w:type="spellEnd"/>
+      <w:r>
+        <w:t xml:space="preserve"> revisó los avances de la semana pasada y me platicó la idea que tenía para la implementación del proyecto, un juego espacial. El 04 de </w:t>
+      </w:r>
+      <w:proofErr w:type="gramStart"/>
+      <w:r>
+        <w:t>Marzo</w:t>
+      </w:r>
+      <w:proofErr w:type="gramEnd"/>
+      <w:r>
+        <w:t xml:space="preserve">, después de estar viendo ejemplos de </w:t>
+      </w:r>
+      <w:proofErr w:type="spellStart"/>
+      <w:r>
+        <w:t>como</w:t>
+      </w:r>
+      <w:proofErr w:type="spellEnd"/>
+      <w:r>
+        <w:t xml:space="preserve"> mover un objeto con </w:t>
+      </w:r>
+      <w:proofErr w:type="spellStart"/>
+      <w:r>
+        <w:t>hand</w:t>
+      </w:r>
+      <w:proofErr w:type="spellEnd"/>
+      <w:r>
+        <w:t xml:space="preserve"> tracking, </w:t>
+      </w:r>
+      <w:proofErr w:type="spellStart"/>
+      <w:r>
+        <w:t>Yoás</w:t>
+      </w:r>
+      <w:proofErr w:type="spellEnd"/>
+      <w:r>
+        <w:t xml:space="preserve"> me comentó que la idea era que el paciente o jugador disparen desde sus manos para naves enemigas. El 05 y 06 de </w:t>
+      </w:r>
+      <w:proofErr w:type="gramStart"/>
+      <w:r>
+        <w:t>Febrero</w:t>
+      </w:r>
+      <w:proofErr w:type="gramEnd"/>
+      <w:r>
+        <w:t xml:space="preserve"> estuve trabajando para que cuando se hiciera la acción de “</w:t>
+      </w:r>
+      <w:proofErr w:type="spellStart"/>
+      <w:r>
+        <w:t>Pinch</w:t>
+      </w:r>
+      <w:proofErr w:type="spellEnd"/>
+      <w:r>
+        <w:t>”, se disparen diferentes tipos de disparos, también estuve trabajando en los comportamientos de los enemigos, un medidor de supinación, flexión, extensión y pronación.</w:t>
+      </w:r>
+    </w:p>
+    <w:p>
+      <w:pPr>
+        <w:jc w:val="both"/>
+        <w:rPr>
+          <w:b/>
+        </w:rPr>
+      </w:pPr>
+      <w:r>
+        <w:rPr>
+          <w:b/>
+        </w:rPr>
+        <w:t xml:space="preserve">Semana 5 (09 de </w:t>
+      </w:r>
+      <w:proofErr w:type="gramStart"/>
+      <w:r>
+        <w:rPr>
+          <w:b/>
+        </w:rPr>
+        <w:t>Marzo</w:t>
+      </w:r>
+      <w:proofErr w:type="gramEnd"/>
+      <w:r>
+        <w:rPr>
+          <w:b/>
+        </w:rPr>
+        <w:t xml:space="preserve"> del 2026 a 13 de Febrero de 2026)</w:t>
+      </w:r>
+    </w:p>
+    <w:p>
+      <w:pPr>
+        <w:jc w:val="both"/>
+      </w:pPr>
+      <w:r>
+        <w:t xml:space="preserve">Del 09 de </w:t>
+      </w:r>
+      <w:proofErr w:type="gramStart"/>
+      <w:r>
+        <w:t>Marzo</w:t>
+      </w:r>
+      <w:proofErr w:type="gramEnd"/>
+      <w:r>
+        <w:t xml:space="preserve"> al 12 de Marzo estuve ajustando el comportamiento del contador de Puntuación, el 12 de Marzo </w:t>
+      </w:r>
+      <w:proofErr w:type="spellStart"/>
+      <w:r>
+        <w:t>Yoás</w:t>
+      </w:r>
+      <w:proofErr w:type="spellEnd"/>
+      <w:r>
+        <w:t xml:space="preserve"> asistió al Anexo para revisar avances, me comentó que el movimiento de “</w:t>
+      </w:r>
+      <w:proofErr w:type="spellStart"/>
+      <w:r>
+        <w:t>Pinch</w:t>
+      </w:r>
+      <w:proofErr w:type="spellEnd"/>
+      <w:r>
+        <w:t xml:space="preserve">” podía ser algo </w:t>
       </w:r>
       <w:r>
         <w:t>complicado</w:t>
       </w:r>
       <w:r>
-        <w:t xml:space="preserve"> para los pacientes, así que el jugador ya no tendría que disparar, solo con tocar a los enemigos. El 13 de Marzo me dediqué a que los enemigos se detengan a una distancia del jugador para que este los toque con las manos de hand tracking, pero que desaparezcan si no lo hace en un tiempo determinado.</w:t>
+        <w:t xml:space="preserve"> para los pacientes, así que el jugador ya no tendría que disparar, solo con tocar a los enemigos. El 13 de </w:t>
+      </w:r>
+      <w:proofErr w:type="gramStart"/>
+      <w:r>
+        <w:t>Marzo</w:t>
+      </w:r>
+      <w:proofErr w:type="gramEnd"/>
+      <w:r>
+        <w:t xml:space="preserve"> me dediqué a que los enemigos se detengan a una distancia del jugador para que este los toque con las manos de </w:t>
+      </w:r>
+      <w:proofErr w:type="spellStart"/>
+      <w:r>
+        <w:t>hand</w:t>
+      </w:r>
+      <w:proofErr w:type="spellEnd"/>
+      <w:r>
+        <w:t xml:space="preserve"> tracking, pero que desaparezcan si no lo hace en un tiempo determinado.</w:t>
       </w:r>
       <w:r>
         <w:t xml:space="preserve"> </w:t>
@@ -150,15 +505,37 @@
         <w:rPr>
           <w:b/>
         </w:rPr>
-        <w:t>Semana 6 (17 de Marzo del 2026 a 20 de Marzo del 2026)</w:t>
-      </w:r>
-    </w:p>
-    <w:p>
-      <w:pPr>
-        <w:jc w:val="both"/>
-      </w:pPr>
-      <w:r>
-        <w:t xml:space="preserve">El 17 de Marzo se comenzó con la implementación de un sistema de cuenta regresiva para el comienzo de las rondas de enemigos; la idea es hacer que se inicie con una cuenta regresiva </w:t>
+        <w:t xml:space="preserve">Semana 6 (17 de </w:t>
+      </w:r>
+      <w:proofErr w:type="gramStart"/>
+      <w:r>
+        <w:rPr>
+          <w:b/>
+        </w:rPr>
+        <w:t>Marzo</w:t>
+      </w:r>
+      <w:proofErr w:type="gramEnd"/>
+      <w:r>
+        <w:rPr>
+          <w:b/>
+        </w:rPr>
+        <w:t xml:space="preserve"> del 2026 a 20 de Marzo del 2026)</w:t>
+      </w:r>
+    </w:p>
+    <w:p>
+      <w:pPr>
+        <w:jc w:val="both"/>
+      </w:pPr>
+      <w:r>
+        <w:t xml:space="preserve">El 17 de </w:t>
+      </w:r>
+      <w:proofErr w:type="gramStart"/>
+      <w:r>
+        <w:t>Marzo</w:t>
+      </w:r>
+      <w:proofErr w:type="gramEnd"/>
+      <w:r>
+        <w:t xml:space="preserve"> se comenzó con la implementación de un sistema de cuenta regresiva para el comienzo de las rondas de enemigos; la idea es hacer que se inicie con una cuenta regresiva </w:t>
       </w:r>
       <w:r>
         <w:lastRenderedPageBreak/>
@@ -174,10 +551,42 @@
         <w:t xml:space="preserve">. </w:t>
       </w:r>
       <w:r>
-        <w:t>El 18 de Marzo me encargué de juntar las escenas y completar la implementación del panel de “Continuar”</w:t>
-      </w:r>
-      <w:r>
-        <w:t>. El 19 de Marzo mejoré el comportamiento y los Spawners de los enemigos. El 20 de Marzo,</w:t>
+        <w:t xml:space="preserve">El 18 de </w:t>
+      </w:r>
+      <w:proofErr w:type="gramStart"/>
+      <w:r>
+        <w:t>Marzo</w:t>
+      </w:r>
+      <w:proofErr w:type="gramEnd"/>
+      <w:r>
+        <w:t xml:space="preserve"> me encargué de juntar las escenas y completar la implementación del panel de “Continuar”</w:t>
+      </w:r>
+      <w:r>
+        <w:t xml:space="preserve">. El 19 de </w:t>
+      </w:r>
+      <w:proofErr w:type="gramStart"/>
+      <w:r>
+        <w:t>Marzo</w:t>
+      </w:r>
+      <w:proofErr w:type="gramEnd"/>
+      <w:r>
+        <w:t xml:space="preserve"> mejoré el comportamiento y los </w:t>
+      </w:r>
+      <w:proofErr w:type="spellStart"/>
+      <w:r>
+        <w:t>Spawners</w:t>
+      </w:r>
+      <w:proofErr w:type="spellEnd"/>
+      <w:r>
+        <w:t xml:space="preserve"> de los enemigos. El 20 de </w:t>
+      </w:r>
+      <w:proofErr w:type="gramStart"/>
+      <w:r>
+        <w:t>Marzo</w:t>
+      </w:r>
+      <w:proofErr w:type="gramEnd"/>
+      <w:r>
+        <w:t>,</w:t>
       </w:r>
       <w:r>
         <w:t xml:space="preserve"> comencé a implementar diferentes niveles en caso de que el paciente necesite hacer ejercicios específicos.</w:t>
@@ -194,70 +603,210 @@
         <w:rPr>
           <w:b/>
         </w:rPr>
-        <w:t>Semana 7 (23 de Marzo del 2026 a 28 de Marzo del 2026)</w:t>
-      </w:r>
-    </w:p>
-    <w:p>
-      <w:pPr>
-        <w:jc w:val="both"/>
-      </w:pPr>
-      <w:r>
-        <w:t>El 23 de Marzo, por indicaciones de Yoás, se cambió el enfoque de los enemigos. Estos aparecerán y rodearán al Jugador como si estuvieran en un domo o semicírculo; dicho semicírculo variará su tamaño en base a la distancia máxima que el Jugador pueda estirar su brazo sano. Esa lógica también se implementó.</w:t>
-      </w:r>
-      <w:r>
-        <w:t xml:space="preserve"> El 24 de Marzo me dediqué a hacer la solicitud de tesis.</w:t>
-      </w:r>
-      <w:r>
-        <w:t xml:space="preserve"> El 25 de Marzo, Yoás revisó los avances, donde debo cambiar la orientación del domo y agregar más parámetros a ser modificados por el terapeuta, así como un flujo de trabajo.</w:t>
-      </w:r>
-      <w:r>
-        <w:t xml:space="preserve"> 26 y 27 de Marzo estuve configurando la nueva orientación del domo y el comportamiento de los enemigos.</w:t>
-      </w:r>
-      <w:r>
-        <w:t xml:space="preserve"> El 28 de Marzo conecté las escenas.</w:t>
-      </w:r>
-    </w:p>
-    <w:p>
-      <w:pPr>
-        <w:jc w:val="both"/>
-        <w:rPr>
-          <w:b/>
-        </w:rPr>
-      </w:pPr>
-      <w:r>
-        <w:rPr>
-          <w:b/>
-        </w:rPr>
-        <w:t>Semana 8 (06 de Abril del 2026 a 10 de Abril del 2026)</w:t>
-      </w:r>
-    </w:p>
-    <w:p>
-      <w:pPr>
-        <w:jc w:val="both"/>
-      </w:pPr>
-      <w:r>
-        <w:t xml:space="preserve">El 06 de Abril comencé con la implementación </w:t>
-      </w:r>
-      <w:r>
-        <w:t>de la selección de los enemigos; Yoas me encomendó hacer un modo de realidad mixta.</w:t>
-      </w:r>
-      <w:r>
-        <w:t xml:space="preserve"> 07 de Abril detecté que hay problemas con el cable de conexión, debo buscar un USB 3.0.</w:t>
+        <w:t xml:space="preserve">Semana 7 (23 de </w:t>
+      </w:r>
+      <w:proofErr w:type="gramStart"/>
+      <w:r>
+        <w:rPr>
+          <w:b/>
+        </w:rPr>
+        <w:t>Marzo</w:t>
+      </w:r>
+      <w:proofErr w:type="gramEnd"/>
+      <w:r>
+        <w:rPr>
+          <w:b/>
+        </w:rPr>
+        <w:t xml:space="preserve"> del 2026 a 28 de Marzo del 2026)</w:t>
+      </w:r>
+    </w:p>
+    <w:p>
+      <w:pPr>
+        <w:jc w:val="both"/>
+      </w:pPr>
+      <w:r>
+        <w:t xml:space="preserve">El 23 de </w:t>
+      </w:r>
+      <w:proofErr w:type="gramStart"/>
+      <w:r>
+        <w:t>Marzo</w:t>
+      </w:r>
+      <w:proofErr w:type="gramEnd"/>
+      <w:r>
+        <w:t xml:space="preserve">, por indicaciones de </w:t>
+      </w:r>
+      <w:proofErr w:type="spellStart"/>
+      <w:r>
+        <w:t>Yoás</w:t>
+      </w:r>
+      <w:proofErr w:type="spellEnd"/>
+      <w:r>
+        <w:t>, se cambió el enfoque de los enemigos. Estos aparecerán y rodearán al Jugador como si estuvieran en un domo o semicírculo; dicho semicírculo variará su tamaño en base a la distancia máxima que el Jugador pueda estirar su brazo sano. Esa lógica también se implementó.</w:t>
+      </w:r>
+      <w:r>
+        <w:t xml:space="preserve"> El 24 de </w:t>
+      </w:r>
+      <w:proofErr w:type="gramStart"/>
+      <w:r>
+        <w:t>Marzo</w:t>
+      </w:r>
+      <w:proofErr w:type="gramEnd"/>
+      <w:r>
+        <w:t xml:space="preserve"> me dediqué a hacer la solicitud de tesis.</w:t>
+      </w:r>
+      <w:r>
+        <w:t xml:space="preserve"> El 25 de </w:t>
+      </w:r>
+      <w:proofErr w:type="gramStart"/>
+      <w:r>
+        <w:t>Marzo</w:t>
+      </w:r>
+      <w:proofErr w:type="gramEnd"/>
+      <w:r>
+        <w:t xml:space="preserve">, </w:t>
+      </w:r>
+      <w:proofErr w:type="spellStart"/>
+      <w:r>
+        <w:t>Yoás</w:t>
+      </w:r>
+      <w:proofErr w:type="spellEnd"/>
+      <w:r>
+        <w:t xml:space="preserve"> revisó los avances, donde debo cambiar la orientación del domo y agregar más parámetros a ser modificados por el terapeuta, así como un flujo de trabajo.</w:t>
+      </w:r>
+      <w:r>
+        <w:t xml:space="preserve"> 26 y 27 de </w:t>
+      </w:r>
+      <w:proofErr w:type="gramStart"/>
+      <w:r>
+        <w:t>Marzo</w:t>
+      </w:r>
+      <w:proofErr w:type="gramEnd"/>
+      <w:r>
+        <w:t xml:space="preserve"> estuve configurando la nueva orientación del domo y el comportamiento de los enemigos.</w:t>
+      </w:r>
+      <w:r>
+        <w:t xml:space="preserve"> El 28 de </w:t>
+      </w:r>
+      <w:proofErr w:type="gramStart"/>
+      <w:r>
+        <w:t>Marzo</w:t>
+      </w:r>
+      <w:proofErr w:type="gramEnd"/>
+      <w:r>
+        <w:t xml:space="preserve"> conecté las escenas.</w:t>
+      </w:r>
+    </w:p>
+    <w:p>
+      <w:pPr>
+        <w:jc w:val="both"/>
+        <w:rPr>
+          <w:b/>
+        </w:rPr>
+      </w:pPr>
+      <w:r>
+        <w:rPr>
+          <w:b/>
+        </w:rPr>
+        <w:t xml:space="preserve">Semana 8 (06 de </w:t>
+      </w:r>
+      <w:proofErr w:type="gramStart"/>
+      <w:r>
+        <w:rPr>
+          <w:b/>
+        </w:rPr>
+        <w:t>Abril</w:t>
+      </w:r>
+      <w:proofErr w:type="gramEnd"/>
+      <w:r>
+        <w:rPr>
+          <w:b/>
+        </w:rPr>
+        <w:t xml:space="preserve"> del 2026 a 10 de Abril del 2026)</w:t>
+      </w:r>
+    </w:p>
+    <w:p>
+      <w:pPr>
+        <w:jc w:val="both"/>
+      </w:pPr>
+      <w:r>
+        <w:t xml:space="preserve">El 06 de </w:t>
+      </w:r>
+      <w:proofErr w:type="gramStart"/>
+      <w:r>
+        <w:t>Abril</w:t>
+      </w:r>
+      <w:proofErr w:type="gramEnd"/>
+      <w:r>
+        <w:t xml:space="preserve"> comencé con la implementación </w:t>
+      </w:r>
+      <w:r>
+        <w:t xml:space="preserve">de la selección de los enemigos; </w:t>
+      </w:r>
+      <w:proofErr w:type="spellStart"/>
+      <w:r>
+        <w:t>Yoas</w:t>
+      </w:r>
+      <w:proofErr w:type="spellEnd"/>
+      <w:r>
+        <w:t xml:space="preserve"> me encomendó hacer un modo de realidad mixta.</w:t>
+      </w:r>
+      <w:r>
+        <w:t xml:space="preserve"> 07 de </w:t>
+      </w:r>
+      <w:proofErr w:type="gramStart"/>
+      <w:r>
+        <w:t>Abril</w:t>
+      </w:r>
+      <w:proofErr w:type="gramEnd"/>
+      <w:r>
+        <w:t xml:space="preserve"> detecté que hay problemas con el cable de conexión, debo buscar un USB 3.0.</w:t>
       </w:r>
       <w:r>
         <w:t xml:space="preserve"> </w:t>
       </w:r>
       <w:r>
-        <w:t xml:space="preserve">El 08 de Abril, después de registrar el Meta Quest 3S a la cuenta de desarrollador y arreglar un </w:t>
+        <w:t xml:space="preserve">El 08 de </w:t>
+      </w:r>
+      <w:proofErr w:type="gramStart"/>
+      <w:r>
+        <w:t>Abril</w:t>
+      </w:r>
+      <w:proofErr w:type="gramEnd"/>
+      <w:r>
+        <w:t xml:space="preserve">, después de registrar el Meta </w:t>
+      </w:r>
+      <w:proofErr w:type="spellStart"/>
+      <w:r>
+        <w:t>Quest</w:t>
+      </w:r>
+      <w:proofErr w:type="spellEnd"/>
+      <w:r>
+        <w:t xml:space="preserve"> 3S a la cuenta de desarrollador y arreglar un </w:t>
       </w:r>
       <w:r>
         <w:t>problema</w:t>
       </w:r>
       <w:r>
-        <w:t xml:space="preserve"> con el Canvas, se pudo conectar y completar la Realidad Mixta.</w:t>
-      </w:r>
-      <w:r>
-        <w:t xml:space="preserve"> El 10 de Abril se continuó con la implementación del seleccionador de Enemigos, ahora falta esperar por los modelos.</w:t>
+        <w:t xml:space="preserve"> con el </w:t>
+      </w:r>
+      <w:proofErr w:type="spellStart"/>
+      <w:r>
+        <w:t>Canvas</w:t>
+      </w:r>
+      <w:proofErr w:type="spellEnd"/>
+      <w:r>
+        <w:t>, se pudo conectar y completar la Realidad Mixta.</w:t>
+      </w:r>
+      <w:r>
+        <w:t xml:space="preserve"> El 10 de </w:t>
+      </w:r>
+      <w:proofErr w:type="gramStart"/>
+      <w:r>
+        <w:t>Abril</w:t>
+      </w:r>
+      <w:proofErr w:type="gramEnd"/>
+      <w:r>
+        <w:t xml:space="preserve"> se continuó con la implementación del seleccionador de Enemigos, ahora falta esperar por los modelos.</w:t>
       </w:r>
     </w:p>
     <w:p>
@@ -277,7 +826,21 @@
         <w:rPr>
           <w:b/>
         </w:rPr>
-        <w:t>na 9 (13 de Abril del 2026 al 17</w:t>
+        <w:t xml:space="preserve">na 9 (13 de </w:t>
+      </w:r>
+      <w:proofErr w:type="gramStart"/>
+      <w:r>
+        <w:rPr>
+          <w:b/>
+        </w:rPr>
+        <w:t>Abril</w:t>
+      </w:r>
+      <w:proofErr w:type="gramEnd"/>
+      <w:r>
+        <w:rPr>
+          <w:b/>
+        </w:rPr>
+        <w:t xml:space="preserve"> del 2026 al 17</w:t>
       </w:r>
       <w:r>
         <w:rPr>
@@ -291,50 +854,181 @@
         <w:jc w:val="both"/>
       </w:pPr>
       <w:r>
-        <w:t>El 13 de Abril, comencé a trabajar con los modelos de las naves; debo configurarlos para una actividad que se tendrá por parte de Amerike.</w:t>
-      </w:r>
-      <w:r>
-        <w:t xml:space="preserve"> El 14 de Abril terminé de configurar los modelos y limpié un poco el código y los Assets para la muestra del día siguiente.</w:t>
-      </w:r>
-      <w:r>
-        <w:t xml:space="preserve"> El 15 de Abril realicé unos ajustes a la cámara del jugador y alisté todo para la muestra de Amerike</w:t>
-      </w:r>
-      <w:r>
-        <w:t>. El 16 de Abril fue la muestra, hubo problemas con la Etiqueta Player, ya fue solucionado pero al menos en la muestra se tuvo ese problema. El 17 de Abril se comenzó a probar las mecánicas del segundo minijuego, este toma en cuenta la rotación de la muñeca del jugador para poder rotar las piezas del rompecabezas.</w:t>
-      </w:r>
-    </w:p>
-    <w:p>
-      <w:pPr>
-        <w:jc w:val="both"/>
-        <w:rPr>
-          <w:b/>
-        </w:rPr>
-      </w:pPr>
-      <w:r>
-        <w:rPr>
-          <w:b/>
-        </w:rPr>
-        <w:t>Semana 10 (20 de Abril del 2026 al 24 de Abril del 2026)</w:t>
-      </w:r>
-    </w:p>
-    <w:p>
-      <w:pPr>
-        <w:jc w:val="both"/>
-      </w:pPr>
-      <w:r>
-        <w:t>El 20 de Abril, comencé a trabajar en el sistema para confirmar que el rompecabezas esté formado, pero por los modelos que estoy usando, no sé exactamente si está funcionando hasta que tenga los modelos correctos.</w:t>
-      </w:r>
-      <w:r>
-        <w:t xml:space="preserve"> El 21 de Abril hubo retroalimentación por parte de Yoás, para las runas no hay que aplicar los botones, pero el sistema de victoria está bien, ahora hay que idear una forma para implementar las puertas.</w:t>
-      </w:r>
-      <w:r>
-        <w:t xml:space="preserve"> El 22 de Abril se comenzó la implementación de las puertas, las cuales funcionarán como forma de medir el progreso del jugador.</w:t>
-      </w:r>
-      <w:r>
-        <w:t xml:space="preserve"> El 23 de Abril se comenzó a implementar el contador para finalizar el nivel.</w:t>
-      </w:r>
-      <w:r>
-        <w:t xml:space="preserve"> El 24 de Abril se arregló la funcionalidad del contador, además de que se activan interfaces en base al resultado de las rotaciones. La siguiente semana comienzo a implementar un objeto que aumente la intensidad </w:t>
+        <w:t xml:space="preserve">El 13 de </w:t>
+      </w:r>
+      <w:proofErr w:type="gramStart"/>
+      <w:r>
+        <w:t>Abril</w:t>
+      </w:r>
+      <w:proofErr w:type="gramEnd"/>
+      <w:r>
+        <w:t xml:space="preserve">, comencé a trabajar con los modelos de las naves; debo configurarlos para una actividad que se tendrá por parte de </w:t>
+      </w:r>
+      <w:proofErr w:type="spellStart"/>
+      <w:r>
+        <w:t>Amerike</w:t>
+      </w:r>
+      <w:proofErr w:type="spellEnd"/>
+      <w:r>
+        <w:t>.</w:t>
+      </w:r>
+      <w:r>
+        <w:t xml:space="preserve"> El 14 de </w:t>
+      </w:r>
+      <w:proofErr w:type="gramStart"/>
+      <w:r>
+        <w:t>Abril</w:t>
+      </w:r>
+      <w:proofErr w:type="gramEnd"/>
+      <w:r>
+        <w:t xml:space="preserve"> terminé de configurar los modelos y limpié un poco el código y los </w:t>
+      </w:r>
+      <w:proofErr w:type="spellStart"/>
+      <w:r>
+        <w:t>Assets</w:t>
+      </w:r>
+      <w:proofErr w:type="spellEnd"/>
+      <w:r>
+        <w:t xml:space="preserve"> para la muestra del día siguiente.</w:t>
+      </w:r>
+      <w:r>
+        <w:t xml:space="preserve"> El 15 de </w:t>
+      </w:r>
+      <w:proofErr w:type="gramStart"/>
+      <w:r>
+        <w:t>Abril</w:t>
+      </w:r>
+      <w:proofErr w:type="gramEnd"/>
+      <w:r>
+        <w:t xml:space="preserve"> realicé unos ajustes a la cámara del jugador y alisté todo para la muestra de </w:t>
+      </w:r>
+      <w:proofErr w:type="spellStart"/>
+      <w:r>
+        <w:t>Amerike</w:t>
+      </w:r>
+      <w:proofErr w:type="spellEnd"/>
+      <w:r>
+        <w:t xml:space="preserve">. El 16 de </w:t>
+      </w:r>
+      <w:proofErr w:type="gramStart"/>
+      <w:r>
+        <w:t>Abril</w:t>
+      </w:r>
+      <w:proofErr w:type="gramEnd"/>
+      <w:r>
+        <w:t xml:space="preserve"> fue la muestra, hubo problemas con la Etiqueta Player, ya fue solucionado pero al menos en la muestra se tuvo ese problema. El 17 de </w:t>
+      </w:r>
+      <w:proofErr w:type="gramStart"/>
+      <w:r>
+        <w:t>Abril</w:t>
+      </w:r>
+      <w:proofErr w:type="gramEnd"/>
+      <w:r>
+        <w:t xml:space="preserve"> se comenzó a probar las mecánicas del segundo </w:t>
+      </w:r>
+      <w:proofErr w:type="spellStart"/>
+      <w:r>
+        <w:t>minijuego</w:t>
+      </w:r>
+      <w:proofErr w:type="spellEnd"/>
+      <w:r>
+        <w:t>, este toma en cuenta la rotación de la muñeca del jugador para poder rotar las piezas del rompecabezas.</w:t>
+      </w:r>
+    </w:p>
+    <w:p>
+      <w:pPr>
+        <w:jc w:val="both"/>
+        <w:rPr>
+          <w:b/>
+        </w:rPr>
+      </w:pPr>
+      <w:r>
+        <w:rPr>
+          <w:b/>
+        </w:rPr>
+        <w:t xml:space="preserve">Semana 10 (20 de </w:t>
+      </w:r>
+      <w:proofErr w:type="gramStart"/>
+      <w:r>
+        <w:rPr>
+          <w:b/>
+        </w:rPr>
+        <w:t>Abril</w:t>
+      </w:r>
+      <w:proofErr w:type="gramEnd"/>
+      <w:r>
+        <w:rPr>
+          <w:b/>
+        </w:rPr>
+        <w:t xml:space="preserve"> del 2026 al 24 de Abril del 2026)</w:t>
+      </w:r>
+    </w:p>
+    <w:p>
+      <w:pPr>
+        <w:jc w:val="both"/>
+      </w:pPr>
+      <w:r>
+        <w:t xml:space="preserve">El 20 de </w:t>
+      </w:r>
+      <w:proofErr w:type="gramStart"/>
+      <w:r>
+        <w:t>Abril</w:t>
+      </w:r>
+      <w:proofErr w:type="gramEnd"/>
+      <w:r>
+        <w:t>, comencé a trabajar en el sistema para confirmar que el rompecabezas esté formado, pero por los modelos que estoy usando, no sé exactamente si está funcionando hasta que tenga los modelos correctos.</w:t>
+      </w:r>
+      <w:r>
+        <w:t xml:space="preserve"> El 21 de </w:t>
+      </w:r>
+      <w:proofErr w:type="gramStart"/>
+      <w:r>
+        <w:t>Abril</w:t>
+      </w:r>
+      <w:proofErr w:type="gramEnd"/>
+      <w:r>
+        <w:t xml:space="preserve"> hubo retroalimentación por parte de </w:t>
+      </w:r>
+      <w:proofErr w:type="spellStart"/>
+      <w:r>
+        <w:t>Yoás</w:t>
+      </w:r>
+      <w:proofErr w:type="spellEnd"/>
+      <w:r>
+        <w:t>, para las runas no hay que aplicar los botones, pero el sistema de victoria está bien, ahora hay que idear una forma para implementar las puertas.</w:t>
+      </w:r>
+      <w:r>
+        <w:t xml:space="preserve"> El 22 de </w:t>
+      </w:r>
+      <w:proofErr w:type="gramStart"/>
+      <w:r>
+        <w:t>Abril</w:t>
+      </w:r>
+      <w:proofErr w:type="gramEnd"/>
+      <w:r>
+        <w:t xml:space="preserve"> se comenzó la implementación de las puertas, las cuales funcionarán como forma de medir el progreso del jugador.</w:t>
+      </w:r>
+      <w:r>
+        <w:t xml:space="preserve"> El 23 de </w:t>
+      </w:r>
+      <w:proofErr w:type="gramStart"/>
+      <w:r>
+        <w:t>Abril</w:t>
+      </w:r>
+      <w:proofErr w:type="gramEnd"/>
+      <w:r>
+        <w:t xml:space="preserve"> se comenzó a implementar el contador para finalizar el nivel.</w:t>
+      </w:r>
+      <w:r>
+        <w:t xml:space="preserve"> El 24 de </w:t>
+      </w:r>
+      <w:proofErr w:type="gramStart"/>
+      <w:r>
+        <w:t>Abril</w:t>
+      </w:r>
+      <w:proofErr w:type="gramEnd"/>
+      <w:r>
+        <w:t xml:space="preserve"> se arregló la funcionalidad del contador, además de que se activan interfaces en base al resultado de las rotaciones. La siguiente semana comienzo a implementar un objeto que aumente la intensidad </w:t>
       </w:r>
       <w:r>
         <w:lastRenderedPageBreak/>
@@ -352,7 +1046,21 @@
         <w:rPr>
           <w:b/>
         </w:rPr>
-        <w:t>Semana 11 (27 de Abril del 2026 al 30 de Abril</w:t>
+        <w:t xml:space="preserve">Semana 11 (27 de </w:t>
+      </w:r>
+      <w:proofErr w:type="gramStart"/>
+      <w:r>
+        <w:rPr>
+          <w:b/>
+        </w:rPr>
+        <w:t>Abril</w:t>
+      </w:r>
+      <w:proofErr w:type="gramEnd"/>
+      <w:r>
+        <w:rPr>
+          <w:b/>
+        </w:rPr>
+        <w:t xml:space="preserve"> del 2026 al 30 de Abril</w:t>
       </w:r>
       <w:r>
         <w:rPr>
@@ -372,47 +1080,208 @@
         <w:jc w:val="both"/>
       </w:pPr>
       <w:r>
-        <w:t>El 27 de Abril, comencé a implementar la iluminación de un objeto para darle un efecto de premio.</w:t>
-      </w:r>
-      <w:r>
-        <w:t xml:space="preserve"> El 28 de Abril, comencé a hacer ajustes para la interfaz, en la semana debo ver si cuando el jugador pierda, se reinicia toda la partida o solo el escenario.</w:t>
-      </w:r>
-      <w:r>
-        <w:t xml:space="preserve"> El 30 de Abril recibí comentarios de Yoas para continuar con mi implementación de las piezas del rompecabezas por separada en lugar de juntas, así como poner limitaciones para las piezas.</w:t>
-      </w:r>
-    </w:p>
-    <w:p>
-      <w:pPr>
-        <w:jc w:val="both"/>
-        <w:rPr>
-          <w:b/>
-        </w:rPr>
-      </w:pPr>
-      <w:r>
-        <w:rPr>
-          <w:b/>
-        </w:rPr>
-        <w:t>Semana 12 (04 de Mayo del 2026 al 08 de Mayo del 2026)</w:t>
-      </w:r>
-    </w:p>
-    <w:p>
-      <w:pPr>
-        <w:jc w:val="both"/>
-      </w:pPr>
-      <w:r>
-        <w:t>El 04 de Mayo implementé los botones para continuar la partida o reiniciar el nivel en caso de que termine el tiempo.</w:t>
-      </w:r>
-      <w:r>
-        <w:t xml:space="preserve"> El 05 de Mayo implementé un límite de rotación para cada pieza del rompecabezas para que el paciente tenga que interactuar varias veces y pueda trabajar en la rotación de su muñeca.</w:t>
-      </w:r>
-      <w:r>
-        <w:t xml:space="preserve"> El 06 de Mayo implementé un menú general para los 4 minijuegos.</w:t>
-      </w:r>
-      <w:r>
-        <w:t xml:space="preserve"> El 7 y 8 de Mayo continue implementa el menú de los 4 minijuegos, procuré que el paciente tenga la opción de girar a otros lados para cambiar entre realidad aumentada y mixta.</w:t>
+        <w:t xml:space="preserve">El 27 de </w:t>
+      </w:r>
+      <w:proofErr w:type="gramStart"/>
+      <w:r>
+        <w:t>Abril</w:t>
+      </w:r>
+      <w:proofErr w:type="gramEnd"/>
+      <w:r>
+        <w:t>, comencé a implementar la iluminación de un objeto para darle un efecto de premio.</w:t>
+      </w:r>
+      <w:r>
+        <w:t xml:space="preserve"> El 28 de </w:t>
+      </w:r>
+      <w:proofErr w:type="gramStart"/>
+      <w:r>
+        <w:t>Abril</w:t>
+      </w:r>
+      <w:proofErr w:type="gramEnd"/>
+      <w:r>
+        <w:t>, comencé a hacer ajustes para la interfaz, en la semana debo ver si cuando el jugador pierda, se reinicia toda la partida o solo el escenario.</w:t>
+      </w:r>
+      <w:r>
+        <w:t xml:space="preserve"> El 30 de </w:t>
+      </w:r>
+      <w:proofErr w:type="gramStart"/>
+      <w:r>
+        <w:t>Abril</w:t>
+      </w:r>
+      <w:proofErr w:type="gramEnd"/>
+      <w:r>
+        <w:t xml:space="preserve"> recibí comentarios de </w:t>
+      </w:r>
+      <w:proofErr w:type="spellStart"/>
+      <w:r>
+        <w:t>Yoas</w:t>
+      </w:r>
+      <w:proofErr w:type="spellEnd"/>
+      <w:r>
+        <w:t xml:space="preserve"> para continuar con mi implementación de las piezas del rompecabezas por separada en lugar de juntas, así como poner limitaciones para las piezas.</w:t>
+      </w:r>
+    </w:p>
+    <w:p>
+      <w:pPr>
+        <w:jc w:val="both"/>
+        <w:rPr>
+          <w:b/>
+        </w:rPr>
+      </w:pPr>
+      <w:r>
+        <w:rPr>
+          <w:b/>
+        </w:rPr>
+        <w:t xml:space="preserve">Semana 12 (04 de </w:t>
+      </w:r>
+      <w:proofErr w:type="gramStart"/>
+      <w:r>
+        <w:rPr>
+          <w:b/>
+        </w:rPr>
+        <w:t>Mayo</w:t>
+      </w:r>
+      <w:proofErr w:type="gramEnd"/>
+      <w:r>
+        <w:rPr>
+          <w:b/>
+        </w:rPr>
+        <w:t xml:space="preserve"> del 2026 al 08 de Mayo del 2026)</w:t>
+      </w:r>
+    </w:p>
+    <w:p>
+      <w:pPr>
+        <w:jc w:val="both"/>
+      </w:pPr>
+      <w:r>
+        <w:t xml:space="preserve">El 04 de </w:t>
+      </w:r>
+      <w:proofErr w:type="gramStart"/>
+      <w:r>
+        <w:t>Mayo</w:t>
+      </w:r>
+      <w:proofErr w:type="gramEnd"/>
+      <w:r>
+        <w:t xml:space="preserve"> implementé los botones para continuar la partida o reiniciar el nivel en caso de que termine el tiempo.</w:t>
+      </w:r>
+      <w:r>
+        <w:t xml:space="preserve"> El 05 de </w:t>
+      </w:r>
+      <w:proofErr w:type="gramStart"/>
+      <w:r>
+        <w:t>Mayo</w:t>
+      </w:r>
+      <w:proofErr w:type="gramEnd"/>
+      <w:r>
+        <w:t xml:space="preserve"> implementé un límite de rotación para cada pieza del rompecabezas para que el paciente tenga que interactuar varias veces y pueda trabajar en la rotación de su muñeca.</w:t>
+      </w:r>
+      <w:r>
+        <w:t xml:space="preserve"> El 06 de </w:t>
+      </w:r>
+      <w:proofErr w:type="gramStart"/>
+      <w:r>
+        <w:t>Mayo</w:t>
+      </w:r>
+      <w:proofErr w:type="gramEnd"/>
+      <w:r>
+        <w:t xml:space="preserve"> implementé un menú general para los 4 </w:t>
+      </w:r>
+      <w:proofErr w:type="spellStart"/>
+      <w:r>
+        <w:t>minijuegos</w:t>
+      </w:r>
+      <w:proofErr w:type="spellEnd"/>
+      <w:r>
+        <w:t>.</w:t>
+      </w:r>
+      <w:r>
+        <w:t xml:space="preserve"> El 7 y 8 de </w:t>
+      </w:r>
+      <w:proofErr w:type="gramStart"/>
+      <w:r>
+        <w:t>Mayo</w:t>
+      </w:r>
+      <w:proofErr w:type="gramEnd"/>
+      <w:r>
+        <w:t xml:space="preserve"> </w:t>
+      </w:r>
+      <w:r>
+        <w:t>continué</w:t>
+      </w:r>
+      <w:r>
+        <w:t xml:space="preserve"> implementa</w:t>
+      </w:r>
+      <w:r>
+        <w:t>do</w:t>
+      </w:r>
+      <w:r>
+        <w:t xml:space="preserve"> el menú de l</w:t>
       </w:r>
       <w:bookmarkStart w:id="0" w:name="_GoBack"/>
       <w:bookmarkEnd w:id="0"/>
+      <w:r>
+        <w:t xml:space="preserve">os 4 </w:t>
+      </w:r>
+      <w:proofErr w:type="spellStart"/>
+      <w:r>
+        <w:t>minijuegos</w:t>
+      </w:r>
+      <w:proofErr w:type="spellEnd"/>
+      <w:r>
+        <w:t>, procuré que el paciente tenga la opción de girar a otros lados para cambiar entre realidad aumentada y mixta.</w:t>
+      </w:r>
+    </w:p>
+    <w:p>
+      <w:pPr>
+        <w:jc w:val="both"/>
+        <w:rPr>
+          <w:b/>
+        </w:rPr>
+      </w:pPr>
+      <w:r>
+        <w:rPr>
+          <w:b/>
+        </w:rPr>
+        <w:t xml:space="preserve">Semana 13 (11 de </w:t>
+      </w:r>
+      <w:proofErr w:type="gramStart"/>
+      <w:r>
+        <w:rPr>
+          <w:b/>
+        </w:rPr>
+        <w:t>Mayo</w:t>
+      </w:r>
+      <w:proofErr w:type="gramEnd"/>
+      <w:r>
+        <w:rPr>
+          <w:b/>
+        </w:rPr>
+        <w:t xml:space="preserve"> del 2026 al 14 de Mayo del 2026)</w:t>
+      </w:r>
+    </w:p>
+    <w:p>
+      <w:pPr>
+        <w:jc w:val="both"/>
+      </w:pPr>
+      <w:r>
+        <w:t xml:space="preserve">El 11 de </w:t>
+      </w:r>
+      <w:proofErr w:type="gramStart"/>
+      <w:r>
+        <w:t>Mayo</w:t>
+      </w:r>
+      <w:proofErr w:type="gramEnd"/>
+      <w:r>
+        <w:t xml:space="preserve"> terminé la implementación del botón para alternar de realidad desde el menú general; comenzaré a ver el prototipo del tercer </w:t>
+      </w:r>
+      <w:proofErr w:type="spellStart"/>
+      <w:r>
+        <w:t>minijuego</w:t>
+      </w:r>
+      <w:proofErr w:type="spellEnd"/>
+      <w:r>
+        <w:t>.</w:t>
+      </w:r>
     </w:p>
     <w:sectPr>
       <w:pgSz w:w="11906" w:h="16838"/>

</xml_diff>

<commit_message>
Se comienzan a implementar las naves destruidas
</commit_message>
<xml_diff>
--- a/ReporteActividades.docx
+++ b/ReporteActividades.docx
@@ -451,8 +451,33 @@
       <w:r>
         <w:t xml:space="preserve"> El 14 de Mayo mejoré los Colliders de las Naves y añadí las nuevas texturas que hizo mi compañera Yael.</w:t>
       </w:r>
+    </w:p>
+    <w:p>
+      <w:pPr>
+        <w:jc w:val="both"/>
+        <w:rPr>
+          <w:b/>
+        </w:rPr>
+      </w:pPr>
+      <w:r>
+        <w:rPr>
+          <w:b/>
+        </w:rPr>
+        <w:t>Semana 14 (18 de Mayo del 2026 al 22 de Mayo del 2026)</w:t>
+      </w:r>
+    </w:p>
+    <w:p>
+      <w:pPr>
+        <w:jc w:val="both"/>
+      </w:pPr>
+      <w:r>
+        <w:t>El 18 de Mayo comencé a ver las animaciones de las naves destruidas para el primer mini</w:t>
+      </w:r>
       <w:bookmarkStart w:id="0" w:name="_GoBack"/>
       <w:bookmarkEnd w:id="0"/>
+      <w:r>
+        <w:t>juego.</w:t>
+      </w:r>
     </w:p>
     <w:sectPr>
       <w:pgSz w:w="11906" w:h="16838"/>

</xml_diff>

<commit_message>
Se agregan la implementacion de la nave destruida
</commit_message>
<xml_diff>
--- a/ReporteActividades.docx
+++ b/ReporteActividades.docx
@@ -13,85 +13,322 @@
         <w:rPr>
           <w:b/>
         </w:rPr>
-        <w:t>Semana 1 (09 de Febrero de 2026 a 13 de Febrero de 2026)</w:t>
-      </w:r>
-    </w:p>
-    <w:p>
-      <w:pPr>
-        <w:jc w:val="both"/>
-      </w:pPr>
-      <w:r>
-        <w:t>El primer día se inició con el desarrollo de un Roll A Ball, principalmente para familiarizarse con el entorno de Unity. El mismo día se terminó el tutorial, pero al día siguiente se volvió a iniciar, ya que la versión utilizada</w:t>
-      </w:r>
-      <w:r>
-        <w:t xml:space="preserve"> de Unity no era la solicitada por Yoá</w:t>
-      </w:r>
-      <w:r>
-        <w:t xml:space="preserve">s. </w:t>
-      </w:r>
-      <w:r>
-        <w:t>El 11 de Febrero se comenzó con el desarrollo de la segunda escena, que era casi la primera escena pero se tenían que implementar enemigos, plataformas, vidas, monedas, spawners y plataformas. El 12 de Febrero se implementó la Lava, la cual tenía que cambiar de color cada 5 segundos. El 13 de Febrero se estuvo haciendo en los spawners de enemigos y monedas.</w:t>
-      </w:r>
-    </w:p>
-    <w:p>
-      <w:pPr>
-        <w:jc w:val="both"/>
-        <w:rPr>
-          <w:b/>
-        </w:rPr>
-      </w:pPr>
-      <w:r>
-        <w:rPr>
-          <w:b/>
-        </w:rPr>
-        <w:t>Semana 2 (16 de Febrero de 2026 a 20 de Febrero de 2026)</w:t>
-      </w:r>
-    </w:p>
-    <w:p>
-      <w:pPr>
-        <w:jc w:val="both"/>
-      </w:pPr>
-      <w:r>
-        <w:t>El 16 de Febrero se comenzó con la implementación de las escenas, los menús de pausa y cambios de escenas. Se completó el desarrollo de Roll A Ball. El 17 de Febrero Yoás le dio visto bueno al demo y pasé a familiarizarme con el e</w:t>
-      </w:r>
-      <w:r>
-        <w:t>ntorno de Meta Quest 3S. Si bien el 17 y 18 de Febrero estuve trabajando en un demo para saber como funcionan los controles, por problemas de hardware en el equipo donde estaba trabajando en el LANR, no podía probar lo que había hecho. El 19 de Febrero comencé a trabajar en el Anexo, ya que había un equipo disponible con una tarjeta gráfica compatible con el software de Meta Horizon Link, después de configurar el entorno, finalmente pude probar lo que había desarrollado los días pasados. El 19 de Febrero comencé a experimentar con los Building Blocks de Hand Tracking, algo necesario para evitar la necesidad de usar los controles de los lentes, solo interacción con las manos.</w:t>
-      </w:r>
-    </w:p>
-    <w:p>
-      <w:pPr>
-        <w:jc w:val="both"/>
-        <w:rPr>
-          <w:b/>
-        </w:rPr>
-      </w:pPr>
-      <w:r>
-        <w:rPr>
-          <w:b/>
-        </w:rPr>
-        <w:t>Semana 3 (23 de Febrero de 2026 a 27 de Febrero de 2026)</w:t>
-      </w:r>
-    </w:p>
-    <w:p>
-      <w:pPr>
-        <w:jc w:val="both"/>
-      </w:pPr>
-      <w:r>
-        <w:t>Lesly, una compañera que trabajaba en el Anexo iba a ocupar la computadora donde iba a estar trabajando, así que no asistí hasta el Jueves 26 de Febrero. Los días restantes de la semana me dediqué a terminar el demo y prácticar el cambio de escenas con interacción en UI haciendo uso de Hand Tracking.</w:t>
-      </w:r>
-    </w:p>
-    <w:p>
-      <w:pPr>
-        <w:jc w:val="both"/>
-        <w:rPr>
-          <w:b/>
-        </w:rPr>
-      </w:pPr>
-      <w:r>
-        <w:rPr>
-          <w:b/>
-        </w:rPr>
-        <w:t xml:space="preserve">Semana 4 (02 de Marzo del 2026 a </w:t>
+        <w:t xml:space="preserve">Semana 1 (09 de </w:t>
+      </w:r>
+      <w:proofErr w:type="gramStart"/>
+      <w:r>
+        <w:rPr>
+          <w:b/>
+        </w:rPr>
+        <w:t>Febrero</w:t>
+      </w:r>
+      <w:proofErr w:type="gramEnd"/>
+      <w:r>
+        <w:rPr>
+          <w:b/>
+        </w:rPr>
+        <w:t xml:space="preserve"> de 2026 a 13 de Febrero de 2026)</w:t>
+      </w:r>
+    </w:p>
+    <w:p>
+      <w:pPr>
+        <w:jc w:val="both"/>
+      </w:pPr>
+      <w:r>
+        <w:t xml:space="preserve">El primer día se inició con el desarrollo de un Roll A </w:t>
+      </w:r>
+      <w:proofErr w:type="spellStart"/>
+      <w:r>
+        <w:t>Ball</w:t>
+      </w:r>
+      <w:proofErr w:type="spellEnd"/>
+      <w:r>
+        <w:t xml:space="preserve">, principalmente para familiarizarse con el entorno de </w:t>
+      </w:r>
+      <w:proofErr w:type="spellStart"/>
+      <w:r>
+        <w:t>Unity</w:t>
+      </w:r>
+      <w:proofErr w:type="spellEnd"/>
+      <w:r>
+        <w:t>. El mismo día se terminó el tutorial, pero al día siguiente se volvió a iniciar, ya que la versión utilizada</w:t>
+      </w:r>
+      <w:r>
+        <w:t xml:space="preserve"> de </w:t>
+      </w:r>
+      <w:proofErr w:type="spellStart"/>
+      <w:r>
+        <w:t>Unity</w:t>
+      </w:r>
+      <w:proofErr w:type="spellEnd"/>
+      <w:r>
+        <w:t xml:space="preserve"> no era la solicitada por </w:t>
+      </w:r>
+      <w:proofErr w:type="spellStart"/>
+      <w:r>
+        <w:t>Yoá</w:t>
+      </w:r>
+      <w:r>
+        <w:t>s</w:t>
+      </w:r>
+      <w:proofErr w:type="spellEnd"/>
+      <w:r>
+        <w:t xml:space="preserve">. </w:t>
+      </w:r>
+      <w:r>
+        <w:t xml:space="preserve">El 11 de </w:t>
+      </w:r>
+      <w:proofErr w:type="gramStart"/>
+      <w:r>
+        <w:t>Febrero</w:t>
+      </w:r>
+      <w:proofErr w:type="gramEnd"/>
+      <w:r>
+        <w:t xml:space="preserve"> se comenzó con el desarrollo de la segunda escena, que era casi la primera escena pero se tenían que implementar enemigos, plataformas, vidas, monedas, </w:t>
+      </w:r>
+      <w:proofErr w:type="spellStart"/>
+      <w:r>
+        <w:t>spawners</w:t>
+      </w:r>
+      <w:proofErr w:type="spellEnd"/>
+      <w:r>
+        <w:t xml:space="preserve"> y plataformas. El 12 de </w:t>
+      </w:r>
+      <w:proofErr w:type="gramStart"/>
+      <w:r>
+        <w:t>Febrero</w:t>
+      </w:r>
+      <w:proofErr w:type="gramEnd"/>
+      <w:r>
+        <w:t xml:space="preserve"> se implementó la Lava, la cual tenía que cambiar de color cada 5 segundos. El 13 de </w:t>
+      </w:r>
+      <w:proofErr w:type="gramStart"/>
+      <w:r>
+        <w:t>Febrero</w:t>
+      </w:r>
+      <w:proofErr w:type="gramEnd"/>
+      <w:r>
+        <w:t xml:space="preserve"> se estuvo haciendo en los </w:t>
+      </w:r>
+      <w:proofErr w:type="spellStart"/>
+      <w:r>
+        <w:t>spawners</w:t>
+      </w:r>
+      <w:proofErr w:type="spellEnd"/>
+      <w:r>
+        <w:t xml:space="preserve"> de enemigos y monedas.</w:t>
+      </w:r>
+    </w:p>
+    <w:p>
+      <w:pPr>
+        <w:jc w:val="both"/>
+        <w:rPr>
+          <w:b/>
+        </w:rPr>
+      </w:pPr>
+      <w:r>
+        <w:rPr>
+          <w:b/>
+        </w:rPr>
+        <w:t xml:space="preserve">Semana 2 (16 de </w:t>
+      </w:r>
+      <w:proofErr w:type="gramStart"/>
+      <w:r>
+        <w:rPr>
+          <w:b/>
+        </w:rPr>
+        <w:t>Febrero</w:t>
+      </w:r>
+      <w:proofErr w:type="gramEnd"/>
+      <w:r>
+        <w:rPr>
+          <w:b/>
+        </w:rPr>
+        <w:t xml:space="preserve"> de 2026 a 20 de Febrero de 2026)</w:t>
+      </w:r>
+    </w:p>
+    <w:p>
+      <w:pPr>
+        <w:jc w:val="both"/>
+      </w:pPr>
+      <w:r>
+        <w:t xml:space="preserve">El 16 de </w:t>
+      </w:r>
+      <w:proofErr w:type="gramStart"/>
+      <w:r>
+        <w:t>Febrero</w:t>
+      </w:r>
+      <w:proofErr w:type="gramEnd"/>
+      <w:r>
+        <w:t xml:space="preserve"> se comenzó con la implementación de las escenas, los menús de pausa y cambios de escenas. Se completó el desarrollo de Roll A </w:t>
+      </w:r>
+      <w:proofErr w:type="spellStart"/>
+      <w:r>
+        <w:t>Ball</w:t>
+      </w:r>
+      <w:proofErr w:type="spellEnd"/>
+      <w:r>
+        <w:t xml:space="preserve">. El 17 de </w:t>
+      </w:r>
+      <w:proofErr w:type="gramStart"/>
+      <w:r>
+        <w:t>Febrero</w:t>
+      </w:r>
+      <w:proofErr w:type="gramEnd"/>
+      <w:r>
+        <w:t xml:space="preserve"> </w:t>
+      </w:r>
+      <w:proofErr w:type="spellStart"/>
+      <w:r>
+        <w:t>Yoás</w:t>
+      </w:r>
+      <w:proofErr w:type="spellEnd"/>
+      <w:r>
+        <w:t xml:space="preserve"> le dio visto bueno al demo y pasé a familiarizarme con el e</w:t>
+      </w:r>
+      <w:r>
+        <w:t xml:space="preserve">ntorno de Meta </w:t>
+      </w:r>
+      <w:proofErr w:type="spellStart"/>
+      <w:r>
+        <w:t>Quest</w:t>
+      </w:r>
+      <w:proofErr w:type="spellEnd"/>
+      <w:r>
+        <w:t xml:space="preserve"> 3S. Si bien el 17 y 18 de </w:t>
+      </w:r>
+      <w:proofErr w:type="gramStart"/>
+      <w:r>
+        <w:t>Febrero</w:t>
+      </w:r>
+      <w:proofErr w:type="gramEnd"/>
+      <w:r>
+        <w:t xml:space="preserve"> estuve trabajando en un demo para saber </w:t>
+      </w:r>
+      <w:proofErr w:type="spellStart"/>
+      <w:r>
+        <w:t>como</w:t>
+      </w:r>
+      <w:proofErr w:type="spellEnd"/>
+      <w:r>
+        <w:t xml:space="preserve"> funcionan los controles, por problemas de hardware en el equipo donde estaba trabajando en el LANR, no podía probar lo que había hecho. El 19 de </w:t>
+      </w:r>
+      <w:proofErr w:type="gramStart"/>
+      <w:r>
+        <w:t>Febrero</w:t>
+      </w:r>
+      <w:proofErr w:type="gramEnd"/>
+      <w:r>
+        <w:t xml:space="preserve"> comencé a trabajar en el Anexo, ya que había un equipo disponible con una tarjeta gráfica compatible con el software de Meta </w:t>
+      </w:r>
+      <w:proofErr w:type="spellStart"/>
+      <w:r>
+        <w:t>Horizon</w:t>
+      </w:r>
+      <w:proofErr w:type="spellEnd"/>
+      <w:r>
+        <w:t xml:space="preserve"> Link, después de configurar el entorno, finalmente pude probar lo que había desarrollado los días pasados. El 19 de </w:t>
+      </w:r>
+      <w:proofErr w:type="gramStart"/>
+      <w:r>
+        <w:t>Febrero</w:t>
+      </w:r>
+      <w:proofErr w:type="gramEnd"/>
+      <w:r>
+        <w:t xml:space="preserve"> comencé a experimentar con los </w:t>
+      </w:r>
+      <w:proofErr w:type="spellStart"/>
+      <w:r>
+        <w:t>Building</w:t>
+      </w:r>
+      <w:proofErr w:type="spellEnd"/>
+      <w:r>
+        <w:t xml:space="preserve"> Blocks de Hand Tracking, algo necesario para evitar la necesidad de usar los controles de los lentes, solo interacción con las manos.</w:t>
+      </w:r>
+    </w:p>
+    <w:p>
+      <w:pPr>
+        <w:jc w:val="both"/>
+        <w:rPr>
+          <w:b/>
+        </w:rPr>
+      </w:pPr>
+      <w:r>
+        <w:rPr>
+          <w:b/>
+        </w:rPr>
+        <w:t xml:space="preserve">Semana 3 (23 de </w:t>
+      </w:r>
+      <w:proofErr w:type="gramStart"/>
+      <w:r>
+        <w:rPr>
+          <w:b/>
+        </w:rPr>
+        <w:t>Febrero</w:t>
+      </w:r>
+      <w:proofErr w:type="gramEnd"/>
+      <w:r>
+        <w:rPr>
+          <w:b/>
+        </w:rPr>
+        <w:t xml:space="preserve"> de 2026 a 27 de Febrero de 2026)</w:t>
+      </w:r>
+    </w:p>
+    <w:p>
+      <w:pPr>
+        <w:jc w:val="both"/>
+      </w:pPr>
+      <w:proofErr w:type="spellStart"/>
+      <w:r>
+        <w:t>Lesly</w:t>
+      </w:r>
+      <w:proofErr w:type="spellEnd"/>
+      <w:r>
+        <w:t xml:space="preserve">, una compañera que trabajaba en el Anexo iba a ocupar la computadora donde iba a estar trabajando, así que no asistí hasta el </w:t>
+      </w:r>
+      <w:proofErr w:type="gramStart"/>
+      <w:r>
+        <w:t>Jueves</w:t>
+      </w:r>
+      <w:proofErr w:type="gramEnd"/>
+      <w:r>
+        <w:t xml:space="preserve"> 26 de Febrero. Los días restantes de la semana me dediqué a terminar el demo y </w:t>
+      </w:r>
+      <w:proofErr w:type="spellStart"/>
+      <w:r>
+        <w:t>prácticar</w:t>
+      </w:r>
+      <w:proofErr w:type="spellEnd"/>
+      <w:r>
+        <w:t xml:space="preserve"> el cambio de escenas con interacción en UI haciendo uso de Hand Tracking.</w:t>
+      </w:r>
+    </w:p>
+    <w:p>
+      <w:pPr>
+        <w:jc w:val="both"/>
+        <w:rPr>
+          <w:b/>
+        </w:rPr>
+      </w:pPr>
+      <w:r>
+        <w:rPr>
+          <w:b/>
+        </w:rPr>
+        <w:t xml:space="preserve">Semana 4 (02 de </w:t>
+      </w:r>
+      <w:proofErr w:type="gramStart"/>
+      <w:r>
+        <w:rPr>
+          <w:b/>
+        </w:rPr>
+        <w:t>Marzo</w:t>
+      </w:r>
+      <w:proofErr w:type="gramEnd"/>
+      <w:r>
+        <w:rPr>
+          <w:b/>
+        </w:rPr>
+        <w:t xml:space="preserve"> del 2026 a </w:t>
       </w:r>
       <w:r>
         <w:rPr>
@@ -105,35 +342,153 @@
         <w:jc w:val="both"/>
       </w:pPr>
       <w:r>
-        <w:t>El 02 de Marzo, Yoás revisó los avances de la semana pasada y me platicó la idea que tenía para la implementación del proyecto, un juego espacial. El 04 de Marzo, después de estar viendo ejemplos de como mover un objeto con hand tracking, Yoás me comentó que la idea era que el paciente o jugador disparen desde sus manos para naves enemigas. El 05 y 06 de Febrero estuve trabajando para que cuando se hiciera la acción de “Pinch”, se disparen diferentes tipos de disparos, también estuve trabajando en los comportamientos de los enemigos, un medidor de supinación, flexión, extensión y pronación.</w:t>
-      </w:r>
-    </w:p>
-    <w:p>
-      <w:pPr>
-        <w:jc w:val="both"/>
-        <w:rPr>
-          <w:b/>
-        </w:rPr>
-      </w:pPr>
-      <w:r>
-        <w:rPr>
-          <w:b/>
-        </w:rPr>
-        <w:t>Semana 5 (09 de Marzo del 2026 a 13 de Febrero de 2026)</w:t>
-      </w:r>
-    </w:p>
-    <w:p>
-      <w:pPr>
-        <w:jc w:val="both"/>
-      </w:pPr>
-      <w:r>
-        <w:t xml:space="preserve">Del 09 de Marzo al 12 de Marzo estuve ajustando el comportamiento del contador de Puntuación, el 12 de Marzo Yoás asistió al Anexo para revisar avances, me comentó que el movimiento de “Pinch” podía ser algo </w:t>
+        <w:t xml:space="preserve">El 02 de </w:t>
+      </w:r>
+      <w:proofErr w:type="gramStart"/>
+      <w:r>
+        <w:t>Marzo</w:t>
+      </w:r>
+      <w:proofErr w:type="gramEnd"/>
+      <w:r>
+        <w:t xml:space="preserve">, </w:t>
+      </w:r>
+      <w:proofErr w:type="spellStart"/>
+      <w:r>
+        <w:t>Yoás</w:t>
+      </w:r>
+      <w:proofErr w:type="spellEnd"/>
+      <w:r>
+        <w:t xml:space="preserve"> revisó los avances de la semana pasada y me platicó la idea que tenía para la implementación del proyecto, un juego espacial. El 04 de </w:t>
+      </w:r>
+      <w:proofErr w:type="gramStart"/>
+      <w:r>
+        <w:t>Marzo</w:t>
+      </w:r>
+      <w:proofErr w:type="gramEnd"/>
+      <w:r>
+        <w:t xml:space="preserve">, después de estar viendo ejemplos de </w:t>
+      </w:r>
+      <w:proofErr w:type="spellStart"/>
+      <w:r>
+        <w:t>como</w:t>
+      </w:r>
+      <w:proofErr w:type="spellEnd"/>
+      <w:r>
+        <w:t xml:space="preserve"> mover un objeto con </w:t>
+      </w:r>
+      <w:proofErr w:type="spellStart"/>
+      <w:r>
+        <w:t>hand</w:t>
+      </w:r>
+      <w:proofErr w:type="spellEnd"/>
+      <w:r>
+        <w:t xml:space="preserve"> tracking, </w:t>
+      </w:r>
+      <w:proofErr w:type="spellStart"/>
+      <w:r>
+        <w:t>Yoás</w:t>
+      </w:r>
+      <w:proofErr w:type="spellEnd"/>
+      <w:r>
+        <w:t xml:space="preserve"> me comentó que la idea era que el paciente o jugador disparen desde sus manos para naves enemigas. El 05 y 06 de </w:t>
+      </w:r>
+      <w:proofErr w:type="gramStart"/>
+      <w:r>
+        <w:t>Febrero</w:t>
+      </w:r>
+      <w:proofErr w:type="gramEnd"/>
+      <w:r>
+        <w:t xml:space="preserve"> estuve trabajando para que cuando se hiciera la acción de “</w:t>
+      </w:r>
+      <w:proofErr w:type="spellStart"/>
+      <w:r>
+        <w:t>Pinch</w:t>
+      </w:r>
+      <w:proofErr w:type="spellEnd"/>
+      <w:r>
+        <w:t>”, se disparen diferentes tipos de disparos, también estuve trabajando en los comportamientos de los enemigos, un medidor de supinación, flexión, extensión y pronación.</w:t>
+      </w:r>
+    </w:p>
+    <w:p>
+      <w:pPr>
+        <w:jc w:val="both"/>
+        <w:rPr>
+          <w:b/>
+        </w:rPr>
+      </w:pPr>
+      <w:r>
+        <w:rPr>
+          <w:b/>
+        </w:rPr>
+        <w:t xml:space="preserve">Semana 5 (09 de </w:t>
+      </w:r>
+      <w:proofErr w:type="gramStart"/>
+      <w:r>
+        <w:rPr>
+          <w:b/>
+        </w:rPr>
+        <w:t>Marzo</w:t>
+      </w:r>
+      <w:proofErr w:type="gramEnd"/>
+      <w:r>
+        <w:rPr>
+          <w:b/>
+        </w:rPr>
+        <w:t xml:space="preserve"> del 2026 a 13 de Febrero de 2026)</w:t>
+      </w:r>
+    </w:p>
+    <w:p>
+      <w:pPr>
+        <w:jc w:val="both"/>
+      </w:pPr>
+      <w:r>
+        <w:t xml:space="preserve">Del 09 de </w:t>
+      </w:r>
+      <w:proofErr w:type="gramStart"/>
+      <w:r>
+        <w:t>Marzo</w:t>
+      </w:r>
+      <w:proofErr w:type="gramEnd"/>
+      <w:r>
+        <w:t xml:space="preserve"> al 12 de Marzo estuve ajustando el comportamiento del contador de Puntuación, el 12 de Marzo </w:t>
+      </w:r>
+      <w:proofErr w:type="spellStart"/>
+      <w:r>
+        <w:t>Yoás</w:t>
+      </w:r>
+      <w:proofErr w:type="spellEnd"/>
+      <w:r>
+        <w:t xml:space="preserve"> asistió al Anexo para revisar avances, me comentó que el movimiento de “</w:t>
+      </w:r>
+      <w:proofErr w:type="spellStart"/>
+      <w:r>
+        <w:t>Pinch</w:t>
+      </w:r>
+      <w:proofErr w:type="spellEnd"/>
+      <w:r>
+        <w:t xml:space="preserve">” podía ser algo </w:t>
       </w:r>
       <w:r>
         <w:t>complicado</w:t>
       </w:r>
       <w:r>
-        <w:t xml:space="preserve"> para los pacientes, así que el jugador ya no tendría que disparar, solo con tocar a los enemigos. El 13 de Marzo me dediqué a que los enemigos se detengan a una distancia del jugador para que este los toque con las manos de hand tracking, pero que desaparezcan si no lo hace en un tiempo determinado.</w:t>
+        <w:t xml:space="preserve"> para los pacientes, así que el jugador ya no tendría que disparar, solo con tocar a los enemigos. El 13 de </w:t>
+      </w:r>
+      <w:proofErr w:type="gramStart"/>
+      <w:r>
+        <w:t>Marzo</w:t>
+      </w:r>
+      <w:proofErr w:type="gramEnd"/>
+      <w:r>
+        <w:t xml:space="preserve"> me dediqué a que los enemigos se detengan a una distancia del jugador para que este los toque con las manos de </w:t>
+      </w:r>
+      <w:proofErr w:type="spellStart"/>
+      <w:r>
+        <w:t>hand</w:t>
+      </w:r>
+      <w:proofErr w:type="spellEnd"/>
+      <w:r>
+        <w:t xml:space="preserve"> tracking, pero que desaparezcan si no lo hace en un tiempo determinado.</w:t>
       </w:r>
       <w:r>
         <w:t xml:space="preserve"> </w:t>
@@ -150,15 +505,37 @@
         <w:rPr>
           <w:b/>
         </w:rPr>
-        <w:t>Semana 6 (17 de Marzo del 2026 a 20 de Marzo del 2026)</w:t>
-      </w:r>
-    </w:p>
-    <w:p>
-      <w:pPr>
-        <w:jc w:val="both"/>
-      </w:pPr>
-      <w:r>
-        <w:t xml:space="preserve">El 17 de Marzo se comenzó con la implementación de un sistema de cuenta regresiva para el comienzo de las rondas de enemigos; la idea es hacer que se inicie con una cuenta regresiva </w:t>
+        <w:t xml:space="preserve">Semana 6 (17 de </w:t>
+      </w:r>
+      <w:proofErr w:type="gramStart"/>
+      <w:r>
+        <w:rPr>
+          <w:b/>
+        </w:rPr>
+        <w:t>Marzo</w:t>
+      </w:r>
+      <w:proofErr w:type="gramEnd"/>
+      <w:r>
+        <w:rPr>
+          <w:b/>
+        </w:rPr>
+        <w:t xml:space="preserve"> del 2026 a 20 de Marzo del 2026)</w:t>
+      </w:r>
+    </w:p>
+    <w:p>
+      <w:pPr>
+        <w:jc w:val="both"/>
+      </w:pPr>
+      <w:r>
+        <w:t xml:space="preserve">El 17 de </w:t>
+      </w:r>
+      <w:proofErr w:type="gramStart"/>
+      <w:r>
+        <w:t>Marzo</w:t>
+      </w:r>
+      <w:proofErr w:type="gramEnd"/>
+      <w:r>
+        <w:t xml:space="preserve"> se comenzó con la implementación de un sistema de cuenta regresiva para el comienzo de las rondas de enemigos; la idea es hacer que se inicie con una cuenta regresiva </w:t>
       </w:r>
       <w:r>
         <w:lastRenderedPageBreak/>
@@ -174,10 +551,42 @@
         <w:t xml:space="preserve">. </w:t>
       </w:r>
       <w:r>
-        <w:t>El 18 de Marzo me encargué de juntar las escenas y completar la implementación del panel de “Continuar”</w:t>
-      </w:r>
-      <w:r>
-        <w:t>. El 19 de Marzo mejoré el comportamiento y los Spawners de los enemigos. El 20 de Marzo,</w:t>
+        <w:t xml:space="preserve">El 18 de </w:t>
+      </w:r>
+      <w:proofErr w:type="gramStart"/>
+      <w:r>
+        <w:t>Marzo</w:t>
+      </w:r>
+      <w:proofErr w:type="gramEnd"/>
+      <w:r>
+        <w:t xml:space="preserve"> me encargué de juntar las escenas y completar la implementación del panel de “Continuar”</w:t>
+      </w:r>
+      <w:r>
+        <w:t xml:space="preserve">. El 19 de </w:t>
+      </w:r>
+      <w:proofErr w:type="gramStart"/>
+      <w:r>
+        <w:t>Marzo</w:t>
+      </w:r>
+      <w:proofErr w:type="gramEnd"/>
+      <w:r>
+        <w:t xml:space="preserve"> mejoré el comportamiento y los </w:t>
+      </w:r>
+      <w:proofErr w:type="spellStart"/>
+      <w:r>
+        <w:t>Spawners</w:t>
+      </w:r>
+      <w:proofErr w:type="spellEnd"/>
+      <w:r>
+        <w:t xml:space="preserve"> de los enemigos. El 20 de </w:t>
+      </w:r>
+      <w:proofErr w:type="gramStart"/>
+      <w:r>
+        <w:t>Marzo</w:t>
+      </w:r>
+      <w:proofErr w:type="gramEnd"/>
+      <w:r>
+        <w:t>,</w:t>
       </w:r>
       <w:r>
         <w:t xml:space="preserve"> comencé a implementar diferentes niveles en caso de que el paciente necesite hacer ejercicios específicos.</w:t>
@@ -194,70 +603,210 @@
         <w:rPr>
           <w:b/>
         </w:rPr>
-        <w:t>Semana 7 (23 de Marzo del 2026 a 28 de Marzo del 2026)</w:t>
-      </w:r>
-    </w:p>
-    <w:p>
-      <w:pPr>
-        <w:jc w:val="both"/>
-      </w:pPr>
-      <w:r>
-        <w:t>El 23 de Marzo, por indicaciones de Yoás, se cambió el enfoque de los enemigos. Estos aparecerán y rodearán al Jugador como si estuvieran en un domo o semicírculo; dicho semicírculo variará su tamaño en base a la distancia máxima que el Jugador pueda estirar su brazo sano. Esa lógica también se implementó.</w:t>
-      </w:r>
-      <w:r>
-        <w:t xml:space="preserve"> El 24 de Marzo me dediqué a hacer la solicitud de tesis.</w:t>
-      </w:r>
-      <w:r>
-        <w:t xml:space="preserve"> El 25 de Marzo, Yoás revisó los avances, donde debo cambiar la orientación del domo y agregar más parámetros a ser modificados por el terapeuta, así como un flujo de trabajo.</w:t>
-      </w:r>
-      <w:r>
-        <w:t xml:space="preserve"> 26 y 27 de Marzo estuve configurando la nueva orientación del domo y el comportamiento de los enemigos.</w:t>
-      </w:r>
-      <w:r>
-        <w:t xml:space="preserve"> El 28 de Marzo conecté las escenas.</w:t>
-      </w:r>
-    </w:p>
-    <w:p>
-      <w:pPr>
-        <w:jc w:val="both"/>
-        <w:rPr>
-          <w:b/>
-        </w:rPr>
-      </w:pPr>
-      <w:r>
-        <w:rPr>
-          <w:b/>
-        </w:rPr>
-        <w:t>Semana 8 (06 de Abril del 2026 a 10 de Abril del 2026)</w:t>
-      </w:r>
-    </w:p>
-    <w:p>
-      <w:pPr>
-        <w:jc w:val="both"/>
-      </w:pPr>
-      <w:r>
-        <w:t xml:space="preserve">El 06 de Abril comencé con la implementación </w:t>
-      </w:r>
-      <w:r>
-        <w:t>de la selección de los enemigos; Yoas me encomendó hacer un modo de realidad mixta.</w:t>
-      </w:r>
-      <w:r>
-        <w:t xml:space="preserve"> 07 de Abril detecté que hay problemas con el cable de conexión, debo buscar un USB 3.0.</w:t>
+        <w:t xml:space="preserve">Semana 7 (23 de </w:t>
+      </w:r>
+      <w:proofErr w:type="gramStart"/>
+      <w:r>
+        <w:rPr>
+          <w:b/>
+        </w:rPr>
+        <w:t>Marzo</w:t>
+      </w:r>
+      <w:proofErr w:type="gramEnd"/>
+      <w:r>
+        <w:rPr>
+          <w:b/>
+        </w:rPr>
+        <w:t xml:space="preserve"> del 2026 a 28 de Marzo del 2026)</w:t>
+      </w:r>
+    </w:p>
+    <w:p>
+      <w:pPr>
+        <w:jc w:val="both"/>
+      </w:pPr>
+      <w:r>
+        <w:t xml:space="preserve">El 23 de </w:t>
+      </w:r>
+      <w:proofErr w:type="gramStart"/>
+      <w:r>
+        <w:t>Marzo</w:t>
+      </w:r>
+      <w:proofErr w:type="gramEnd"/>
+      <w:r>
+        <w:t xml:space="preserve">, por indicaciones de </w:t>
+      </w:r>
+      <w:proofErr w:type="spellStart"/>
+      <w:r>
+        <w:t>Yoás</w:t>
+      </w:r>
+      <w:proofErr w:type="spellEnd"/>
+      <w:r>
+        <w:t>, se cambió el enfoque de los enemigos. Estos aparecerán y rodearán al Jugador como si estuvieran en un domo o semicírculo; dicho semicírculo variará su tamaño en base a la distancia máxima que el Jugador pueda estirar su brazo sano. Esa lógica también se implementó.</w:t>
+      </w:r>
+      <w:r>
+        <w:t xml:space="preserve"> El 24 de </w:t>
+      </w:r>
+      <w:proofErr w:type="gramStart"/>
+      <w:r>
+        <w:t>Marzo</w:t>
+      </w:r>
+      <w:proofErr w:type="gramEnd"/>
+      <w:r>
+        <w:t xml:space="preserve"> me dediqué a hacer la solicitud de tesis.</w:t>
+      </w:r>
+      <w:r>
+        <w:t xml:space="preserve"> El 25 de </w:t>
+      </w:r>
+      <w:proofErr w:type="gramStart"/>
+      <w:r>
+        <w:t>Marzo</w:t>
+      </w:r>
+      <w:proofErr w:type="gramEnd"/>
+      <w:r>
+        <w:t xml:space="preserve">, </w:t>
+      </w:r>
+      <w:proofErr w:type="spellStart"/>
+      <w:r>
+        <w:t>Yoás</w:t>
+      </w:r>
+      <w:proofErr w:type="spellEnd"/>
+      <w:r>
+        <w:t xml:space="preserve"> revisó los avances, donde debo cambiar la orientación del domo y agregar más parámetros a ser modificados por el terapeuta, así como un flujo de trabajo.</w:t>
+      </w:r>
+      <w:r>
+        <w:t xml:space="preserve"> 26 y 27 de </w:t>
+      </w:r>
+      <w:proofErr w:type="gramStart"/>
+      <w:r>
+        <w:t>Marzo</w:t>
+      </w:r>
+      <w:proofErr w:type="gramEnd"/>
+      <w:r>
+        <w:t xml:space="preserve"> estuve configurando la nueva orientación del domo y el comportamiento de los enemigos.</w:t>
+      </w:r>
+      <w:r>
+        <w:t xml:space="preserve"> El 28 de </w:t>
+      </w:r>
+      <w:proofErr w:type="gramStart"/>
+      <w:r>
+        <w:t>Marzo</w:t>
+      </w:r>
+      <w:proofErr w:type="gramEnd"/>
+      <w:r>
+        <w:t xml:space="preserve"> conecté las escenas.</w:t>
+      </w:r>
+    </w:p>
+    <w:p>
+      <w:pPr>
+        <w:jc w:val="both"/>
+        <w:rPr>
+          <w:b/>
+        </w:rPr>
+      </w:pPr>
+      <w:r>
+        <w:rPr>
+          <w:b/>
+        </w:rPr>
+        <w:t xml:space="preserve">Semana 8 (06 de </w:t>
+      </w:r>
+      <w:proofErr w:type="gramStart"/>
+      <w:r>
+        <w:rPr>
+          <w:b/>
+        </w:rPr>
+        <w:t>Abril</w:t>
+      </w:r>
+      <w:proofErr w:type="gramEnd"/>
+      <w:r>
+        <w:rPr>
+          <w:b/>
+        </w:rPr>
+        <w:t xml:space="preserve"> del 2026 a 10 de Abril del 2026)</w:t>
+      </w:r>
+    </w:p>
+    <w:p>
+      <w:pPr>
+        <w:jc w:val="both"/>
+      </w:pPr>
+      <w:r>
+        <w:t xml:space="preserve">El 06 de </w:t>
+      </w:r>
+      <w:proofErr w:type="gramStart"/>
+      <w:r>
+        <w:t>Abril</w:t>
+      </w:r>
+      <w:proofErr w:type="gramEnd"/>
+      <w:r>
+        <w:t xml:space="preserve"> comencé con la implementación </w:t>
+      </w:r>
+      <w:r>
+        <w:t xml:space="preserve">de la selección de los enemigos; </w:t>
+      </w:r>
+      <w:proofErr w:type="spellStart"/>
+      <w:r>
+        <w:t>Yoas</w:t>
+      </w:r>
+      <w:proofErr w:type="spellEnd"/>
+      <w:r>
+        <w:t xml:space="preserve"> me encomendó hacer un modo de realidad mixta.</w:t>
+      </w:r>
+      <w:r>
+        <w:t xml:space="preserve"> 07 de </w:t>
+      </w:r>
+      <w:proofErr w:type="gramStart"/>
+      <w:r>
+        <w:t>Abril</w:t>
+      </w:r>
+      <w:proofErr w:type="gramEnd"/>
+      <w:r>
+        <w:t xml:space="preserve"> detecté que hay problemas con el cable de conexión, debo buscar un USB 3.0.</w:t>
       </w:r>
       <w:r>
         <w:t xml:space="preserve"> </w:t>
       </w:r>
       <w:r>
-        <w:t xml:space="preserve">El 08 de Abril, después de registrar el Meta Quest 3S a la cuenta de desarrollador y arreglar un </w:t>
+        <w:t xml:space="preserve">El 08 de </w:t>
+      </w:r>
+      <w:proofErr w:type="gramStart"/>
+      <w:r>
+        <w:t>Abril</w:t>
+      </w:r>
+      <w:proofErr w:type="gramEnd"/>
+      <w:r>
+        <w:t xml:space="preserve">, después de registrar el Meta </w:t>
+      </w:r>
+      <w:proofErr w:type="spellStart"/>
+      <w:r>
+        <w:t>Quest</w:t>
+      </w:r>
+      <w:proofErr w:type="spellEnd"/>
+      <w:r>
+        <w:t xml:space="preserve"> 3S a la cuenta de desarrollador y arreglar un </w:t>
       </w:r>
       <w:r>
         <w:t>problema</w:t>
       </w:r>
       <w:r>
-        <w:t xml:space="preserve"> con el Canvas, se pudo conectar y completar la Realidad Mixta.</w:t>
-      </w:r>
-      <w:r>
-        <w:t xml:space="preserve"> El 10 de Abril se continuó con la implementación del seleccionador de Enemigos, ahora falta esperar por los modelos.</w:t>
+        <w:t xml:space="preserve"> con el </w:t>
+      </w:r>
+      <w:proofErr w:type="spellStart"/>
+      <w:r>
+        <w:t>Canvas</w:t>
+      </w:r>
+      <w:proofErr w:type="spellEnd"/>
+      <w:r>
+        <w:t>, se pudo conectar y completar la Realidad Mixta.</w:t>
+      </w:r>
+      <w:r>
+        <w:t xml:space="preserve"> El 10 de </w:t>
+      </w:r>
+      <w:proofErr w:type="gramStart"/>
+      <w:r>
+        <w:t>Abril</w:t>
+      </w:r>
+      <w:proofErr w:type="gramEnd"/>
+      <w:r>
+        <w:t xml:space="preserve"> se continuó con la implementación del seleccionador de Enemigos, ahora falta esperar por los modelos.</w:t>
       </w:r>
     </w:p>
     <w:p>
@@ -277,7 +826,21 @@
         <w:rPr>
           <w:b/>
         </w:rPr>
-        <w:t>na 9 (13 de Abril del 2026 al 17</w:t>
+        <w:t xml:space="preserve">na 9 (13 de </w:t>
+      </w:r>
+      <w:proofErr w:type="gramStart"/>
+      <w:r>
+        <w:rPr>
+          <w:b/>
+        </w:rPr>
+        <w:t>Abril</w:t>
+      </w:r>
+      <w:proofErr w:type="gramEnd"/>
+      <w:r>
+        <w:rPr>
+          <w:b/>
+        </w:rPr>
+        <w:t xml:space="preserve"> del 2026 al 17</w:t>
       </w:r>
       <w:r>
         <w:rPr>
@@ -291,50 +854,181 @@
         <w:jc w:val="both"/>
       </w:pPr>
       <w:r>
-        <w:t>El 13 de Abril, comencé a trabajar con los modelos de las naves; debo configurarlos para una actividad que se tendrá por parte de Amerike.</w:t>
-      </w:r>
-      <w:r>
-        <w:t xml:space="preserve"> El 14 de Abril terminé de configurar los modelos y limpié un poco el código y los Assets para la muestra del día siguiente.</w:t>
-      </w:r>
-      <w:r>
-        <w:t xml:space="preserve"> El 15 de Abril realicé unos ajustes a la cámara del jugador y alisté todo para la muestra de Amerike</w:t>
-      </w:r>
-      <w:r>
-        <w:t>. El 16 de Abril fue la muestra, hubo problemas con la Etiqueta Player, ya fue solucionado pero al menos en la muestra se tuvo ese problema. El 17 de Abril se comenzó a probar las mecánicas del segundo minijuego, este toma en cuenta la rotación de la muñeca del jugador para poder rotar las piezas del rompecabezas.</w:t>
-      </w:r>
-    </w:p>
-    <w:p>
-      <w:pPr>
-        <w:jc w:val="both"/>
-        <w:rPr>
-          <w:b/>
-        </w:rPr>
-      </w:pPr>
-      <w:r>
-        <w:rPr>
-          <w:b/>
-        </w:rPr>
-        <w:t>Semana 10 (20 de Abril del 2026 al 24 de Abril del 2026)</w:t>
-      </w:r>
-    </w:p>
-    <w:p>
-      <w:pPr>
-        <w:jc w:val="both"/>
-      </w:pPr>
-      <w:r>
-        <w:t>El 20 de Abril, comencé a trabajar en el sistema para confirmar que el rompecabezas esté formado, pero por los modelos que estoy usando, no sé exactamente si está funcionando hasta que tenga los modelos correctos.</w:t>
-      </w:r>
-      <w:r>
-        <w:t xml:space="preserve"> El 21 de Abril hubo retroalimentación por parte de Yoás, para las runas no hay que aplicar los botones, pero el sistema de victoria está bien, ahora hay que idear una forma para implementar las puertas.</w:t>
-      </w:r>
-      <w:r>
-        <w:t xml:space="preserve"> El 22 de Abril se comenzó la implementación de las puertas, las cuales funcionarán como forma de medir el progreso del jugador.</w:t>
-      </w:r>
-      <w:r>
-        <w:t xml:space="preserve"> El 23 de Abril se comenzó a implementar el contador para finalizar el nivel.</w:t>
-      </w:r>
-      <w:r>
-        <w:t xml:space="preserve"> El 24 de Abril se arregló la funcionalidad del contador, además de que se activan interfaces en base al resultado de las rotaciones. La siguiente semana comienzo a implementar un objeto que aumente la intensidad </w:t>
+        <w:t xml:space="preserve">El 13 de </w:t>
+      </w:r>
+      <w:proofErr w:type="gramStart"/>
+      <w:r>
+        <w:t>Abril</w:t>
+      </w:r>
+      <w:proofErr w:type="gramEnd"/>
+      <w:r>
+        <w:t xml:space="preserve">, comencé a trabajar con los modelos de las naves; debo configurarlos para una actividad que se tendrá por parte de </w:t>
+      </w:r>
+      <w:proofErr w:type="spellStart"/>
+      <w:r>
+        <w:t>Amerike</w:t>
+      </w:r>
+      <w:proofErr w:type="spellEnd"/>
+      <w:r>
+        <w:t>.</w:t>
+      </w:r>
+      <w:r>
+        <w:t xml:space="preserve"> El 14 de </w:t>
+      </w:r>
+      <w:proofErr w:type="gramStart"/>
+      <w:r>
+        <w:t>Abril</w:t>
+      </w:r>
+      <w:proofErr w:type="gramEnd"/>
+      <w:r>
+        <w:t xml:space="preserve"> terminé de configurar los modelos y limpié un poco el código y los </w:t>
+      </w:r>
+      <w:proofErr w:type="spellStart"/>
+      <w:r>
+        <w:t>Assets</w:t>
+      </w:r>
+      <w:proofErr w:type="spellEnd"/>
+      <w:r>
+        <w:t xml:space="preserve"> para la muestra del día siguiente.</w:t>
+      </w:r>
+      <w:r>
+        <w:t xml:space="preserve"> El 15 de </w:t>
+      </w:r>
+      <w:proofErr w:type="gramStart"/>
+      <w:r>
+        <w:t>Abril</w:t>
+      </w:r>
+      <w:proofErr w:type="gramEnd"/>
+      <w:r>
+        <w:t xml:space="preserve"> realicé unos ajustes a la cámara del jugador y alisté todo para la muestra de </w:t>
+      </w:r>
+      <w:proofErr w:type="spellStart"/>
+      <w:r>
+        <w:t>Amerike</w:t>
+      </w:r>
+      <w:proofErr w:type="spellEnd"/>
+      <w:r>
+        <w:t xml:space="preserve">. El 16 de </w:t>
+      </w:r>
+      <w:proofErr w:type="gramStart"/>
+      <w:r>
+        <w:t>Abril</w:t>
+      </w:r>
+      <w:proofErr w:type="gramEnd"/>
+      <w:r>
+        <w:t xml:space="preserve"> fue la muestra, hubo problemas con la Etiqueta Player, ya fue solucionado pero al menos en la muestra se tuvo ese problema. El 17 de </w:t>
+      </w:r>
+      <w:proofErr w:type="gramStart"/>
+      <w:r>
+        <w:t>Abril</w:t>
+      </w:r>
+      <w:proofErr w:type="gramEnd"/>
+      <w:r>
+        <w:t xml:space="preserve"> se comenzó a probar las mecánicas del segundo </w:t>
+      </w:r>
+      <w:proofErr w:type="spellStart"/>
+      <w:r>
+        <w:t>minijuego</w:t>
+      </w:r>
+      <w:proofErr w:type="spellEnd"/>
+      <w:r>
+        <w:t>, este toma en cuenta la rotación de la muñeca del jugador para poder rotar las piezas del rompecabezas.</w:t>
+      </w:r>
+    </w:p>
+    <w:p>
+      <w:pPr>
+        <w:jc w:val="both"/>
+        <w:rPr>
+          <w:b/>
+        </w:rPr>
+      </w:pPr>
+      <w:r>
+        <w:rPr>
+          <w:b/>
+        </w:rPr>
+        <w:t xml:space="preserve">Semana 10 (20 de </w:t>
+      </w:r>
+      <w:proofErr w:type="gramStart"/>
+      <w:r>
+        <w:rPr>
+          <w:b/>
+        </w:rPr>
+        <w:t>Abril</w:t>
+      </w:r>
+      <w:proofErr w:type="gramEnd"/>
+      <w:r>
+        <w:rPr>
+          <w:b/>
+        </w:rPr>
+        <w:t xml:space="preserve"> del 2026 al 24 de Abril del 2026)</w:t>
+      </w:r>
+    </w:p>
+    <w:p>
+      <w:pPr>
+        <w:jc w:val="both"/>
+      </w:pPr>
+      <w:r>
+        <w:t xml:space="preserve">El 20 de </w:t>
+      </w:r>
+      <w:proofErr w:type="gramStart"/>
+      <w:r>
+        <w:t>Abril</w:t>
+      </w:r>
+      <w:proofErr w:type="gramEnd"/>
+      <w:r>
+        <w:t>, comencé a trabajar en el sistema para confirmar que el rompecabezas esté formado, pero por los modelos que estoy usando, no sé exactamente si está funcionando hasta que tenga los modelos correctos.</w:t>
+      </w:r>
+      <w:r>
+        <w:t xml:space="preserve"> El 21 de </w:t>
+      </w:r>
+      <w:proofErr w:type="gramStart"/>
+      <w:r>
+        <w:t>Abril</w:t>
+      </w:r>
+      <w:proofErr w:type="gramEnd"/>
+      <w:r>
+        <w:t xml:space="preserve"> hubo retroalimentación por parte de </w:t>
+      </w:r>
+      <w:proofErr w:type="spellStart"/>
+      <w:r>
+        <w:t>Yoás</w:t>
+      </w:r>
+      <w:proofErr w:type="spellEnd"/>
+      <w:r>
+        <w:t>, para las runas no hay que aplicar los botones, pero el sistema de victoria está bien, ahora hay que idear una forma para implementar las puertas.</w:t>
+      </w:r>
+      <w:r>
+        <w:t xml:space="preserve"> El 22 de </w:t>
+      </w:r>
+      <w:proofErr w:type="gramStart"/>
+      <w:r>
+        <w:t>Abril</w:t>
+      </w:r>
+      <w:proofErr w:type="gramEnd"/>
+      <w:r>
+        <w:t xml:space="preserve"> se comenzó la implementación de las puertas, las cuales funcionarán como forma de medir el progreso del jugador.</w:t>
+      </w:r>
+      <w:r>
+        <w:t xml:space="preserve"> El 23 de </w:t>
+      </w:r>
+      <w:proofErr w:type="gramStart"/>
+      <w:r>
+        <w:t>Abril</w:t>
+      </w:r>
+      <w:proofErr w:type="gramEnd"/>
+      <w:r>
+        <w:t xml:space="preserve"> se comenzó a implementar el contador para finalizar el nivel.</w:t>
+      </w:r>
+      <w:r>
+        <w:t xml:space="preserve"> El 24 de </w:t>
+      </w:r>
+      <w:proofErr w:type="gramStart"/>
+      <w:r>
+        <w:t>Abril</w:t>
+      </w:r>
+      <w:proofErr w:type="gramEnd"/>
+      <w:r>
+        <w:t xml:space="preserve"> se arregló la funcionalidad del contador, además de que se activan interfaces en base al resultado de las rotaciones. La siguiente semana comienzo a implementar un objeto que aumente la intensidad </w:t>
       </w:r>
       <w:r>
         <w:lastRenderedPageBreak/>
@@ -352,7 +1046,21 @@
         <w:rPr>
           <w:b/>
         </w:rPr>
-        <w:t>Semana 11 (27 de Abril del 2026 al 30 de Abril</w:t>
+        <w:t xml:space="preserve">Semana 11 (27 de </w:t>
+      </w:r>
+      <w:proofErr w:type="gramStart"/>
+      <w:r>
+        <w:rPr>
+          <w:b/>
+        </w:rPr>
+        <w:t>Abril</w:t>
+      </w:r>
+      <w:proofErr w:type="gramEnd"/>
+      <w:r>
+        <w:rPr>
+          <w:b/>
+        </w:rPr>
+        <w:t xml:space="preserve"> del 2026 al 30 de Abril</w:t>
       </w:r>
       <w:r>
         <w:rPr>
@@ -372,44 +1080,130 @@
         <w:jc w:val="both"/>
       </w:pPr>
       <w:r>
-        <w:t>El 27 de Abril, comencé a implementar la iluminación de un objeto para darle un efecto de premio.</w:t>
-      </w:r>
-      <w:r>
-        <w:t xml:space="preserve"> El 28 de Abril, comencé a hacer ajustes para la interfaz, en la semana debo ver si cuando el jugador pierda, se reinicia toda la partida o solo el escenario.</w:t>
-      </w:r>
-      <w:r>
-        <w:t xml:space="preserve"> El 30 de Abril recibí comentarios de Yoas para continuar con mi implementación de las piezas del rompecabezas por separada en lugar de juntas, así como poner limitaciones para las piezas.</w:t>
-      </w:r>
-    </w:p>
-    <w:p>
-      <w:pPr>
-        <w:jc w:val="both"/>
-        <w:rPr>
-          <w:b/>
-        </w:rPr>
-      </w:pPr>
-      <w:r>
-        <w:rPr>
-          <w:b/>
-        </w:rPr>
-        <w:t>Semana 12 (04 de Mayo del 2026 al 08 de Mayo del 2026)</w:t>
-      </w:r>
-    </w:p>
-    <w:p>
-      <w:pPr>
-        <w:jc w:val="both"/>
-      </w:pPr>
-      <w:r>
-        <w:t>El 04 de Mayo implementé los botones para continuar la partida o reiniciar el nivel en caso de que termine el tiempo.</w:t>
-      </w:r>
-      <w:r>
-        <w:t xml:space="preserve"> El 05 de Mayo implementé un límite de rotación para cada pieza del rompecabezas para que el paciente tenga que interactuar varias veces y pueda trabajar en la rotación de su muñeca.</w:t>
-      </w:r>
-      <w:r>
-        <w:t xml:space="preserve"> El 06 de Mayo implementé un menú general para los 4 minijuegos.</w:t>
-      </w:r>
-      <w:r>
-        <w:t xml:space="preserve"> El 7 y 8 de Mayo </w:t>
+        <w:t xml:space="preserve">El 27 de </w:t>
+      </w:r>
+      <w:proofErr w:type="gramStart"/>
+      <w:r>
+        <w:t>Abril</w:t>
+      </w:r>
+      <w:proofErr w:type="gramEnd"/>
+      <w:r>
+        <w:t>, comencé a implementar la iluminación de un objeto para darle un efecto de premio.</w:t>
+      </w:r>
+      <w:r>
+        <w:t xml:space="preserve"> El 28 de </w:t>
+      </w:r>
+      <w:proofErr w:type="gramStart"/>
+      <w:r>
+        <w:t>Abril</w:t>
+      </w:r>
+      <w:proofErr w:type="gramEnd"/>
+      <w:r>
+        <w:t>, comencé a hacer ajustes para la interfaz, en la semana debo ver si cuando el jugador pierda, se reinicia toda la partida o solo el escenario.</w:t>
+      </w:r>
+      <w:r>
+        <w:t xml:space="preserve"> El 30 de </w:t>
+      </w:r>
+      <w:proofErr w:type="gramStart"/>
+      <w:r>
+        <w:t>Abril</w:t>
+      </w:r>
+      <w:proofErr w:type="gramEnd"/>
+      <w:r>
+        <w:t xml:space="preserve"> recibí comentarios de </w:t>
+      </w:r>
+      <w:proofErr w:type="spellStart"/>
+      <w:r>
+        <w:t>Yoas</w:t>
+      </w:r>
+      <w:proofErr w:type="spellEnd"/>
+      <w:r>
+        <w:t xml:space="preserve"> para continuar con mi implementación de las piezas del rompecabezas por separada en lugar de juntas, así como poner limitaciones para las piezas.</w:t>
+      </w:r>
+    </w:p>
+    <w:p>
+      <w:pPr>
+        <w:jc w:val="both"/>
+        <w:rPr>
+          <w:b/>
+        </w:rPr>
+      </w:pPr>
+      <w:r>
+        <w:rPr>
+          <w:b/>
+        </w:rPr>
+        <w:t xml:space="preserve">Semana 12 (04 de </w:t>
+      </w:r>
+      <w:proofErr w:type="gramStart"/>
+      <w:r>
+        <w:rPr>
+          <w:b/>
+        </w:rPr>
+        <w:t>Mayo</w:t>
+      </w:r>
+      <w:proofErr w:type="gramEnd"/>
+      <w:r>
+        <w:rPr>
+          <w:b/>
+        </w:rPr>
+        <w:t xml:space="preserve"> del 2026 al 08 de Mayo del 2026)</w:t>
+      </w:r>
+    </w:p>
+    <w:p>
+      <w:pPr>
+        <w:jc w:val="both"/>
+      </w:pPr>
+      <w:r>
+        <w:t xml:space="preserve">El 04 de </w:t>
+      </w:r>
+      <w:proofErr w:type="gramStart"/>
+      <w:r>
+        <w:t>Mayo</w:t>
+      </w:r>
+      <w:proofErr w:type="gramEnd"/>
+      <w:r>
+        <w:t xml:space="preserve"> implementé los botones para continuar la partida o reiniciar el nivel en caso de que termine el tiempo.</w:t>
+      </w:r>
+      <w:r>
+        <w:t xml:space="preserve"> El 05 de </w:t>
+      </w:r>
+      <w:proofErr w:type="gramStart"/>
+      <w:r>
+        <w:t>Mayo</w:t>
+      </w:r>
+      <w:proofErr w:type="gramEnd"/>
+      <w:r>
+        <w:t xml:space="preserve"> implementé un límite de rotación para cada pieza del rompecabezas para que el paciente tenga que interactuar varias veces y pueda trabajar en la rotación de su muñeca.</w:t>
+      </w:r>
+      <w:r>
+        <w:t xml:space="preserve"> El 06 de </w:t>
+      </w:r>
+      <w:proofErr w:type="gramStart"/>
+      <w:r>
+        <w:t>Mayo</w:t>
+      </w:r>
+      <w:proofErr w:type="gramEnd"/>
+      <w:r>
+        <w:t xml:space="preserve"> implementé un menú general para los 4 </w:t>
+      </w:r>
+      <w:proofErr w:type="spellStart"/>
+      <w:r>
+        <w:t>minijuegos</w:t>
+      </w:r>
+      <w:proofErr w:type="spellEnd"/>
+      <w:r>
+        <w:t>.</w:t>
+      </w:r>
+      <w:r>
+        <w:t xml:space="preserve"> El 7 y 8 de </w:t>
+      </w:r>
+      <w:proofErr w:type="gramStart"/>
+      <w:r>
+        <w:t>Mayo</w:t>
+      </w:r>
+      <w:proofErr w:type="gramEnd"/>
+      <w:r>
+        <w:t xml:space="preserve"> </w:t>
       </w:r>
       <w:r>
         <w:t>continué</w:t>
@@ -421,62 +1215,173 @@
         <w:t>do</w:t>
       </w:r>
       <w:r>
-        <w:t xml:space="preserve"> el menú de los 4 minijuegos, procuré que el paciente tenga la opción de girar a otros lados para cambiar entre realidad aumentada y mixta.</w:t>
-      </w:r>
-    </w:p>
-    <w:p>
-      <w:pPr>
-        <w:jc w:val="both"/>
-        <w:rPr>
-          <w:b/>
-        </w:rPr>
-      </w:pPr>
-      <w:r>
-        <w:rPr>
-          <w:b/>
-        </w:rPr>
-        <w:t>Semana 13 (11 de Mayo del 2026 al 14 de Mayo del 2026)</w:t>
-      </w:r>
-    </w:p>
-    <w:p>
-      <w:pPr>
-        <w:jc w:val="both"/>
-      </w:pPr>
-      <w:r>
-        <w:t>El 11 de Mayo terminé la implementación del botón para alternar de realidad desde el menú general; comenzaré a ver el prototipo del tercer minijuego.</w:t>
-      </w:r>
-      <w:r>
-        <w:t xml:space="preserve"> El 12 de Mayo comencé a implementar una forma para que la dificultad de los niveles aumente en base al tiempo que tarda el paciente en resolver el rompecabezas.</w:t>
-      </w:r>
-      <w:r>
-        <w:t xml:space="preserve"> El 14 de Mayo mejoré los Colliders de las Naves y añadí las nuevas texturas que hizo mi compañera Yael.</w:t>
-      </w:r>
-    </w:p>
-    <w:p>
-      <w:pPr>
-        <w:jc w:val="both"/>
-        <w:rPr>
-          <w:b/>
-        </w:rPr>
-      </w:pPr>
-      <w:r>
-        <w:rPr>
-          <w:b/>
-        </w:rPr>
-        <w:t>Semana 14 (18 de Mayo del 2026 al 22 de Mayo del 2026)</w:t>
-      </w:r>
-    </w:p>
-    <w:p>
-      <w:pPr>
-        <w:jc w:val="both"/>
-      </w:pPr>
-      <w:r>
-        <w:t>El 18 de Mayo comencé a ver las animaciones de las naves destruidas para el primer mini</w:t>
+        <w:t xml:space="preserve"> el menú de los 4 </w:t>
+      </w:r>
+      <w:proofErr w:type="spellStart"/>
+      <w:r>
+        <w:t>minijuegos</w:t>
+      </w:r>
+      <w:proofErr w:type="spellEnd"/>
+      <w:r>
+        <w:t>, procuré que el paciente tenga la opción de girar a otros lados para cambiar entre realidad aumentada y mixta.</w:t>
+      </w:r>
+    </w:p>
+    <w:p>
+      <w:pPr>
+        <w:jc w:val="both"/>
+        <w:rPr>
+          <w:b/>
+        </w:rPr>
+      </w:pPr>
+      <w:r>
+        <w:rPr>
+          <w:b/>
+        </w:rPr>
+        <w:t xml:space="preserve">Semana 13 (11 de </w:t>
+      </w:r>
+      <w:proofErr w:type="gramStart"/>
+      <w:r>
+        <w:rPr>
+          <w:b/>
+        </w:rPr>
+        <w:t>Mayo</w:t>
+      </w:r>
+      <w:proofErr w:type="gramEnd"/>
+      <w:r>
+        <w:rPr>
+          <w:b/>
+        </w:rPr>
+        <w:t xml:space="preserve"> del 2026 al 14 de Mayo del 2026)</w:t>
+      </w:r>
+    </w:p>
+    <w:p>
+      <w:pPr>
+        <w:jc w:val="both"/>
+      </w:pPr>
+      <w:r>
+        <w:t xml:space="preserve">El 11 de </w:t>
+      </w:r>
+      <w:proofErr w:type="gramStart"/>
+      <w:r>
+        <w:t>Mayo</w:t>
+      </w:r>
+      <w:proofErr w:type="gramEnd"/>
+      <w:r>
+        <w:t xml:space="preserve"> terminé la implementación del botón para alternar de realidad desde el menú general; comenzaré a ver el prototipo del tercer </w:t>
+      </w:r>
+      <w:proofErr w:type="spellStart"/>
+      <w:r>
+        <w:t>minijuego</w:t>
+      </w:r>
+      <w:proofErr w:type="spellEnd"/>
+      <w:r>
+        <w:t>.</w:t>
+      </w:r>
+      <w:r>
+        <w:t xml:space="preserve"> El 12 de </w:t>
+      </w:r>
+      <w:proofErr w:type="gramStart"/>
+      <w:r>
+        <w:t>Mayo</w:t>
+      </w:r>
+      <w:proofErr w:type="gramEnd"/>
+      <w:r>
+        <w:t xml:space="preserve"> comencé a implementar una forma para que la dificultad de los niveles aumente en base al tiempo que tarda el paciente en resolver el rompecabezas.</w:t>
+      </w:r>
+      <w:r>
+        <w:t xml:space="preserve"> El 14 de </w:t>
+      </w:r>
+      <w:proofErr w:type="gramStart"/>
+      <w:r>
+        <w:t>Mayo</w:t>
+      </w:r>
+      <w:proofErr w:type="gramEnd"/>
+      <w:r>
+        <w:t xml:space="preserve"> mejoré los </w:t>
+      </w:r>
+      <w:proofErr w:type="spellStart"/>
+      <w:r>
+        <w:t>Colliders</w:t>
+      </w:r>
+      <w:proofErr w:type="spellEnd"/>
+      <w:r>
+        <w:t xml:space="preserve"> de las Naves y añadí las nuevas texturas que hizo mi compañera </w:t>
+      </w:r>
+      <w:proofErr w:type="spellStart"/>
+      <w:r>
+        <w:t>Yael</w:t>
+      </w:r>
+      <w:proofErr w:type="spellEnd"/>
+      <w:r>
+        <w:t>.</w:t>
+      </w:r>
+    </w:p>
+    <w:p>
+      <w:pPr>
+        <w:jc w:val="both"/>
+        <w:rPr>
+          <w:b/>
+        </w:rPr>
+      </w:pPr>
+      <w:r>
+        <w:rPr>
+          <w:b/>
+        </w:rPr>
+        <w:t xml:space="preserve">Semana 14 (18 de </w:t>
+      </w:r>
+      <w:proofErr w:type="gramStart"/>
+      <w:r>
+        <w:rPr>
+          <w:b/>
+        </w:rPr>
+        <w:t>Mayo</w:t>
+      </w:r>
+      <w:proofErr w:type="gramEnd"/>
+      <w:r>
+        <w:rPr>
+          <w:b/>
+        </w:rPr>
+        <w:t xml:space="preserve"> del 2026 al 22 de Mayo del 2026)</w:t>
+      </w:r>
+    </w:p>
+    <w:p>
+      <w:pPr>
+        <w:jc w:val="both"/>
+      </w:pPr>
+      <w:r>
+        <w:t xml:space="preserve">El 18 de </w:t>
+      </w:r>
+      <w:proofErr w:type="gramStart"/>
+      <w:r>
+        <w:t>Mayo</w:t>
+      </w:r>
+      <w:proofErr w:type="gramEnd"/>
+      <w:r>
+        <w:t xml:space="preserve"> comencé a ver las animaciones de las naves destruidas para el primer </w:t>
+      </w:r>
+      <w:proofErr w:type="spellStart"/>
+      <w:r>
+        <w:t>minijuego</w:t>
+      </w:r>
+      <w:proofErr w:type="spellEnd"/>
+      <w:r>
+        <w:t>.</w:t>
+      </w:r>
+      <w:r>
+        <w:t xml:space="preserve"> El 19 de </w:t>
+      </w:r>
+      <w:proofErr w:type="gramStart"/>
+      <w:r>
+        <w:t>Mayo</w:t>
+      </w:r>
+      <w:proofErr w:type="gramEnd"/>
+      <w:r>
+        <w:t xml:space="preserve"> implementé las animaciones de las naves destruidas así como su comportamiento al momento de que el paciente</w:t>
       </w:r>
       <w:bookmarkStart w:id="0" w:name="_GoBack"/>
       <w:bookmarkEnd w:id="0"/>
       <w:r>
-        <w:t>juego.</w:t>
+        <w:t xml:space="preserve"> interactúa con ellas.</w:t>
       </w:r>
     </w:p>
     <w:sectPr>

</xml_diff>

<commit_message>
Implementacion de la alerta en el segundo minijuego
</commit_message>
<xml_diff>
--- a/ReporteActividades.docx
+++ b/ReporteActividades.docx
@@ -13,85 +13,322 @@
         <w:rPr>
           <w:b/>
         </w:rPr>
-        <w:t>Semana 1 (09 de Febrero de 2026 a 13 de Febrero de 2026)</w:t>
-      </w:r>
-    </w:p>
-    <w:p>
-      <w:pPr>
-        <w:jc w:val="both"/>
-      </w:pPr>
-      <w:r>
-        <w:t>El primer día se inició con el desarrollo de un Roll A Ball, principalmente para familiarizarse con el entorno de Unity. El mismo día se terminó el tutorial, pero al día siguiente se volvió a iniciar, ya que la versión utilizada</w:t>
-      </w:r>
-      <w:r>
-        <w:t xml:space="preserve"> de Unity no era la solicitada por Yoá</w:t>
-      </w:r>
-      <w:r>
-        <w:t xml:space="preserve">s. </w:t>
-      </w:r>
-      <w:r>
-        <w:t>El 11 de Febrero se comenzó con el desarrollo de la segunda escena, que era casi la primera escena pero se tenían que implementar enemigos, plataformas, vidas, monedas, spawners y plataformas. El 12 de Febrero se implementó la Lava, la cual tenía que cambiar de color cada 5 segundos. El 13 de Febrero se estuvo haciendo en los spawners de enemigos y monedas.</w:t>
-      </w:r>
-    </w:p>
-    <w:p>
-      <w:pPr>
-        <w:jc w:val="both"/>
-        <w:rPr>
-          <w:b/>
-        </w:rPr>
-      </w:pPr>
-      <w:r>
-        <w:rPr>
-          <w:b/>
-        </w:rPr>
-        <w:t>Semana 2 (16 de Febrero de 2026 a 20 de Febrero de 2026)</w:t>
-      </w:r>
-    </w:p>
-    <w:p>
-      <w:pPr>
-        <w:jc w:val="both"/>
-      </w:pPr>
-      <w:r>
-        <w:t>El 16 de Febrero se comenzó con la implementación de las escenas, los menús de pausa y cambios de escenas. Se completó el desarrollo de Roll A Ball. El 17 de Febrero Yoás le dio visto bueno al demo y pasé a familiarizarme con el e</w:t>
-      </w:r>
-      <w:r>
-        <w:t>ntorno de Meta Quest 3S. Si bien el 17 y 18 de Febrero estuve trabajando en un demo para saber como funcionan los controles, por problemas de hardware en el equipo donde estaba trabajando en el LANR, no podía probar lo que había hecho. El 19 de Febrero comencé a trabajar en el Anexo, ya que había un equipo disponible con una tarjeta gráfica compatible con el software de Meta Horizon Link, después de configurar el entorno, finalmente pude probar lo que había desarrollado los días pasados. El 19 de Febrero comencé a experimentar con los Building Blocks de Hand Tracking, algo necesario para evitar la necesidad de usar los controles de los lentes, solo interacción con las manos.</w:t>
-      </w:r>
-    </w:p>
-    <w:p>
-      <w:pPr>
-        <w:jc w:val="both"/>
-        <w:rPr>
-          <w:b/>
-        </w:rPr>
-      </w:pPr>
-      <w:r>
-        <w:rPr>
-          <w:b/>
-        </w:rPr>
-        <w:t>Semana 3 (23 de Febrero de 2026 a 27 de Febrero de 2026)</w:t>
-      </w:r>
-    </w:p>
-    <w:p>
-      <w:pPr>
-        <w:jc w:val="both"/>
-      </w:pPr>
-      <w:r>
-        <w:t>Lesly, una compañera que trabajaba en el Anexo iba a ocupar la computadora donde iba a estar trabajando, así que no asistí hasta el Jueves 26 de Febrero. Los días restantes de la semana me dediqué a terminar el demo y prácticar el cambio de escenas con interacción en UI haciendo uso de Hand Tracking.</w:t>
-      </w:r>
-    </w:p>
-    <w:p>
-      <w:pPr>
-        <w:jc w:val="both"/>
-        <w:rPr>
-          <w:b/>
-        </w:rPr>
-      </w:pPr>
-      <w:r>
-        <w:rPr>
-          <w:b/>
-        </w:rPr>
-        <w:t xml:space="preserve">Semana 4 (02 de Marzo del 2026 a </w:t>
+        <w:t xml:space="preserve">Semana 1 (09 de </w:t>
+      </w:r>
+      <w:proofErr w:type="gramStart"/>
+      <w:r>
+        <w:rPr>
+          <w:b/>
+        </w:rPr>
+        <w:t>Febrero</w:t>
+      </w:r>
+      <w:proofErr w:type="gramEnd"/>
+      <w:r>
+        <w:rPr>
+          <w:b/>
+        </w:rPr>
+        <w:t xml:space="preserve"> de 2026 a 13 de Febrero de 2026)</w:t>
+      </w:r>
+    </w:p>
+    <w:p>
+      <w:pPr>
+        <w:jc w:val="both"/>
+      </w:pPr>
+      <w:r>
+        <w:t xml:space="preserve">El primer día se inició con el desarrollo de un Roll A </w:t>
+      </w:r>
+      <w:proofErr w:type="spellStart"/>
+      <w:r>
+        <w:t>Ball</w:t>
+      </w:r>
+      <w:proofErr w:type="spellEnd"/>
+      <w:r>
+        <w:t xml:space="preserve">, principalmente para familiarizarse con el entorno de </w:t>
+      </w:r>
+      <w:proofErr w:type="spellStart"/>
+      <w:r>
+        <w:t>Unity</w:t>
+      </w:r>
+      <w:proofErr w:type="spellEnd"/>
+      <w:r>
+        <w:t>. El mismo día se terminó el tutorial, pero al día siguiente se volvió a iniciar, ya que la versión utilizada</w:t>
+      </w:r>
+      <w:r>
+        <w:t xml:space="preserve"> de </w:t>
+      </w:r>
+      <w:proofErr w:type="spellStart"/>
+      <w:r>
+        <w:t>Unity</w:t>
+      </w:r>
+      <w:proofErr w:type="spellEnd"/>
+      <w:r>
+        <w:t xml:space="preserve"> no era la solicitada por </w:t>
+      </w:r>
+      <w:proofErr w:type="spellStart"/>
+      <w:r>
+        <w:t>Yoá</w:t>
+      </w:r>
+      <w:r>
+        <w:t>s</w:t>
+      </w:r>
+      <w:proofErr w:type="spellEnd"/>
+      <w:r>
+        <w:t xml:space="preserve">. </w:t>
+      </w:r>
+      <w:r>
+        <w:t xml:space="preserve">El 11 de </w:t>
+      </w:r>
+      <w:proofErr w:type="gramStart"/>
+      <w:r>
+        <w:t>Febrero</w:t>
+      </w:r>
+      <w:proofErr w:type="gramEnd"/>
+      <w:r>
+        <w:t xml:space="preserve"> se comenzó con el desarrollo de la segunda escena, que era casi la primera escena pero se tenían que implementar enemigos, plataformas, vidas, monedas, </w:t>
+      </w:r>
+      <w:proofErr w:type="spellStart"/>
+      <w:r>
+        <w:t>spawners</w:t>
+      </w:r>
+      <w:proofErr w:type="spellEnd"/>
+      <w:r>
+        <w:t xml:space="preserve"> y plataformas. El 12 de </w:t>
+      </w:r>
+      <w:proofErr w:type="gramStart"/>
+      <w:r>
+        <w:t>Febrero</w:t>
+      </w:r>
+      <w:proofErr w:type="gramEnd"/>
+      <w:r>
+        <w:t xml:space="preserve"> se implementó la Lava, la cual tenía que cambiar de color cada 5 segundos. El 13 de </w:t>
+      </w:r>
+      <w:proofErr w:type="gramStart"/>
+      <w:r>
+        <w:t>Febrero</w:t>
+      </w:r>
+      <w:proofErr w:type="gramEnd"/>
+      <w:r>
+        <w:t xml:space="preserve"> se estuvo haciendo en los </w:t>
+      </w:r>
+      <w:proofErr w:type="spellStart"/>
+      <w:r>
+        <w:t>spawners</w:t>
+      </w:r>
+      <w:proofErr w:type="spellEnd"/>
+      <w:r>
+        <w:t xml:space="preserve"> de enemigos y monedas.</w:t>
+      </w:r>
+    </w:p>
+    <w:p>
+      <w:pPr>
+        <w:jc w:val="both"/>
+        <w:rPr>
+          <w:b/>
+        </w:rPr>
+      </w:pPr>
+      <w:r>
+        <w:rPr>
+          <w:b/>
+        </w:rPr>
+        <w:t xml:space="preserve">Semana 2 (16 de </w:t>
+      </w:r>
+      <w:proofErr w:type="gramStart"/>
+      <w:r>
+        <w:rPr>
+          <w:b/>
+        </w:rPr>
+        <w:t>Febrero</w:t>
+      </w:r>
+      <w:proofErr w:type="gramEnd"/>
+      <w:r>
+        <w:rPr>
+          <w:b/>
+        </w:rPr>
+        <w:t xml:space="preserve"> de 2026 a 20 de Febrero de 2026)</w:t>
+      </w:r>
+    </w:p>
+    <w:p>
+      <w:pPr>
+        <w:jc w:val="both"/>
+      </w:pPr>
+      <w:r>
+        <w:t xml:space="preserve">El 16 de </w:t>
+      </w:r>
+      <w:proofErr w:type="gramStart"/>
+      <w:r>
+        <w:t>Febrero</w:t>
+      </w:r>
+      <w:proofErr w:type="gramEnd"/>
+      <w:r>
+        <w:t xml:space="preserve"> se comenzó con la implementación de las escenas, los menús de pausa y cambios de escenas. Se completó el desarrollo de Roll A </w:t>
+      </w:r>
+      <w:proofErr w:type="spellStart"/>
+      <w:r>
+        <w:t>Ball</w:t>
+      </w:r>
+      <w:proofErr w:type="spellEnd"/>
+      <w:r>
+        <w:t xml:space="preserve">. El 17 de </w:t>
+      </w:r>
+      <w:proofErr w:type="gramStart"/>
+      <w:r>
+        <w:t>Febrero</w:t>
+      </w:r>
+      <w:proofErr w:type="gramEnd"/>
+      <w:r>
+        <w:t xml:space="preserve"> </w:t>
+      </w:r>
+      <w:proofErr w:type="spellStart"/>
+      <w:r>
+        <w:t>Yoás</w:t>
+      </w:r>
+      <w:proofErr w:type="spellEnd"/>
+      <w:r>
+        <w:t xml:space="preserve"> le dio visto bueno al demo y pasé a familiarizarme con el e</w:t>
+      </w:r>
+      <w:r>
+        <w:t xml:space="preserve">ntorno de Meta </w:t>
+      </w:r>
+      <w:proofErr w:type="spellStart"/>
+      <w:r>
+        <w:t>Quest</w:t>
+      </w:r>
+      <w:proofErr w:type="spellEnd"/>
+      <w:r>
+        <w:t xml:space="preserve"> 3S. Si bien el 17 y 18 de </w:t>
+      </w:r>
+      <w:proofErr w:type="gramStart"/>
+      <w:r>
+        <w:t>Febrero</w:t>
+      </w:r>
+      <w:proofErr w:type="gramEnd"/>
+      <w:r>
+        <w:t xml:space="preserve"> estuve trabajando en un demo para saber </w:t>
+      </w:r>
+      <w:proofErr w:type="spellStart"/>
+      <w:r>
+        <w:t>como</w:t>
+      </w:r>
+      <w:proofErr w:type="spellEnd"/>
+      <w:r>
+        <w:t xml:space="preserve"> funcionan los controles, por problemas de hardware en el equipo donde estaba trabajando en el LANR, no podía probar lo que había hecho. El 19 de </w:t>
+      </w:r>
+      <w:proofErr w:type="gramStart"/>
+      <w:r>
+        <w:t>Febrero</w:t>
+      </w:r>
+      <w:proofErr w:type="gramEnd"/>
+      <w:r>
+        <w:t xml:space="preserve"> comencé a trabajar en el Anexo, ya que había un equipo disponible con una tarjeta gráfica compatible con el software de Meta </w:t>
+      </w:r>
+      <w:proofErr w:type="spellStart"/>
+      <w:r>
+        <w:t>Horizon</w:t>
+      </w:r>
+      <w:proofErr w:type="spellEnd"/>
+      <w:r>
+        <w:t xml:space="preserve"> Link, después de configurar el entorno, finalmente pude probar lo que había desarrollado los días pasados. El 19 de </w:t>
+      </w:r>
+      <w:proofErr w:type="gramStart"/>
+      <w:r>
+        <w:t>Febrero</w:t>
+      </w:r>
+      <w:proofErr w:type="gramEnd"/>
+      <w:r>
+        <w:t xml:space="preserve"> comencé a experimentar con los </w:t>
+      </w:r>
+      <w:proofErr w:type="spellStart"/>
+      <w:r>
+        <w:t>Building</w:t>
+      </w:r>
+      <w:proofErr w:type="spellEnd"/>
+      <w:r>
+        <w:t xml:space="preserve"> Blocks de Hand Tracking, algo necesario para evitar la necesidad de usar los controles de los lentes, solo interacción con las manos.</w:t>
+      </w:r>
+    </w:p>
+    <w:p>
+      <w:pPr>
+        <w:jc w:val="both"/>
+        <w:rPr>
+          <w:b/>
+        </w:rPr>
+      </w:pPr>
+      <w:r>
+        <w:rPr>
+          <w:b/>
+        </w:rPr>
+        <w:t xml:space="preserve">Semana 3 (23 de </w:t>
+      </w:r>
+      <w:proofErr w:type="gramStart"/>
+      <w:r>
+        <w:rPr>
+          <w:b/>
+        </w:rPr>
+        <w:t>Febrero</w:t>
+      </w:r>
+      <w:proofErr w:type="gramEnd"/>
+      <w:r>
+        <w:rPr>
+          <w:b/>
+        </w:rPr>
+        <w:t xml:space="preserve"> de 2026 a 27 de Febrero de 2026)</w:t>
+      </w:r>
+    </w:p>
+    <w:p>
+      <w:pPr>
+        <w:jc w:val="both"/>
+      </w:pPr>
+      <w:proofErr w:type="spellStart"/>
+      <w:r>
+        <w:t>Lesly</w:t>
+      </w:r>
+      <w:proofErr w:type="spellEnd"/>
+      <w:r>
+        <w:t xml:space="preserve">, una compañera que trabajaba en el Anexo iba a ocupar la computadora donde iba a estar trabajando, así que no asistí hasta el </w:t>
+      </w:r>
+      <w:proofErr w:type="gramStart"/>
+      <w:r>
+        <w:t>Jueves</w:t>
+      </w:r>
+      <w:proofErr w:type="gramEnd"/>
+      <w:r>
+        <w:t xml:space="preserve"> 26 de Febrero. Los días restantes de la semana me dediqué a terminar el demo y </w:t>
+      </w:r>
+      <w:proofErr w:type="spellStart"/>
+      <w:r>
+        <w:t>prácticar</w:t>
+      </w:r>
+      <w:proofErr w:type="spellEnd"/>
+      <w:r>
+        <w:t xml:space="preserve"> el cambio de escenas con interacción en UI haciendo uso de Hand Tracking.</w:t>
+      </w:r>
+    </w:p>
+    <w:p>
+      <w:pPr>
+        <w:jc w:val="both"/>
+        <w:rPr>
+          <w:b/>
+        </w:rPr>
+      </w:pPr>
+      <w:r>
+        <w:rPr>
+          <w:b/>
+        </w:rPr>
+        <w:t xml:space="preserve">Semana 4 (02 de </w:t>
+      </w:r>
+      <w:proofErr w:type="gramStart"/>
+      <w:r>
+        <w:rPr>
+          <w:b/>
+        </w:rPr>
+        <w:t>Marzo</w:t>
+      </w:r>
+      <w:proofErr w:type="gramEnd"/>
+      <w:r>
+        <w:rPr>
+          <w:b/>
+        </w:rPr>
+        <w:t xml:space="preserve"> del 2026 a </w:t>
       </w:r>
       <w:r>
         <w:rPr>
@@ -105,35 +342,153 @@
         <w:jc w:val="both"/>
       </w:pPr>
       <w:r>
-        <w:t>El 02 de Marzo, Yoás revisó los avances de la semana pasada y me platicó la idea que tenía para la implementación del proyecto, un juego espacial. El 04 de Marzo, después de estar viendo ejemplos de como mover un objeto con hand tracking, Yoás me comentó que la idea era que el paciente o jugador disparen desde sus manos para naves enemigas. El 05 y 06 de Febrero estuve trabajando para que cuando se hiciera la acción de “Pinch”, se disparen diferentes tipos de disparos, también estuve trabajando en los comportamientos de los enemigos, un medidor de supinación, flexión, extensión y pronación.</w:t>
-      </w:r>
-    </w:p>
-    <w:p>
-      <w:pPr>
-        <w:jc w:val="both"/>
-        <w:rPr>
-          <w:b/>
-        </w:rPr>
-      </w:pPr>
-      <w:r>
-        <w:rPr>
-          <w:b/>
-        </w:rPr>
-        <w:t>Semana 5 (09 de Marzo del 2026 a 13 de Febrero de 2026)</w:t>
-      </w:r>
-    </w:p>
-    <w:p>
-      <w:pPr>
-        <w:jc w:val="both"/>
-      </w:pPr>
-      <w:r>
-        <w:t xml:space="preserve">Del 09 de Marzo al 12 de Marzo estuve ajustando el comportamiento del contador de Puntuación, el 12 de Marzo Yoás asistió al Anexo para revisar avances, me comentó que el movimiento de “Pinch” podía ser algo </w:t>
+        <w:t xml:space="preserve">El 02 de </w:t>
+      </w:r>
+      <w:proofErr w:type="gramStart"/>
+      <w:r>
+        <w:t>Marzo</w:t>
+      </w:r>
+      <w:proofErr w:type="gramEnd"/>
+      <w:r>
+        <w:t xml:space="preserve">, </w:t>
+      </w:r>
+      <w:proofErr w:type="spellStart"/>
+      <w:r>
+        <w:t>Yoás</w:t>
+      </w:r>
+      <w:proofErr w:type="spellEnd"/>
+      <w:r>
+        <w:t xml:space="preserve"> revisó los avances de la semana pasada y me platicó la idea que tenía para la implementación del proyecto, un juego espacial. El 04 de </w:t>
+      </w:r>
+      <w:proofErr w:type="gramStart"/>
+      <w:r>
+        <w:t>Marzo</w:t>
+      </w:r>
+      <w:proofErr w:type="gramEnd"/>
+      <w:r>
+        <w:t xml:space="preserve">, después de estar viendo ejemplos de </w:t>
+      </w:r>
+      <w:proofErr w:type="spellStart"/>
+      <w:r>
+        <w:t>como</w:t>
+      </w:r>
+      <w:proofErr w:type="spellEnd"/>
+      <w:r>
+        <w:t xml:space="preserve"> mover un objeto con </w:t>
+      </w:r>
+      <w:proofErr w:type="spellStart"/>
+      <w:r>
+        <w:t>hand</w:t>
+      </w:r>
+      <w:proofErr w:type="spellEnd"/>
+      <w:r>
+        <w:t xml:space="preserve"> tracking, </w:t>
+      </w:r>
+      <w:proofErr w:type="spellStart"/>
+      <w:r>
+        <w:t>Yoás</w:t>
+      </w:r>
+      <w:proofErr w:type="spellEnd"/>
+      <w:r>
+        <w:t xml:space="preserve"> me comentó que la idea era que el paciente o jugador disparen desde sus manos para naves enemigas. El 05 y 06 de </w:t>
+      </w:r>
+      <w:proofErr w:type="gramStart"/>
+      <w:r>
+        <w:t>Febrero</w:t>
+      </w:r>
+      <w:proofErr w:type="gramEnd"/>
+      <w:r>
+        <w:t xml:space="preserve"> estuve trabajando para que cuando se hiciera la acción de “</w:t>
+      </w:r>
+      <w:proofErr w:type="spellStart"/>
+      <w:r>
+        <w:t>Pinch</w:t>
+      </w:r>
+      <w:proofErr w:type="spellEnd"/>
+      <w:r>
+        <w:t>”, se disparen diferentes tipos de disparos, también estuve trabajando en los comportamientos de los enemigos, un medidor de supinación, flexión, extensión y pronación.</w:t>
+      </w:r>
+    </w:p>
+    <w:p>
+      <w:pPr>
+        <w:jc w:val="both"/>
+        <w:rPr>
+          <w:b/>
+        </w:rPr>
+      </w:pPr>
+      <w:r>
+        <w:rPr>
+          <w:b/>
+        </w:rPr>
+        <w:t xml:space="preserve">Semana 5 (09 de </w:t>
+      </w:r>
+      <w:proofErr w:type="gramStart"/>
+      <w:r>
+        <w:rPr>
+          <w:b/>
+        </w:rPr>
+        <w:t>Marzo</w:t>
+      </w:r>
+      <w:proofErr w:type="gramEnd"/>
+      <w:r>
+        <w:rPr>
+          <w:b/>
+        </w:rPr>
+        <w:t xml:space="preserve"> del 2026 a 13 de Febrero de 2026)</w:t>
+      </w:r>
+    </w:p>
+    <w:p>
+      <w:pPr>
+        <w:jc w:val="both"/>
+      </w:pPr>
+      <w:r>
+        <w:t xml:space="preserve">Del 09 de </w:t>
+      </w:r>
+      <w:proofErr w:type="gramStart"/>
+      <w:r>
+        <w:t>Marzo</w:t>
+      </w:r>
+      <w:proofErr w:type="gramEnd"/>
+      <w:r>
+        <w:t xml:space="preserve"> al 12 de Marzo estuve ajustando el comportamiento del contador de Puntuación, el 12 de Marzo </w:t>
+      </w:r>
+      <w:proofErr w:type="spellStart"/>
+      <w:r>
+        <w:t>Yoás</w:t>
+      </w:r>
+      <w:proofErr w:type="spellEnd"/>
+      <w:r>
+        <w:t xml:space="preserve"> asistió al Anexo para revisar avances, me comentó que el movimiento de “</w:t>
+      </w:r>
+      <w:proofErr w:type="spellStart"/>
+      <w:r>
+        <w:t>Pinch</w:t>
+      </w:r>
+      <w:proofErr w:type="spellEnd"/>
+      <w:r>
+        <w:t xml:space="preserve">” podía ser algo </w:t>
       </w:r>
       <w:r>
         <w:t>complicado</w:t>
       </w:r>
       <w:r>
-        <w:t xml:space="preserve"> para los pacientes, así que el jugador ya no tendría que disparar, solo con tocar a los enemigos. El 13 de Marzo me dediqué a que los enemigos se detengan a una distancia del jugador para que este los toque con las manos de hand tracking, pero que desaparezcan si no lo hace en un tiempo determinado.</w:t>
+        <w:t xml:space="preserve"> para los pacientes, así que el jugador ya no tendría que disparar, solo con tocar a los enemigos. El 13 de </w:t>
+      </w:r>
+      <w:proofErr w:type="gramStart"/>
+      <w:r>
+        <w:t>Marzo</w:t>
+      </w:r>
+      <w:proofErr w:type="gramEnd"/>
+      <w:r>
+        <w:t xml:space="preserve"> me dediqué a que los enemigos se detengan a una distancia del jugador para que este los toque con las manos de </w:t>
+      </w:r>
+      <w:proofErr w:type="spellStart"/>
+      <w:r>
+        <w:t>hand</w:t>
+      </w:r>
+      <w:proofErr w:type="spellEnd"/>
+      <w:r>
+        <w:t xml:space="preserve"> tracking, pero que desaparezcan si no lo hace en un tiempo determinado.</w:t>
       </w:r>
       <w:r>
         <w:t xml:space="preserve"> </w:t>
@@ -150,15 +505,37 @@
         <w:rPr>
           <w:b/>
         </w:rPr>
-        <w:t>Semana 6 (17 de Marzo del 2026 a 20 de Marzo del 2026)</w:t>
-      </w:r>
-    </w:p>
-    <w:p>
-      <w:pPr>
-        <w:jc w:val="both"/>
-      </w:pPr>
-      <w:r>
-        <w:t xml:space="preserve">El 17 de Marzo se comenzó con la implementación de un sistema de cuenta regresiva para el comienzo de las rondas de enemigos; la idea es hacer que se inicie con una cuenta regresiva </w:t>
+        <w:t xml:space="preserve">Semana 6 (17 de </w:t>
+      </w:r>
+      <w:proofErr w:type="gramStart"/>
+      <w:r>
+        <w:rPr>
+          <w:b/>
+        </w:rPr>
+        <w:t>Marzo</w:t>
+      </w:r>
+      <w:proofErr w:type="gramEnd"/>
+      <w:r>
+        <w:rPr>
+          <w:b/>
+        </w:rPr>
+        <w:t xml:space="preserve"> del 2026 a 20 de Marzo del 2026)</w:t>
+      </w:r>
+    </w:p>
+    <w:p>
+      <w:pPr>
+        <w:jc w:val="both"/>
+      </w:pPr>
+      <w:r>
+        <w:t xml:space="preserve">El 17 de </w:t>
+      </w:r>
+      <w:proofErr w:type="gramStart"/>
+      <w:r>
+        <w:t>Marzo</w:t>
+      </w:r>
+      <w:proofErr w:type="gramEnd"/>
+      <w:r>
+        <w:t xml:space="preserve"> se comenzó con la implementación de un sistema de cuenta regresiva para el comienzo de las rondas de enemigos; la idea es hacer que se inicie con una cuenta regresiva </w:t>
       </w:r>
       <w:r>
         <w:lastRenderedPageBreak/>
@@ -174,10 +551,42 @@
         <w:t xml:space="preserve">. </w:t>
       </w:r>
       <w:r>
-        <w:t>El 18 de Marzo me encargué de juntar las escenas y completar la implementación del panel de “Continuar”</w:t>
-      </w:r>
-      <w:r>
-        <w:t>. El 19 de Marzo mejoré el comportamiento y los Spawners de los enemigos. El 20 de Marzo,</w:t>
+        <w:t xml:space="preserve">El 18 de </w:t>
+      </w:r>
+      <w:proofErr w:type="gramStart"/>
+      <w:r>
+        <w:t>Marzo</w:t>
+      </w:r>
+      <w:proofErr w:type="gramEnd"/>
+      <w:r>
+        <w:t xml:space="preserve"> me encargué de juntar las escenas y completar la implementación del panel de “Continuar”</w:t>
+      </w:r>
+      <w:r>
+        <w:t xml:space="preserve">. El 19 de </w:t>
+      </w:r>
+      <w:proofErr w:type="gramStart"/>
+      <w:r>
+        <w:t>Marzo</w:t>
+      </w:r>
+      <w:proofErr w:type="gramEnd"/>
+      <w:r>
+        <w:t xml:space="preserve"> mejoré el comportamiento y los </w:t>
+      </w:r>
+      <w:proofErr w:type="spellStart"/>
+      <w:r>
+        <w:t>Spawners</w:t>
+      </w:r>
+      <w:proofErr w:type="spellEnd"/>
+      <w:r>
+        <w:t xml:space="preserve"> de los enemigos. El 20 de </w:t>
+      </w:r>
+      <w:proofErr w:type="gramStart"/>
+      <w:r>
+        <w:t>Marzo</w:t>
+      </w:r>
+      <w:proofErr w:type="gramEnd"/>
+      <w:r>
+        <w:t>,</w:t>
       </w:r>
       <w:r>
         <w:t xml:space="preserve"> comencé a implementar diferentes niveles en caso de que el paciente necesite hacer ejercicios específicos.</w:t>
@@ -194,70 +603,210 @@
         <w:rPr>
           <w:b/>
         </w:rPr>
-        <w:t>Semana 7 (23 de Marzo del 2026 a 28 de Marzo del 2026)</w:t>
-      </w:r>
-    </w:p>
-    <w:p>
-      <w:pPr>
-        <w:jc w:val="both"/>
-      </w:pPr>
-      <w:r>
-        <w:t>El 23 de Marzo, por indicaciones de Yoás, se cambió el enfoque de los enemigos. Estos aparecerán y rodearán al Jugador como si estuvieran en un domo o semicírculo; dicho semicírculo variará su tamaño en base a la distancia máxima que el Jugador pueda estirar su brazo sano. Esa lógica también se implementó.</w:t>
-      </w:r>
-      <w:r>
-        <w:t xml:space="preserve"> El 24 de Marzo me dediqué a hacer la solicitud de tesis.</w:t>
-      </w:r>
-      <w:r>
-        <w:t xml:space="preserve"> El 25 de Marzo, Yoás revisó los avances, donde debo cambiar la orientación del domo y agregar más parámetros a ser modificados por el terapeuta, así como un flujo de trabajo.</w:t>
-      </w:r>
-      <w:r>
-        <w:t xml:space="preserve"> 26 y 27 de Marzo estuve configurando la nueva orientación del domo y el comportamiento de los enemigos.</w:t>
-      </w:r>
-      <w:r>
-        <w:t xml:space="preserve"> El 28 de Marzo conecté las escenas.</w:t>
-      </w:r>
-    </w:p>
-    <w:p>
-      <w:pPr>
-        <w:jc w:val="both"/>
-        <w:rPr>
-          <w:b/>
-        </w:rPr>
-      </w:pPr>
-      <w:r>
-        <w:rPr>
-          <w:b/>
-        </w:rPr>
-        <w:t>Semana 8 (06 de Abril del 2026 a 10 de Abril del 2026)</w:t>
-      </w:r>
-    </w:p>
-    <w:p>
-      <w:pPr>
-        <w:jc w:val="both"/>
-      </w:pPr>
-      <w:r>
-        <w:t xml:space="preserve">El 06 de Abril comencé con la implementación </w:t>
-      </w:r>
-      <w:r>
-        <w:t>de la selección de los enemigos; Yoas me encomendó hacer un modo de realidad mixta.</w:t>
-      </w:r>
-      <w:r>
-        <w:t xml:space="preserve"> 07 de Abril detecté que hay problemas con el cable de conexión, debo buscar un USB 3.0.</w:t>
+        <w:t xml:space="preserve">Semana 7 (23 de </w:t>
+      </w:r>
+      <w:proofErr w:type="gramStart"/>
+      <w:r>
+        <w:rPr>
+          <w:b/>
+        </w:rPr>
+        <w:t>Marzo</w:t>
+      </w:r>
+      <w:proofErr w:type="gramEnd"/>
+      <w:r>
+        <w:rPr>
+          <w:b/>
+        </w:rPr>
+        <w:t xml:space="preserve"> del 2026 a 28 de Marzo del 2026)</w:t>
+      </w:r>
+    </w:p>
+    <w:p>
+      <w:pPr>
+        <w:jc w:val="both"/>
+      </w:pPr>
+      <w:r>
+        <w:t xml:space="preserve">El 23 de </w:t>
+      </w:r>
+      <w:proofErr w:type="gramStart"/>
+      <w:r>
+        <w:t>Marzo</w:t>
+      </w:r>
+      <w:proofErr w:type="gramEnd"/>
+      <w:r>
+        <w:t xml:space="preserve">, por indicaciones de </w:t>
+      </w:r>
+      <w:proofErr w:type="spellStart"/>
+      <w:r>
+        <w:t>Yoás</w:t>
+      </w:r>
+      <w:proofErr w:type="spellEnd"/>
+      <w:r>
+        <w:t>, se cambió el enfoque de los enemigos. Estos aparecerán y rodearán al Jugador como si estuvieran en un domo o semicírculo; dicho semicírculo variará su tamaño en base a la distancia máxima que el Jugador pueda estirar su brazo sano. Esa lógica también se implementó.</w:t>
+      </w:r>
+      <w:r>
+        <w:t xml:space="preserve"> El 24 de </w:t>
+      </w:r>
+      <w:proofErr w:type="gramStart"/>
+      <w:r>
+        <w:t>Marzo</w:t>
+      </w:r>
+      <w:proofErr w:type="gramEnd"/>
+      <w:r>
+        <w:t xml:space="preserve"> me dediqué a hacer la solicitud de tesis.</w:t>
+      </w:r>
+      <w:r>
+        <w:t xml:space="preserve"> El 25 de </w:t>
+      </w:r>
+      <w:proofErr w:type="gramStart"/>
+      <w:r>
+        <w:t>Marzo</w:t>
+      </w:r>
+      <w:proofErr w:type="gramEnd"/>
+      <w:r>
+        <w:t xml:space="preserve">, </w:t>
+      </w:r>
+      <w:proofErr w:type="spellStart"/>
+      <w:r>
+        <w:t>Yoás</w:t>
+      </w:r>
+      <w:proofErr w:type="spellEnd"/>
+      <w:r>
+        <w:t xml:space="preserve"> revisó los avances, donde debo cambiar la orientación del domo y agregar más parámetros a ser modificados por el terapeuta, así como un flujo de trabajo.</w:t>
+      </w:r>
+      <w:r>
+        <w:t xml:space="preserve"> 26 y 27 de </w:t>
+      </w:r>
+      <w:proofErr w:type="gramStart"/>
+      <w:r>
+        <w:t>Marzo</w:t>
+      </w:r>
+      <w:proofErr w:type="gramEnd"/>
+      <w:r>
+        <w:t xml:space="preserve"> estuve configurando la nueva orientación del domo y el comportamiento de los enemigos.</w:t>
+      </w:r>
+      <w:r>
+        <w:t xml:space="preserve"> El 28 de </w:t>
+      </w:r>
+      <w:proofErr w:type="gramStart"/>
+      <w:r>
+        <w:t>Marzo</w:t>
+      </w:r>
+      <w:proofErr w:type="gramEnd"/>
+      <w:r>
+        <w:t xml:space="preserve"> conecté las escenas.</w:t>
+      </w:r>
+    </w:p>
+    <w:p>
+      <w:pPr>
+        <w:jc w:val="both"/>
+        <w:rPr>
+          <w:b/>
+        </w:rPr>
+      </w:pPr>
+      <w:r>
+        <w:rPr>
+          <w:b/>
+        </w:rPr>
+        <w:t xml:space="preserve">Semana 8 (06 de </w:t>
+      </w:r>
+      <w:proofErr w:type="gramStart"/>
+      <w:r>
+        <w:rPr>
+          <w:b/>
+        </w:rPr>
+        <w:t>Abril</w:t>
+      </w:r>
+      <w:proofErr w:type="gramEnd"/>
+      <w:r>
+        <w:rPr>
+          <w:b/>
+        </w:rPr>
+        <w:t xml:space="preserve"> del 2026 a 10 de Abril del 2026)</w:t>
+      </w:r>
+    </w:p>
+    <w:p>
+      <w:pPr>
+        <w:jc w:val="both"/>
+      </w:pPr>
+      <w:r>
+        <w:t xml:space="preserve">El 06 de </w:t>
+      </w:r>
+      <w:proofErr w:type="gramStart"/>
+      <w:r>
+        <w:t>Abril</w:t>
+      </w:r>
+      <w:proofErr w:type="gramEnd"/>
+      <w:r>
+        <w:t xml:space="preserve"> comencé con la implementación </w:t>
+      </w:r>
+      <w:r>
+        <w:t xml:space="preserve">de la selección de los enemigos; </w:t>
+      </w:r>
+      <w:proofErr w:type="spellStart"/>
+      <w:r>
+        <w:t>Yoas</w:t>
+      </w:r>
+      <w:proofErr w:type="spellEnd"/>
+      <w:r>
+        <w:t xml:space="preserve"> me encomendó hacer un modo de realidad mixta.</w:t>
+      </w:r>
+      <w:r>
+        <w:t xml:space="preserve"> 07 de </w:t>
+      </w:r>
+      <w:proofErr w:type="gramStart"/>
+      <w:r>
+        <w:t>Abril</w:t>
+      </w:r>
+      <w:proofErr w:type="gramEnd"/>
+      <w:r>
+        <w:t xml:space="preserve"> detecté que hay problemas con el cable de conexión, debo buscar un USB 3.0.</w:t>
       </w:r>
       <w:r>
         <w:t xml:space="preserve"> </w:t>
       </w:r>
       <w:r>
-        <w:t xml:space="preserve">El 08 de Abril, después de registrar el Meta Quest 3S a la cuenta de desarrollador y arreglar un </w:t>
+        <w:t xml:space="preserve">El 08 de </w:t>
+      </w:r>
+      <w:proofErr w:type="gramStart"/>
+      <w:r>
+        <w:t>Abril</w:t>
+      </w:r>
+      <w:proofErr w:type="gramEnd"/>
+      <w:r>
+        <w:t xml:space="preserve">, después de registrar el Meta </w:t>
+      </w:r>
+      <w:proofErr w:type="spellStart"/>
+      <w:r>
+        <w:t>Quest</w:t>
+      </w:r>
+      <w:proofErr w:type="spellEnd"/>
+      <w:r>
+        <w:t xml:space="preserve"> 3S a la cuenta de desarrollador y arreglar un </w:t>
       </w:r>
       <w:r>
         <w:t>problema</w:t>
       </w:r>
       <w:r>
-        <w:t xml:space="preserve"> con el Canvas, se pudo conectar y completar la Realidad Mixta.</w:t>
-      </w:r>
-      <w:r>
-        <w:t xml:space="preserve"> El 10 de Abril se continuó con la implementación del seleccionador de Enemigos, ahora falta esperar por los modelos.</w:t>
+        <w:t xml:space="preserve"> con el </w:t>
+      </w:r>
+      <w:proofErr w:type="spellStart"/>
+      <w:r>
+        <w:t>Canvas</w:t>
+      </w:r>
+      <w:proofErr w:type="spellEnd"/>
+      <w:r>
+        <w:t>, se pudo conectar y completar la Realidad Mixta.</w:t>
+      </w:r>
+      <w:r>
+        <w:t xml:space="preserve"> El 10 de </w:t>
+      </w:r>
+      <w:proofErr w:type="gramStart"/>
+      <w:r>
+        <w:t>Abril</w:t>
+      </w:r>
+      <w:proofErr w:type="gramEnd"/>
+      <w:r>
+        <w:t xml:space="preserve"> se continuó con la implementación del seleccionador de Enemigos, ahora falta esperar por los modelos.</w:t>
       </w:r>
     </w:p>
     <w:p>
@@ -277,7 +826,21 @@
         <w:rPr>
           <w:b/>
         </w:rPr>
-        <w:t>na 9 (13 de Abril del 2026 al 17</w:t>
+        <w:t xml:space="preserve">na 9 (13 de </w:t>
+      </w:r>
+      <w:proofErr w:type="gramStart"/>
+      <w:r>
+        <w:rPr>
+          <w:b/>
+        </w:rPr>
+        <w:t>Abril</w:t>
+      </w:r>
+      <w:proofErr w:type="gramEnd"/>
+      <w:r>
+        <w:rPr>
+          <w:b/>
+        </w:rPr>
+        <w:t xml:space="preserve"> del 2026 al 17</w:t>
       </w:r>
       <w:r>
         <w:rPr>
@@ -291,50 +854,181 @@
         <w:jc w:val="both"/>
       </w:pPr>
       <w:r>
-        <w:t>El 13 de Abril, comencé a trabajar con los modelos de las naves; debo configurarlos para una actividad que se tendrá por parte de Amerike.</w:t>
-      </w:r>
-      <w:r>
-        <w:t xml:space="preserve"> El 14 de Abril terminé de configurar los modelos y limpié un poco el código y los Assets para la muestra del día siguiente.</w:t>
-      </w:r>
-      <w:r>
-        <w:t xml:space="preserve"> El 15 de Abril realicé unos ajustes a la cámara del jugador y alisté todo para la muestra de Amerike</w:t>
-      </w:r>
-      <w:r>
-        <w:t>. El 16 de Abril fue la muestra, hubo problemas con la Etiqueta Player, ya fue solucionado pero al menos en la muestra se tuvo ese problema. El 17 de Abril se comenzó a probar las mecánicas del segundo minijuego, este toma en cuenta la rotación de la muñeca del jugador para poder rotar las piezas del rompecabezas.</w:t>
-      </w:r>
-    </w:p>
-    <w:p>
-      <w:pPr>
-        <w:jc w:val="both"/>
-        <w:rPr>
-          <w:b/>
-        </w:rPr>
-      </w:pPr>
-      <w:r>
-        <w:rPr>
-          <w:b/>
-        </w:rPr>
-        <w:t>Semana 10 (20 de Abril del 2026 al 24 de Abril del 2026)</w:t>
-      </w:r>
-    </w:p>
-    <w:p>
-      <w:pPr>
-        <w:jc w:val="both"/>
-      </w:pPr>
-      <w:r>
-        <w:t>El 20 de Abril, comencé a trabajar en el sistema para confirmar que el rompecabezas esté formado, pero por los modelos que estoy usando, no sé exactamente si está funcionando hasta que tenga los modelos correctos.</w:t>
-      </w:r>
-      <w:r>
-        <w:t xml:space="preserve"> El 21 de Abril hubo retroalimentación por parte de Yoás, para las runas no hay que aplicar los botones, pero el sistema de victoria está bien, ahora hay que idear una forma para implementar las puertas.</w:t>
-      </w:r>
-      <w:r>
-        <w:t xml:space="preserve"> El 22 de Abril se comenzó la implementación de las puertas, las cuales funcionarán como forma de medir el progreso del jugador.</w:t>
-      </w:r>
-      <w:r>
-        <w:t xml:space="preserve"> El 23 de Abril se comenzó a implementar el contador para finalizar el nivel.</w:t>
-      </w:r>
-      <w:r>
-        <w:t xml:space="preserve"> El 24 de Abril se arregló la funcionalidad del contador, además de que se activan interfaces en base al resultado de las rotaciones. La siguiente semana comienzo a implementar un objeto que aumente la intensidad </w:t>
+        <w:t xml:space="preserve">El 13 de </w:t>
+      </w:r>
+      <w:proofErr w:type="gramStart"/>
+      <w:r>
+        <w:t>Abril</w:t>
+      </w:r>
+      <w:proofErr w:type="gramEnd"/>
+      <w:r>
+        <w:t xml:space="preserve">, comencé a trabajar con los modelos de las naves; debo configurarlos para una actividad que se tendrá por parte de </w:t>
+      </w:r>
+      <w:proofErr w:type="spellStart"/>
+      <w:r>
+        <w:t>Amerike</w:t>
+      </w:r>
+      <w:proofErr w:type="spellEnd"/>
+      <w:r>
+        <w:t>.</w:t>
+      </w:r>
+      <w:r>
+        <w:t xml:space="preserve"> El 14 de </w:t>
+      </w:r>
+      <w:proofErr w:type="gramStart"/>
+      <w:r>
+        <w:t>Abril</w:t>
+      </w:r>
+      <w:proofErr w:type="gramEnd"/>
+      <w:r>
+        <w:t xml:space="preserve"> terminé de configurar los modelos y limpié un poco el código y los </w:t>
+      </w:r>
+      <w:proofErr w:type="spellStart"/>
+      <w:r>
+        <w:t>Assets</w:t>
+      </w:r>
+      <w:proofErr w:type="spellEnd"/>
+      <w:r>
+        <w:t xml:space="preserve"> para la muestra del día siguiente.</w:t>
+      </w:r>
+      <w:r>
+        <w:t xml:space="preserve"> El 15 de </w:t>
+      </w:r>
+      <w:proofErr w:type="gramStart"/>
+      <w:r>
+        <w:t>Abril</w:t>
+      </w:r>
+      <w:proofErr w:type="gramEnd"/>
+      <w:r>
+        <w:t xml:space="preserve"> realicé unos ajustes a la cámara del jugador y alisté todo para la muestra de </w:t>
+      </w:r>
+      <w:proofErr w:type="spellStart"/>
+      <w:r>
+        <w:t>Amerike</w:t>
+      </w:r>
+      <w:proofErr w:type="spellEnd"/>
+      <w:r>
+        <w:t xml:space="preserve">. El 16 de </w:t>
+      </w:r>
+      <w:proofErr w:type="gramStart"/>
+      <w:r>
+        <w:t>Abril</w:t>
+      </w:r>
+      <w:proofErr w:type="gramEnd"/>
+      <w:r>
+        <w:t xml:space="preserve"> fue la muestra, hubo problemas con la Etiqueta Player, ya fue solucionado pero al menos en la muestra se tuvo ese problema. El 17 de </w:t>
+      </w:r>
+      <w:proofErr w:type="gramStart"/>
+      <w:r>
+        <w:t>Abril</w:t>
+      </w:r>
+      <w:proofErr w:type="gramEnd"/>
+      <w:r>
+        <w:t xml:space="preserve"> se comenzó a probar las mecánicas del segundo </w:t>
+      </w:r>
+      <w:proofErr w:type="spellStart"/>
+      <w:r>
+        <w:t>minijuego</w:t>
+      </w:r>
+      <w:proofErr w:type="spellEnd"/>
+      <w:r>
+        <w:t>, este toma en cuenta la rotación de la muñeca del jugador para poder rotar las piezas del rompecabezas.</w:t>
+      </w:r>
+    </w:p>
+    <w:p>
+      <w:pPr>
+        <w:jc w:val="both"/>
+        <w:rPr>
+          <w:b/>
+        </w:rPr>
+      </w:pPr>
+      <w:r>
+        <w:rPr>
+          <w:b/>
+        </w:rPr>
+        <w:t xml:space="preserve">Semana 10 (20 de </w:t>
+      </w:r>
+      <w:proofErr w:type="gramStart"/>
+      <w:r>
+        <w:rPr>
+          <w:b/>
+        </w:rPr>
+        <w:t>Abril</w:t>
+      </w:r>
+      <w:proofErr w:type="gramEnd"/>
+      <w:r>
+        <w:rPr>
+          <w:b/>
+        </w:rPr>
+        <w:t xml:space="preserve"> del 2026 al 24 de Abril del 2026)</w:t>
+      </w:r>
+    </w:p>
+    <w:p>
+      <w:pPr>
+        <w:jc w:val="both"/>
+      </w:pPr>
+      <w:r>
+        <w:t xml:space="preserve">El 20 de </w:t>
+      </w:r>
+      <w:proofErr w:type="gramStart"/>
+      <w:r>
+        <w:t>Abril</w:t>
+      </w:r>
+      <w:proofErr w:type="gramEnd"/>
+      <w:r>
+        <w:t>, comencé a trabajar en el sistema para confirmar que el rompecabezas esté formado, pero por los modelos que estoy usando, no sé exactamente si está funcionando hasta que tenga los modelos correctos.</w:t>
+      </w:r>
+      <w:r>
+        <w:t xml:space="preserve"> El 21 de </w:t>
+      </w:r>
+      <w:proofErr w:type="gramStart"/>
+      <w:r>
+        <w:t>Abril</w:t>
+      </w:r>
+      <w:proofErr w:type="gramEnd"/>
+      <w:r>
+        <w:t xml:space="preserve"> hubo retroalimentación por parte de </w:t>
+      </w:r>
+      <w:proofErr w:type="spellStart"/>
+      <w:r>
+        <w:t>Yoás</w:t>
+      </w:r>
+      <w:proofErr w:type="spellEnd"/>
+      <w:r>
+        <w:t>, para las runas no hay que aplicar los botones, pero el sistema de victoria está bien, ahora hay que idear una forma para implementar las puertas.</w:t>
+      </w:r>
+      <w:r>
+        <w:t xml:space="preserve"> El 22 de </w:t>
+      </w:r>
+      <w:proofErr w:type="gramStart"/>
+      <w:r>
+        <w:t>Abril</w:t>
+      </w:r>
+      <w:proofErr w:type="gramEnd"/>
+      <w:r>
+        <w:t xml:space="preserve"> se comenzó la implementación de las puertas, las cuales funcionarán como forma de medir el progreso del jugador.</w:t>
+      </w:r>
+      <w:r>
+        <w:t xml:space="preserve"> El 23 de </w:t>
+      </w:r>
+      <w:proofErr w:type="gramStart"/>
+      <w:r>
+        <w:t>Abril</w:t>
+      </w:r>
+      <w:proofErr w:type="gramEnd"/>
+      <w:r>
+        <w:t xml:space="preserve"> se comenzó a implementar el contador para finalizar el nivel.</w:t>
+      </w:r>
+      <w:r>
+        <w:t xml:space="preserve"> El 24 de </w:t>
+      </w:r>
+      <w:proofErr w:type="gramStart"/>
+      <w:r>
+        <w:t>Abril</w:t>
+      </w:r>
+      <w:proofErr w:type="gramEnd"/>
+      <w:r>
+        <w:t xml:space="preserve"> se arregló la funcionalidad del contador, además de que se activan interfaces en base al resultado de las rotaciones. La siguiente semana comienzo a implementar un objeto que aumente la intensidad </w:t>
       </w:r>
       <w:r>
         <w:lastRenderedPageBreak/>
@@ -352,7 +1046,21 @@
         <w:rPr>
           <w:b/>
         </w:rPr>
-        <w:t>Semana 11 (27 de Abril del 2026 al 30 de Abril</w:t>
+        <w:t xml:space="preserve">Semana 11 (27 de </w:t>
+      </w:r>
+      <w:proofErr w:type="gramStart"/>
+      <w:r>
+        <w:rPr>
+          <w:b/>
+        </w:rPr>
+        <w:t>Abril</w:t>
+      </w:r>
+      <w:proofErr w:type="gramEnd"/>
+      <w:r>
+        <w:rPr>
+          <w:b/>
+        </w:rPr>
+        <w:t xml:space="preserve"> del 2026 al 30 de Abril</w:t>
       </w:r>
       <w:r>
         <w:rPr>
@@ -372,44 +1080,130 @@
         <w:jc w:val="both"/>
       </w:pPr>
       <w:r>
-        <w:t>El 27 de Abril, comencé a implementar la iluminación de un objeto para darle un efecto de premio.</w:t>
-      </w:r>
-      <w:r>
-        <w:t xml:space="preserve"> El 28 de Abril, comencé a hacer ajustes para la interfaz, en la semana debo ver si cuando el jugador pierda, se reinicia toda la partida o solo el escenario.</w:t>
-      </w:r>
-      <w:r>
-        <w:t xml:space="preserve"> El 30 de Abril recibí comentarios de Yoas para continuar con mi implementación de las piezas del rompecabezas por separada en lugar de juntas, así como poner limitaciones para las piezas.</w:t>
-      </w:r>
-    </w:p>
-    <w:p>
-      <w:pPr>
-        <w:jc w:val="both"/>
-        <w:rPr>
-          <w:b/>
-        </w:rPr>
-      </w:pPr>
-      <w:r>
-        <w:rPr>
-          <w:b/>
-        </w:rPr>
-        <w:t>Semana 12 (04 de Mayo del 2026 al 08 de Mayo del 2026)</w:t>
-      </w:r>
-    </w:p>
-    <w:p>
-      <w:pPr>
-        <w:jc w:val="both"/>
-      </w:pPr>
-      <w:r>
-        <w:t>El 04 de Mayo implementé los botones para continuar la partida o reiniciar el nivel en caso de que termine el tiempo.</w:t>
-      </w:r>
-      <w:r>
-        <w:t xml:space="preserve"> El 05 de Mayo implementé un límite de rotación para cada pieza del rompecabezas para que el paciente tenga que interactuar varias veces y pueda trabajar en la rotación de su muñeca.</w:t>
-      </w:r>
-      <w:r>
-        <w:t xml:space="preserve"> El 06 de Mayo implementé un menú general para los 4 minijuegos.</w:t>
-      </w:r>
-      <w:r>
-        <w:t xml:space="preserve"> El 7 y 8 de Mayo </w:t>
+        <w:t xml:space="preserve">El 27 de </w:t>
+      </w:r>
+      <w:proofErr w:type="gramStart"/>
+      <w:r>
+        <w:t>Abril</w:t>
+      </w:r>
+      <w:proofErr w:type="gramEnd"/>
+      <w:r>
+        <w:t>, comencé a implementar la iluminación de un objeto para darle un efecto de premio.</w:t>
+      </w:r>
+      <w:r>
+        <w:t xml:space="preserve"> El 28 de </w:t>
+      </w:r>
+      <w:proofErr w:type="gramStart"/>
+      <w:r>
+        <w:t>Abril</w:t>
+      </w:r>
+      <w:proofErr w:type="gramEnd"/>
+      <w:r>
+        <w:t>, comencé a hacer ajustes para la interfaz, en la semana debo ver si cuando el jugador pierda, se reinicia toda la partida o solo el escenario.</w:t>
+      </w:r>
+      <w:r>
+        <w:t xml:space="preserve"> El 30 de </w:t>
+      </w:r>
+      <w:proofErr w:type="gramStart"/>
+      <w:r>
+        <w:t>Abril</w:t>
+      </w:r>
+      <w:proofErr w:type="gramEnd"/>
+      <w:r>
+        <w:t xml:space="preserve"> recibí comentarios de </w:t>
+      </w:r>
+      <w:proofErr w:type="spellStart"/>
+      <w:r>
+        <w:t>Yoas</w:t>
+      </w:r>
+      <w:proofErr w:type="spellEnd"/>
+      <w:r>
+        <w:t xml:space="preserve"> para continuar con mi implementación de las piezas del rompecabezas por separada en lugar de juntas, así como poner limitaciones para las piezas.</w:t>
+      </w:r>
+    </w:p>
+    <w:p>
+      <w:pPr>
+        <w:jc w:val="both"/>
+        <w:rPr>
+          <w:b/>
+        </w:rPr>
+      </w:pPr>
+      <w:r>
+        <w:rPr>
+          <w:b/>
+        </w:rPr>
+        <w:t xml:space="preserve">Semana 12 (04 de </w:t>
+      </w:r>
+      <w:proofErr w:type="gramStart"/>
+      <w:r>
+        <w:rPr>
+          <w:b/>
+        </w:rPr>
+        <w:t>Mayo</w:t>
+      </w:r>
+      <w:proofErr w:type="gramEnd"/>
+      <w:r>
+        <w:rPr>
+          <w:b/>
+        </w:rPr>
+        <w:t xml:space="preserve"> del 2026 al 08 de Mayo del 2026)</w:t>
+      </w:r>
+    </w:p>
+    <w:p>
+      <w:pPr>
+        <w:jc w:val="both"/>
+      </w:pPr>
+      <w:r>
+        <w:t xml:space="preserve">El 04 de </w:t>
+      </w:r>
+      <w:proofErr w:type="gramStart"/>
+      <w:r>
+        <w:t>Mayo</w:t>
+      </w:r>
+      <w:proofErr w:type="gramEnd"/>
+      <w:r>
+        <w:t xml:space="preserve"> implementé los botones para continuar la partida o reiniciar el nivel en caso de que termine el tiempo.</w:t>
+      </w:r>
+      <w:r>
+        <w:t xml:space="preserve"> El 05 de </w:t>
+      </w:r>
+      <w:proofErr w:type="gramStart"/>
+      <w:r>
+        <w:t>Mayo</w:t>
+      </w:r>
+      <w:proofErr w:type="gramEnd"/>
+      <w:r>
+        <w:t xml:space="preserve"> implementé un límite de rotación para cada pieza del rompecabezas para que el paciente tenga que interactuar varias veces y pueda trabajar en la rotación de su muñeca.</w:t>
+      </w:r>
+      <w:r>
+        <w:t xml:space="preserve"> El 06 de </w:t>
+      </w:r>
+      <w:proofErr w:type="gramStart"/>
+      <w:r>
+        <w:t>Mayo</w:t>
+      </w:r>
+      <w:proofErr w:type="gramEnd"/>
+      <w:r>
+        <w:t xml:space="preserve"> implementé un menú general para los 4 </w:t>
+      </w:r>
+      <w:proofErr w:type="spellStart"/>
+      <w:r>
+        <w:t>minijuegos</w:t>
+      </w:r>
+      <w:proofErr w:type="spellEnd"/>
+      <w:r>
+        <w:t>.</w:t>
+      </w:r>
+      <w:r>
+        <w:t xml:space="preserve"> El 7 y 8 de </w:t>
+      </w:r>
+      <w:proofErr w:type="gramStart"/>
+      <w:r>
+        <w:t>Mayo</w:t>
+      </w:r>
+      <w:proofErr w:type="gramEnd"/>
+      <w:r>
+        <w:t xml:space="preserve"> </w:t>
       </w:r>
       <w:r>
         <w:t>continué</w:t>
@@ -421,63 +1215,190 @@
         <w:t>do</w:t>
       </w:r>
       <w:r>
-        <w:t xml:space="preserve"> el menú de los 4 minijuegos, procuré que el paciente tenga la opción de girar a otros lados para cambiar entre realidad aumentada y mixta.</w:t>
-      </w:r>
-    </w:p>
-    <w:p>
-      <w:pPr>
-        <w:jc w:val="both"/>
-        <w:rPr>
-          <w:b/>
-        </w:rPr>
-      </w:pPr>
-      <w:r>
-        <w:rPr>
-          <w:b/>
-        </w:rPr>
-        <w:t>Semana 13 (11 de Mayo del 2026 al 14 de Mayo del 2026)</w:t>
-      </w:r>
-    </w:p>
-    <w:p>
-      <w:pPr>
-        <w:jc w:val="both"/>
-      </w:pPr>
-      <w:r>
-        <w:t>El 11 de Mayo terminé la implementación del botón para alternar de realidad desde el menú general; comenzaré a ver el prototipo del tercer minijuego.</w:t>
-      </w:r>
-      <w:r>
-        <w:t xml:space="preserve"> El 12 de Mayo comencé a implementar una forma para que la dificultad de los niveles aumente en base al tiempo que tarda el paciente en resolver el rompecabezas.</w:t>
-      </w:r>
-      <w:r>
-        <w:t xml:space="preserve"> El 14 de Mayo mejoré los Colliders de las Naves y añadí las nuevas texturas que hizo mi compañera Yael.</w:t>
-      </w:r>
-    </w:p>
-    <w:p>
-      <w:pPr>
-        <w:jc w:val="both"/>
-        <w:rPr>
-          <w:b/>
-        </w:rPr>
-      </w:pPr>
-      <w:r>
-        <w:rPr>
-          <w:b/>
-        </w:rPr>
-        <w:t>Semana 14 (18 de Mayo del 2026 al 22 de Mayo del 2026)</w:t>
-      </w:r>
-    </w:p>
-    <w:p>
-      <w:pPr>
-        <w:jc w:val="both"/>
-      </w:pPr>
-      <w:r>
-        <w:t>El 18 de Mayo comencé a ver las animaciones de las naves destruidas para el primer minijuego.</w:t>
-      </w:r>
-      <w:r>
-        <w:t xml:space="preserve"> El 19 de Mayo implementé las animaciones de las naves destruidas así como su comportamiento al momento de que el paciente interactúa con ellas.</w:t>
-      </w:r>
-      <w:r>
-        <w:t xml:space="preserve"> El 20 de Mayo comencé a implementar un mensaje continuo para animar y recordarle al paciente lo que debe hacer.</w:t>
+        <w:t xml:space="preserve"> el menú de los 4 </w:t>
+      </w:r>
+      <w:proofErr w:type="spellStart"/>
+      <w:r>
+        <w:t>minijuegos</w:t>
+      </w:r>
+      <w:proofErr w:type="spellEnd"/>
+      <w:r>
+        <w:t>, procuré que el paciente tenga la opción de girar a otros lados para cambiar entre realidad aumentada y mixta.</w:t>
+      </w:r>
+    </w:p>
+    <w:p>
+      <w:pPr>
+        <w:jc w:val="both"/>
+        <w:rPr>
+          <w:b/>
+        </w:rPr>
+      </w:pPr>
+      <w:r>
+        <w:rPr>
+          <w:b/>
+        </w:rPr>
+        <w:t xml:space="preserve">Semana 13 (11 de </w:t>
+      </w:r>
+      <w:proofErr w:type="gramStart"/>
+      <w:r>
+        <w:rPr>
+          <w:b/>
+        </w:rPr>
+        <w:t>Mayo</w:t>
+      </w:r>
+      <w:proofErr w:type="gramEnd"/>
+      <w:r>
+        <w:rPr>
+          <w:b/>
+        </w:rPr>
+        <w:t xml:space="preserve"> del 2026 al 14 de Mayo del 2026)</w:t>
+      </w:r>
+    </w:p>
+    <w:p>
+      <w:pPr>
+        <w:jc w:val="both"/>
+      </w:pPr>
+      <w:r>
+        <w:t xml:space="preserve">El 11 de </w:t>
+      </w:r>
+      <w:proofErr w:type="gramStart"/>
+      <w:r>
+        <w:t>Mayo</w:t>
+      </w:r>
+      <w:proofErr w:type="gramEnd"/>
+      <w:r>
+        <w:t xml:space="preserve"> terminé la implementación del botón para alternar de realidad desde el menú general; comenzaré a ver el prototipo del tercer </w:t>
+      </w:r>
+      <w:proofErr w:type="spellStart"/>
+      <w:r>
+        <w:t>minijuego</w:t>
+      </w:r>
+      <w:proofErr w:type="spellEnd"/>
+      <w:r>
+        <w:t>.</w:t>
+      </w:r>
+      <w:r>
+        <w:t xml:space="preserve"> El 12 de </w:t>
+      </w:r>
+      <w:proofErr w:type="gramStart"/>
+      <w:r>
+        <w:t>Mayo</w:t>
+      </w:r>
+      <w:proofErr w:type="gramEnd"/>
+      <w:r>
+        <w:t xml:space="preserve"> comencé a implementar una forma para que la dificultad de los niveles aumente en base al tiempo que tarda el paciente en resolver el rompecabezas.</w:t>
+      </w:r>
+      <w:r>
+        <w:t xml:space="preserve"> El 14 de </w:t>
+      </w:r>
+      <w:proofErr w:type="gramStart"/>
+      <w:r>
+        <w:t>Mayo</w:t>
+      </w:r>
+      <w:proofErr w:type="gramEnd"/>
+      <w:r>
+        <w:t xml:space="preserve"> mejoré los </w:t>
+      </w:r>
+      <w:proofErr w:type="spellStart"/>
+      <w:r>
+        <w:t>Colliders</w:t>
+      </w:r>
+      <w:proofErr w:type="spellEnd"/>
+      <w:r>
+        <w:t xml:space="preserve"> de las Naves y añadí las nuevas texturas que hizo mi compañera </w:t>
+      </w:r>
+      <w:proofErr w:type="spellStart"/>
+      <w:r>
+        <w:t>Yael</w:t>
+      </w:r>
+      <w:proofErr w:type="spellEnd"/>
+      <w:r>
+        <w:t>.</w:t>
+      </w:r>
+    </w:p>
+    <w:p>
+      <w:pPr>
+        <w:jc w:val="both"/>
+        <w:rPr>
+          <w:b/>
+        </w:rPr>
+      </w:pPr>
+      <w:r>
+        <w:rPr>
+          <w:b/>
+        </w:rPr>
+        <w:t xml:space="preserve">Semana 14 (18 de </w:t>
+      </w:r>
+      <w:proofErr w:type="gramStart"/>
+      <w:r>
+        <w:rPr>
+          <w:b/>
+        </w:rPr>
+        <w:t>Mayo</w:t>
+      </w:r>
+      <w:proofErr w:type="gramEnd"/>
+      <w:r>
+        <w:rPr>
+          <w:b/>
+        </w:rPr>
+        <w:t xml:space="preserve"> del 2026 al 22 de Mayo del 2026)</w:t>
+      </w:r>
+    </w:p>
+    <w:p>
+      <w:pPr>
+        <w:jc w:val="both"/>
+      </w:pPr>
+      <w:r>
+        <w:t xml:space="preserve">El 18 de </w:t>
+      </w:r>
+      <w:proofErr w:type="gramStart"/>
+      <w:r>
+        <w:t>Mayo</w:t>
+      </w:r>
+      <w:proofErr w:type="gramEnd"/>
+      <w:r>
+        <w:t xml:space="preserve"> comencé a ver las animaciones de las naves destruidas para el primer </w:t>
+      </w:r>
+      <w:proofErr w:type="spellStart"/>
+      <w:r>
+        <w:t>minijuego</w:t>
+      </w:r>
+      <w:proofErr w:type="spellEnd"/>
+      <w:r>
+        <w:t>.</w:t>
+      </w:r>
+      <w:r>
+        <w:t xml:space="preserve"> El 19 de </w:t>
+      </w:r>
+      <w:proofErr w:type="gramStart"/>
+      <w:r>
+        <w:t>Mayo</w:t>
+      </w:r>
+      <w:proofErr w:type="gramEnd"/>
+      <w:r>
+        <w:t xml:space="preserve"> implementé las animaciones de las naves destruidas así como su comportamiento al momento de que el paciente interactúa con ellas.</w:t>
+      </w:r>
+      <w:r>
+        <w:t xml:space="preserve"> El 20 de </w:t>
+      </w:r>
+      <w:proofErr w:type="gramStart"/>
+      <w:r>
+        <w:t>Mayo</w:t>
+      </w:r>
+      <w:proofErr w:type="gramEnd"/>
+      <w:r>
+        <w:t xml:space="preserve"> comencé a implementar un mensaje continuo para animar y recordarle al paciente lo que debe hacer.</w:t>
+      </w:r>
+      <w:r>
+        <w:t xml:space="preserve"> El 21 de </w:t>
+      </w:r>
+      <w:proofErr w:type="gramStart"/>
+      <w:r>
+        <w:t>Mayo</w:t>
+      </w:r>
+      <w:proofErr w:type="gramEnd"/>
+      <w:r>
+        <w:t xml:space="preserve"> se implementó el mensaje continuo en el segundo minijuego.</w:t>
       </w:r>
       <w:bookmarkStart w:id="0" w:name="_GoBack"/>
       <w:bookmarkEnd w:id="0"/>

</xml_diff>

<commit_message>
Se comienza la implementacion de los sonidos de las naves y los nuevos modelos de las runas del puzzle
</commit_message>
<xml_diff>
--- a/ReporteActividades.docx
+++ b/ReporteActividades.docx
@@ -484,6 +484,37 @@
       </w:r>
       <w:r>
         <w:t xml:space="preserve"> El 22 de Mayo se comenzaron a implementar sonidos para los primeros minijuegos.</w:t>
+      </w:r>
+    </w:p>
+    <w:p>
+      <w:pPr>
+        <w:jc w:val="both"/>
+        <w:rPr>
+          <w:b/>
+        </w:rPr>
+      </w:pPr>
+      <w:r>
+        <w:rPr>
+          <w:b/>
+        </w:rPr>
+        <w:t>Semana 15 (25 de Mayo del 2026 al 29 de Mayo del 2026)</w:t>
+      </w:r>
+    </w:p>
+    <w:p>
+      <w:pPr>
+        <w:jc w:val="both"/>
+      </w:pPr>
+      <w:r>
+        <w:t>El 25 de Mayo comencé a implementar efecto</w:t>
+      </w:r>
+      <w:r>
+        <w:t>s de sonido para los Enemigos, inicié</w:t>
+      </w:r>
+      <w:r>
+        <w:t xml:space="preserve"> la edi</w:t>
+      </w:r>
+      <w:r>
+        <w:t>ción de los iconos de las Naves y me encargué de implementar el nuevo diseño de los Puzzles.</w:t>
       </w:r>
       <w:bookmarkStart w:id="0" w:name="_GoBack"/>
       <w:bookmarkEnd w:id="0"/>

</xml_diff>

<commit_message>
Se agregan texturas a las Runas del Puzzle
</commit_message>
<xml_diff>
--- a/ReporteActividades.docx
+++ b/ReporteActividades.docx
@@ -518,6 +518,12 @@
       </w:r>
       <w:r>
         <w:t xml:space="preserve"> El 26 de Mayo completé la implementación de los iconos para la selección de Enemigos en el primer minijuego.</w:t>
+      </w:r>
+      <w:r>
+        <w:t xml:space="preserve"> El 27 de Mayo del 2026, comencé con la implementación del tercer minijuego.</w:t>
+      </w:r>
+      <w:r>
+        <w:t xml:space="preserve"> El 28 de Mayo arreglé los problemas que trajo consigo el nuevo modelo de las Runas, ya funcionan como deberían.</w:t>
       </w:r>
       <w:bookmarkStart w:id="0" w:name="_GoBack"/>
       <w:bookmarkEnd w:id="0"/>

</xml_diff>

<commit_message>
Se inicia la aplicacion de correcciones a los puzzles
</commit_message>
<xml_diff>
--- a/ReporteActividades.docx
+++ b/ReporteActividades.docx
@@ -13,85 +13,322 @@
         <w:rPr>
           <w:b/>
         </w:rPr>
-        <w:t>Semana 1 (09 de Febrero de 2026 a 13 de Febrero de 2026)</w:t>
-      </w:r>
-    </w:p>
-    <w:p>
-      <w:pPr>
-        <w:jc w:val="both"/>
-      </w:pPr>
-      <w:r>
-        <w:t>El primer día se inició con el desarrollo de un Roll A Ball, principalmente para familiarizarse con el entorno de Unity. El mismo día se terminó el tutorial, pero al día siguiente se volvió a iniciar, ya que la versión utilizada</w:t>
-      </w:r>
-      <w:r>
-        <w:t xml:space="preserve"> de Unity no era la solicitada por Yoá</w:t>
-      </w:r>
-      <w:r>
-        <w:t xml:space="preserve">s. </w:t>
-      </w:r>
-      <w:r>
-        <w:t>El 11 de Febrero se comenzó con el desarrollo de la segunda escena, que era casi la primera escena pero se tenían que implementar enemigos, plataformas, vidas, monedas, spawners y plataformas. El 12 de Febrero se implementó la Lava, la cual tenía que cambiar de color cada 5 segundos. El 13 de Febrero se estuvo haciendo en los spawners de enemigos y monedas.</w:t>
-      </w:r>
-    </w:p>
-    <w:p>
-      <w:pPr>
-        <w:jc w:val="both"/>
-        <w:rPr>
-          <w:b/>
-        </w:rPr>
-      </w:pPr>
-      <w:r>
-        <w:rPr>
-          <w:b/>
-        </w:rPr>
-        <w:t>Semana 2 (16 de Febrero de 2026 a 20 de Febrero de 2026)</w:t>
-      </w:r>
-    </w:p>
-    <w:p>
-      <w:pPr>
-        <w:jc w:val="both"/>
-      </w:pPr>
-      <w:r>
-        <w:t>El 16 de Febrero se comenzó con la implementación de las escenas, los menús de pausa y cambios de escenas. Se completó el desarrollo de Roll A Ball. El 17 de Febrero Yoás le dio visto bueno al demo y pasé a familiarizarme con el e</w:t>
-      </w:r>
-      <w:r>
-        <w:t>ntorno de Meta Quest 3S. Si bien el 17 y 18 de Febrero estuve trabajando en un demo para saber como funcionan los controles, por problemas de hardware en el equipo donde estaba trabajando en el LANR, no podía probar lo que había hecho. El 19 de Febrero comencé a trabajar en el Anexo, ya que había un equipo disponible con una tarjeta gráfica compatible con el software de Meta Horizon Link, después de configurar el entorno, finalmente pude probar lo que había desarrollado los días pasados. El 19 de Febrero comencé a experimentar con los Building Blocks de Hand Tracking, algo necesario para evitar la necesidad de usar los controles de los lentes, solo interacción con las manos.</w:t>
-      </w:r>
-    </w:p>
-    <w:p>
-      <w:pPr>
-        <w:jc w:val="both"/>
-        <w:rPr>
-          <w:b/>
-        </w:rPr>
-      </w:pPr>
-      <w:r>
-        <w:rPr>
-          <w:b/>
-        </w:rPr>
-        <w:t>Semana 3 (23 de Febrero de 2026 a 27 de Febrero de 2026)</w:t>
-      </w:r>
-    </w:p>
-    <w:p>
-      <w:pPr>
-        <w:jc w:val="both"/>
-      </w:pPr>
-      <w:r>
-        <w:t>Lesly, una compañera que trabajaba en el Anexo iba a ocupar la computadora donde iba a estar trabajando, así que no asistí hasta el Jueves 26 de Febrero. Los días restantes de la semana me dediqué a terminar el demo y prácticar el cambio de escenas con interacción en UI haciendo uso de Hand Tracking.</w:t>
-      </w:r>
-    </w:p>
-    <w:p>
-      <w:pPr>
-        <w:jc w:val="both"/>
-        <w:rPr>
-          <w:b/>
-        </w:rPr>
-      </w:pPr>
-      <w:r>
-        <w:rPr>
-          <w:b/>
-        </w:rPr>
-        <w:t xml:space="preserve">Semana 4 (02 de Marzo del 2026 a </w:t>
+        <w:t xml:space="preserve">Semana 1 (09 de </w:t>
+      </w:r>
+      <w:proofErr w:type="gramStart"/>
+      <w:r>
+        <w:rPr>
+          <w:b/>
+        </w:rPr>
+        <w:t>Febrero</w:t>
+      </w:r>
+      <w:proofErr w:type="gramEnd"/>
+      <w:r>
+        <w:rPr>
+          <w:b/>
+        </w:rPr>
+        <w:t xml:space="preserve"> de 2026 a 13 de Febrero de 2026)</w:t>
+      </w:r>
+    </w:p>
+    <w:p>
+      <w:pPr>
+        <w:jc w:val="both"/>
+      </w:pPr>
+      <w:r>
+        <w:t xml:space="preserve">El primer día se inició con el desarrollo de un Roll A </w:t>
+      </w:r>
+      <w:proofErr w:type="spellStart"/>
+      <w:r>
+        <w:t>Ball</w:t>
+      </w:r>
+      <w:proofErr w:type="spellEnd"/>
+      <w:r>
+        <w:t xml:space="preserve">, principalmente para familiarizarse con el entorno de </w:t>
+      </w:r>
+      <w:proofErr w:type="spellStart"/>
+      <w:r>
+        <w:t>Unity</w:t>
+      </w:r>
+      <w:proofErr w:type="spellEnd"/>
+      <w:r>
+        <w:t>. El mismo día se terminó el tutorial, pero al día siguiente se volvió a iniciar, ya que la versión utilizada</w:t>
+      </w:r>
+      <w:r>
+        <w:t xml:space="preserve"> de </w:t>
+      </w:r>
+      <w:proofErr w:type="spellStart"/>
+      <w:r>
+        <w:t>Unity</w:t>
+      </w:r>
+      <w:proofErr w:type="spellEnd"/>
+      <w:r>
+        <w:t xml:space="preserve"> no era la solicitada por </w:t>
+      </w:r>
+      <w:proofErr w:type="spellStart"/>
+      <w:r>
+        <w:t>Yoá</w:t>
+      </w:r>
+      <w:r>
+        <w:t>s</w:t>
+      </w:r>
+      <w:proofErr w:type="spellEnd"/>
+      <w:r>
+        <w:t xml:space="preserve">. </w:t>
+      </w:r>
+      <w:r>
+        <w:t xml:space="preserve">El 11 de </w:t>
+      </w:r>
+      <w:proofErr w:type="gramStart"/>
+      <w:r>
+        <w:t>Febrero</w:t>
+      </w:r>
+      <w:proofErr w:type="gramEnd"/>
+      <w:r>
+        <w:t xml:space="preserve"> se comenzó con el desarrollo de la segunda escena, que era casi la primera escena pero se tenían que implementar enemigos, plataformas, vidas, monedas, </w:t>
+      </w:r>
+      <w:proofErr w:type="spellStart"/>
+      <w:r>
+        <w:t>spawners</w:t>
+      </w:r>
+      <w:proofErr w:type="spellEnd"/>
+      <w:r>
+        <w:t xml:space="preserve"> y plataformas. El 12 de </w:t>
+      </w:r>
+      <w:proofErr w:type="gramStart"/>
+      <w:r>
+        <w:t>Febrero</w:t>
+      </w:r>
+      <w:proofErr w:type="gramEnd"/>
+      <w:r>
+        <w:t xml:space="preserve"> se implementó la Lava, la cual tenía que cambiar de color cada 5 segundos. El 13 de </w:t>
+      </w:r>
+      <w:proofErr w:type="gramStart"/>
+      <w:r>
+        <w:t>Febrero</w:t>
+      </w:r>
+      <w:proofErr w:type="gramEnd"/>
+      <w:r>
+        <w:t xml:space="preserve"> se estuvo haciendo en los </w:t>
+      </w:r>
+      <w:proofErr w:type="spellStart"/>
+      <w:r>
+        <w:t>spawners</w:t>
+      </w:r>
+      <w:proofErr w:type="spellEnd"/>
+      <w:r>
+        <w:t xml:space="preserve"> de enemigos y monedas.</w:t>
+      </w:r>
+    </w:p>
+    <w:p>
+      <w:pPr>
+        <w:jc w:val="both"/>
+        <w:rPr>
+          <w:b/>
+        </w:rPr>
+      </w:pPr>
+      <w:r>
+        <w:rPr>
+          <w:b/>
+        </w:rPr>
+        <w:t xml:space="preserve">Semana 2 (16 de </w:t>
+      </w:r>
+      <w:proofErr w:type="gramStart"/>
+      <w:r>
+        <w:rPr>
+          <w:b/>
+        </w:rPr>
+        <w:t>Febrero</w:t>
+      </w:r>
+      <w:proofErr w:type="gramEnd"/>
+      <w:r>
+        <w:rPr>
+          <w:b/>
+        </w:rPr>
+        <w:t xml:space="preserve"> de 2026 a 20 de Febrero de 2026)</w:t>
+      </w:r>
+    </w:p>
+    <w:p>
+      <w:pPr>
+        <w:jc w:val="both"/>
+      </w:pPr>
+      <w:r>
+        <w:t xml:space="preserve">El 16 de </w:t>
+      </w:r>
+      <w:proofErr w:type="gramStart"/>
+      <w:r>
+        <w:t>Febrero</w:t>
+      </w:r>
+      <w:proofErr w:type="gramEnd"/>
+      <w:r>
+        <w:t xml:space="preserve"> se comenzó con la implementación de las escenas, los menús de pausa y cambios de escenas. Se completó el desarrollo de Roll A </w:t>
+      </w:r>
+      <w:proofErr w:type="spellStart"/>
+      <w:r>
+        <w:t>Ball</w:t>
+      </w:r>
+      <w:proofErr w:type="spellEnd"/>
+      <w:r>
+        <w:t xml:space="preserve">. El 17 de </w:t>
+      </w:r>
+      <w:proofErr w:type="gramStart"/>
+      <w:r>
+        <w:t>Febrero</w:t>
+      </w:r>
+      <w:proofErr w:type="gramEnd"/>
+      <w:r>
+        <w:t xml:space="preserve"> </w:t>
+      </w:r>
+      <w:proofErr w:type="spellStart"/>
+      <w:r>
+        <w:t>Yoás</w:t>
+      </w:r>
+      <w:proofErr w:type="spellEnd"/>
+      <w:r>
+        <w:t xml:space="preserve"> le dio visto bueno al demo y pasé a familiarizarme con el e</w:t>
+      </w:r>
+      <w:r>
+        <w:t xml:space="preserve">ntorno de Meta </w:t>
+      </w:r>
+      <w:proofErr w:type="spellStart"/>
+      <w:r>
+        <w:t>Quest</w:t>
+      </w:r>
+      <w:proofErr w:type="spellEnd"/>
+      <w:r>
+        <w:t xml:space="preserve"> 3S. Si bien el 17 y 18 de </w:t>
+      </w:r>
+      <w:proofErr w:type="gramStart"/>
+      <w:r>
+        <w:t>Febrero</w:t>
+      </w:r>
+      <w:proofErr w:type="gramEnd"/>
+      <w:r>
+        <w:t xml:space="preserve"> estuve trabajando en un demo para saber </w:t>
+      </w:r>
+      <w:proofErr w:type="spellStart"/>
+      <w:r>
+        <w:t>como</w:t>
+      </w:r>
+      <w:proofErr w:type="spellEnd"/>
+      <w:r>
+        <w:t xml:space="preserve"> funcionan los controles, por problemas de hardware en el equipo donde estaba trabajando en el LANR, no podía probar lo que había hecho. El 19 de </w:t>
+      </w:r>
+      <w:proofErr w:type="gramStart"/>
+      <w:r>
+        <w:t>Febrero</w:t>
+      </w:r>
+      <w:proofErr w:type="gramEnd"/>
+      <w:r>
+        <w:t xml:space="preserve"> comencé a trabajar en el Anexo, ya que había un equipo disponible con una tarjeta gráfica compatible con el software de Meta </w:t>
+      </w:r>
+      <w:proofErr w:type="spellStart"/>
+      <w:r>
+        <w:t>Horizon</w:t>
+      </w:r>
+      <w:proofErr w:type="spellEnd"/>
+      <w:r>
+        <w:t xml:space="preserve"> Link, después de configurar el entorno, finalmente pude probar lo que había desarrollado los días pasados. El 19 de </w:t>
+      </w:r>
+      <w:proofErr w:type="gramStart"/>
+      <w:r>
+        <w:t>Febrero</w:t>
+      </w:r>
+      <w:proofErr w:type="gramEnd"/>
+      <w:r>
+        <w:t xml:space="preserve"> comencé a experimentar con los </w:t>
+      </w:r>
+      <w:proofErr w:type="spellStart"/>
+      <w:r>
+        <w:t>Building</w:t>
+      </w:r>
+      <w:proofErr w:type="spellEnd"/>
+      <w:r>
+        <w:t xml:space="preserve"> Blocks de Hand Tracking, algo necesario para evitar la necesidad de usar los controles de los lentes, solo interacción con las manos.</w:t>
+      </w:r>
+    </w:p>
+    <w:p>
+      <w:pPr>
+        <w:jc w:val="both"/>
+        <w:rPr>
+          <w:b/>
+        </w:rPr>
+      </w:pPr>
+      <w:r>
+        <w:rPr>
+          <w:b/>
+        </w:rPr>
+        <w:t xml:space="preserve">Semana 3 (23 de </w:t>
+      </w:r>
+      <w:proofErr w:type="gramStart"/>
+      <w:r>
+        <w:rPr>
+          <w:b/>
+        </w:rPr>
+        <w:t>Febrero</w:t>
+      </w:r>
+      <w:proofErr w:type="gramEnd"/>
+      <w:r>
+        <w:rPr>
+          <w:b/>
+        </w:rPr>
+        <w:t xml:space="preserve"> de 2026 a 27 de Febrero de 2026)</w:t>
+      </w:r>
+    </w:p>
+    <w:p>
+      <w:pPr>
+        <w:jc w:val="both"/>
+      </w:pPr>
+      <w:proofErr w:type="spellStart"/>
+      <w:r>
+        <w:t>Lesly</w:t>
+      </w:r>
+      <w:proofErr w:type="spellEnd"/>
+      <w:r>
+        <w:t xml:space="preserve">, una compañera que trabajaba en el Anexo iba a ocupar la computadora donde iba a estar trabajando, así que no asistí hasta el </w:t>
+      </w:r>
+      <w:proofErr w:type="gramStart"/>
+      <w:r>
+        <w:t>Jueves</w:t>
+      </w:r>
+      <w:proofErr w:type="gramEnd"/>
+      <w:r>
+        <w:t xml:space="preserve"> 26 de Febrero. Los días restantes de la semana me dediqué a terminar el demo y </w:t>
+      </w:r>
+      <w:proofErr w:type="spellStart"/>
+      <w:r>
+        <w:t>prácticar</w:t>
+      </w:r>
+      <w:proofErr w:type="spellEnd"/>
+      <w:r>
+        <w:t xml:space="preserve"> el cambio de escenas con interacción en UI haciendo uso de Hand Tracking.</w:t>
+      </w:r>
+    </w:p>
+    <w:p>
+      <w:pPr>
+        <w:jc w:val="both"/>
+        <w:rPr>
+          <w:b/>
+        </w:rPr>
+      </w:pPr>
+      <w:r>
+        <w:rPr>
+          <w:b/>
+        </w:rPr>
+        <w:t xml:space="preserve">Semana 4 (02 de </w:t>
+      </w:r>
+      <w:proofErr w:type="gramStart"/>
+      <w:r>
+        <w:rPr>
+          <w:b/>
+        </w:rPr>
+        <w:t>Marzo</w:t>
+      </w:r>
+      <w:proofErr w:type="gramEnd"/>
+      <w:r>
+        <w:rPr>
+          <w:b/>
+        </w:rPr>
+        <w:t xml:space="preserve"> del 2026 a </w:t>
       </w:r>
       <w:r>
         <w:rPr>
@@ -105,35 +342,153 @@
         <w:jc w:val="both"/>
       </w:pPr>
       <w:r>
-        <w:t>El 02 de Marzo, Yoás revisó los avances de la semana pasada y me platicó la idea que tenía para la implementación del proyecto, un juego espacial. El 04 de Marzo, después de estar viendo ejemplos de como mover un objeto con hand tracking, Yoás me comentó que la idea era que el paciente o jugador disparen desde sus manos para naves enemigas. El 05 y 06 de Febrero estuve trabajando para que cuando se hiciera la acción de “Pinch”, se disparen diferentes tipos de disparos, también estuve trabajando en los comportamientos de los enemigos, un medidor de supinación, flexión, extensión y pronación.</w:t>
-      </w:r>
-    </w:p>
-    <w:p>
-      <w:pPr>
-        <w:jc w:val="both"/>
-        <w:rPr>
-          <w:b/>
-        </w:rPr>
-      </w:pPr>
-      <w:r>
-        <w:rPr>
-          <w:b/>
-        </w:rPr>
-        <w:t>Semana 5 (09 de Marzo del 2026 a 13 de Febrero de 2026)</w:t>
-      </w:r>
-    </w:p>
-    <w:p>
-      <w:pPr>
-        <w:jc w:val="both"/>
-      </w:pPr>
-      <w:r>
-        <w:t xml:space="preserve">Del 09 de Marzo al 12 de Marzo estuve ajustando el comportamiento del contador de Puntuación, el 12 de Marzo Yoás asistió al Anexo para revisar avances, me comentó que el movimiento de “Pinch” podía ser algo </w:t>
+        <w:t xml:space="preserve">El 02 de </w:t>
+      </w:r>
+      <w:proofErr w:type="gramStart"/>
+      <w:r>
+        <w:t>Marzo</w:t>
+      </w:r>
+      <w:proofErr w:type="gramEnd"/>
+      <w:r>
+        <w:t xml:space="preserve">, </w:t>
+      </w:r>
+      <w:proofErr w:type="spellStart"/>
+      <w:r>
+        <w:t>Yoás</w:t>
+      </w:r>
+      <w:proofErr w:type="spellEnd"/>
+      <w:r>
+        <w:t xml:space="preserve"> revisó los avances de la semana pasada y me platicó la idea que tenía para la implementación del proyecto, un juego espacial. El 04 de </w:t>
+      </w:r>
+      <w:proofErr w:type="gramStart"/>
+      <w:r>
+        <w:t>Marzo</w:t>
+      </w:r>
+      <w:proofErr w:type="gramEnd"/>
+      <w:r>
+        <w:t xml:space="preserve">, después de estar viendo ejemplos de </w:t>
+      </w:r>
+      <w:proofErr w:type="spellStart"/>
+      <w:r>
+        <w:t>como</w:t>
+      </w:r>
+      <w:proofErr w:type="spellEnd"/>
+      <w:r>
+        <w:t xml:space="preserve"> mover un objeto con </w:t>
+      </w:r>
+      <w:proofErr w:type="spellStart"/>
+      <w:r>
+        <w:t>hand</w:t>
+      </w:r>
+      <w:proofErr w:type="spellEnd"/>
+      <w:r>
+        <w:t xml:space="preserve"> tracking, </w:t>
+      </w:r>
+      <w:proofErr w:type="spellStart"/>
+      <w:r>
+        <w:t>Yoás</w:t>
+      </w:r>
+      <w:proofErr w:type="spellEnd"/>
+      <w:r>
+        <w:t xml:space="preserve"> me comentó que la idea era que el paciente o jugador disparen desde sus manos para naves enemigas. El 05 y 06 de </w:t>
+      </w:r>
+      <w:proofErr w:type="gramStart"/>
+      <w:r>
+        <w:t>Febrero</w:t>
+      </w:r>
+      <w:proofErr w:type="gramEnd"/>
+      <w:r>
+        <w:t xml:space="preserve"> estuve trabajando para que cuando se hiciera la acción de “</w:t>
+      </w:r>
+      <w:proofErr w:type="spellStart"/>
+      <w:r>
+        <w:t>Pinch</w:t>
+      </w:r>
+      <w:proofErr w:type="spellEnd"/>
+      <w:r>
+        <w:t>”, se disparen diferentes tipos de disparos, también estuve trabajando en los comportamientos de los enemigos, un medidor de supinación, flexión, extensión y pronación.</w:t>
+      </w:r>
+    </w:p>
+    <w:p>
+      <w:pPr>
+        <w:jc w:val="both"/>
+        <w:rPr>
+          <w:b/>
+        </w:rPr>
+      </w:pPr>
+      <w:r>
+        <w:rPr>
+          <w:b/>
+        </w:rPr>
+        <w:t xml:space="preserve">Semana 5 (09 de </w:t>
+      </w:r>
+      <w:proofErr w:type="gramStart"/>
+      <w:r>
+        <w:rPr>
+          <w:b/>
+        </w:rPr>
+        <w:t>Marzo</w:t>
+      </w:r>
+      <w:proofErr w:type="gramEnd"/>
+      <w:r>
+        <w:rPr>
+          <w:b/>
+        </w:rPr>
+        <w:t xml:space="preserve"> del 2026 a 13 de Febrero de 2026)</w:t>
+      </w:r>
+    </w:p>
+    <w:p>
+      <w:pPr>
+        <w:jc w:val="both"/>
+      </w:pPr>
+      <w:r>
+        <w:t xml:space="preserve">Del 09 de </w:t>
+      </w:r>
+      <w:proofErr w:type="gramStart"/>
+      <w:r>
+        <w:t>Marzo</w:t>
+      </w:r>
+      <w:proofErr w:type="gramEnd"/>
+      <w:r>
+        <w:t xml:space="preserve"> al 12 de Marzo estuve ajustando el comportamiento del contador de Puntuación, el 12 de Marzo </w:t>
+      </w:r>
+      <w:proofErr w:type="spellStart"/>
+      <w:r>
+        <w:t>Yoás</w:t>
+      </w:r>
+      <w:proofErr w:type="spellEnd"/>
+      <w:r>
+        <w:t xml:space="preserve"> asistió al Anexo para revisar avances, me comentó que el movimiento de “</w:t>
+      </w:r>
+      <w:proofErr w:type="spellStart"/>
+      <w:r>
+        <w:t>Pinch</w:t>
+      </w:r>
+      <w:proofErr w:type="spellEnd"/>
+      <w:r>
+        <w:t xml:space="preserve">” podía ser algo </w:t>
       </w:r>
       <w:r>
         <w:t>complicado</w:t>
       </w:r>
       <w:r>
-        <w:t xml:space="preserve"> para los pacientes, así que el jugador ya no tendría que disparar, solo con tocar a los enemigos. El 13 de Marzo me dediqué a que los enemigos se detengan a una distancia del jugador para que este los toque con las manos de hand tracking, pero que desaparezcan si no lo hace en un tiempo determinado.</w:t>
+        <w:t xml:space="preserve"> para los pacientes, así que el jugador ya no tendría que disparar, solo con tocar a los enemigos. El 13 de </w:t>
+      </w:r>
+      <w:proofErr w:type="gramStart"/>
+      <w:r>
+        <w:t>Marzo</w:t>
+      </w:r>
+      <w:proofErr w:type="gramEnd"/>
+      <w:r>
+        <w:t xml:space="preserve"> me dediqué a que los enemigos se detengan a una distancia del jugador para que este los toque con las manos de </w:t>
+      </w:r>
+      <w:proofErr w:type="spellStart"/>
+      <w:r>
+        <w:t>hand</w:t>
+      </w:r>
+      <w:proofErr w:type="spellEnd"/>
+      <w:r>
+        <w:t xml:space="preserve"> tracking, pero que desaparezcan si no lo hace en un tiempo determinado.</w:t>
       </w:r>
       <w:r>
         <w:t xml:space="preserve"> </w:t>
@@ -150,15 +505,37 @@
         <w:rPr>
           <w:b/>
         </w:rPr>
-        <w:t>Semana 6 (17 de Marzo del 2026 a 20 de Marzo del 2026)</w:t>
-      </w:r>
-    </w:p>
-    <w:p>
-      <w:pPr>
-        <w:jc w:val="both"/>
-      </w:pPr>
-      <w:r>
-        <w:t xml:space="preserve">El 17 de Marzo se comenzó con la implementación de un sistema de cuenta regresiva para el comienzo de las rondas de enemigos; la idea es hacer que se inicie con una cuenta regresiva </w:t>
+        <w:t xml:space="preserve">Semana 6 (17 de </w:t>
+      </w:r>
+      <w:proofErr w:type="gramStart"/>
+      <w:r>
+        <w:rPr>
+          <w:b/>
+        </w:rPr>
+        <w:t>Marzo</w:t>
+      </w:r>
+      <w:proofErr w:type="gramEnd"/>
+      <w:r>
+        <w:rPr>
+          <w:b/>
+        </w:rPr>
+        <w:t xml:space="preserve"> del 2026 a 20 de Marzo del 2026)</w:t>
+      </w:r>
+    </w:p>
+    <w:p>
+      <w:pPr>
+        <w:jc w:val="both"/>
+      </w:pPr>
+      <w:r>
+        <w:t xml:space="preserve">El 17 de </w:t>
+      </w:r>
+      <w:proofErr w:type="gramStart"/>
+      <w:r>
+        <w:t>Marzo</w:t>
+      </w:r>
+      <w:proofErr w:type="gramEnd"/>
+      <w:r>
+        <w:t xml:space="preserve"> se comenzó con la implementación de un sistema de cuenta regresiva para el comienzo de las rondas de enemigos; la idea es hacer que se inicie con una cuenta regresiva </w:t>
       </w:r>
       <w:r>
         <w:lastRenderedPageBreak/>
@@ -174,10 +551,42 @@
         <w:t xml:space="preserve">. </w:t>
       </w:r>
       <w:r>
-        <w:t>El 18 de Marzo me encargué de juntar las escenas y completar la implementación del panel de “Continuar”</w:t>
-      </w:r>
-      <w:r>
-        <w:t>. El 19 de Marzo mejoré el comportamiento y los Spawners de los enemigos. El 20 de Marzo,</w:t>
+        <w:t xml:space="preserve">El 18 de </w:t>
+      </w:r>
+      <w:proofErr w:type="gramStart"/>
+      <w:r>
+        <w:t>Marzo</w:t>
+      </w:r>
+      <w:proofErr w:type="gramEnd"/>
+      <w:r>
+        <w:t xml:space="preserve"> me encargué de juntar las escenas y completar la implementación del panel de “Continuar”</w:t>
+      </w:r>
+      <w:r>
+        <w:t xml:space="preserve">. El 19 de </w:t>
+      </w:r>
+      <w:proofErr w:type="gramStart"/>
+      <w:r>
+        <w:t>Marzo</w:t>
+      </w:r>
+      <w:proofErr w:type="gramEnd"/>
+      <w:r>
+        <w:t xml:space="preserve"> mejoré el comportamiento y los </w:t>
+      </w:r>
+      <w:proofErr w:type="spellStart"/>
+      <w:r>
+        <w:t>Spawners</w:t>
+      </w:r>
+      <w:proofErr w:type="spellEnd"/>
+      <w:r>
+        <w:t xml:space="preserve"> de los enemigos. El 20 de </w:t>
+      </w:r>
+      <w:proofErr w:type="gramStart"/>
+      <w:r>
+        <w:t>Marzo</w:t>
+      </w:r>
+      <w:proofErr w:type="gramEnd"/>
+      <w:r>
+        <w:t>,</w:t>
       </w:r>
       <w:r>
         <w:t xml:space="preserve"> comencé a implementar diferentes niveles en caso de que el paciente necesite hacer ejercicios específicos.</w:t>
@@ -194,70 +603,210 @@
         <w:rPr>
           <w:b/>
         </w:rPr>
-        <w:t>Semana 7 (23 de Marzo del 2026 a 28 de Marzo del 2026)</w:t>
-      </w:r>
-    </w:p>
-    <w:p>
-      <w:pPr>
-        <w:jc w:val="both"/>
-      </w:pPr>
-      <w:r>
-        <w:t>El 23 de Marzo, por indicaciones de Yoás, se cambió el enfoque de los enemigos. Estos aparecerán y rodearán al Jugador como si estuvieran en un domo o semicírculo; dicho semicírculo variará su tamaño en base a la distancia máxima que el Jugador pueda estirar su brazo sano. Esa lógica también se implementó.</w:t>
-      </w:r>
-      <w:r>
-        <w:t xml:space="preserve"> El 24 de Marzo me dediqué a hacer la solicitud de tesis.</w:t>
-      </w:r>
-      <w:r>
-        <w:t xml:space="preserve"> El 25 de Marzo, Yoás revisó los avances, donde debo cambiar la orientación del domo y agregar más parámetros a ser modificados por el terapeuta, así como un flujo de trabajo.</w:t>
-      </w:r>
-      <w:r>
-        <w:t xml:space="preserve"> 26 y 27 de Marzo estuve configurando la nueva orientación del domo y el comportamiento de los enemigos.</w:t>
-      </w:r>
-      <w:r>
-        <w:t xml:space="preserve"> El 28 de Marzo conecté las escenas.</w:t>
-      </w:r>
-    </w:p>
-    <w:p>
-      <w:pPr>
-        <w:jc w:val="both"/>
-        <w:rPr>
-          <w:b/>
-        </w:rPr>
-      </w:pPr>
-      <w:r>
-        <w:rPr>
-          <w:b/>
-        </w:rPr>
-        <w:t>Semana 8 (06 de Abril del 2026 a 10 de Abril del 2026)</w:t>
-      </w:r>
-    </w:p>
-    <w:p>
-      <w:pPr>
-        <w:jc w:val="both"/>
-      </w:pPr>
-      <w:r>
-        <w:t xml:space="preserve">El 06 de Abril comencé con la implementación </w:t>
-      </w:r>
-      <w:r>
-        <w:t>de la selección de los enemigos; Yoas me encomendó hacer un modo de realidad mixta.</w:t>
-      </w:r>
-      <w:r>
-        <w:t xml:space="preserve"> 07 de Abril detecté que hay problemas con el cable de conexión, debo buscar un USB 3.0.</w:t>
+        <w:t xml:space="preserve">Semana 7 (23 de </w:t>
+      </w:r>
+      <w:proofErr w:type="gramStart"/>
+      <w:r>
+        <w:rPr>
+          <w:b/>
+        </w:rPr>
+        <w:t>Marzo</w:t>
+      </w:r>
+      <w:proofErr w:type="gramEnd"/>
+      <w:r>
+        <w:rPr>
+          <w:b/>
+        </w:rPr>
+        <w:t xml:space="preserve"> del 2026 a 28 de Marzo del 2026)</w:t>
+      </w:r>
+    </w:p>
+    <w:p>
+      <w:pPr>
+        <w:jc w:val="both"/>
+      </w:pPr>
+      <w:r>
+        <w:t xml:space="preserve">El 23 de </w:t>
+      </w:r>
+      <w:proofErr w:type="gramStart"/>
+      <w:r>
+        <w:t>Marzo</w:t>
+      </w:r>
+      <w:proofErr w:type="gramEnd"/>
+      <w:r>
+        <w:t xml:space="preserve">, por indicaciones de </w:t>
+      </w:r>
+      <w:proofErr w:type="spellStart"/>
+      <w:r>
+        <w:t>Yoás</w:t>
+      </w:r>
+      <w:proofErr w:type="spellEnd"/>
+      <w:r>
+        <w:t>, se cambió el enfoque de los enemigos. Estos aparecerán y rodearán al Jugador como si estuvieran en un domo o semicírculo; dicho semicírculo variará su tamaño en base a la distancia máxima que el Jugador pueda estirar su brazo sano. Esa lógica también se implementó.</w:t>
+      </w:r>
+      <w:r>
+        <w:t xml:space="preserve"> El 24 de </w:t>
+      </w:r>
+      <w:proofErr w:type="gramStart"/>
+      <w:r>
+        <w:t>Marzo</w:t>
+      </w:r>
+      <w:proofErr w:type="gramEnd"/>
+      <w:r>
+        <w:t xml:space="preserve"> me dediqué a hacer la solicitud de tesis.</w:t>
+      </w:r>
+      <w:r>
+        <w:t xml:space="preserve"> El 25 de </w:t>
+      </w:r>
+      <w:proofErr w:type="gramStart"/>
+      <w:r>
+        <w:t>Marzo</w:t>
+      </w:r>
+      <w:proofErr w:type="gramEnd"/>
+      <w:r>
+        <w:t xml:space="preserve">, </w:t>
+      </w:r>
+      <w:proofErr w:type="spellStart"/>
+      <w:r>
+        <w:t>Yoás</w:t>
+      </w:r>
+      <w:proofErr w:type="spellEnd"/>
+      <w:r>
+        <w:t xml:space="preserve"> revisó los avances, donde debo cambiar la orientación del domo y agregar más parámetros a ser modificados por el terapeuta, así como un flujo de trabajo.</w:t>
+      </w:r>
+      <w:r>
+        <w:t xml:space="preserve"> 26 y 27 de </w:t>
+      </w:r>
+      <w:proofErr w:type="gramStart"/>
+      <w:r>
+        <w:t>Marzo</w:t>
+      </w:r>
+      <w:proofErr w:type="gramEnd"/>
+      <w:r>
+        <w:t xml:space="preserve"> estuve configurando la nueva orientación del domo y el comportamiento de los enemigos.</w:t>
+      </w:r>
+      <w:r>
+        <w:t xml:space="preserve"> El 28 de </w:t>
+      </w:r>
+      <w:proofErr w:type="gramStart"/>
+      <w:r>
+        <w:t>Marzo</w:t>
+      </w:r>
+      <w:proofErr w:type="gramEnd"/>
+      <w:r>
+        <w:t xml:space="preserve"> conecté las escenas.</w:t>
+      </w:r>
+    </w:p>
+    <w:p>
+      <w:pPr>
+        <w:jc w:val="both"/>
+        <w:rPr>
+          <w:b/>
+        </w:rPr>
+      </w:pPr>
+      <w:r>
+        <w:rPr>
+          <w:b/>
+        </w:rPr>
+        <w:t xml:space="preserve">Semana 8 (06 de </w:t>
+      </w:r>
+      <w:proofErr w:type="gramStart"/>
+      <w:r>
+        <w:rPr>
+          <w:b/>
+        </w:rPr>
+        <w:t>Abril</w:t>
+      </w:r>
+      <w:proofErr w:type="gramEnd"/>
+      <w:r>
+        <w:rPr>
+          <w:b/>
+        </w:rPr>
+        <w:t xml:space="preserve"> del 2026 a 10 de Abril del 2026)</w:t>
+      </w:r>
+    </w:p>
+    <w:p>
+      <w:pPr>
+        <w:jc w:val="both"/>
+      </w:pPr>
+      <w:r>
+        <w:t xml:space="preserve">El 06 de </w:t>
+      </w:r>
+      <w:proofErr w:type="gramStart"/>
+      <w:r>
+        <w:t>Abril</w:t>
+      </w:r>
+      <w:proofErr w:type="gramEnd"/>
+      <w:r>
+        <w:t xml:space="preserve"> comencé con la implementación </w:t>
+      </w:r>
+      <w:r>
+        <w:t xml:space="preserve">de la selección de los enemigos; </w:t>
+      </w:r>
+      <w:proofErr w:type="spellStart"/>
+      <w:r>
+        <w:t>Yoas</w:t>
+      </w:r>
+      <w:proofErr w:type="spellEnd"/>
+      <w:r>
+        <w:t xml:space="preserve"> me encomendó hacer un modo de realidad mixta.</w:t>
+      </w:r>
+      <w:r>
+        <w:t xml:space="preserve"> 07 de </w:t>
+      </w:r>
+      <w:proofErr w:type="gramStart"/>
+      <w:r>
+        <w:t>Abril</w:t>
+      </w:r>
+      <w:proofErr w:type="gramEnd"/>
+      <w:r>
+        <w:t xml:space="preserve"> detecté que hay problemas con el cable de conexión, debo buscar un USB 3.0.</w:t>
       </w:r>
       <w:r>
         <w:t xml:space="preserve"> </w:t>
       </w:r>
       <w:r>
-        <w:t xml:space="preserve">El 08 de Abril, después de registrar el Meta Quest 3S a la cuenta de desarrollador y arreglar un </w:t>
+        <w:t xml:space="preserve">El 08 de </w:t>
+      </w:r>
+      <w:proofErr w:type="gramStart"/>
+      <w:r>
+        <w:t>Abril</w:t>
+      </w:r>
+      <w:proofErr w:type="gramEnd"/>
+      <w:r>
+        <w:t xml:space="preserve">, después de registrar el Meta </w:t>
+      </w:r>
+      <w:proofErr w:type="spellStart"/>
+      <w:r>
+        <w:t>Quest</w:t>
+      </w:r>
+      <w:proofErr w:type="spellEnd"/>
+      <w:r>
+        <w:t xml:space="preserve"> 3S a la cuenta de desarrollador y arreglar un </w:t>
       </w:r>
       <w:r>
         <w:t>problema</w:t>
       </w:r>
       <w:r>
-        <w:t xml:space="preserve"> con el Canvas, se pudo conectar y completar la Realidad Mixta.</w:t>
-      </w:r>
-      <w:r>
-        <w:t xml:space="preserve"> El 10 de Abril se continuó con la implementación del seleccionador de Enemigos, ahora falta esperar por los modelos.</w:t>
+        <w:t xml:space="preserve"> con el </w:t>
+      </w:r>
+      <w:proofErr w:type="spellStart"/>
+      <w:r>
+        <w:t>Canvas</w:t>
+      </w:r>
+      <w:proofErr w:type="spellEnd"/>
+      <w:r>
+        <w:t>, se pudo conectar y completar la Realidad Mixta.</w:t>
+      </w:r>
+      <w:r>
+        <w:t xml:space="preserve"> El 10 de </w:t>
+      </w:r>
+      <w:proofErr w:type="gramStart"/>
+      <w:r>
+        <w:t>Abril</w:t>
+      </w:r>
+      <w:proofErr w:type="gramEnd"/>
+      <w:r>
+        <w:t xml:space="preserve"> se continuó con la implementación del seleccionador de Enemigos, ahora falta esperar por los modelos.</w:t>
       </w:r>
     </w:p>
     <w:p>
@@ -277,7 +826,21 @@
         <w:rPr>
           <w:b/>
         </w:rPr>
-        <w:t>na 9 (13 de Abril del 2026 al 17</w:t>
+        <w:t xml:space="preserve">na 9 (13 de </w:t>
+      </w:r>
+      <w:proofErr w:type="gramStart"/>
+      <w:r>
+        <w:rPr>
+          <w:b/>
+        </w:rPr>
+        <w:t>Abril</w:t>
+      </w:r>
+      <w:proofErr w:type="gramEnd"/>
+      <w:r>
+        <w:rPr>
+          <w:b/>
+        </w:rPr>
+        <w:t xml:space="preserve"> del 2026 al 17</w:t>
       </w:r>
       <w:r>
         <w:rPr>
@@ -291,50 +854,181 @@
         <w:jc w:val="both"/>
       </w:pPr>
       <w:r>
-        <w:t>El 13 de Abril, comencé a trabajar con los modelos de las naves; debo configurarlos para una actividad que se tendrá por parte de Amerike.</w:t>
-      </w:r>
-      <w:r>
-        <w:t xml:space="preserve"> El 14 de Abril terminé de configurar los modelos y limpié un poco el código y los Assets para la muestra del día siguiente.</w:t>
-      </w:r>
-      <w:r>
-        <w:t xml:space="preserve"> El 15 de Abril realicé unos ajustes a la cámara del jugador y alisté todo para la muestra de Amerike</w:t>
-      </w:r>
-      <w:r>
-        <w:t>. El 16 de Abril fue la muestra, hubo problemas con la Etiqueta Player, ya fue solucionado pero al menos en la muestra se tuvo ese problema. El 17 de Abril se comenzó a probar las mecánicas del segundo minijuego, este toma en cuenta la rotación de la muñeca del jugador para poder rotar las piezas del rompecabezas.</w:t>
-      </w:r>
-    </w:p>
-    <w:p>
-      <w:pPr>
-        <w:jc w:val="both"/>
-        <w:rPr>
-          <w:b/>
-        </w:rPr>
-      </w:pPr>
-      <w:r>
-        <w:rPr>
-          <w:b/>
-        </w:rPr>
-        <w:t>Semana 10 (20 de Abril del 2026 al 24 de Abril del 2026)</w:t>
-      </w:r>
-    </w:p>
-    <w:p>
-      <w:pPr>
-        <w:jc w:val="both"/>
-      </w:pPr>
-      <w:r>
-        <w:t>El 20 de Abril, comencé a trabajar en el sistema para confirmar que el rompecabezas esté formado, pero por los modelos que estoy usando, no sé exactamente si está funcionando hasta que tenga los modelos correctos.</w:t>
-      </w:r>
-      <w:r>
-        <w:t xml:space="preserve"> El 21 de Abril hubo retroalimentación por parte de Yoás, para las runas no hay que aplicar los botones, pero el sistema de victoria está bien, ahora hay que idear una forma para implementar las puertas.</w:t>
-      </w:r>
-      <w:r>
-        <w:t xml:space="preserve"> El 22 de Abril se comenzó la implementación de las puertas, las cuales funcionarán como forma de medir el progreso del jugador.</w:t>
-      </w:r>
-      <w:r>
-        <w:t xml:space="preserve"> El 23 de Abril se comenzó a implementar el contador para finalizar el nivel.</w:t>
-      </w:r>
-      <w:r>
-        <w:t xml:space="preserve"> El 24 de Abril se arregló la funcionalidad del contador, además de que se activan interfaces en base al resultado de las rotaciones. La siguiente semana comienzo a implementar un objeto que aumente la intensidad </w:t>
+        <w:t xml:space="preserve">El 13 de </w:t>
+      </w:r>
+      <w:proofErr w:type="gramStart"/>
+      <w:r>
+        <w:t>Abril</w:t>
+      </w:r>
+      <w:proofErr w:type="gramEnd"/>
+      <w:r>
+        <w:t xml:space="preserve">, comencé a trabajar con los modelos de las naves; debo configurarlos para una actividad que se tendrá por parte de </w:t>
+      </w:r>
+      <w:proofErr w:type="spellStart"/>
+      <w:r>
+        <w:t>Amerike</w:t>
+      </w:r>
+      <w:proofErr w:type="spellEnd"/>
+      <w:r>
+        <w:t>.</w:t>
+      </w:r>
+      <w:r>
+        <w:t xml:space="preserve"> El 14 de </w:t>
+      </w:r>
+      <w:proofErr w:type="gramStart"/>
+      <w:r>
+        <w:t>Abril</w:t>
+      </w:r>
+      <w:proofErr w:type="gramEnd"/>
+      <w:r>
+        <w:t xml:space="preserve"> terminé de configurar los modelos y limpié un poco el código y los </w:t>
+      </w:r>
+      <w:proofErr w:type="spellStart"/>
+      <w:r>
+        <w:t>Assets</w:t>
+      </w:r>
+      <w:proofErr w:type="spellEnd"/>
+      <w:r>
+        <w:t xml:space="preserve"> para la muestra del día siguiente.</w:t>
+      </w:r>
+      <w:r>
+        <w:t xml:space="preserve"> El 15 de </w:t>
+      </w:r>
+      <w:proofErr w:type="gramStart"/>
+      <w:r>
+        <w:t>Abril</w:t>
+      </w:r>
+      <w:proofErr w:type="gramEnd"/>
+      <w:r>
+        <w:t xml:space="preserve"> realicé unos ajustes a la cámara del jugador y alisté todo para la muestra de </w:t>
+      </w:r>
+      <w:proofErr w:type="spellStart"/>
+      <w:r>
+        <w:t>Amerike</w:t>
+      </w:r>
+      <w:proofErr w:type="spellEnd"/>
+      <w:r>
+        <w:t xml:space="preserve">. El 16 de </w:t>
+      </w:r>
+      <w:proofErr w:type="gramStart"/>
+      <w:r>
+        <w:t>Abril</w:t>
+      </w:r>
+      <w:proofErr w:type="gramEnd"/>
+      <w:r>
+        <w:t xml:space="preserve"> fue la muestra, hubo problemas con la Etiqueta Player, ya fue solucionado pero al menos en la muestra se tuvo ese problema. El 17 de </w:t>
+      </w:r>
+      <w:proofErr w:type="gramStart"/>
+      <w:r>
+        <w:t>Abril</w:t>
+      </w:r>
+      <w:proofErr w:type="gramEnd"/>
+      <w:r>
+        <w:t xml:space="preserve"> se comenzó a probar las mecánicas del segundo </w:t>
+      </w:r>
+      <w:proofErr w:type="spellStart"/>
+      <w:r>
+        <w:t>minijuego</w:t>
+      </w:r>
+      <w:proofErr w:type="spellEnd"/>
+      <w:r>
+        <w:t>, este toma en cuenta la rotación de la muñeca del jugador para poder rotar las piezas del rompecabezas.</w:t>
+      </w:r>
+    </w:p>
+    <w:p>
+      <w:pPr>
+        <w:jc w:val="both"/>
+        <w:rPr>
+          <w:b/>
+        </w:rPr>
+      </w:pPr>
+      <w:r>
+        <w:rPr>
+          <w:b/>
+        </w:rPr>
+        <w:t xml:space="preserve">Semana 10 (20 de </w:t>
+      </w:r>
+      <w:proofErr w:type="gramStart"/>
+      <w:r>
+        <w:rPr>
+          <w:b/>
+        </w:rPr>
+        <w:t>Abril</w:t>
+      </w:r>
+      <w:proofErr w:type="gramEnd"/>
+      <w:r>
+        <w:rPr>
+          <w:b/>
+        </w:rPr>
+        <w:t xml:space="preserve"> del 2026 al 24 de Abril del 2026)</w:t>
+      </w:r>
+    </w:p>
+    <w:p>
+      <w:pPr>
+        <w:jc w:val="both"/>
+      </w:pPr>
+      <w:r>
+        <w:t xml:space="preserve">El 20 de </w:t>
+      </w:r>
+      <w:proofErr w:type="gramStart"/>
+      <w:r>
+        <w:t>Abril</w:t>
+      </w:r>
+      <w:proofErr w:type="gramEnd"/>
+      <w:r>
+        <w:t>, comencé a trabajar en el sistema para confirmar que el rompecabezas esté formado, pero por los modelos que estoy usando, no sé exactamente si está funcionando hasta que tenga los modelos correctos.</w:t>
+      </w:r>
+      <w:r>
+        <w:t xml:space="preserve"> El 21 de </w:t>
+      </w:r>
+      <w:proofErr w:type="gramStart"/>
+      <w:r>
+        <w:t>Abril</w:t>
+      </w:r>
+      <w:proofErr w:type="gramEnd"/>
+      <w:r>
+        <w:t xml:space="preserve"> hubo retroalimentación por parte de </w:t>
+      </w:r>
+      <w:proofErr w:type="spellStart"/>
+      <w:r>
+        <w:t>Yoás</w:t>
+      </w:r>
+      <w:proofErr w:type="spellEnd"/>
+      <w:r>
+        <w:t>, para las runas no hay que aplicar los botones, pero el sistema de victoria está bien, ahora hay que idear una forma para implementar las puertas.</w:t>
+      </w:r>
+      <w:r>
+        <w:t xml:space="preserve"> El 22 de </w:t>
+      </w:r>
+      <w:proofErr w:type="gramStart"/>
+      <w:r>
+        <w:t>Abril</w:t>
+      </w:r>
+      <w:proofErr w:type="gramEnd"/>
+      <w:r>
+        <w:t xml:space="preserve"> se comenzó la implementación de las puertas, las cuales funcionarán como forma de medir el progreso del jugador.</w:t>
+      </w:r>
+      <w:r>
+        <w:t xml:space="preserve"> El 23 de </w:t>
+      </w:r>
+      <w:proofErr w:type="gramStart"/>
+      <w:r>
+        <w:t>Abril</w:t>
+      </w:r>
+      <w:proofErr w:type="gramEnd"/>
+      <w:r>
+        <w:t xml:space="preserve"> se comenzó a implementar el contador para finalizar el nivel.</w:t>
+      </w:r>
+      <w:r>
+        <w:t xml:space="preserve"> El 24 de </w:t>
+      </w:r>
+      <w:proofErr w:type="gramStart"/>
+      <w:r>
+        <w:t>Abril</w:t>
+      </w:r>
+      <w:proofErr w:type="gramEnd"/>
+      <w:r>
+        <w:t xml:space="preserve"> se arregló la funcionalidad del contador, además de que se activan interfaces en base al resultado de las rotaciones. La siguiente semana comienzo a implementar un objeto que aumente la intensidad </w:t>
       </w:r>
       <w:r>
         <w:lastRenderedPageBreak/>
@@ -352,7 +1046,21 @@
         <w:rPr>
           <w:b/>
         </w:rPr>
-        <w:t>Semana 11 (27 de Abril del 2026 al 30 de Abril</w:t>
+        <w:t xml:space="preserve">Semana 11 (27 de </w:t>
+      </w:r>
+      <w:proofErr w:type="gramStart"/>
+      <w:r>
+        <w:rPr>
+          <w:b/>
+        </w:rPr>
+        <w:t>Abril</w:t>
+      </w:r>
+      <w:proofErr w:type="gramEnd"/>
+      <w:r>
+        <w:rPr>
+          <w:b/>
+        </w:rPr>
+        <w:t xml:space="preserve"> del 2026 al 30 de Abril</w:t>
       </w:r>
       <w:r>
         <w:rPr>
@@ -372,44 +1080,130 @@
         <w:jc w:val="both"/>
       </w:pPr>
       <w:r>
-        <w:t>El 27 de Abril, comencé a implementar la iluminación de un objeto para darle un efecto de premio.</w:t>
-      </w:r>
-      <w:r>
-        <w:t xml:space="preserve"> El 28 de Abril, comencé a hacer ajustes para la interfaz, en la semana debo ver si cuando el jugador pierda, se reinicia toda la partida o solo el escenario.</w:t>
-      </w:r>
-      <w:r>
-        <w:t xml:space="preserve"> El 30 de Abril recibí comentarios de Yoas para continuar con mi implementación de las piezas del rompecabezas por separada en lugar de juntas, así como poner limitaciones para las piezas.</w:t>
-      </w:r>
-    </w:p>
-    <w:p>
-      <w:pPr>
-        <w:jc w:val="both"/>
-        <w:rPr>
-          <w:b/>
-        </w:rPr>
-      </w:pPr>
-      <w:r>
-        <w:rPr>
-          <w:b/>
-        </w:rPr>
-        <w:t>Semana 12 (04 de Mayo del 2026 al 08 de Mayo del 2026)</w:t>
-      </w:r>
-    </w:p>
-    <w:p>
-      <w:pPr>
-        <w:jc w:val="both"/>
-      </w:pPr>
-      <w:r>
-        <w:t>El 04 de Mayo implementé los botones para continuar la partida o reiniciar el nivel en caso de que termine el tiempo.</w:t>
-      </w:r>
-      <w:r>
-        <w:t xml:space="preserve"> El 05 de Mayo implementé un límite de rotación para cada pieza del rompecabezas para que el paciente tenga que interactuar varias veces y pueda trabajar en la rotación de su muñeca.</w:t>
-      </w:r>
-      <w:r>
-        <w:t xml:space="preserve"> El 06 de Mayo implementé un menú general para los 4 minijuegos.</w:t>
-      </w:r>
-      <w:r>
-        <w:t xml:space="preserve"> El 7 y 8 de Mayo </w:t>
+        <w:t xml:space="preserve">El 27 de </w:t>
+      </w:r>
+      <w:proofErr w:type="gramStart"/>
+      <w:r>
+        <w:t>Abril</w:t>
+      </w:r>
+      <w:proofErr w:type="gramEnd"/>
+      <w:r>
+        <w:t>, comencé a implementar la iluminación de un objeto para darle un efecto de premio.</w:t>
+      </w:r>
+      <w:r>
+        <w:t xml:space="preserve"> El 28 de </w:t>
+      </w:r>
+      <w:proofErr w:type="gramStart"/>
+      <w:r>
+        <w:t>Abril</w:t>
+      </w:r>
+      <w:proofErr w:type="gramEnd"/>
+      <w:r>
+        <w:t>, comencé a hacer ajustes para la interfaz, en la semana debo ver si cuando el jugador pierda, se reinicia toda la partida o solo el escenario.</w:t>
+      </w:r>
+      <w:r>
+        <w:t xml:space="preserve"> El 30 de </w:t>
+      </w:r>
+      <w:proofErr w:type="gramStart"/>
+      <w:r>
+        <w:t>Abril</w:t>
+      </w:r>
+      <w:proofErr w:type="gramEnd"/>
+      <w:r>
+        <w:t xml:space="preserve"> recibí comentarios de </w:t>
+      </w:r>
+      <w:proofErr w:type="spellStart"/>
+      <w:r>
+        <w:t>Yoas</w:t>
+      </w:r>
+      <w:proofErr w:type="spellEnd"/>
+      <w:r>
+        <w:t xml:space="preserve"> para continuar con mi implementación de las piezas del rompecabezas por separada en lugar de juntas, así como poner limitaciones para las piezas.</w:t>
+      </w:r>
+    </w:p>
+    <w:p>
+      <w:pPr>
+        <w:jc w:val="both"/>
+        <w:rPr>
+          <w:b/>
+        </w:rPr>
+      </w:pPr>
+      <w:r>
+        <w:rPr>
+          <w:b/>
+        </w:rPr>
+        <w:t xml:space="preserve">Semana 12 (04 de </w:t>
+      </w:r>
+      <w:proofErr w:type="gramStart"/>
+      <w:r>
+        <w:rPr>
+          <w:b/>
+        </w:rPr>
+        <w:t>Mayo</w:t>
+      </w:r>
+      <w:proofErr w:type="gramEnd"/>
+      <w:r>
+        <w:rPr>
+          <w:b/>
+        </w:rPr>
+        <w:t xml:space="preserve"> del 2026 al 08 de Mayo del 2026)</w:t>
+      </w:r>
+    </w:p>
+    <w:p>
+      <w:pPr>
+        <w:jc w:val="both"/>
+      </w:pPr>
+      <w:r>
+        <w:t xml:space="preserve">El 04 de </w:t>
+      </w:r>
+      <w:proofErr w:type="gramStart"/>
+      <w:r>
+        <w:t>Mayo</w:t>
+      </w:r>
+      <w:proofErr w:type="gramEnd"/>
+      <w:r>
+        <w:t xml:space="preserve"> implementé los botones para continuar la partida o reiniciar el nivel en caso de que termine el tiempo.</w:t>
+      </w:r>
+      <w:r>
+        <w:t xml:space="preserve"> El 05 de </w:t>
+      </w:r>
+      <w:proofErr w:type="gramStart"/>
+      <w:r>
+        <w:t>Mayo</w:t>
+      </w:r>
+      <w:proofErr w:type="gramEnd"/>
+      <w:r>
+        <w:t xml:space="preserve"> implementé un límite de rotación para cada pieza del rompecabezas para que el paciente tenga que interactuar varias veces y pueda trabajar en la rotación de su muñeca.</w:t>
+      </w:r>
+      <w:r>
+        <w:t xml:space="preserve"> El 06 de </w:t>
+      </w:r>
+      <w:proofErr w:type="gramStart"/>
+      <w:r>
+        <w:t>Mayo</w:t>
+      </w:r>
+      <w:proofErr w:type="gramEnd"/>
+      <w:r>
+        <w:t xml:space="preserve"> implementé un menú general para los 4 </w:t>
+      </w:r>
+      <w:proofErr w:type="spellStart"/>
+      <w:r>
+        <w:t>minijuegos</w:t>
+      </w:r>
+      <w:proofErr w:type="spellEnd"/>
+      <w:r>
+        <w:t>.</w:t>
+      </w:r>
+      <w:r>
+        <w:t xml:space="preserve"> El 7 y 8 de </w:t>
+      </w:r>
+      <w:proofErr w:type="gramStart"/>
+      <w:r>
+        <w:t>Mayo</w:t>
+      </w:r>
+      <w:proofErr w:type="gramEnd"/>
+      <w:r>
+        <w:t xml:space="preserve"> </w:t>
       </w:r>
       <w:r>
         <w:t>continué</w:t>
@@ -421,91 +1215,261 @@
         <w:t>do</w:t>
       </w:r>
       <w:r>
-        <w:t xml:space="preserve"> el menú de los 4 minijuegos, procuré que el paciente tenga la opción de girar a otros lados para cambiar entre realidad aumentada y mixta.</w:t>
-      </w:r>
-    </w:p>
-    <w:p>
-      <w:pPr>
-        <w:jc w:val="both"/>
-        <w:rPr>
-          <w:b/>
-        </w:rPr>
-      </w:pPr>
-      <w:r>
-        <w:rPr>
-          <w:b/>
-        </w:rPr>
-        <w:t>Semana 13 (11 de Mayo del 2026 al 14 de Mayo del 2026)</w:t>
-      </w:r>
-    </w:p>
-    <w:p>
-      <w:pPr>
-        <w:jc w:val="both"/>
-      </w:pPr>
-      <w:r>
-        <w:t>El 11 de Mayo terminé la implementación del botón para alternar de realidad desde el menú general; comenzaré a ver el prototipo del tercer minijuego.</w:t>
-      </w:r>
-      <w:r>
-        <w:t xml:space="preserve"> El 12 de Mayo comencé a implementar una forma para que la dificultad de los niveles aumente en base al tiempo que tarda el paciente en resolver el rompecabezas.</w:t>
-      </w:r>
-      <w:r>
-        <w:t xml:space="preserve"> El 14 de Mayo mejoré los Colliders de las Naves y añadí las nuevas texturas que hizo mi compañera Yael.</w:t>
-      </w:r>
-    </w:p>
-    <w:p>
-      <w:pPr>
-        <w:jc w:val="both"/>
-        <w:rPr>
-          <w:b/>
-        </w:rPr>
-      </w:pPr>
-      <w:r>
-        <w:rPr>
-          <w:b/>
-        </w:rPr>
-        <w:t>Semana 14 (18 de Mayo del 2026 al 22 de Mayo del 2026)</w:t>
-      </w:r>
-    </w:p>
-    <w:p>
-      <w:pPr>
-        <w:jc w:val="both"/>
-      </w:pPr>
-      <w:r>
-        <w:t>El 18 de Mayo comencé a ver las animaciones de las naves destruidas para el primer minijuego.</w:t>
-      </w:r>
-      <w:r>
-        <w:t xml:space="preserve"> El 19 de Mayo implementé las animaciones de las naves destruidas así como su comportamiento al momento de que el paciente interactúa con ellas.</w:t>
-      </w:r>
-      <w:r>
-        <w:t xml:space="preserve"> El 20 de Mayo comencé a implementar un mensaje continuo para animar y recordarle al paciente lo que debe hacer.</w:t>
-      </w:r>
-      <w:r>
-        <w:t xml:space="preserve"> El 21 de Mayo se implementó el mensaje continuo en el segundo minijuego.</w:t>
-      </w:r>
-      <w:r>
-        <w:t xml:space="preserve"> El 22 de Mayo se comenzaron a implementar sonidos para los primeros minijuegos.</w:t>
-      </w:r>
-    </w:p>
-    <w:p>
-      <w:pPr>
-        <w:jc w:val="both"/>
-        <w:rPr>
-          <w:b/>
-        </w:rPr>
-      </w:pPr>
-      <w:r>
-        <w:rPr>
-          <w:b/>
-        </w:rPr>
-        <w:t>Semana 15 (25 de Mayo del 2026 al 29 de Mayo del 2026)</w:t>
-      </w:r>
-    </w:p>
-    <w:p>
-      <w:pPr>
-        <w:jc w:val="both"/>
-      </w:pPr>
-      <w:r>
-        <w:t>El 25 de Mayo comencé a implementar efecto</w:t>
+        <w:t xml:space="preserve"> el menú de los 4 </w:t>
+      </w:r>
+      <w:proofErr w:type="spellStart"/>
+      <w:r>
+        <w:t>minijuegos</w:t>
+      </w:r>
+      <w:proofErr w:type="spellEnd"/>
+      <w:r>
+        <w:t>, procuré que el paciente tenga la opción de girar a otros lados para cambiar entre realidad aumentada y mixta.</w:t>
+      </w:r>
+    </w:p>
+    <w:p>
+      <w:pPr>
+        <w:jc w:val="both"/>
+        <w:rPr>
+          <w:b/>
+        </w:rPr>
+      </w:pPr>
+      <w:r>
+        <w:rPr>
+          <w:b/>
+        </w:rPr>
+        <w:t xml:space="preserve">Semana 13 (11 de </w:t>
+      </w:r>
+      <w:proofErr w:type="gramStart"/>
+      <w:r>
+        <w:rPr>
+          <w:b/>
+        </w:rPr>
+        <w:t>Mayo</w:t>
+      </w:r>
+      <w:proofErr w:type="gramEnd"/>
+      <w:r>
+        <w:rPr>
+          <w:b/>
+        </w:rPr>
+        <w:t xml:space="preserve"> del 2026 al 14 de Mayo del 2026)</w:t>
+      </w:r>
+    </w:p>
+    <w:p>
+      <w:pPr>
+        <w:jc w:val="both"/>
+      </w:pPr>
+      <w:r>
+        <w:t xml:space="preserve">El 11 de </w:t>
+      </w:r>
+      <w:proofErr w:type="gramStart"/>
+      <w:r>
+        <w:t>Mayo</w:t>
+      </w:r>
+      <w:proofErr w:type="gramEnd"/>
+      <w:r>
+        <w:t xml:space="preserve"> terminé la implementación del botón para alternar de realidad desde el menú general; comenzaré a ver el prototipo del tercer </w:t>
+      </w:r>
+      <w:proofErr w:type="spellStart"/>
+      <w:r>
+        <w:t>minijuego</w:t>
+      </w:r>
+      <w:proofErr w:type="spellEnd"/>
+      <w:r>
+        <w:t>.</w:t>
+      </w:r>
+      <w:r>
+        <w:t xml:space="preserve"> El 12 de </w:t>
+      </w:r>
+      <w:proofErr w:type="gramStart"/>
+      <w:r>
+        <w:t>Mayo</w:t>
+      </w:r>
+      <w:proofErr w:type="gramEnd"/>
+      <w:r>
+        <w:t xml:space="preserve"> comencé a implementar una forma para que la dificultad de los niveles aumente en base al tiempo que tarda el paciente en resolver el rompecabezas.</w:t>
+      </w:r>
+      <w:r>
+        <w:t xml:space="preserve"> El 14 de </w:t>
+      </w:r>
+      <w:proofErr w:type="gramStart"/>
+      <w:r>
+        <w:t>Mayo</w:t>
+      </w:r>
+      <w:proofErr w:type="gramEnd"/>
+      <w:r>
+        <w:t xml:space="preserve"> mejoré los </w:t>
+      </w:r>
+      <w:proofErr w:type="spellStart"/>
+      <w:r>
+        <w:t>Colliders</w:t>
+      </w:r>
+      <w:proofErr w:type="spellEnd"/>
+      <w:r>
+        <w:t xml:space="preserve"> de las Naves y añadí las nuevas texturas que hizo mi compañera </w:t>
+      </w:r>
+      <w:proofErr w:type="spellStart"/>
+      <w:r>
+        <w:t>Yael</w:t>
+      </w:r>
+      <w:proofErr w:type="spellEnd"/>
+      <w:r>
+        <w:t>.</w:t>
+      </w:r>
+    </w:p>
+    <w:p>
+      <w:pPr>
+        <w:jc w:val="both"/>
+        <w:rPr>
+          <w:b/>
+        </w:rPr>
+      </w:pPr>
+      <w:r>
+        <w:rPr>
+          <w:b/>
+        </w:rPr>
+        <w:t xml:space="preserve">Semana 14 (18 de </w:t>
+      </w:r>
+      <w:proofErr w:type="gramStart"/>
+      <w:r>
+        <w:rPr>
+          <w:b/>
+        </w:rPr>
+        <w:t>Mayo</w:t>
+      </w:r>
+      <w:proofErr w:type="gramEnd"/>
+      <w:r>
+        <w:rPr>
+          <w:b/>
+        </w:rPr>
+        <w:t xml:space="preserve"> del 2026 al 22 de Mayo del 2026)</w:t>
+      </w:r>
+    </w:p>
+    <w:p>
+      <w:pPr>
+        <w:jc w:val="both"/>
+      </w:pPr>
+      <w:r>
+        <w:t xml:space="preserve">El 18 de </w:t>
+      </w:r>
+      <w:proofErr w:type="gramStart"/>
+      <w:r>
+        <w:t>Mayo</w:t>
+      </w:r>
+      <w:proofErr w:type="gramEnd"/>
+      <w:r>
+        <w:t xml:space="preserve"> comencé a ver las animaciones de las naves destruidas para el primer </w:t>
+      </w:r>
+      <w:proofErr w:type="spellStart"/>
+      <w:r>
+        <w:t>minijuego</w:t>
+      </w:r>
+      <w:proofErr w:type="spellEnd"/>
+      <w:r>
+        <w:t>.</w:t>
+      </w:r>
+      <w:r>
+        <w:t xml:space="preserve"> El 19 de </w:t>
+      </w:r>
+      <w:proofErr w:type="gramStart"/>
+      <w:r>
+        <w:t>Mayo</w:t>
+      </w:r>
+      <w:proofErr w:type="gramEnd"/>
+      <w:r>
+        <w:t xml:space="preserve"> implementé las animaciones de las naves destruidas así como su comportamiento al momento de que el paciente interactúa con ellas.</w:t>
+      </w:r>
+      <w:r>
+        <w:t xml:space="preserve"> El 20 de </w:t>
+      </w:r>
+      <w:proofErr w:type="gramStart"/>
+      <w:r>
+        <w:t>Mayo</w:t>
+      </w:r>
+      <w:proofErr w:type="gramEnd"/>
+      <w:r>
+        <w:t xml:space="preserve"> comencé a implementar un mensaje continuo para animar y recordarle al paciente lo que debe hacer.</w:t>
+      </w:r>
+      <w:r>
+        <w:t xml:space="preserve"> El 21 de </w:t>
+      </w:r>
+      <w:proofErr w:type="gramStart"/>
+      <w:r>
+        <w:t>Mayo</w:t>
+      </w:r>
+      <w:proofErr w:type="gramEnd"/>
+      <w:r>
+        <w:t xml:space="preserve"> se implementó el mensaje continuo en el segundo </w:t>
+      </w:r>
+      <w:proofErr w:type="spellStart"/>
+      <w:r>
+        <w:t>minijuego</w:t>
+      </w:r>
+      <w:proofErr w:type="spellEnd"/>
+      <w:r>
+        <w:t>.</w:t>
+      </w:r>
+      <w:r>
+        <w:t xml:space="preserve"> El 22 de </w:t>
+      </w:r>
+      <w:proofErr w:type="gramStart"/>
+      <w:r>
+        <w:t>Mayo</w:t>
+      </w:r>
+      <w:proofErr w:type="gramEnd"/>
+      <w:r>
+        <w:t xml:space="preserve"> se comenzaron a implementar sonidos para los primeros </w:t>
+      </w:r>
+      <w:proofErr w:type="spellStart"/>
+      <w:r>
+        <w:t>minijuegos</w:t>
+      </w:r>
+      <w:proofErr w:type="spellEnd"/>
+      <w:r>
+        <w:t>.</w:t>
+      </w:r>
+    </w:p>
+    <w:p>
+      <w:pPr>
+        <w:jc w:val="both"/>
+        <w:rPr>
+          <w:b/>
+        </w:rPr>
+      </w:pPr>
+      <w:r>
+        <w:rPr>
+          <w:b/>
+        </w:rPr>
+        <w:t xml:space="preserve">Semana 15 (25 de </w:t>
+      </w:r>
+      <w:proofErr w:type="gramStart"/>
+      <w:r>
+        <w:rPr>
+          <w:b/>
+        </w:rPr>
+        <w:t>Mayo</w:t>
+      </w:r>
+      <w:proofErr w:type="gramEnd"/>
+      <w:r>
+        <w:rPr>
+          <w:b/>
+        </w:rPr>
+        <w:t xml:space="preserve"> del 2026 al 29 de Mayo del 2026)</w:t>
+      </w:r>
+    </w:p>
+    <w:p>
+      <w:pPr>
+        <w:jc w:val="both"/>
+      </w:pPr>
+      <w:r>
+        <w:t xml:space="preserve">El 25 de </w:t>
+      </w:r>
+      <w:proofErr w:type="gramStart"/>
+      <w:r>
+        <w:t>Mayo</w:t>
+      </w:r>
+      <w:proofErr w:type="gramEnd"/>
+      <w:r>
+        <w:t xml:space="preserve"> comencé a implementar efecto</w:t>
       </w:r>
       <w:r>
         <w:t>s de sonido para los Enemigos, inicié</w:t>
@@ -514,22 +1478,133 @@
         <w:t xml:space="preserve"> la edi</w:t>
       </w:r>
       <w:r>
-        <w:t>ción de los iconos de las Naves y me encargué de implementar el nuevo diseño de los Puzzles.</w:t>
-      </w:r>
-      <w:r>
-        <w:t xml:space="preserve"> El 26 de Mayo completé la implementación de los iconos para la selección de Enemigos en el primer minijuego.</w:t>
-      </w:r>
-      <w:r>
-        <w:t xml:space="preserve"> El 27 de Mayo del 2026, comencé con la implementación del tercer minijuego.</w:t>
-      </w:r>
-      <w:r>
-        <w:t xml:space="preserve"> El 28 de Mayo arreglé los problemas que trajo consigo el nuevo modelo de las Runas, ya funcionan como deberían.</w:t>
-      </w:r>
-      <w:r>
-        <w:t xml:space="preserve"> El 28 de Mayo implementé un prototipo para la detección de flexión y extensión de la muñeca.</w:t>
+        <w:t xml:space="preserve">ción de los iconos de las Naves y me encargué de implementar el nuevo diseño de los </w:t>
+      </w:r>
+      <w:proofErr w:type="spellStart"/>
+      <w:r>
+        <w:t>Puzzles</w:t>
+      </w:r>
+      <w:proofErr w:type="spellEnd"/>
+      <w:r>
+        <w:t>.</w:t>
+      </w:r>
+      <w:r>
+        <w:t xml:space="preserve"> El 26 de </w:t>
+      </w:r>
+      <w:proofErr w:type="gramStart"/>
+      <w:r>
+        <w:t>Mayo</w:t>
+      </w:r>
+      <w:proofErr w:type="gramEnd"/>
+      <w:r>
+        <w:t xml:space="preserve"> completé la implementación de los iconos para la selección de Enemigos en el primer </w:t>
+      </w:r>
+      <w:proofErr w:type="spellStart"/>
+      <w:r>
+        <w:t>minijuego</w:t>
+      </w:r>
+      <w:proofErr w:type="spellEnd"/>
+      <w:r>
+        <w:t>.</w:t>
+      </w:r>
+      <w:r>
+        <w:t xml:space="preserve"> El 27 de </w:t>
+      </w:r>
+      <w:proofErr w:type="gramStart"/>
+      <w:r>
+        <w:t>Mayo</w:t>
+      </w:r>
+      <w:proofErr w:type="gramEnd"/>
+      <w:r>
+        <w:t xml:space="preserve"> del 2026, comencé con la implementación del tercer </w:t>
+      </w:r>
+      <w:proofErr w:type="spellStart"/>
+      <w:r>
+        <w:t>minijuego</w:t>
+      </w:r>
+      <w:proofErr w:type="spellEnd"/>
+      <w:r>
+        <w:t>.</w:t>
+      </w:r>
+      <w:r>
+        <w:t xml:space="preserve"> El 28 de </w:t>
+      </w:r>
+      <w:proofErr w:type="gramStart"/>
+      <w:r>
+        <w:t>Mayo</w:t>
+      </w:r>
+      <w:proofErr w:type="gramEnd"/>
+      <w:r>
+        <w:t xml:space="preserve"> arreglé los problemas que trajo consigo el nuevo modelo de las Runas, ya funcionan como deberían.</w:t>
+      </w:r>
+      <w:r>
+        <w:t xml:space="preserve"> El 28 de </w:t>
+      </w:r>
+      <w:proofErr w:type="gramStart"/>
+      <w:r>
+        <w:t>Mayo</w:t>
+      </w:r>
+      <w:proofErr w:type="gramEnd"/>
+      <w:r>
+        <w:t xml:space="preserve"> implementé un prototipo para la detección de flexión y extensión de la muñeca.</w:t>
+      </w:r>
+    </w:p>
+    <w:p>
+      <w:pPr>
+        <w:jc w:val="both"/>
+        <w:rPr>
+          <w:b/>
+        </w:rPr>
+      </w:pPr>
+      <w:r>
+        <w:rPr>
+          <w:b/>
+        </w:rPr>
+        <w:t xml:space="preserve">Semana 16 (01 de </w:t>
+      </w:r>
+      <w:proofErr w:type="gramStart"/>
+      <w:r>
+        <w:rPr>
+          <w:b/>
+        </w:rPr>
+        <w:t>Junio</w:t>
+      </w:r>
+      <w:proofErr w:type="gramEnd"/>
+      <w:r>
+        <w:rPr>
+          <w:b/>
+        </w:rPr>
+        <w:t xml:space="preserve"> del 2026 al 05 de Junio del 2026)</w:t>
+      </w:r>
+    </w:p>
+    <w:p>
+      <w:pPr>
+        <w:jc w:val="both"/>
+      </w:pPr>
+      <w:r>
+        <w:t xml:space="preserve">El 01 de </w:t>
+      </w:r>
+      <w:proofErr w:type="gramStart"/>
+      <w:r>
+        <w:t>Junio</w:t>
+      </w:r>
+      <w:proofErr w:type="gramEnd"/>
+      <w:r>
+        <w:t xml:space="preserve"> comencé a modificar las runas por una corrección por parte de </w:t>
+      </w:r>
+      <w:proofErr w:type="spellStart"/>
+      <w:r>
+        <w:t>Yo</w:t>
       </w:r>
       <w:bookmarkStart w:id="0" w:name="_GoBack"/>
       <w:bookmarkEnd w:id="0"/>
+      <w:r>
+        <w:t>as</w:t>
+      </w:r>
+      <w:proofErr w:type="spellEnd"/>
+      <w:r>
+        <w:t xml:space="preserve">. </w:t>
+      </w:r>
     </w:p>
     <w:sectPr>
       <w:pgSz w:w="11906" w:h="16838"/>

</xml_diff>

<commit_message>
Se agrega una forma de configurar el brazo en el que se enfocara la terapia
</commit_message>
<xml_diff>
--- a/ReporteActividades.docx
+++ b/ReporteActividades.docx
@@ -555,6 +555,13 @@
       </w:r>
       <w:r>
         <w:t xml:space="preserve"> El 03 de Junio mejoré el comportamiento de las puertas en base a la nueva estructura de las Runas.</w:t>
+      </w:r>
+      <w:r>
+        <w:t xml:space="preserve"> </w:t>
+      </w:r>
+      <w:r>
+        <w:lastRenderedPageBreak/>
+        <w:t>El 4 y 5 de Junio implementé una forma en que el paciente o el terapeuta pueda elegir con que brazo se trabajará en sus sesión.</w:t>
       </w:r>
       <w:bookmarkStart w:id="0" w:name="_GoBack"/>
       <w:bookmarkEnd w:id="0"/>
@@ -1252,4 +1259,16 @@
     </a:ext>
   </a:extLst>
 </a:theme>
+</file>
+
+<file path=customXml/item1.xml><?xml version="1.0" encoding="utf-8"?>
+<b:Sources xmlns:b="http://schemas.openxmlformats.org/officeDocument/2006/bibliography" xmlns="http://schemas.openxmlformats.org/officeDocument/2006/bibliography" SelectedStyle="\APASixthEditionOfficeOnline.xsl" StyleName="APA" Version="6"/>
+</file>
+
+<file path=customXml/itemProps1.xml><?xml version="1.0" encoding="utf-8"?>
+<ds:datastoreItem xmlns:ds="http://schemas.openxmlformats.org/officeDocument/2006/customXml" ds:itemID="{542B4330-5BB3-42E7-8091-BD3DAE92ABA2}">
+  <ds:schemaRefs>
+    <ds:schemaRef ds:uri="http://schemas.openxmlformats.org/officeDocument/2006/bibliography"/>
+  </ds:schemaRefs>
+</ds:datastoreItem>
 </file>
</xml_diff>

<commit_message>
Se agrega un sistema mejorado para escoger una mano y se comienza con el sistema del minijuego 3
</commit_message>
<xml_diff>
--- a/ReporteActividades.docx
+++ b/ReporteActividades.docx
@@ -561,10 +561,63 @@
       </w:r>
       <w:r>
         <w:lastRenderedPageBreak/>
-        <w:t>El 4 y 5 de Junio implementé una forma en que el paciente o el terapeuta pueda elegir con que brazo se trabajará en sus sesión.</w:t>
+        <w:t>El 4 y 5 de Junio implementé una forma en que el paciente o el terapeuta pueda elegir c</w:t>
+      </w:r>
+      <w:r>
+        <w:t>on que brazo se trabajará en su</w:t>
+      </w:r>
+      <w:r>
+        <w:t xml:space="preserve"> sesión.</w:t>
+      </w:r>
+    </w:p>
+    <w:p>
+      <w:pPr>
+        <w:jc w:val="both"/>
+        <w:rPr>
+          <w:b/>
+        </w:rPr>
+      </w:pPr>
+      <w:r>
+        <w:rPr>
+          <w:b/>
+        </w:rPr>
+        <w:t>Semana 17 (08 de Junio del 2026 al 12 de Junio del 2026)</w:t>
+      </w:r>
+    </w:p>
+    <w:p>
+      <w:pPr>
+        <w:jc w:val="both"/>
+      </w:pPr>
+      <w:r>
+        <w:t>Se mejoró el sistema de selección de mano para que sea consistente con todo el sistema de juego.</w:t>
       </w:r>
       <w:bookmarkStart w:id="0" w:name="_GoBack"/>
       <w:bookmarkEnd w:id="0"/>
+    </w:p>
+    <w:p>
+      <w:pPr>
+        <w:jc w:val="both"/>
+        <w:rPr>
+          <w:b/>
+        </w:rPr>
+      </w:pPr>
+      <w:r>
+        <w:rPr>
+          <w:b/>
+        </w:rPr>
+        <w:t>Semana 28 (15 de Junio del 2026 al 19 de Junio del 2026)</w:t>
+      </w:r>
+    </w:p>
+    <w:p>
+      <w:pPr>
+        <w:jc w:val="both"/>
+      </w:pPr>
+      <w:r>
+        <w:t xml:space="preserve">El 15 de Junio comencé a implementar el </w:t>
+      </w:r>
+      <w:r>
+        <w:t>funcionamiento del sistema para el minijuego 3.</w:t>
+      </w:r>
     </w:p>
     <w:sectPr>
       <w:pgSz w:w="11906" w:h="16838"/>
@@ -1266,7 +1319,7 @@
 </file>
 
 <file path=customXml/itemProps1.xml><?xml version="1.0" encoding="utf-8"?>
-<ds:datastoreItem xmlns:ds="http://schemas.openxmlformats.org/officeDocument/2006/customXml" ds:itemID="{542B4330-5BB3-42E7-8091-BD3DAE92ABA2}">
+<ds:datastoreItem xmlns:ds="http://schemas.openxmlformats.org/officeDocument/2006/customXml" ds:itemID="{A3F058EC-84DA-406D-9F42-441ACCBD60F1}">
   <ds:schemaRefs>
     <ds:schemaRef ds:uri="http://schemas.openxmlformats.org/officeDocument/2006/bibliography"/>
   </ds:schemaRefs>

</xml_diff>

<commit_message>
Se arregla el sistema de botones del minijuego 3
</commit_message>
<xml_diff>
--- a/ReporteActividades.docx
+++ b/ReporteActividades.docx
@@ -13,85 +13,322 @@
         <w:rPr>
           <w:b/>
         </w:rPr>
-        <w:t>Semana 1 (09 de Febrero de 2026 a 13 de Febrero de 2026)</w:t>
-      </w:r>
-    </w:p>
-    <w:p>
-      <w:pPr>
-        <w:jc w:val="both"/>
-      </w:pPr>
-      <w:r>
-        <w:t>El primer día se inició con el desarrollo de un Roll A Ball, principalmente para familiarizarse con el entorno de Unity. El mismo día se terminó el tutorial, pero al día siguiente se volvió a iniciar, ya que la versión utilizada</w:t>
-      </w:r>
-      <w:r>
-        <w:t xml:space="preserve"> de Unity no era la solicitada por Yoá</w:t>
-      </w:r>
-      <w:r>
-        <w:t xml:space="preserve">s. </w:t>
-      </w:r>
-      <w:r>
-        <w:t>El 11 de Febrero se comenzó con el desarrollo de la segunda escena, que era casi la primera escena pero se tenían que implementar enemigos, plataformas, vidas, monedas, spawners y plataformas. El 12 de Febrero se implementó la Lava, la cual tenía que cambiar de color cada 5 segundos. El 13 de Febrero se estuvo haciendo en los spawners de enemigos y monedas.</w:t>
-      </w:r>
-    </w:p>
-    <w:p>
-      <w:pPr>
-        <w:jc w:val="both"/>
-        <w:rPr>
-          <w:b/>
-        </w:rPr>
-      </w:pPr>
-      <w:r>
-        <w:rPr>
-          <w:b/>
-        </w:rPr>
-        <w:t>Semana 2 (16 de Febrero de 2026 a 20 de Febrero de 2026)</w:t>
-      </w:r>
-    </w:p>
-    <w:p>
-      <w:pPr>
-        <w:jc w:val="both"/>
-      </w:pPr>
-      <w:r>
-        <w:t>El 16 de Febrero se comenzó con la implementación de las escenas, los menús de pausa y cambios de escenas. Se completó el desarrollo de Roll A Ball. El 17 de Febrero Yoás le dio visto bueno al demo y pasé a familiarizarme con el e</w:t>
-      </w:r>
-      <w:r>
-        <w:t>ntorno de Meta Quest 3S. Si bien el 17 y 18 de Febrero estuve trabajando en un demo para saber como funcionan los controles, por problemas de hardware en el equipo donde estaba trabajando en el LANR, no podía probar lo que había hecho. El 19 de Febrero comencé a trabajar en el Anexo, ya que había un equipo disponible con una tarjeta gráfica compatible con el software de Meta Horizon Link, después de configurar el entorno, finalmente pude probar lo que había desarrollado los días pasados. El 19 de Febrero comencé a experimentar con los Building Blocks de Hand Tracking, algo necesario para evitar la necesidad de usar los controles de los lentes, solo interacción con las manos.</w:t>
-      </w:r>
-    </w:p>
-    <w:p>
-      <w:pPr>
-        <w:jc w:val="both"/>
-        <w:rPr>
-          <w:b/>
-        </w:rPr>
-      </w:pPr>
-      <w:r>
-        <w:rPr>
-          <w:b/>
-        </w:rPr>
-        <w:t>Semana 3 (23 de Febrero de 2026 a 27 de Febrero de 2026)</w:t>
-      </w:r>
-    </w:p>
-    <w:p>
-      <w:pPr>
-        <w:jc w:val="both"/>
-      </w:pPr>
-      <w:r>
-        <w:t>Lesly, una compañera que trabajaba en el Anexo iba a ocupar la computadora donde iba a estar trabajando, así que no asistí hasta el Jueves 26 de Febrero. Los días restantes de la semana me dediqué a terminar el demo y prácticar el cambio de escenas con interacción en UI haciendo uso de Hand Tracking.</w:t>
-      </w:r>
-    </w:p>
-    <w:p>
-      <w:pPr>
-        <w:jc w:val="both"/>
-        <w:rPr>
-          <w:b/>
-        </w:rPr>
-      </w:pPr>
-      <w:r>
-        <w:rPr>
-          <w:b/>
-        </w:rPr>
-        <w:t xml:space="preserve">Semana 4 (02 de Marzo del 2026 a </w:t>
+        <w:t xml:space="preserve">Semana 1 (09 de </w:t>
+      </w:r>
+      <w:proofErr w:type="gramStart"/>
+      <w:r>
+        <w:rPr>
+          <w:b/>
+        </w:rPr>
+        <w:t>Febrero</w:t>
+      </w:r>
+      <w:proofErr w:type="gramEnd"/>
+      <w:r>
+        <w:rPr>
+          <w:b/>
+        </w:rPr>
+        <w:t xml:space="preserve"> de 2026 a 13 de Febrero de 2026)</w:t>
+      </w:r>
+    </w:p>
+    <w:p>
+      <w:pPr>
+        <w:jc w:val="both"/>
+      </w:pPr>
+      <w:r>
+        <w:t xml:space="preserve">El primer día se inició con el desarrollo de un Roll A </w:t>
+      </w:r>
+      <w:proofErr w:type="spellStart"/>
+      <w:r>
+        <w:t>Ball</w:t>
+      </w:r>
+      <w:proofErr w:type="spellEnd"/>
+      <w:r>
+        <w:t xml:space="preserve">, principalmente para familiarizarse con el entorno de </w:t>
+      </w:r>
+      <w:proofErr w:type="spellStart"/>
+      <w:r>
+        <w:t>Unity</w:t>
+      </w:r>
+      <w:proofErr w:type="spellEnd"/>
+      <w:r>
+        <w:t>. El mismo día se terminó el tutorial, pero al día siguiente se volvió a iniciar, ya que la versión utilizada</w:t>
+      </w:r>
+      <w:r>
+        <w:t xml:space="preserve"> de </w:t>
+      </w:r>
+      <w:proofErr w:type="spellStart"/>
+      <w:r>
+        <w:t>Unity</w:t>
+      </w:r>
+      <w:proofErr w:type="spellEnd"/>
+      <w:r>
+        <w:t xml:space="preserve"> no era la solicitada por </w:t>
+      </w:r>
+      <w:proofErr w:type="spellStart"/>
+      <w:r>
+        <w:t>Yoá</w:t>
+      </w:r>
+      <w:r>
+        <w:t>s</w:t>
+      </w:r>
+      <w:proofErr w:type="spellEnd"/>
+      <w:r>
+        <w:t xml:space="preserve">. </w:t>
+      </w:r>
+      <w:r>
+        <w:t xml:space="preserve">El 11 de </w:t>
+      </w:r>
+      <w:proofErr w:type="gramStart"/>
+      <w:r>
+        <w:t>Febrero</w:t>
+      </w:r>
+      <w:proofErr w:type="gramEnd"/>
+      <w:r>
+        <w:t xml:space="preserve"> se comenzó con el desarrollo de la segunda escena, que era casi la primera escena pero se tenían que implementar enemigos, plataformas, vidas, monedas, </w:t>
+      </w:r>
+      <w:proofErr w:type="spellStart"/>
+      <w:r>
+        <w:t>spawners</w:t>
+      </w:r>
+      <w:proofErr w:type="spellEnd"/>
+      <w:r>
+        <w:t xml:space="preserve"> y plataformas. El 12 de </w:t>
+      </w:r>
+      <w:proofErr w:type="gramStart"/>
+      <w:r>
+        <w:t>Febrero</w:t>
+      </w:r>
+      <w:proofErr w:type="gramEnd"/>
+      <w:r>
+        <w:t xml:space="preserve"> se implementó la Lava, la cual tenía que cambiar de color cada 5 segundos. El 13 de </w:t>
+      </w:r>
+      <w:proofErr w:type="gramStart"/>
+      <w:r>
+        <w:t>Febrero</w:t>
+      </w:r>
+      <w:proofErr w:type="gramEnd"/>
+      <w:r>
+        <w:t xml:space="preserve"> se estuvo haciendo en los </w:t>
+      </w:r>
+      <w:proofErr w:type="spellStart"/>
+      <w:r>
+        <w:t>spawners</w:t>
+      </w:r>
+      <w:proofErr w:type="spellEnd"/>
+      <w:r>
+        <w:t xml:space="preserve"> de enemigos y monedas.</w:t>
+      </w:r>
+    </w:p>
+    <w:p>
+      <w:pPr>
+        <w:jc w:val="both"/>
+        <w:rPr>
+          <w:b/>
+        </w:rPr>
+      </w:pPr>
+      <w:r>
+        <w:rPr>
+          <w:b/>
+        </w:rPr>
+        <w:t xml:space="preserve">Semana 2 (16 de </w:t>
+      </w:r>
+      <w:proofErr w:type="gramStart"/>
+      <w:r>
+        <w:rPr>
+          <w:b/>
+        </w:rPr>
+        <w:t>Febrero</w:t>
+      </w:r>
+      <w:proofErr w:type="gramEnd"/>
+      <w:r>
+        <w:rPr>
+          <w:b/>
+        </w:rPr>
+        <w:t xml:space="preserve"> de 2026 a 20 de Febrero de 2026)</w:t>
+      </w:r>
+    </w:p>
+    <w:p>
+      <w:pPr>
+        <w:jc w:val="both"/>
+      </w:pPr>
+      <w:r>
+        <w:t xml:space="preserve">El 16 de </w:t>
+      </w:r>
+      <w:proofErr w:type="gramStart"/>
+      <w:r>
+        <w:t>Febrero</w:t>
+      </w:r>
+      <w:proofErr w:type="gramEnd"/>
+      <w:r>
+        <w:t xml:space="preserve"> se comenzó con la implementación de las escenas, los menús de pausa y cambios de escenas. Se completó el desarrollo de Roll A </w:t>
+      </w:r>
+      <w:proofErr w:type="spellStart"/>
+      <w:r>
+        <w:t>Ball</w:t>
+      </w:r>
+      <w:proofErr w:type="spellEnd"/>
+      <w:r>
+        <w:t xml:space="preserve">. El 17 de </w:t>
+      </w:r>
+      <w:proofErr w:type="gramStart"/>
+      <w:r>
+        <w:t>Febrero</w:t>
+      </w:r>
+      <w:proofErr w:type="gramEnd"/>
+      <w:r>
+        <w:t xml:space="preserve"> </w:t>
+      </w:r>
+      <w:proofErr w:type="spellStart"/>
+      <w:r>
+        <w:t>Yoás</w:t>
+      </w:r>
+      <w:proofErr w:type="spellEnd"/>
+      <w:r>
+        <w:t xml:space="preserve"> le dio visto bueno al demo y pasé a familiarizarme con el e</w:t>
+      </w:r>
+      <w:r>
+        <w:t xml:space="preserve">ntorno de Meta </w:t>
+      </w:r>
+      <w:proofErr w:type="spellStart"/>
+      <w:r>
+        <w:t>Quest</w:t>
+      </w:r>
+      <w:proofErr w:type="spellEnd"/>
+      <w:r>
+        <w:t xml:space="preserve"> 3S. Si bien el 17 y 18 de </w:t>
+      </w:r>
+      <w:proofErr w:type="gramStart"/>
+      <w:r>
+        <w:t>Febrero</w:t>
+      </w:r>
+      <w:proofErr w:type="gramEnd"/>
+      <w:r>
+        <w:t xml:space="preserve"> estuve trabajando en un demo para saber </w:t>
+      </w:r>
+      <w:proofErr w:type="spellStart"/>
+      <w:r>
+        <w:t>como</w:t>
+      </w:r>
+      <w:proofErr w:type="spellEnd"/>
+      <w:r>
+        <w:t xml:space="preserve"> funcionan los controles, por problemas de hardware en el equipo donde estaba trabajando en el LANR, no podía probar lo que había hecho. El 19 de </w:t>
+      </w:r>
+      <w:proofErr w:type="gramStart"/>
+      <w:r>
+        <w:t>Febrero</w:t>
+      </w:r>
+      <w:proofErr w:type="gramEnd"/>
+      <w:r>
+        <w:t xml:space="preserve"> comencé a trabajar en el Anexo, ya que había un equipo disponible con una tarjeta gráfica compatible con el software de Meta </w:t>
+      </w:r>
+      <w:proofErr w:type="spellStart"/>
+      <w:r>
+        <w:t>Horizon</w:t>
+      </w:r>
+      <w:proofErr w:type="spellEnd"/>
+      <w:r>
+        <w:t xml:space="preserve"> Link, después de configurar el entorno, finalmente pude probar lo que había desarrollado los días pasados. El 19 de </w:t>
+      </w:r>
+      <w:proofErr w:type="gramStart"/>
+      <w:r>
+        <w:t>Febrero</w:t>
+      </w:r>
+      <w:proofErr w:type="gramEnd"/>
+      <w:r>
+        <w:t xml:space="preserve"> comencé a experimentar con los </w:t>
+      </w:r>
+      <w:proofErr w:type="spellStart"/>
+      <w:r>
+        <w:t>Building</w:t>
+      </w:r>
+      <w:proofErr w:type="spellEnd"/>
+      <w:r>
+        <w:t xml:space="preserve"> Blocks de Hand Tracking, algo necesario para evitar la necesidad de usar los controles de los lentes, solo interacción con las manos.</w:t>
+      </w:r>
+    </w:p>
+    <w:p>
+      <w:pPr>
+        <w:jc w:val="both"/>
+        <w:rPr>
+          <w:b/>
+        </w:rPr>
+      </w:pPr>
+      <w:r>
+        <w:rPr>
+          <w:b/>
+        </w:rPr>
+        <w:t xml:space="preserve">Semana 3 (23 de </w:t>
+      </w:r>
+      <w:proofErr w:type="gramStart"/>
+      <w:r>
+        <w:rPr>
+          <w:b/>
+        </w:rPr>
+        <w:t>Febrero</w:t>
+      </w:r>
+      <w:proofErr w:type="gramEnd"/>
+      <w:r>
+        <w:rPr>
+          <w:b/>
+        </w:rPr>
+        <w:t xml:space="preserve"> de 2026 a 27 de Febrero de 2026)</w:t>
+      </w:r>
+    </w:p>
+    <w:p>
+      <w:pPr>
+        <w:jc w:val="both"/>
+      </w:pPr>
+      <w:proofErr w:type="spellStart"/>
+      <w:r>
+        <w:t>Lesly</w:t>
+      </w:r>
+      <w:proofErr w:type="spellEnd"/>
+      <w:r>
+        <w:t xml:space="preserve">, una compañera que trabajaba en el Anexo iba a ocupar la computadora donde iba a estar trabajando, así que no asistí hasta el </w:t>
+      </w:r>
+      <w:proofErr w:type="gramStart"/>
+      <w:r>
+        <w:t>Jueves</w:t>
+      </w:r>
+      <w:proofErr w:type="gramEnd"/>
+      <w:r>
+        <w:t xml:space="preserve"> 26 de Febrero. Los días restantes de la semana me dediqué a terminar el demo y </w:t>
+      </w:r>
+      <w:proofErr w:type="spellStart"/>
+      <w:r>
+        <w:t>prácticar</w:t>
+      </w:r>
+      <w:proofErr w:type="spellEnd"/>
+      <w:r>
+        <w:t xml:space="preserve"> el cambio de escenas con interacción en UI haciendo uso de Hand Tracking.</w:t>
+      </w:r>
+    </w:p>
+    <w:p>
+      <w:pPr>
+        <w:jc w:val="both"/>
+        <w:rPr>
+          <w:b/>
+        </w:rPr>
+      </w:pPr>
+      <w:r>
+        <w:rPr>
+          <w:b/>
+        </w:rPr>
+        <w:t xml:space="preserve">Semana 4 (02 de </w:t>
+      </w:r>
+      <w:proofErr w:type="gramStart"/>
+      <w:r>
+        <w:rPr>
+          <w:b/>
+        </w:rPr>
+        <w:t>Marzo</w:t>
+      </w:r>
+      <w:proofErr w:type="gramEnd"/>
+      <w:r>
+        <w:rPr>
+          <w:b/>
+        </w:rPr>
+        <w:t xml:space="preserve"> del 2026 a </w:t>
       </w:r>
       <w:r>
         <w:rPr>
@@ -105,35 +342,153 @@
         <w:jc w:val="both"/>
       </w:pPr>
       <w:r>
-        <w:t>El 02 de Marzo, Yoás revisó los avances de la semana pasada y me platicó la idea que tenía para la implementación del proyecto, un juego espacial. El 04 de Marzo, después de estar viendo ejemplos de como mover un objeto con hand tracking, Yoás me comentó que la idea era que el paciente o jugador disparen desde sus manos para naves enemigas. El 05 y 06 de Febrero estuve trabajando para que cuando se hiciera la acción de “Pinch”, se disparen diferentes tipos de disparos, también estuve trabajando en los comportamientos de los enemigos, un medidor de supinación, flexión, extensión y pronación.</w:t>
-      </w:r>
-    </w:p>
-    <w:p>
-      <w:pPr>
-        <w:jc w:val="both"/>
-        <w:rPr>
-          <w:b/>
-        </w:rPr>
-      </w:pPr>
-      <w:r>
-        <w:rPr>
-          <w:b/>
-        </w:rPr>
-        <w:t>Semana 5 (09 de Marzo del 2026 a 13 de Febrero de 2026)</w:t>
-      </w:r>
-    </w:p>
-    <w:p>
-      <w:pPr>
-        <w:jc w:val="both"/>
-      </w:pPr>
-      <w:r>
-        <w:t xml:space="preserve">Del 09 de Marzo al 12 de Marzo estuve ajustando el comportamiento del contador de Puntuación, el 12 de Marzo Yoás asistió al Anexo para revisar avances, me comentó que el movimiento de “Pinch” podía ser algo </w:t>
+        <w:t xml:space="preserve">El 02 de </w:t>
+      </w:r>
+      <w:proofErr w:type="gramStart"/>
+      <w:r>
+        <w:t>Marzo</w:t>
+      </w:r>
+      <w:proofErr w:type="gramEnd"/>
+      <w:r>
+        <w:t xml:space="preserve">, </w:t>
+      </w:r>
+      <w:proofErr w:type="spellStart"/>
+      <w:r>
+        <w:t>Yoás</w:t>
+      </w:r>
+      <w:proofErr w:type="spellEnd"/>
+      <w:r>
+        <w:t xml:space="preserve"> revisó los avances de la semana pasada y me platicó la idea que tenía para la implementación del proyecto, un juego espacial. El 04 de </w:t>
+      </w:r>
+      <w:proofErr w:type="gramStart"/>
+      <w:r>
+        <w:t>Marzo</w:t>
+      </w:r>
+      <w:proofErr w:type="gramEnd"/>
+      <w:r>
+        <w:t xml:space="preserve">, después de estar viendo ejemplos de </w:t>
+      </w:r>
+      <w:proofErr w:type="spellStart"/>
+      <w:r>
+        <w:t>como</w:t>
+      </w:r>
+      <w:proofErr w:type="spellEnd"/>
+      <w:r>
+        <w:t xml:space="preserve"> mover un objeto con </w:t>
+      </w:r>
+      <w:proofErr w:type="spellStart"/>
+      <w:r>
+        <w:t>hand</w:t>
+      </w:r>
+      <w:proofErr w:type="spellEnd"/>
+      <w:r>
+        <w:t xml:space="preserve"> tracking, </w:t>
+      </w:r>
+      <w:proofErr w:type="spellStart"/>
+      <w:r>
+        <w:t>Yoás</w:t>
+      </w:r>
+      <w:proofErr w:type="spellEnd"/>
+      <w:r>
+        <w:t xml:space="preserve"> me comentó que la idea era que el paciente o jugador disparen desde sus manos para naves enemigas. El 05 y 06 de </w:t>
+      </w:r>
+      <w:proofErr w:type="gramStart"/>
+      <w:r>
+        <w:t>Febrero</w:t>
+      </w:r>
+      <w:proofErr w:type="gramEnd"/>
+      <w:r>
+        <w:t xml:space="preserve"> estuve trabajando para que cuando se hiciera la acción de “</w:t>
+      </w:r>
+      <w:proofErr w:type="spellStart"/>
+      <w:r>
+        <w:t>Pinch</w:t>
+      </w:r>
+      <w:proofErr w:type="spellEnd"/>
+      <w:r>
+        <w:t>”, se disparen diferentes tipos de disparos, también estuve trabajando en los comportamientos de los enemigos, un medidor de supinación, flexión, extensión y pronación.</w:t>
+      </w:r>
+    </w:p>
+    <w:p>
+      <w:pPr>
+        <w:jc w:val="both"/>
+        <w:rPr>
+          <w:b/>
+        </w:rPr>
+      </w:pPr>
+      <w:r>
+        <w:rPr>
+          <w:b/>
+        </w:rPr>
+        <w:t xml:space="preserve">Semana 5 (09 de </w:t>
+      </w:r>
+      <w:proofErr w:type="gramStart"/>
+      <w:r>
+        <w:rPr>
+          <w:b/>
+        </w:rPr>
+        <w:t>Marzo</w:t>
+      </w:r>
+      <w:proofErr w:type="gramEnd"/>
+      <w:r>
+        <w:rPr>
+          <w:b/>
+        </w:rPr>
+        <w:t xml:space="preserve"> del 2026 a 13 de Febrero de 2026)</w:t>
+      </w:r>
+    </w:p>
+    <w:p>
+      <w:pPr>
+        <w:jc w:val="both"/>
+      </w:pPr>
+      <w:r>
+        <w:t xml:space="preserve">Del 09 de </w:t>
+      </w:r>
+      <w:proofErr w:type="gramStart"/>
+      <w:r>
+        <w:t>Marzo</w:t>
+      </w:r>
+      <w:proofErr w:type="gramEnd"/>
+      <w:r>
+        <w:t xml:space="preserve"> al 12 de Marzo estuve ajustando el comportamiento del contador de Puntuación, el 12 de Marzo </w:t>
+      </w:r>
+      <w:proofErr w:type="spellStart"/>
+      <w:r>
+        <w:t>Yoás</w:t>
+      </w:r>
+      <w:proofErr w:type="spellEnd"/>
+      <w:r>
+        <w:t xml:space="preserve"> asistió al Anexo para revisar avances, me comentó que el movimiento de “</w:t>
+      </w:r>
+      <w:proofErr w:type="spellStart"/>
+      <w:r>
+        <w:t>Pinch</w:t>
+      </w:r>
+      <w:proofErr w:type="spellEnd"/>
+      <w:r>
+        <w:t xml:space="preserve">” podía ser algo </w:t>
       </w:r>
       <w:r>
         <w:t>complicado</w:t>
       </w:r>
       <w:r>
-        <w:t xml:space="preserve"> para los pacientes, así que el jugador ya no tendría que disparar, solo con tocar a los enemigos. El 13 de Marzo me dediqué a que los enemigos se detengan a una distancia del jugador para que este los toque con las manos de hand tracking, pero que desaparezcan si no lo hace en un tiempo determinado.</w:t>
+        <w:t xml:space="preserve"> para los pacientes, así que el jugador ya no tendría que disparar, solo con tocar a los enemigos. El 13 de </w:t>
+      </w:r>
+      <w:proofErr w:type="gramStart"/>
+      <w:r>
+        <w:t>Marzo</w:t>
+      </w:r>
+      <w:proofErr w:type="gramEnd"/>
+      <w:r>
+        <w:t xml:space="preserve"> me dediqué a que los enemigos se detengan a una distancia del jugador para que este los toque con las manos de </w:t>
+      </w:r>
+      <w:proofErr w:type="spellStart"/>
+      <w:r>
+        <w:t>hand</w:t>
+      </w:r>
+      <w:proofErr w:type="spellEnd"/>
+      <w:r>
+        <w:t xml:space="preserve"> tracking, pero que desaparezcan si no lo hace en un tiempo determinado.</w:t>
       </w:r>
       <w:r>
         <w:t xml:space="preserve"> </w:t>
@@ -150,15 +505,37 @@
         <w:rPr>
           <w:b/>
         </w:rPr>
-        <w:t>Semana 6 (17 de Marzo del 2026 a 20 de Marzo del 2026)</w:t>
-      </w:r>
-    </w:p>
-    <w:p>
-      <w:pPr>
-        <w:jc w:val="both"/>
-      </w:pPr>
-      <w:r>
-        <w:t xml:space="preserve">El 17 de Marzo se comenzó con la implementación de un sistema de cuenta regresiva para el comienzo de las rondas de enemigos; la idea es hacer que se inicie con una cuenta regresiva </w:t>
+        <w:t xml:space="preserve">Semana 6 (17 de </w:t>
+      </w:r>
+      <w:proofErr w:type="gramStart"/>
+      <w:r>
+        <w:rPr>
+          <w:b/>
+        </w:rPr>
+        <w:t>Marzo</w:t>
+      </w:r>
+      <w:proofErr w:type="gramEnd"/>
+      <w:r>
+        <w:rPr>
+          <w:b/>
+        </w:rPr>
+        <w:t xml:space="preserve"> del 2026 a 20 de Marzo del 2026)</w:t>
+      </w:r>
+    </w:p>
+    <w:p>
+      <w:pPr>
+        <w:jc w:val="both"/>
+      </w:pPr>
+      <w:r>
+        <w:t xml:space="preserve">El 17 de </w:t>
+      </w:r>
+      <w:proofErr w:type="gramStart"/>
+      <w:r>
+        <w:t>Marzo</w:t>
+      </w:r>
+      <w:proofErr w:type="gramEnd"/>
+      <w:r>
+        <w:t xml:space="preserve"> se comenzó con la implementación de un sistema de cuenta regresiva para el comienzo de las rondas de enemigos; la idea es hacer que se inicie con una cuenta regresiva </w:t>
       </w:r>
       <w:r>
         <w:lastRenderedPageBreak/>
@@ -174,10 +551,42 @@
         <w:t xml:space="preserve">. </w:t>
       </w:r>
       <w:r>
-        <w:t>El 18 de Marzo me encargué de juntar las escenas y completar la implementación del panel de “Continuar”</w:t>
-      </w:r>
-      <w:r>
-        <w:t>. El 19 de Marzo mejoré el comportamiento y los Spawners de los enemigos. El 20 de Marzo,</w:t>
+        <w:t xml:space="preserve">El 18 de </w:t>
+      </w:r>
+      <w:proofErr w:type="gramStart"/>
+      <w:r>
+        <w:t>Marzo</w:t>
+      </w:r>
+      <w:proofErr w:type="gramEnd"/>
+      <w:r>
+        <w:t xml:space="preserve"> me encargué de juntar las escenas y completar la implementación del panel de “Continuar”</w:t>
+      </w:r>
+      <w:r>
+        <w:t xml:space="preserve">. El 19 de </w:t>
+      </w:r>
+      <w:proofErr w:type="gramStart"/>
+      <w:r>
+        <w:t>Marzo</w:t>
+      </w:r>
+      <w:proofErr w:type="gramEnd"/>
+      <w:r>
+        <w:t xml:space="preserve"> mejoré el comportamiento y los </w:t>
+      </w:r>
+      <w:proofErr w:type="spellStart"/>
+      <w:r>
+        <w:t>Spawners</w:t>
+      </w:r>
+      <w:proofErr w:type="spellEnd"/>
+      <w:r>
+        <w:t xml:space="preserve"> de los enemigos. El 20 de </w:t>
+      </w:r>
+      <w:proofErr w:type="gramStart"/>
+      <w:r>
+        <w:t>Marzo</w:t>
+      </w:r>
+      <w:proofErr w:type="gramEnd"/>
+      <w:r>
+        <w:t>,</w:t>
       </w:r>
       <w:r>
         <w:t xml:space="preserve"> comencé a implementar diferentes niveles en caso de que el paciente necesite hacer ejercicios específicos.</w:t>
@@ -194,70 +603,210 @@
         <w:rPr>
           <w:b/>
         </w:rPr>
-        <w:t>Semana 7 (23 de Marzo del 2026 a 28 de Marzo del 2026)</w:t>
-      </w:r>
-    </w:p>
-    <w:p>
-      <w:pPr>
-        <w:jc w:val="both"/>
-      </w:pPr>
-      <w:r>
-        <w:t>El 23 de Marzo, por indicaciones de Yoás, se cambió el enfoque de los enemigos. Estos aparecerán y rodearán al Jugador como si estuvieran en un domo o semicírculo; dicho semicírculo variará su tamaño en base a la distancia máxima que el Jugador pueda estirar su brazo sano. Esa lógica también se implementó.</w:t>
-      </w:r>
-      <w:r>
-        <w:t xml:space="preserve"> El 24 de Marzo me dediqué a hacer la solicitud de tesis.</w:t>
-      </w:r>
-      <w:r>
-        <w:t xml:space="preserve"> El 25 de Marzo, Yoás revisó los avances, donde debo cambiar la orientación del domo y agregar más parámetros a ser modificados por el terapeuta, así como un flujo de trabajo.</w:t>
-      </w:r>
-      <w:r>
-        <w:t xml:space="preserve"> 26 y 27 de Marzo estuve configurando la nueva orientación del domo y el comportamiento de los enemigos.</w:t>
-      </w:r>
-      <w:r>
-        <w:t xml:space="preserve"> El 28 de Marzo conecté las escenas.</w:t>
-      </w:r>
-    </w:p>
-    <w:p>
-      <w:pPr>
-        <w:jc w:val="both"/>
-        <w:rPr>
-          <w:b/>
-        </w:rPr>
-      </w:pPr>
-      <w:r>
-        <w:rPr>
-          <w:b/>
-        </w:rPr>
-        <w:t>Semana 8 (06 de Abril del 2026 a 10 de Abril del 2026)</w:t>
-      </w:r>
-    </w:p>
-    <w:p>
-      <w:pPr>
-        <w:jc w:val="both"/>
-      </w:pPr>
-      <w:r>
-        <w:t xml:space="preserve">El 06 de Abril comencé con la implementación </w:t>
-      </w:r>
-      <w:r>
-        <w:t>de la selección de los enemigos; Yoas me encomendó hacer un modo de realidad mixta.</w:t>
-      </w:r>
-      <w:r>
-        <w:t xml:space="preserve"> 07 de Abril detecté que hay problemas con el cable de conexión, debo buscar un USB 3.0.</w:t>
+        <w:t xml:space="preserve">Semana 7 (23 de </w:t>
+      </w:r>
+      <w:proofErr w:type="gramStart"/>
+      <w:r>
+        <w:rPr>
+          <w:b/>
+        </w:rPr>
+        <w:t>Marzo</w:t>
+      </w:r>
+      <w:proofErr w:type="gramEnd"/>
+      <w:r>
+        <w:rPr>
+          <w:b/>
+        </w:rPr>
+        <w:t xml:space="preserve"> del 2026 a 28 de Marzo del 2026)</w:t>
+      </w:r>
+    </w:p>
+    <w:p>
+      <w:pPr>
+        <w:jc w:val="both"/>
+      </w:pPr>
+      <w:r>
+        <w:t xml:space="preserve">El 23 de </w:t>
+      </w:r>
+      <w:proofErr w:type="gramStart"/>
+      <w:r>
+        <w:t>Marzo</w:t>
+      </w:r>
+      <w:proofErr w:type="gramEnd"/>
+      <w:r>
+        <w:t xml:space="preserve">, por indicaciones de </w:t>
+      </w:r>
+      <w:proofErr w:type="spellStart"/>
+      <w:r>
+        <w:t>Yoás</w:t>
+      </w:r>
+      <w:proofErr w:type="spellEnd"/>
+      <w:r>
+        <w:t>, se cambió el enfoque de los enemigos. Estos aparecerán y rodearán al Jugador como si estuvieran en un domo o semicírculo; dicho semicírculo variará su tamaño en base a la distancia máxima que el Jugador pueda estirar su brazo sano. Esa lógica también se implementó.</w:t>
+      </w:r>
+      <w:r>
+        <w:t xml:space="preserve"> El 24 de </w:t>
+      </w:r>
+      <w:proofErr w:type="gramStart"/>
+      <w:r>
+        <w:t>Marzo</w:t>
+      </w:r>
+      <w:proofErr w:type="gramEnd"/>
+      <w:r>
+        <w:t xml:space="preserve"> me dediqué a hacer la solicitud de tesis.</w:t>
+      </w:r>
+      <w:r>
+        <w:t xml:space="preserve"> El 25 de </w:t>
+      </w:r>
+      <w:proofErr w:type="gramStart"/>
+      <w:r>
+        <w:t>Marzo</w:t>
+      </w:r>
+      <w:proofErr w:type="gramEnd"/>
+      <w:r>
+        <w:t xml:space="preserve">, </w:t>
+      </w:r>
+      <w:proofErr w:type="spellStart"/>
+      <w:r>
+        <w:t>Yoás</w:t>
+      </w:r>
+      <w:proofErr w:type="spellEnd"/>
+      <w:r>
+        <w:t xml:space="preserve"> revisó los avances, donde debo cambiar la orientación del domo y agregar más parámetros a ser modificados por el terapeuta, así como un flujo de trabajo.</w:t>
+      </w:r>
+      <w:r>
+        <w:t xml:space="preserve"> 26 y 27 de </w:t>
+      </w:r>
+      <w:proofErr w:type="gramStart"/>
+      <w:r>
+        <w:t>Marzo</w:t>
+      </w:r>
+      <w:proofErr w:type="gramEnd"/>
+      <w:r>
+        <w:t xml:space="preserve"> estuve configurando la nueva orientación del domo y el comportamiento de los enemigos.</w:t>
+      </w:r>
+      <w:r>
+        <w:t xml:space="preserve"> El 28 de </w:t>
+      </w:r>
+      <w:proofErr w:type="gramStart"/>
+      <w:r>
+        <w:t>Marzo</w:t>
+      </w:r>
+      <w:proofErr w:type="gramEnd"/>
+      <w:r>
+        <w:t xml:space="preserve"> conecté las escenas.</w:t>
+      </w:r>
+    </w:p>
+    <w:p>
+      <w:pPr>
+        <w:jc w:val="both"/>
+        <w:rPr>
+          <w:b/>
+        </w:rPr>
+      </w:pPr>
+      <w:r>
+        <w:rPr>
+          <w:b/>
+        </w:rPr>
+        <w:t xml:space="preserve">Semana 8 (06 de </w:t>
+      </w:r>
+      <w:proofErr w:type="gramStart"/>
+      <w:r>
+        <w:rPr>
+          <w:b/>
+        </w:rPr>
+        <w:t>Abril</w:t>
+      </w:r>
+      <w:proofErr w:type="gramEnd"/>
+      <w:r>
+        <w:rPr>
+          <w:b/>
+        </w:rPr>
+        <w:t xml:space="preserve"> del 2026 a 10 de Abril del 2026)</w:t>
+      </w:r>
+    </w:p>
+    <w:p>
+      <w:pPr>
+        <w:jc w:val="both"/>
+      </w:pPr>
+      <w:r>
+        <w:t xml:space="preserve">El 06 de </w:t>
+      </w:r>
+      <w:proofErr w:type="gramStart"/>
+      <w:r>
+        <w:t>Abril</w:t>
+      </w:r>
+      <w:proofErr w:type="gramEnd"/>
+      <w:r>
+        <w:t xml:space="preserve"> comencé con la implementación </w:t>
+      </w:r>
+      <w:r>
+        <w:t xml:space="preserve">de la selección de los enemigos; </w:t>
+      </w:r>
+      <w:proofErr w:type="spellStart"/>
+      <w:r>
+        <w:t>Yoas</w:t>
+      </w:r>
+      <w:proofErr w:type="spellEnd"/>
+      <w:r>
+        <w:t xml:space="preserve"> me encomendó hacer un modo de realidad mixta.</w:t>
+      </w:r>
+      <w:r>
+        <w:t xml:space="preserve"> 07 de </w:t>
+      </w:r>
+      <w:proofErr w:type="gramStart"/>
+      <w:r>
+        <w:t>Abril</w:t>
+      </w:r>
+      <w:proofErr w:type="gramEnd"/>
+      <w:r>
+        <w:t xml:space="preserve"> detecté que hay problemas con el cable de conexión, debo buscar un USB 3.0.</w:t>
       </w:r>
       <w:r>
         <w:t xml:space="preserve"> </w:t>
       </w:r>
       <w:r>
-        <w:t xml:space="preserve">El 08 de Abril, después de registrar el Meta Quest 3S a la cuenta de desarrollador y arreglar un </w:t>
+        <w:t xml:space="preserve">El 08 de </w:t>
+      </w:r>
+      <w:proofErr w:type="gramStart"/>
+      <w:r>
+        <w:t>Abril</w:t>
+      </w:r>
+      <w:proofErr w:type="gramEnd"/>
+      <w:r>
+        <w:t xml:space="preserve">, después de registrar el Meta </w:t>
+      </w:r>
+      <w:proofErr w:type="spellStart"/>
+      <w:r>
+        <w:t>Quest</w:t>
+      </w:r>
+      <w:proofErr w:type="spellEnd"/>
+      <w:r>
+        <w:t xml:space="preserve"> 3S a la cuenta de desarrollador y arreglar un </w:t>
       </w:r>
       <w:r>
         <w:t>problema</w:t>
       </w:r>
       <w:r>
-        <w:t xml:space="preserve"> con el Canvas, se pudo conectar y completar la Realidad Mixta.</w:t>
-      </w:r>
-      <w:r>
-        <w:t xml:space="preserve"> El 10 de Abril se continuó con la implementación del seleccionador de Enemigos, ahora falta esperar por los modelos.</w:t>
+        <w:t xml:space="preserve"> con el </w:t>
+      </w:r>
+      <w:proofErr w:type="spellStart"/>
+      <w:r>
+        <w:t>Canvas</w:t>
+      </w:r>
+      <w:proofErr w:type="spellEnd"/>
+      <w:r>
+        <w:t>, se pudo conectar y completar la Realidad Mixta.</w:t>
+      </w:r>
+      <w:r>
+        <w:t xml:space="preserve"> El 10 de </w:t>
+      </w:r>
+      <w:proofErr w:type="gramStart"/>
+      <w:r>
+        <w:t>Abril</w:t>
+      </w:r>
+      <w:proofErr w:type="gramEnd"/>
+      <w:r>
+        <w:t xml:space="preserve"> se continuó con la implementación del seleccionador de Enemigos, ahora falta esperar por los modelos.</w:t>
       </w:r>
     </w:p>
     <w:p>
@@ -277,7 +826,21 @@
         <w:rPr>
           <w:b/>
         </w:rPr>
-        <w:t>na 9 (13 de Abril del 2026 al 17</w:t>
+        <w:t xml:space="preserve">na 9 (13 de </w:t>
+      </w:r>
+      <w:proofErr w:type="gramStart"/>
+      <w:r>
+        <w:rPr>
+          <w:b/>
+        </w:rPr>
+        <w:t>Abril</w:t>
+      </w:r>
+      <w:proofErr w:type="gramEnd"/>
+      <w:r>
+        <w:rPr>
+          <w:b/>
+        </w:rPr>
+        <w:t xml:space="preserve"> del 2026 al 17</w:t>
       </w:r>
       <w:r>
         <w:rPr>
@@ -291,50 +854,181 @@
         <w:jc w:val="both"/>
       </w:pPr>
       <w:r>
-        <w:t>El 13 de Abril, comencé a trabajar con los modelos de las naves; debo configurarlos para una actividad que se tendrá por parte de Amerike.</w:t>
-      </w:r>
-      <w:r>
-        <w:t xml:space="preserve"> El 14 de Abril terminé de configurar los modelos y limpié un poco el código y los Assets para la muestra del día siguiente.</w:t>
-      </w:r>
-      <w:r>
-        <w:t xml:space="preserve"> El 15 de Abril realicé unos ajustes a la cámara del jugador y alisté todo para la muestra de Amerike</w:t>
-      </w:r>
-      <w:r>
-        <w:t>. El 16 de Abril fue la muestra, hubo problemas con la Etiqueta Player, ya fue solucionado pero al menos en la muestra se tuvo ese problema. El 17 de Abril se comenzó a probar las mecánicas del segundo minijuego, este toma en cuenta la rotación de la muñeca del jugador para poder rotar las piezas del rompecabezas.</w:t>
-      </w:r>
-    </w:p>
-    <w:p>
-      <w:pPr>
-        <w:jc w:val="both"/>
-        <w:rPr>
-          <w:b/>
-        </w:rPr>
-      </w:pPr>
-      <w:r>
-        <w:rPr>
-          <w:b/>
-        </w:rPr>
-        <w:t>Semana 10 (20 de Abril del 2026 al 24 de Abril del 2026)</w:t>
-      </w:r>
-    </w:p>
-    <w:p>
-      <w:pPr>
-        <w:jc w:val="both"/>
-      </w:pPr>
-      <w:r>
-        <w:t>El 20 de Abril, comencé a trabajar en el sistema para confirmar que el rompecabezas esté formado, pero por los modelos que estoy usando, no sé exactamente si está funcionando hasta que tenga los modelos correctos.</w:t>
-      </w:r>
-      <w:r>
-        <w:t xml:space="preserve"> El 21 de Abril hubo retroalimentación por parte de Yoás, para las runas no hay que aplicar los botones, pero el sistema de victoria está bien, ahora hay que idear una forma para implementar las puertas.</w:t>
-      </w:r>
-      <w:r>
-        <w:t xml:space="preserve"> El 22 de Abril se comenzó la implementación de las puertas, las cuales funcionarán como forma de medir el progreso del jugador.</w:t>
-      </w:r>
-      <w:r>
-        <w:t xml:space="preserve"> El 23 de Abril se comenzó a implementar el contador para finalizar el nivel.</w:t>
-      </w:r>
-      <w:r>
-        <w:t xml:space="preserve"> El 24 de Abril se arregló la funcionalidad del contador, además de que se activan interfaces en base al resultado de las rotaciones. La siguiente semana comienzo a implementar un objeto que aumente la intensidad </w:t>
+        <w:t xml:space="preserve">El 13 de </w:t>
+      </w:r>
+      <w:proofErr w:type="gramStart"/>
+      <w:r>
+        <w:t>Abril</w:t>
+      </w:r>
+      <w:proofErr w:type="gramEnd"/>
+      <w:r>
+        <w:t xml:space="preserve">, comencé a trabajar con los modelos de las naves; debo configurarlos para una actividad que se tendrá por parte de </w:t>
+      </w:r>
+      <w:proofErr w:type="spellStart"/>
+      <w:r>
+        <w:t>Amerike</w:t>
+      </w:r>
+      <w:proofErr w:type="spellEnd"/>
+      <w:r>
+        <w:t>.</w:t>
+      </w:r>
+      <w:r>
+        <w:t xml:space="preserve"> El 14 de </w:t>
+      </w:r>
+      <w:proofErr w:type="gramStart"/>
+      <w:r>
+        <w:t>Abril</w:t>
+      </w:r>
+      <w:proofErr w:type="gramEnd"/>
+      <w:r>
+        <w:t xml:space="preserve"> terminé de configurar los modelos y limpié un poco el código y los </w:t>
+      </w:r>
+      <w:proofErr w:type="spellStart"/>
+      <w:r>
+        <w:t>Assets</w:t>
+      </w:r>
+      <w:proofErr w:type="spellEnd"/>
+      <w:r>
+        <w:t xml:space="preserve"> para la muestra del día siguiente.</w:t>
+      </w:r>
+      <w:r>
+        <w:t xml:space="preserve"> El 15 de </w:t>
+      </w:r>
+      <w:proofErr w:type="gramStart"/>
+      <w:r>
+        <w:t>Abril</w:t>
+      </w:r>
+      <w:proofErr w:type="gramEnd"/>
+      <w:r>
+        <w:t xml:space="preserve"> realicé unos ajustes a la cámara del jugador y alisté todo para la muestra de </w:t>
+      </w:r>
+      <w:proofErr w:type="spellStart"/>
+      <w:r>
+        <w:t>Amerike</w:t>
+      </w:r>
+      <w:proofErr w:type="spellEnd"/>
+      <w:r>
+        <w:t xml:space="preserve">. El 16 de </w:t>
+      </w:r>
+      <w:proofErr w:type="gramStart"/>
+      <w:r>
+        <w:t>Abril</w:t>
+      </w:r>
+      <w:proofErr w:type="gramEnd"/>
+      <w:r>
+        <w:t xml:space="preserve"> fue la muestra, hubo problemas con la Etiqueta Player, ya fue solucionado pero al menos en la muestra se tuvo ese problema. El 17 de </w:t>
+      </w:r>
+      <w:proofErr w:type="gramStart"/>
+      <w:r>
+        <w:t>Abril</w:t>
+      </w:r>
+      <w:proofErr w:type="gramEnd"/>
+      <w:r>
+        <w:t xml:space="preserve"> se comenzó a probar las mecánicas del segundo </w:t>
+      </w:r>
+      <w:proofErr w:type="spellStart"/>
+      <w:r>
+        <w:t>minijuego</w:t>
+      </w:r>
+      <w:proofErr w:type="spellEnd"/>
+      <w:r>
+        <w:t>, este toma en cuenta la rotación de la muñeca del jugador para poder rotar las piezas del rompecabezas.</w:t>
+      </w:r>
+    </w:p>
+    <w:p>
+      <w:pPr>
+        <w:jc w:val="both"/>
+        <w:rPr>
+          <w:b/>
+        </w:rPr>
+      </w:pPr>
+      <w:r>
+        <w:rPr>
+          <w:b/>
+        </w:rPr>
+        <w:t xml:space="preserve">Semana 10 (20 de </w:t>
+      </w:r>
+      <w:proofErr w:type="gramStart"/>
+      <w:r>
+        <w:rPr>
+          <w:b/>
+        </w:rPr>
+        <w:t>Abril</w:t>
+      </w:r>
+      <w:proofErr w:type="gramEnd"/>
+      <w:r>
+        <w:rPr>
+          <w:b/>
+        </w:rPr>
+        <w:t xml:space="preserve"> del 2026 al 24 de Abril del 2026)</w:t>
+      </w:r>
+    </w:p>
+    <w:p>
+      <w:pPr>
+        <w:jc w:val="both"/>
+      </w:pPr>
+      <w:r>
+        <w:t xml:space="preserve">El 20 de </w:t>
+      </w:r>
+      <w:proofErr w:type="gramStart"/>
+      <w:r>
+        <w:t>Abril</w:t>
+      </w:r>
+      <w:proofErr w:type="gramEnd"/>
+      <w:r>
+        <w:t>, comencé a trabajar en el sistema para confirmar que el rompecabezas esté formado, pero por los modelos que estoy usando, no sé exactamente si está funcionando hasta que tenga los modelos correctos.</w:t>
+      </w:r>
+      <w:r>
+        <w:t xml:space="preserve"> El 21 de </w:t>
+      </w:r>
+      <w:proofErr w:type="gramStart"/>
+      <w:r>
+        <w:t>Abril</w:t>
+      </w:r>
+      <w:proofErr w:type="gramEnd"/>
+      <w:r>
+        <w:t xml:space="preserve"> hubo retroalimentación por parte de </w:t>
+      </w:r>
+      <w:proofErr w:type="spellStart"/>
+      <w:r>
+        <w:t>Yoás</w:t>
+      </w:r>
+      <w:proofErr w:type="spellEnd"/>
+      <w:r>
+        <w:t>, para las runas no hay que aplicar los botones, pero el sistema de victoria está bien, ahora hay que idear una forma para implementar las puertas.</w:t>
+      </w:r>
+      <w:r>
+        <w:t xml:space="preserve"> El 22 de </w:t>
+      </w:r>
+      <w:proofErr w:type="gramStart"/>
+      <w:r>
+        <w:t>Abril</w:t>
+      </w:r>
+      <w:proofErr w:type="gramEnd"/>
+      <w:r>
+        <w:t xml:space="preserve"> se comenzó la implementación de las puertas, las cuales funcionarán como forma de medir el progreso del jugador.</w:t>
+      </w:r>
+      <w:r>
+        <w:t xml:space="preserve"> El 23 de </w:t>
+      </w:r>
+      <w:proofErr w:type="gramStart"/>
+      <w:r>
+        <w:t>Abril</w:t>
+      </w:r>
+      <w:proofErr w:type="gramEnd"/>
+      <w:r>
+        <w:t xml:space="preserve"> se comenzó a implementar el contador para finalizar el nivel.</w:t>
+      </w:r>
+      <w:r>
+        <w:t xml:space="preserve"> El 24 de </w:t>
+      </w:r>
+      <w:proofErr w:type="gramStart"/>
+      <w:r>
+        <w:t>Abril</w:t>
+      </w:r>
+      <w:proofErr w:type="gramEnd"/>
+      <w:r>
+        <w:t xml:space="preserve"> se arregló la funcionalidad del contador, además de que se activan interfaces en base al resultado de las rotaciones. La siguiente semana comienzo a implementar un objeto que aumente la intensidad </w:t>
       </w:r>
       <w:r>
         <w:lastRenderedPageBreak/>
@@ -352,7 +1046,21 @@
         <w:rPr>
           <w:b/>
         </w:rPr>
-        <w:t>Semana 11 (27 de Abril del 2026 al 30 de Abril</w:t>
+        <w:t xml:space="preserve">Semana 11 (27 de </w:t>
+      </w:r>
+      <w:proofErr w:type="gramStart"/>
+      <w:r>
+        <w:rPr>
+          <w:b/>
+        </w:rPr>
+        <w:t>Abril</w:t>
+      </w:r>
+      <w:proofErr w:type="gramEnd"/>
+      <w:r>
+        <w:rPr>
+          <w:b/>
+        </w:rPr>
+        <w:t xml:space="preserve"> del 2026 al 30 de Abril</w:t>
       </w:r>
       <w:r>
         <w:rPr>
@@ -372,44 +1080,130 @@
         <w:jc w:val="both"/>
       </w:pPr>
       <w:r>
-        <w:t>El 27 de Abril, comencé a implementar la iluminación de un objeto para darle un efecto de premio.</w:t>
-      </w:r>
-      <w:r>
-        <w:t xml:space="preserve"> El 28 de Abril, comencé a hacer ajustes para la interfaz, en la semana debo ver si cuando el jugador pierda, se reinicia toda la partida o solo el escenario.</w:t>
-      </w:r>
-      <w:r>
-        <w:t xml:space="preserve"> El 30 de Abril recibí comentarios de Yoas para continuar con mi implementación de las piezas del rompecabezas por separada en lugar de juntas, así como poner limitaciones para las piezas.</w:t>
-      </w:r>
-    </w:p>
-    <w:p>
-      <w:pPr>
-        <w:jc w:val="both"/>
-        <w:rPr>
-          <w:b/>
-        </w:rPr>
-      </w:pPr>
-      <w:r>
-        <w:rPr>
-          <w:b/>
-        </w:rPr>
-        <w:t>Semana 12 (04 de Mayo del 2026 al 08 de Mayo del 2026)</w:t>
-      </w:r>
-    </w:p>
-    <w:p>
-      <w:pPr>
-        <w:jc w:val="both"/>
-      </w:pPr>
-      <w:r>
-        <w:t>El 04 de Mayo implementé los botones para continuar la partida o reiniciar el nivel en caso de que termine el tiempo.</w:t>
-      </w:r>
-      <w:r>
-        <w:t xml:space="preserve"> El 05 de Mayo implementé un límite de rotación para cada pieza del rompecabezas para que el paciente tenga que interactuar varias veces y pueda trabajar en la rotación de su muñeca.</w:t>
-      </w:r>
-      <w:r>
-        <w:t xml:space="preserve"> El 06 de Mayo implementé un menú general para los 4 minijuegos.</w:t>
-      </w:r>
-      <w:r>
-        <w:t xml:space="preserve"> El 7 y 8 de Mayo </w:t>
+        <w:t xml:space="preserve">El 27 de </w:t>
+      </w:r>
+      <w:proofErr w:type="gramStart"/>
+      <w:r>
+        <w:t>Abril</w:t>
+      </w:r>
+      <w:proofErr w:type="gramEnd"/>
+      <w:r>
+        <w:t>, comencé a implementar la iluminación de un objeto para darle un efecto de premio.</w:t>
+      </w:r>
+      <w:r>
+        <w:t xml:space="preserve"> El 28 de </w:t>
+      </w:r>
+      <w:proofErr w:type="gramStart"/>
+      <w:r>
+        <w:t>Abril</w:t>
+      </w:r>
+      <w:proofErr w:type="gramEnd"/>
+      <w:r>
+        <w:t>, comencé a hacer ajustes para la interfaz, en la semana debo ver si cuando el jugador pierda, se reinicia toda la partida o solo el escenario.</w:t>
+      </w:r>
+      <w:r>
+        <w:t xml:space="preserve"> El 30 de </w:t>
+      </w:r>
+      <w:proofErr w:type="gramStart"/>
+      <w:r>
+        <w:t>Abril</w:t>
+      </w:r>
+      <w:proofErr w:type="gramEnd"/>
+      <w:r>
+        <w:t xml:space="preserve"> recibí comentarios de </w:t>
+      </w:r>
+      <w:proofErr w:type="spellStart"/>
+      <w:r>
+        <w:t>Yoas</w:t>
+      </w:r>
+      <w:proofErr w:type="spellEnd"/>
+      <w:r>
+        <w:t xml:space="preserve"> para continuar con mi implementación de las piezas del rompecabezas por separada en lugar de juntas, así como poner limitaciones para las piezas.</w:t>
+      </w:r>
+    </w:p>
+    <w:p>
+      <w:pPr>
+        <w:jc w:val="both"/>
+        <w:rPr>
+          <w:b/>
+        </w:rPr>
+      </w:pPr>
+      <w:r>
+        <w:rPr>
+          <w:b/>
+        </w:rPr>
+        <w:t xml:space="preserve">Semana 12 (04 de </w:t>
+      </w:r>
+      <w:proofErr w:type="gramStart"/>
+      <w:r>
+        <w:rPr>
+          <w:b/>
+        </w:rPr>
+        <w:t>Mayo</w:t>
+      </w:r>
+      <w:proofErr w:type="gramEnd"/>
+      <w:r>
+        <w:rPr>
+          <w:b/>
+        </w:rPr>
+        <w:t xml:space="preserve"> del 2026 al 08 de Mayo del 2026)</w:t>
+      </w:r>
+    </w:p>
+    <w:p>
+      <w:pPr>
+        <w:jc w:val="both"/>
+      </w:pPr>
+      <w:r>
+        <w:t xml:space="preserve">El 04 de </w:t>
+      </w:r>
+      <w:proofErr w:type="gramStart"/>
+      <w:r>
+        <w:t>Mayo</w:t>
+      </w:r>
+      <w:proofErr w:type="gramEnd"/>
+      <w:r>
+        <w:t xml:space="preserve"> implementé los botones para continuar la partida o reiniciar el nivel en caso de que termine el tiempo.</w:t>
+      </w:r>
+      <w:r>
+        <w:t xml:space="preserve"> El 05 de </w:t>
+      </w:r>
+      <w:proofErr w:type="gramStart"/>
+      <w:r>
+        <w:t>Mayo</w:t>
+      </w:r>
+      <w:proofErr w:type="gramEnd"/>
+      <w:r>
+        <w:t xml:space="preserve"> implementé un límite de rotación para cada pieza del rompecabezas para que el paciente tenga que interactuar varias veces y pueda trabajar en la rotación de su muñeca.</w:t>
+      </w:r>
+      <w:r>
+        <w:t xml:space="preserve"> El 06 de </w:t>
+      </w:r>
+      <w:proofErr w:type="gramStart"/>
+      <w:r>
+        <w:t>Mayo</w:t>
+      </w:r>
+      <w:proofErr w:type="gramEnd"/>
+      <w:r>
+        <w:t xml:space="preserve"> implementé un menú general para los 4 </w:t>
+      </w:r>
+      <w:proofErr w:type="spellStart"/>
+      <w:r>
+        <w:t>minijuegos</w:t>
+      </w:r>
+      <w:proofErr w:type="spellEnd"/>
+      <w:r>
+        <w:t>.</w:t>
+      </w:r>
+      <w:r>
+        <w:t xml:space="preserve"> El 7 y 8 de </w:t>
+      </w:r>
+      <w:proofErr w:type="gramStart"/>
+      <w:r>
+        <w:t>Mayo</w:t>
+      </w:r>
+      <w:proofErr w:type="gramEnd"/>
+      <w:r>
+        <w:t xml:space="preserve"> </w:t>
       </w:r>
       <w:r>
         <w:t>continué</w:t>
@@ -421,91 +1215,261 @@
         <w:t>do</w:t>
       </w:r>
       <w:r>
-        <w:t xml:space="preserve"> el menú de los 4 minijuegos, procuré que el paciente tenga la opción de girar a otros lados para cambiar entre realidad aumentada y mixta.</w:t>
-      </w:r>
-    </w:p>
-    <w:p>
-      <w:pPr>
-        <w:jc w:val="both"/>
-        <w:rPr>
-          <w:b/>
-        </w:rPr>
-      </w:pPr>
-      <w:r>
-        <w:rPr>
-          <w:b/>
-        </w:rPr>
-        <w:t>Semana 13 (11 de Mayo del 2026 al 14 de Mayo del 2026)</w:t>
-      </w:r>
-    </w:p>
-    <w:p>
-      <w:pPr>
-        <w:jc w:val="both"/>
-      </w:pPr>
-      <w:r>
-        <w:t>El 11 de Mayo terminé la implementación del botón para alternar de realidad desde el menú general; comenzaré a ver el prototipo del tercer minijuego.</w:t>
-      </w:r>
-      <w:r>
-        <w:t xml:space="preserve"> El 12 de Mayo comencé a implementar una forma para que la dificultad de los niveles aumente en base al tiempo que tarda el paciente en resolver el rompecabezas.</w:t>
-      </w:r>
-      <w:r>
-        <w:t xml:space="preserve"> El 14 de Mayo mejoré los Colliders de las Naves y añadí las nuevas texturas que hizo mi compañera Yael.</w:t>
-      </w:r>
-    </w:p>
-    <w:p>
-      <w:pPr>
-        <w:jc w:val="both"/>
-        <w:rPr>
-          <w:b/>
-        </w:rPr>
-      </w:pPr>
-      <w:r>
-        <w:rPr>
-          <w:b/>
-        </w:rPr>
-        <w:t>Semana 14 (18 de Mayo del 2026 al 22 de Mayo del 2026)</w:t>
-      </w:r>
-    </w:p>
-    <w:p>
-      <w:pPr>
-        <w:jc w:val="both"/>
-      </w:pPr>
-      <w:r>
-        <w:t>El 18 de Mayo comencé a ver las animaciones de las naves destruidas para el primer minijuego.</w:t>
-      </w:r>
-      <w:r>
-        <w:t xml:space="preserve"> El 19 de Mayo implementé las animaciones de las naves destruidas así como su comportamiento al momento de que el paciente interactúa con ellas.</w:t>
-      </w:r>
-      <w:r>
-        <w:t xml:space="preserve"> El 20 de Mayo comencé a implementar un mensaje continuo para animar y recordarle al paciente lo que debe hacer.</w:t>
-      </w:r>
-      <w:r>
-        <w:t xml:space="preserve"> El 21 de Mayo se implementó el mensaje continuo en el segundo minijuego.</w:t>
-      </w:r>
-      <w:r>
-        <w:t xml:space="preserve"> El 22 de Mayo se comenzaron a implementar sonidos para los primeros minijuegos.</w:t>
-      </w:r>
-    </w:p>
-    <w:p>
-      <w:pPr>
-        <w:jc w:val="both"/>
-        <w:rPr>
-          <w:b/>
-        </w:rPr>
-      </w:pPr>
-      <w:r>
-        <w:rPr>
-          <w:b/>
-        </w:rPr>
-        <w:t>Semana 15 (25 de Mayo del 2026 al 29 de Mayo del 2026)</w:t>
-      </w:r>
-    </w:p>
-    <w:p>
-      <w:pPr>
-        <w:jc w:val="both"/>
-      </w:pPr>
-      <w:r>
-        <w:t>El 25 de Mayo comencé a implementar efecto</w:t>
+        <w:t xml:space="preserve"> el menú de los 4 </w:t>
+      </w:r>
+      <w:proofErr w:type="spellStart"/>
+      <w:r>
+        <w:t>minijuegos</w:t>
+      </w:r>
+      <w:proofErr w:type="spellEnd"/>
+      <w:r>
+        <w:t>, procuré que el paciente tenga la opción de girar a otros lados para cambiar entre realidad aumentada y mixta.</w:t>
+      </w:r>
+    </w:p>
+    <w:p>
+      <w:pPr>
+        <w:jc w:val="both"/>
+        <w:rPr>
+          <w:b/>
+        </w:rPr>
+      </w:pPr>
+      <w:r>
+        <w:rPr>
+          <w:b/>
+        </w:rPr>
+        <w:t xml:space="preserve">Semana 13 (11 de </w:t>
+      </w:r>
+      <w:proofErr w:type="gramStart"/>
+      <w:r>
+        <w:rPr>
+          <w:b/>
+        </w:rPr>
+        <w:t>Mayo</w:t>
+      </w:r>
+      <w:proofErr w:type="gramEnd"/>
+      <w:r>
+        <w:rPr>
+          <w:b/>
+        </w:rPr>
+        <w:t xml:space="preserve"> del 2026 al 14 de Mayo del 2026)</w:t>
+      </w:r>
+    </w:p>
+    <w:p>
+      <w:pPr>
+        <w:jc w:val="both"/>
+      </w:pPr>
+      <w:r>
+        <w:t xml:space="preserve">El 11 de </w:t>
+      </w:r>
+      <w:proofErr w:type="gramStart"/>
+      <w:r>
+        <w:t>Mayo</w:t>
+      </w:r>
+      <w:proofErr w:type="gramEnd"/>
+      <w:r>
+        <w:t xml:space="preserve"> terminé la implementación del botón para alternar de realidad desde el menú general; comenzaré a ver el prototipo del tercer </w:t>
+      </w:r>
+      <w:proofErr w:type="spellStart"/>
+      <w:r>
+        <w:t>minijuego</w:t>
+      </w:r>
+      <w:proofErr w:type="spellEnd"/>
+      <w:r>
+        <w:t>.</w:t>
+      </w:r>
+      <w:r>
+        <w:t xml:space="preserve"> El 12 de </w:t>
+      </w:r>
+      <w:proofErr w:type="gramStart"/>
+      <w:r>
+        <w:t>Mayo</w:t>
+      </w:r>
+      <w:proofErr w:type="gramEnd"/>
+      <w:r>
+        <w:t xml:space="preserve"> comencé a implementar una forma para que la dificultad de los niveles aumente en base al tiempo que tarda el paciente en resolver el rompecabezas.</w:t>
+      </w:r>
+      <w:r>
+        <w:t xml:space="preserve"> El 14 de </w:t>
+      </w:r>
+      <w:proofErr w:type="gramStart"/>
+      <w:r>
+        <w:t>Mayo</w:t>
+      </w:r>
+      <w:proofErr w:type="gramEnd"/>
+      <w:r>
+        <w:t xml:space="preserve"> mejoré los </w:t>
+      </w:r>
+      <w:proofErr w:type="spellStart"/>
+      <w:r>
+        <w:t>Colliders</w:t>
+      </w:r>
+      <w:proofErr w:type="spellEnd"/>
+      <w:r>
+        <w:t xml:space="preserve"> de las Naves y añadí las nuevas texturas que hizo mi compañera </w:t>
+      </w:r>
+      <w:proofErr w:type="spellStart"/>
+      <w:r>
+        <w:t>Yael</w:t>
+      </w:r>
+      <w:proofErr w:type="spellEnd"/>
+      <w:r>
+        <w:t>.</w:t>
+      </w:r>
+    </w:p>
+    <w:p>
+      <w:pPr>
+        <w:jc w:val="both"/>
+        <w:rPr>
+          <w:b/>
+        </w:rPr>
+      </w:pPr>
+      <w:r>
+        <w:rPr>
+          <w:b/>
+        </w:rPr>
+        <w:t xml:space="preserve">Semana 14 (18 de </w:t>
+      </w:r>
+      <w:proofErr w:type="gramStart"/>
+      <w:r>
+        <w:rPr>
+          <w:b/>
+        </w:rPr>
+        <w:t>Mayo</w:t>
+      </w:r>
+      <w:proofErr w:type="gramEnd"/>
+      <w:r>
+        <w:rPr>
+          <w:b/>
+        </w:rPr>
+        <w:t xml:space="preserve"> del 2026 al 22 de Mayo del 2026)</w:t>
+      </w:r>
+    </w:p>
+    <w:p>
+      <w:pPr>
+        <w:jc w:val="both"/>
+      </w:pPr>
+      <w:r>
+        <w:t xml:space="preserve">El 18 de </w:t>
+      </w:r>
+      <w:proofErr w:type="gramStart"/>
+      <w:r>
+        <w:t>Mayo</w:t>
+      </w:r>
+      <w:proofErr w:type="gramEnd"/>
+      <w:r>
+        <w:t xml:space="preserve"> comencé a ver las animaciones de las naves destruidas para el primer </w:t>
+      </w:r>
+      <w:proofErr w:type="spellStart"/>
+      <w:r>
+        <w:t>minijuego</w:t>
+      </w:r>
+      <w:proofErr w:type="spellEnd"/>
+      <w:r>
+        <w:t>.</w:t>
+      </w:r>
+      <w:r>
+        <w:t xml:space="preserve"> El 19 de </w:t>
+      </w:r>
+      <w:proofErr w:type="gramStart"/>
+      <w:r>
+        <w:t>Mayo</w:t>
+      </w:r>
+      <w:proofErr w:type="gramEnd"/>
+      <w:r>
+        <w:t xml:space="preserve"> implementé las animaciones de las naves destruidas así como su comportamiento al momento de que el paciente interactúa con ellas.</w:t>
+      </w:r>
+      <w:r>
+        <w:t xml:space="preserve"> El 20 de </w:t>
+      </w:r>
+      <w:proofErr w:type="gramStart"/>
+      <w:r>
+        <w:t>Mayo</w:t>
+      </w:r>
+      <w:proofErr w:type="gramEnd"/>
+      <w:r>
+        <w:t xml:space="preserve"> comencé a implementar un mensaje continuo para animar y recordarle al paciente lo que debe hacer.</w:t>
+      </w:r>
+      <w:r>
+        <w:t xml:space="preserve"> El 21 de </w:t>
+      </w:r>
+      <w:proofErr w:type="gramStart"/>
+      <w:r>
+        <w:t>Mayo</w:t>
+      </w:r>
+      <w:proofErr w:type="gramEnd"/>
+      <w:r>
+        <w:t xml:space="preserve"> se implementó el mensaje continuo en el segundo </w:t>
+      </w:r>
+      <w:proofErr w:type="spellStart"/>
+      <w:r>
+        <w:t>minijuego</w:t>
+      </w:r>
+      <w:proofErr w:type="spellEnd"/>
+      <w:r>
+        <w:t>.</w:t>
+      </w:r>
+      <w:r>
+        <w:t xml:space="preserve"> El 22 de </w:t>
+      </w:r>
+      <w:proofErr w:type="gramStart"/>
+      <w:r>
+        <w:t>Mayo</w:t>
+      </w:r>
+      <w:proofErr w:type="gramEnd"/>
+      <w:r>
+        <w:t xml:space="preserve"> se comenzaron a implementar sonidos para los primeros </w:t>
+      </w:r>
+      <w:proofErr w:type="spellStart"/>
+      <w:r>
+        <w:t>minijuegos</w:t>
+      </w:r>
+      <w:proofErr w:type="spellEnd"/>
+      <w:r>
+        <w:t>.</w:t>
+      </w:r>
+    </w:p>
+    <w:p>
+      <w:pPr>
+        <w:jc w:val="both"/>
+        <w:rPr>
+          <w:b/>
+        </w:rPr>
+      </w:pPr>
+      <w:r>
+        <w:rPr>
+          <w:b/>
+        </w:rPr>
+        <w:t xml:space="preserve">Semana 15 (25 de </w:t>
+      </w:r>
+      <w:proofErr w:type="gramStart"/>
+      <w:r>
+        <w:rPr>
+          <w:b/>
+        </w:rPr>
+        <w:t>Mayo</w:t>
+      </w:r>
+      <w:proofErr w:type="gramEnd"/>
+      <w:r>
+        <w:rPr>
+          <w:b/>
+        </w:rPr>
+        <w:t xml:space="preserve"> del 2026 al 29 de Mayo del 2026)</w:t>
+      </w:r>
+    </w:p>
+    <w:p>
+      <w:pPr>
+        <w:jc w:val="both"/>
+      </w:pPr>
+      <w:r>
+        <w:t xml:space="preserve">El 25 de </w:t>
+      </w:r>
+      <w:proofErr w:type="gramStart"/>
+      <w:r>
+        <w:t>Mayo</w:t>
+      </w:r>
+      <w:proofErr w:type="gramEnd"/>
+      <w:r>
+        <w:t xml:space="preserve"> comencé a implementar efecto</w:t>
       </w:r>
       <w:r>
         <w:t>s de sonido para los Enemigos, inicié</w:t>
@@ -514,54 +1478,164 @@
         <w:t xml:space="preserve"> la edi</w:t>
       </w:r>
       <w:r>
-        <w:t>ción de los iconos de las Naves y me encargué de implementar el nuevo diseño de los Puzzles.</w:t>
-      </w:r>
-      <w:r>
-        <w:t xml:space="preserve"> El 26 de Mayo completé la implementación de los iconos para la selección de Enemigos en el primer minijuego.</w:t>
-      </w:r>
-      <w:r>
-        <w:t xml:space="preserve"> El 27 de Mayo del 2026, comencé con la implementación del tercer minijuego.</w:t>
-      </w:r>
-      <w:r>
-        <w:t xml:space="preserve"> El 28 de Mayo arreglé los problemas que trajo consigo el nuevo modelo de las Runas, ya funcionan como deberían.</w:t>
-      </w:r>
-      <w:r>
-        <w:t xml:space="preserve"> El 28 de Mayo implementé un prototipo para la detección de flexión y extensión de la muñeca.</w:t>
-      </w:r>
-    </w:p>
-    <w:p>
-      <w:pPr>
-        <w:jc w:val="both"/>
-        <w:rPr>
-          <w:b/>
-        </w:rPr>
-      </w:pPr>
-      <w:r>
-        <w:rPr>
-          <w:b/>
-        </w:rPr>
-        <w:t>Semana 16 (01 de Junio del 2026 al 05 de Junio del 2026)</w:t>
-      </w:r>
-    </w:p>
-    <w:p>
-      <w:pPr>
-        <w:jc w:val="both"/>
-      </w:pPr>
-      <w:r>
-        <w:t xml:space="preserve">El 01 de Junio comencé a modificar las runas por una corrección por parte de Yoas. </w:t>
-      </w:r>
-      <w:r>
-        <w:t>El 02 de Junio implementé un mejor control para las Runas, aunque falta ajustar detalles de la puertas.</w:t>
-      </w:r>
-      <w:r>
-        <w:t xml:space="preserve"> El 03 de Junio mejoré el comportamiento de las puertas en base a la nueva estructura de las Runas.</w:t>
+        <w:t xml:space="preserve">ción de los iconos de las Naves y me encargué de implementar el nuevo diseño de los </w:t>
+      </w:r>
+      <w:proofErr w:type="spellStart"/>
+      <w:r>
+        <w:t>Puzzles</w:t>
+      </w:r>
+      <w:proofErr w:type="spellEnd"/>
+      <w:r>
+        <w:t>.</w:t>
+      </w:r>
+      <w:r>
+        <w:t xml:space="preserve"> El 26 de </w:t>
+      </w:r>
+      <w:proofErr w:type="gramStart"/>
+      <w:r>
+        <w:t>Mayo</w:t>
+      </w:r>
+      <w:proofErr w:type="gramEnd"/>
+      <w:r>
+        <w:t xml:space="preserve"> completé la implementación de los iconos para la selección de Enemigos en el primer </w:t>
+      </w:r>
+      <w:proofErr w:type="spellStart"/>
+      <w:r>
+        <w:t>minijuego</w:t>
+      </w:r>
+      <w:proofErr w:type="spellEnd"/>
+      <w:r>
+        <w:t>.</w:t>
+      </w:r>
+      <w:r>
+        <w:t xml:space="preserve"> El 27 de </w:t>
+      </w:r>
+      <w:proofErr w:type="gramStart"/>
+      <w:r>
+        <w:t>Mayo</w:t>
+      </w:r>
+      <w:proofErr w:type="gramEnd"/>
+      <w:r>
+        <w:t xml:space="preserve"> del 2026, comencé con la implementación del tercer </w:t>
+      </w:r>
+      <w:proofErr w:type="spellStart"/>
+      <w:r>
+        <w:t>minijuego</w:t>
+      </w:r>
+      <w:proofErr w:type="spellEnd"/>
+      <w:r>
+        <w:t>.</w:t>
+      </w:r>
+      <w:r>
+        <w:t xml:space="preserve"> El 28 de </w:t>
+      </w:r>
+      <w:proofErr w:type="gramStart"/>
+      <w:r>
+        <w:t>Mayo</w:t>
+      </w:r>
+      <w:proofErr w:type="gramEnd"/>
+      <w:r>
+        <w:t xml:space="preserve"> arreglé los problemas que trajo consigo el nuevo modelo de las Runas, ya funcionan como deberían.</w:t>
+      </w:r>
+      <w:r>
+        <w:t xml:space="preserve"> El 28 de </w:t>
+      </w:r>
+      <w:proofErr w:type="gramStart"/>
+      <w:r>
+        <w:t>Mayo</w:t>
+      </w:r>
+      <w:proofErr w:type="gramEnd"/>
+      <w:r>
+        <w:t xml:space="preserve"> implementé un prototipo para la detección de flexión y extensión de la muñeca.</w:t>
+      </w:r>
+    </w:p>
+    <w:p>
+      <w:pPr>
+        <w:jc w:val="both"/>
+        <w:rPr>
+          <w:b/>
+        </w:rPr>
+      </w:pPr>
+      <w:r>
+        <w:rPr>
+          <w:b/>
+        </w:rPr>
+        <w:t xml:space="preserve">Semana 16 (01 de </w:t>
+      </w:r>
+      <w:proofErr w:type="gramStart"/>
+      <w:r>
+        <w:rPr>
+          <w:b/>
+        </w:rPr>
+        <w:t>Junio</w:t>
+      </w:r>
+      <w:proofErr w:type="gramEnd"/>
+      <w:r>
+        <w:rPr>
+          <w:b/>
+        </w:rPr>
+        <w:t xml:space="preserve"> del 2026 al 05 de Junio del 2026)</w:t>
+      </w:r>
+    </w:p>
+    <w:p>
+      <w:pPr>
+        <w:jc w:val="both"/>
+      </w:pPr>
+      <w:r>
+        <w:t xml:space="preserve">El 01 de </w:t>
+      </w:r>
+      <w:proofErr w:type="gramStart"/>
+      <w:r>
+        <w:t>Junio</w:t>
+      </w:r>
+      <w:proofErr w:type="gramEnd"/>
+      <w:r>
+        <w:t xml:space="preserve"> comencé a modificar las runas por una corrección por parte de </w:t>
+      </w:r>
+      <w:proofErr w:type="spellStart"/>
+      <w:r>
+        <w:t>Yoas</w:t>
+      </w:r>
+      <w:proofErr w:type="spellEnd"/>
+      <w:r>
+        <w:t xml:space="preserve">. </w:t>
+      </w:r>
+      <w:r>
+        <w:t xml:space="preserve">El 02 de </w:t>
+      </w:r>
+      <w:proofErr w:type="gramStart"/>
+      <w:r>
+        <w:t>Junio</w:t>
+      </w:r>
+      <w:proofErr w:type="gramEnd"/>
+      <w:r>
+        <w:t xml:space="preserve"> implementé un mejor control para las Runas, aunque falta ajustar detalles de la puertas.</w:t>
+      </w:r>
+      <w:r>
+        <w:t xml:space="preserve"> El 03 de </w:t>
+      </w:r>
+      <w:proofErr w:type="gramStart"/>
+      <w:r>
+        <w:t>Junio</w:t>
+      </w:r>
+      <w:proofErr w:type="gramEnd"/>
+      <w:r>
+        <w:t xml:space="preserve"> mejoré el comportamiento de las puertas en base a la nueva estructura de las Runas.</w:t>
       </w:r>
       <w:r>
         <w:t xml:space="preserve"> </w:t>
       </w:r>
       <w:r>
         <w:lastRenderedPageBreak/>
-        <w:t>El 4 y 5 de Junio implementé una forma en que el paciente o el terapeuta pueda elegir c</w:t>
+        <w:t xml:space="preserve">El 4 y 5 de </w:t>
+      </w:r>
+      <w:proofErr w:type="gramStart"/>
+      <w:r>
+        <w:t>Junio</w:t>
+      </w:r>
+      <w:proofErr w:type="gramEnd"/>
+      <w:r>
+        <w:t xml:space="preserve"> implementé una forma en que el paciente o el terapeuta pueda elegir c</w:t>
       </w:r>
       <w:r>
         <w:t>on que brazo se trabajará en su</w:t>
@@ -581,7 +1655,21 @@
         <w:rPr>
           <w:b/>
         </w:rPr>
-        <w:t>Semana 17 (08 de Junio del 2026 al 12 de Junio del 2026)</w:t>
+        <w:t xml:space="preserve">Semana 17 (08 de </w:t>
+      </w:r>
+      <w:proofErr w:type="gramStart"/>
+      <w:r>
+        <w:rPr>
+          <w:b/>
+        </w:rPr>
+        <w:t>Junio</w:t>
+      </w:r>
+      <w:proofErr w:type="gramEnd"/>
+      <w:r>
+        <w:rPr>
+          <w:b/>
+        </w:rPr>
+        <w:t xml:space="preserve"> del 2026 al 12 de Junio del 2026)</w:t>
       </w:r>
     </w:p>
     <w:p>
@@ -590,34 +1678,75 @@
       </w:pPr>
       <w:r>
         <w:t>Se mejoró el sistema de selección de mano para que sea consistente con todo el sistema de juego.</w:t>
+      </w:r>
+    </w:p>
+    <w:p>
+      <w:pPr>
+        <w:jc w:val="both"/>
+        <w:rPr>
+          <w:b/>
+        </w:rPr>
+      </w:pPr>
+      <w:r>
+        <w:rPr>
+          <w:b/>
+        </w:rPr>
+        <w:t xml:space="preserve">Semana 28 (15 de </w:t>
+      </w:r>
+      <w:proofErr w:type="gramStart"/>
+      <w:r>
+        <w:rPr>
+          <w:b/>
+        </w:rPr>
+        <w:t>Junio</w:t>
+      </w:r>
+      <w:proofErr w:type="gramEnd"/>
+      <w:r>
+        <w:rPr>
+          <w:b/>
+        </w:rPr>
+        <w:t xml:space="preserve"> del 2026 al 19 de Junio del 2026)</w:t>
+      </w:r>
+    </w:p>
+    <w:p>
+      <w:pPr>
+        <w:jc w:val="both"/>
+      </w:pPr>
+      <w:r>
+        <w:t xml:space="preserve">El 15 de </w:t>
+      </w:r>
+      <w:proofErr w:type="gramStart"/>
+      <w:r>
+        <w:t>Junio</w:t>
+      </w:r>
+      <w:proofErr w:type="gramEnd"/>
+      <w:r>
+        <w:t xml:space="preserve"> comencé a implementar el </w:t>
+      </w:r>
+      <w:r>
+        <w:t xml:space="preserve">funcionamiento del sistema para el </w:t>
+      </w:r>
+      <w:proofErr w:type="spellStart"/>
+      <w:r>
+        <w:t>minijuego</w:t>
+      </w:r>
+      <w:proofErr w:type="spellEnd"/>
+      <w:r>
+        <w:t xml:space="preserve"> 3.</w:t>
+      </w:r>
+      <w:r>
+        <w:t xml:space="preserve"> El 16 de </w:t>
+      </w:r>
+      <w:proofErr w:type="gramStart"/>
+      <w:r>
+        <w:t>Junio</w:t>
+      </w:r>
+      <w:proofErr w:type="gramEnd"/>
+      <w:r>
+        <w:t xml:space="preserve"> se estuvo arreglando la interacción con las interfaces y las manos del paciente.</w:t>
       </w:r>
       <w:bookmarkStart w:id="0" w:name="_GoBack"/>
       <w:bookmarkEnd w:id="0"/>
-    </w:p>
-    <w:p>
-      <w:pPr>
-        <w:jc w:val="both"/>
-        <w:rPr>
-          <w:b/>
-        </w:rPr>
-      </w:pPr>
-      <w:r>
-        <w:rPr>
-          <w:b/>
-        </w:rPr>
-        <w:t>Semana 28 (15 de Junio del 2026 al 19 de Junio del 2026)</w:t>
-      </w:r>
-    </w:p>
-    <w:p>
-      <w:pPr>
-        <w:jc w:val="both"/>
-      </w:pPr>
-      <w:r>
-        <w:t xml:space="preserve">El 15 de Junio comencé a implementar el </w:t>
-      </w:r>
-      <w:r>
-        <w:t>funcionamiento del sistema para el minijuego 3.</w:t>
-      </w:r>
     </w:p>
     <w:sectPr>
       <w:pgSz w:w="11906" w:h="16838"/>
@@ -1319,7 +2448,7 @@
 </file>
 
 <file path=customXml/itemProps1.xml><?xml version="1.0" encoding="utf-8"?>
-<ds:datastoreItem xmlns:ds="http://schemas.openxmlformats.org/officeDocument/2006/customXml" ds:itemID="{A3F058EC-84DA-406D-9F42-441ACCBD60F1}">
+<ds:datastoreItem xmlns:ds="http://schemas.openxmlformats.org/officeDocument/2006/customXml" ds:itemID="{D3FD84C8-6CD9-482B-A7B0-1CE9C44F2697}">
   <ds:schemaRefs>
     <ds:schemaRef ds:uri="http://schemas.openxmlformats.org/officeDocument/2006/bibliography"/>
   </ds:schemaRefs>

</xml_diff>

<commit_message>
Se agrega una calibracion extra para el POV del jugador y que los cambios de escena no sean bruscos
</commit_message>
<xml_diff>
--- a/ReporteActividades.docx
+++ b/ReporteActividades.docx
@@ -621,6 +621,9 @@
       </w:r>
       <w:r>
         <w:t xml:space="preserve"> El 17 de Junio se mejoró el sistema de juego para que se detecte las flexiones y extensiones de mano.</w:t>
+      </w:r>
+      <w:r>
+        <w:t xml:space="preserve"> El 18 de Junio implementé un método de calibración para la posición de la cámara del paciente, este cambio ayuda a que ya no haya saltos de altura entre escenas o cuando se apaga y enciende el visor.</w:t>
       </w:r>
       <w:bookmarkStart w:id="0" w:name="_GoBack"/>
       <w:bookmarkEnd w:id="0"/>
@@ -1325,7 +1328,7 @@
 </file>
 
 <file path=customXml/itemProps1.xml><?xml version="1.0" encoding="utf-8"?>
-<ds:datastoreItem xmlns:ds="http://schemas.openxmlformats.org/officeDocument/2006/customXml" ds:itemID="{12ED2CC4-E615-4364-91F5-C4E0ECE812DC}">
+<ds:datastoreItem xmlns:ds="http://schemas.openxmlformats.org/officeDocument/2006/customXml" ds:itemID="{582EC51E-28DF-40BE-9383-EBBBE76DE39F}">
   <ds:schemaRefs>
     <ds:schemaRef ds:uri="http://schemas.openxmlformats.org/officeDocument/2006/bibliography"/>
   </ds:schemaRefs>

</xml_diff>

<commit_message>
Se mejora la transicion de escenas y se comienza a implementar una varita magica
</commit_message>
<xml_diff>
--- a/ReporteActividades.docx
+++ b/ReporteActividades.docx
@@ -624,6 +624,9 @@
       </w:r>
       <w:r>
         <w:t xml:space="preserve"> El 18 de Junio implementé un método de calibración para la posición de la cámara del paciente, este cambio ayuda a que ya no haya saltos de altura entre escenas o cuando se apaga y enciende el visor.</w:t>
+      </w:r>
+      <w:r>
+        <w:t xml:space="preserve"> El 19 de Junio se mejoró el sistema de cambio de escenas, ya es imperceptible el cambio de escena, ahora se trata de implementar una varita mágica para una mejor experiencia inmersiva.</w:t>
       </w:r>
       <w:bookmarkStart w:id="0" w:name="_GoBack"/>
       <w:bookmarkEnd w:id="0"/>
@@ -1328,7 +1331,7 @@
 </file>
 
 <file path=customXml/itemProps1.xml><?xml version="1.0" encoding="utf-8"?>
-<ds:datastoreItem xmlns:ds="http://schemas.openxmlformats.org/officeDocument/2006/customXml" ds:itemID="{582EC51E-28DF-40BE-9383-EBBBE76DE39F}">
+<ds:datastoreItem xmlns:ds="http://schemas.openxmlformats.org/officeDocument/2006/customXml" ds:itemID="{2B15BA7C-706C-487E-9603-35818BAE16D9}">
   <ds:schemaRefs>
     <ds:schemaRef ds:uri="http://schemas.openxmlformats.org/officeDocument/2006/bibliography"/>
   </ds:schemaRefs>

</xml_diff>

<commit_message>
Se mejora el sistema de retroalimentacion de los minijuegos 2 y 3
</commit_message>
<xml_diff>
--- a/ReporteActividades.docx
+++ b/ReporteActividades.docx
@@ -13,85 +13,322 @@
         <w:rPr>
           <w:b/>
         </w:rPr>
-        <w:t>Semana 1 (09 de Febrero de 2026 a 13 de Febrero de 2026)</w:t>
-      </w:r>
-    </w:p>
-    <w:p>
-      <w:pPr>
-        <w:jc w:val="both"/>
-      </w:pPr>
-      <w:r>
-        <w:t>El primer día se inició con el desarrollo de un Roll A Ball, principalmente para familiarizarse con el entorno de Unity. El mismo día se terminó el tutorial, pero al día siguiente se volvió a iniciar, ya que la versión utilizada</w:t>
-      </w:r>
-      <w:r>
-        <w:t xml:space="preserve"> de Unity no era la solicitada por Yoá</w:t>
-      </w:r>
-      <w:r>
-        <w:t xml:space="preserve">s. </w:t>
-      </w:r>
-      <w:r>
-        <w:t>El 11 de Febrero se comenzó con el desarrollo de la segunda escena, que era casi la primera escena pero se tenían que implementar enemigos, plataformas, vidas, monedas, spawners y plataformas. El 12 de Febrero se implementó la Lava, la cual tenía que cambiar de color cada 5 segundos. El 13 de Febrero se estuvo haciendo en los spawners de enemigos y monedas.</w:t>
-      </w:r>
-    </w:p>
-    <w:p>
-      <w:pPr>
-        <w:jc w:val="both"/>
-        <w:rPr>
-          <w:b/>
-        </w:rPr>
-      </w:pPr>
-      <w:r>
-        <w:rPr>
-          <w:b/>
-        </w:rPr>
-        <w:t>Semana 2 (16 de Febrero de 2026 a 20 de Febrero de 2026)</w:t>
-      </w:r>
-    </w:p>
-    <w:p>
-      <w:pPr>
-        <w:jc w:val="both"/>
-      </w:pPr>
-      <w:r>
-        <w:t>El 16 de Febrero se comenzó con la implementación de las escenas, los menús de pausa y cambios de escenas. Se completó el desarrollo de Roll A Ball. El 17 de Febrero Yoás le dio visto bueno al demo y pasé a familiarizarme con el e</w:t>
-      </w:r>
-      <w:r>
-        <w:t>ntorno de Meta Quest 3S. Si bien el 17 y 18 de Febrero estuve trabajando en un demo para saber como funcionan los controles, por problemas de hardware en el equipo donde estaba trabajando en el LANR, no podía probar lo que había hecho. El 19 de Febrero comencé a trabajar en el Anexo, ya que había un equipo disponible con una tarjeta gráfica compatible con el software de Meta Horizon Link, después de configurar el entorno, finalmente pude probar lo que había desarrollado los días pasados. El 19 de Febrero comencé a experimentar con los Building Blocks de Hand Tracking, algo necesario para evitar la necesidad de usar los controles de los lentes, solo interacción con las manos.</w:t>
-      </w:r>
-    </w:p>
-    <w:p>
-      <w:pPr>
-        <w:jc w:val="both"/>
-        <w:rPr>
-          <w:b/>
-        </w:rPr>
-      </w:pPr>
-      <w:r>
-        <w:rPr>
-          <w:b/>
-        </w:rPr>
-        <w:t>Semana 3 (23 de Febrero de 2026 a 27 de Febrero de 2026)</w:t>
-      </w:r>
-    </w:p>
-    <w:p>
-      <w:pPr>
-        <w:jc w:val="both"/>
-      </w:pPr>
-      <w:r>
-        <w:t>Lesly, una compañera que trabajaba en el Anexo iba a ocupar la computadora donde iba a estar trabajando, así que no asistí hasta el Jueves 26 de Febrero. Los días restantes de la semana me dediqué a terminar el demo y prácticar el cambio de escenas con interacción en UI haciendo uso de Hand Tracking.</w:t>
-      </w:r>
-    </w:p>
-    <w:p>
-      <w:pPr>
-        <w:jc w:val="both"/>
-        <w:rPr>
-          <w:b/>
-        </w:rPr>
-      </w:pPr>
-      <w:r>
-        <w:rPr>
-          <w:b/>
-        </w:rPr>
-        <w:t xml:space="preserve">Semana 4 (02 de Marzo del 2026 a </w:t>
+        <w:t xml:space="preserve">Semana 1 (09 de </w:t>
+      </w:r>
+      <w:proofErr w:type="gramStart"/>
+      <w:r>
+        <w:rPr>
+          <w:b/>
+        </w:rPr>
+        <w:t>Febrero</w:t>
+      </w:r>
+      <w:proofErr w:type="gramEnd"/>
+      <w:r>
+        <w:rPr>
+          <w:b/>
+        </w:rPr>
+        <w:t xml:space="preserve"> de 2026 a 13 de Febrero de 2026)</w:t>
+      </w:r>
+    </w:p>
+    <w:p>
+      <w:pPr>
+        <w:jc w:val="both"/>
+      </w:pPr>
+      <w:r>
+        <w:t xml:space="preserve">El primer día se inició con el desarrollo de un Roll A </w:t>
+      </w:r>
+      <w:proofErr w:type="spellStart"/>
+      <w:r>
+        <w:t>Ball</w:t>
+      </w:r>
+      <w:proofErr w:type="spellEnd"/>
+      <w:r>
+        <w:t xml:space="preserve">, principalmente para familiarizarse con el entorno de </w:t>
+      </w:r>
+      <w:proofErr w:type="spellStart"/>
+      <w:r>
+        <w:t>Unity</w:t>
+      </w:r>
+      <w:proofErr w:type="spellEnd"/>
+      <w:r>
+        <w:t>. El mismo día se terminó el tutorial, pero al día siguiente se volvió a iniciar, ya que la versión utilizada</w:t>
+      </w:r>
+      <w:r>
+        <w:t xml:space="preserve"> de </w:t>
+      </w:r>
+      <w:proofErr w:type="spellStart"/>
+      <w:r>
+        <w:t>Unity</w:t>
+      </w:r>
+      <w:proofErr w:type="spellEnd"/>
+      <w:r>
+        <w:t xml:space="preserve"> no era la solicitada por </w:t>
+      </w:r>
+      <w:proofErr w:type="spellStart"/>
+      <w:r>
+        <w:t>Yoá</w:t>
+      </w:r>
+      <w:r>
+        <w:t>s</w:t>
+      </w:r>
+      <w:proofErr w:type="spellEnd"/>
+      <w:r>
+        <w:t xml:space="preserve">. </w:t>
+      </w:r>
+      <w:r>
+        <w:t xml:space="preserve">El 11 de </w:t>
+      </w:r>
+      <w:proofErr w:type="gramStart"/>
+      <w:r>
+        <w:t>Febrero</w:t>
+      </w:r>
+      <w:proofErr w:type="gramEnd"/>
+      <w:r>
+        <w:t xml:space="preserve"> se comenzó con el desarrollo de la segunda escena, que era casi la primera escena pero se tenían que implementar enemigos, plataformas, vidas, monedas, </w:t>
+      </w:r>
+      <w:proofErr w:type="spellStart"/>
+      <w:r>
+        <w:t>spawners</w:t>
+      </w:r>
+      <w:proofErr w:type="spellEnd"/>
+      <w:r>
+        <w:t xml:space="preserve"> y plataformas. El 12 de </w:t>
+      </w:r>
+      <w:proofErr w:type="gramStart"/>
+      <w:r>
+        <w:t>Febrero</w:t>
+      </w:r>
+      <w:proofErr w:type="gramEnd"/>
+      <w:r>
+        <w:t xml:space="preserve"> se implementó la Lava, la cual tenía que cambiar de color cada 5 segundos. El 13 de </w:t>
+      </w:r>
+      <w:proofErr w:type="gramStart"/>
+      <w:r>
+        <w:t>Febrero</w:t>
+      </w:r>
+      <w:proofErr w:type="gramEnd"/>
+      <w:r>
+        <w:t xml:space="preserve"> se estuvo haciendo en los </w:t>
+      </w:r>
+      <w:proofErr w:type="spellStart"/>
+      <w:r>
+        <w:t>spawners</w:t>
+      </w:r>
+      <w:proofErr w:type="spellEnd"/>
+      <w:r>
+        <w:t xml:space="preserve"> de enemigos y monedas.</w:t>
+      </w:r>
+    </w:p>
+    <w:p>
+      <w:pPr>
+        <w:jc w:val="both"/>
+        <w:rPr>
+          <w:b/>
+        </w:rPr>
+      </w:pPr>
+      <w:r>
+        <w:rPr>
+          <w:b/>
+        </w:rPr>
+        <w:t xml:space="preserve">Semana 2 (16 de </w:t>
+      </w:r>
+      <w:proofErr w:type="gramStart"/>
+      <w:r>
+        <w:rPr>
+          <w:b/>
+        </w:rPr>
+        <w:t>Febrero</w:t>
+      </w:r>
+      <w:proofErr w:type="gramEnd"/>
+      <w:r>
+        <w:rPr>
+          <w:b/>
+        </w:rPr>
+        <w:t xml:space="preserve"> de 2026 a 20 de Febrero de 2026)</w:t>
+      </w:r>
+    </w:p>
+    <w:p>
+      <w:pPr>
+        <w:jc w:val="both"/>
+      </w:pPr>
+      <w:r>
+        <w:t xml:space="preserve">El 16 de </w:t>
+      </w:r>
+      <w:proofErr w:type="gramStart"/>
+      <w:r>
+        <w:t>Febrero</w:t>
+      </w:r>
+      <w:proofErr w:type="gramEnd"/>
+      <w:r>
+        <w:t xml:space="preserve"> se comenzó con la implementación de las escenas, los menús de pausa y cambios de escenas. Se completó el desarrollo de Roll A </w:t>
+      </w:r>
+      <w:proofErr w:type="spellStart"/>
+      <w:r>
+        <w:t>Ball</w:t>
+      </w:r>
+      <w:proofErr w:type="spellEnd"/>
+      <w:r>
+        <w:t xml:space="preserve">. El 17 de </w:t>
+      </w:r>
+      <w:proofErr w:type="gramStart"/>
+      <w:r>
+        <w:t>Febrero</w:t>
+      </w:r>
+      <w:proofErr w:type="gramEnd"/>
+      <w:r>
+        <w:t xml:space="preserve"> </w:t>
+      </w:r>
+      <w:proofErr w:type="spellStart"/>
+      <w:r>
+        <w:t>Yoás</w:t>
+      </w:r>
+      <w:proofErr w:type="spellEnd"/>
+      <w:r>
+        <w:t xml:space="preserve"> le dio visto bueno al demo y pasé a familiarizarme con el e</w:t>
+      </w:r>
+      <w:r>
+        <w:t xml:space="preserve">ntorno de Meta </w:t>
+      </w:r>
+      <w:proofErr w:type="spellStart"/>
+      <w:r>
+        <w:t>Quest</w:t>
+      </w:r>
+      <w:proofErr w:type="spellEnd"/>
+      <w:r>
+        <w:t xml:space="preserve"> 3S. Si bien el 17 y 18 de </w:t>
+      </w:r>
+      <w:proofErr w:type="gramStart"/>
+      <w:r>
+        <w:t>Febrero</w:t>
+      </w:r>
+      <w:proofErr w:type="gramEnd"/>
+      <w:r>
+        <w:t xml:space="preserve"> estuve trabajando en un demo para saber </w:t>
+      </w:r>
+      <w:proofErr w:type="spellStart"/>
+      <w:r>
+        <w:t>como</w:t>
+      </w:r>
+      <w:proofErr w:type="spellEnd"/>
+      <w:r>
+        <w:t xml:space="preserve"> funcionan los controles, por problemas de hardware en el equipo donde estaba trabajando en el LANR, no podía probar lo que había hecho. El 19 de </w:t>
+      </w:r>
+      <w:proofErr w:type="gramStart"/>
+      <w:r>
+        <w:t>Febrero</w:t>
+      </w:r>
+      <w:proofErr w:type="gramEnd"/>
+      <w:r>
+        <w:t xml:space="preserve"> comencé a trabajar en el Anexo, ya que había un equipo disponible con una tarjeta gráfica compatible con el software de Meta </w:t>
+      </w:r>
+      <w:proofErr w:type="spellStart"/>
+      <w:r>
+        <w:t>Horizon</w:t>
+      </w:r>
+      <w:proofErr w:type="spellEnd"/>
+      <w:r>
+        <w:t xml:space="preserve"> Link, después de configurar el entorno, finalmente pude probar lo que había desarrollado los días pasados. El 19 de </w:t>
+      </w:r>
+      <w:proofErr w:type="gramStart"/>
+      <w:r>
+        <w:t>Febrero</w:t>
+      </w:r>
+      <w:proofErr w:type="gramEnd"/>
+      <w:r>
+        <w:t xml:space="preserve"> comencé a experimentar con los </w:t>
+      </w:r>
+      <w:proofErr w:type="spellStart"/>
+      <w:r>
+        <w:t>Building</w:t>
+      </w:r>
+      <w:proofErr w:type="spellEnd"/>
+      <w:r>
+        <w:t xml:space="preserve"> Blocks de Hand Tracking, algo necesario para evitar la necesidad de usar los controles de los lentes, solo interacción con las manos.</w:t>
+      </w:r>
+    </w:p>
+    <w:p>
+      <w:pPr>
+        <w:jc w:val="both"/>
+        <w:rPr>
+          <w:b/>
+        </w:rPr>
+      </w:pPr>
+      <w:r>
+        <w:rPr>
+          <w:b/>
+        </w:rPr>
+        <w:t xml:space="preserve">Semana 3 (23 de </w:t>
+      </w:r>
+      <w:proofErr w:type="gramStart"/>
+      <w:r>
+        <w:rPr>
+          <w:b/>
+        </w:rPr>
+        <w:t>Febrero</w:t>
+      </w:r>
+      <w:proofErr w:type="gramEnd"/>
+      <w:r>
+        <w:rPr>
+          <w:b/>
+        </w:rPr>
+        <w:t xml:space="preserve"> de 2026 a 27 de Febrero de 2026)</w:t>
+      </w:r>
+    </w:p>
+    <w:p>
+      <w:pPr>
+        <w:jc w:val="both"/>
+      </w:pPr>
+      <w:proofErr w:type="spellStart"/>
+      <w:r>
+        <w:t>Lesly</w:t>
+      </w:r>
+      <w:proofErr w:type="spellEnd"/>
+      <w:r>
+        <w:t xml:space="preserve">, una compañera que trabajaba en el Anexo iba a ocupar la computadora donde iba a estar trabajando, así que no asistí hasta el </w:t>
+      </w:r>
+      <w:proofErr w:type="gramStart"/>
+      <w:r>
+        <w:t>Jueves</w:t>
+      </w:r>
+      <w:proofErr w:type="gramEnd"/>
+      <w:r>
+        <w:t xml:space="preserve"> 26 de Febrero. Los días restantes de la semana me dediqué a terminar el demo y </w:t>
+      </w:r>
+      <w:proofErr w:type="spellStart"/>
+      <w:r>
+        <w:t>prácticar</w:t>
+      </w:r>
+      <w:proofErr w:type="spellEnd"/>
+      <w:r>
+        <w:t xml:space="preserve"> el cambio de escenas con interacción en UI haciendo uso de Hand Tracking.</w:t>
+      </w:r>
+    </w:p>
+    <w:p>
+      <w:pPr>
+        <w:jc w:val="both"/>
+        <w:rPr>
+          <w:b/>
+        </w:rPr>
+      </w:pPr>
+      <w:r>
+        <w:rPr>
+          <w:b/>
+        </w:rPr>
+        <w:t xml:space="preserve">Semana 4 (02 de </w:t>
+      </w:r>
+      <w:proofErr w:type="gramStart"/>
+      <w:r>
+        <w:rPr>
+          <w:b/>
+        </w:rPr>
+        <w:t>Marzo</w:t>
+      </w:r>
+      <w:proofErr w:type="gramEnd"/>
+      <w:r>
+        <w:rPr>
+          <w:b/>
+        </w:rPr>
+        <w:t xml:space="preserve"> del 2026 a </w:t>
       </w:r>
       <w:r>
         <w:rPr>
@@ -105,35 +342,153 @@
         <w:jc w:val="both"/>
       </w:pPr>
       <w:r>
-        <w:t>El 02 de Marzo, Yoás revisó los avances de la semana pasada y me platicó la idea que tenía para la implementación del proyecto, un juego espacial. El 04 de Marzo, después de estar viendo ejemplos de como mover un objeto con hand tracking, Yoás me comentó que la idea era que el paciente o jugador disparen desde sus manos para naves enemigas. El 05 y 06 de Febrero estuve trabajando para que cuando se hiciera la acción de “Pinch”, se disparen diferentes tipos de disparos, también estuve trabajando en los comportamientos de los enemigos, un medidor de supinación, flexión, extensión y pronación.</w:t>
-      </w:r>
-    </w:p>
-    <w:p>
-      <w:pPr>
-        <w:jc w:val="both"/>
-        <w:rPr>
-          <w:b/>
-        </w:rPr>
-      </w:pPr>
-      <w:r>
-        <w:rPr>
-          <w:b/>
-        </w:rPr>
-        <w:t>Semana 5 (09 de Marzo del 2026 a 13 de Febrero de 2026)</w:t>
-      </w:r>
-    </w:p>
-    <w:p>
-      <w:pPr>
-        <w:jc w:val="both"/>
-      </w:pPr>
-      <w:r>
-        <w:t xml:space="preserve">Del 09 de Marzo al 12 de Marzo estuve ajustando el comportamiento del contador de Puntuación, el 12 de Marzo Yoás asistió al Anexo para revisar avances, me comentó que el movimiento de “Pinch” podía ser algo </w:t>
+        <w:t xml:space="preserve">El 02 de </w:t>
+      </w:r>
+      <w:proofErr w:type="gramStart"/>
+      <w:r>
+        <w:t>Marzo</w:t>
+      </w:r>
+      <w:proofErr w:type="gramEnd"/>
+      <w:r>
+        <w:t xml:space="preserve">, </w:t>
+      </w:r>
+      <w:proofErr w:type="spellStart"/>
+      <w:r>
+        <w:t>Yoás</w:t>
+      </w:r>
+      <w:proofErr w:type="spellEnd"/>
+      <w:r>
+        <w:t xml:space="preserve"> revisó los avances de la semana pasada y me platicó la idea que tenía para la implementación del proyecto, un juego espacial. El 04 de </w:t>
+      </w:r>
+      <w:proofErr w:type="gramStart"/>
+      <w:r>
+        <w:t>Marzo</w:t>
+      </w:r>
+      <w:proofErr w:type="gramEnd"/>
+      <w:r>
+        <w:t xml:space="preserve">, después de estar viendo ejemplos de </w:t>
+      </w:r>
+      <w:proofErr w:type="spellStart"/>
+      <w:r>
+        <w:t>como</w:t>
+      </w:r>
+      <w:proofErr w:type="spellEnd"/>
+      <w:r>
+        <w:t xml:space="preserve"> mover un objeto con </w:t>
+      </w:r>
+      <w:proofErr w:type="spellStart"/>
+      <w:r>
+        <w:t>hand</w:t>
+      </w:r>
+      <w:proofErr w:type="spellEnd"/>
+      <w:r>
+        <w:t xml:space="preserve"> tracking, </w:t>
+      </w:r>
+      <w:proofErr w:type="spellStart"/>
+      <w:r>
+        <w:t>Yoás</w:t>
+      </w:r>
+      <w:proofErr w:type="spellEnd"/>
+      <w:r>
+        <w:t xml:space="preserve"> me comentó que la idea era que el paciente o jugador disparen desde sus manos para naves enemigas. El 05 y 06 de </w:t>
+      </w:r>
+      <w:proofErr w:type="gramStart"/>
+      <w:r>
+        <w:t>Febrero</w:t>
+      </w:r>
+      <w:proofErr w:type="gramEnd"/>
+      <w:r>
+        <w:t xml:space="preserve"> estuve trabajando para que cuando se hiciera la acción de “</w:t>
+      </w:r>
+      <w:proofErr w:type="spellStart"/>
+      <w:r>
+        <w:t>Pinch</w:t>
+      </w:r>
+      <w:proofErr w:type="spellEnd"/>
+      <w:r>
+        <w:t>”, se disparen diferentes tipos de disparos, también estuve trabajando en los comportamientos de los enemigos, un medidor de supinación, flexión, extensión y pronación.</w:t>
+      </w:r>
+    </w:p>
+    <w:p>
+      <w:pPr>
+        <w:jc w:val="both"/>
+        <w:rPr>
+          <w:b/>
+        </w:rPr>
+      </w:pPr>
+      <w:r>
+        <w:rPr>
+          <w:b/>
+        </w:rPr>
+        <w:t xml:space="preserve">Semana 5 (09 de </w:t>
+      </w:r>
+      <w:proofErr w:type="gramStart"/>
+      <w:r>
+        <w:rPr>
+          <w:b/>
+        </w:rPr>
+        <w:t>Marzo</w:t>
+      </w:r>
+      <w:proofErr w:type="gramEnd"/>
+      <w:r>
+        <w:rPr>
+          <w:b/>
+        </w:rPr>
+        <w:t xml:space="preserve"> del 2026 a 13 de Febrero de 2026)</w:t>
+      </w:r>
+    </w:p>
+    <w:p>
+      <w:pPr>
+        <w:jc w:val="both"/>
+      </w:pPr>
+      <w:r>
+        <w:t xml:space="preserve">Del 09 de </w:t>
+      </w:r>
+      <w:proofErr w:type="gramStart"/>
+      <w:r>
+        <w:t>Marzo</w:t>
+      </w:r>
+      <w:proofErr w:type="gramEnd"/>
+      <w:r>
+        <w:t xml:space="preserve"> al 12 de Marzo estuve ajustando el comportamiento del contador de Puntuación, el 12 de Marzo </w:t>
+      </w:r>
+      <w:proofErr w:type="spellStart"/>
+      <w:r>
+        <w:t>Yoás</w:t>
+      </w:r>
+      <w:proofErr w:type="spellEnd"/>
+      <w:r>
+        <w:t xml:space="preserve"> asistió al Anexo para revisar avances, me comentó que el movimiento de “</w:t>
+      </w:r>
+      <w:proofErr w:type="spellStart"/>
+      <w:r>
+        <w:t>Pinch</w:t>
+      </w:r>
+      <w:proofErr w:type="spellEnd"/>
+      <w:r>
+        <w:t xml:space="preserve">” podía ser algo </w:t>
       </w:r>
       <w:r>
         <w:t>complicado</w:t>
       </w:r>
       <w:r>
-        <w:t xml:space="preserve"> para los pacientes, así que el jugador ya no tendría que disparar, solo con tocar a los enemigos. El 13 de Marzo me dediqué a que los enemigos se detengan a una distancia del jugador para que este los toque con las manos de hand tracking, pero que desaparezcan si no lo hace en un tiempo determinado.</w:t>
+        <w:t xml:space="preserve"> para los pacientes, así que el jugador ya no tendría que disparar, solo con tocar a los enemigos. El 13 de </w:t>
+      </w:r>
+      <w:proofErr w:type="gramStart"/>
+      <w:r>
+        <w:t>Marzo</w:t>
+      </w:r>
+      <w:proofErr w:type="gramEnd"/>
+      <w:r>
+        <w:t xml:space="preserve"> me dediqué a que los enemigos se detengan a una distancia del jugador para que este los toque con las manos de </w:t>
+      </w:r>
+      <w:proofErr w:type="spellStart"/>
+      <w:r>
+        <w:t>hand</w:t>
+      </w:r>
+      <w:proofErr w:type="spellEnd"/>
+      <w:r>
+        <w:t xml:space="preserve"> tracking, pero que desaparezcan si no lo hace en un tiempo determinado.</w:t>
       </w:r>
       <w:r>
         <w:t xml:space="preserve"> </w:t>
@@ -150,15 +505,37 @@
         <w:rPr>
           <w:b/>
         </w:rPr>
-        <w:t>Semana 6 (17 de Marzo del 2026 a 20 de Marzo del 2026)</w:t>
-      </w:r>
-    </w:p>
-    <w:p>
-      <w:pPr>
-        <w:jc w:val="both"/>
-      </w:pPr>
-      <w:r>
-        <w:t xml:space="preserve">El 17 de Marzo se comenzó con la implementación de un sistema de cuenta regresiva para el comienzo de las rondas de enemigos; la idea es hacer que se inicie con una cuenta regresiva </w:t>
+        <w:t xml:space="preserve">Semana 6 (17 de </w:t>
+      </w:r>
+      <w:proofErr w:type="gramStart"/>
+      <w:r>
+        <w:rPr>
+          <w:b/>
+        </w:rPr>
+        <w:t>Marzo</w:t>
+      </w:r>
+      <w:proofErr w:type="gramEnd"/>
+      <w:r>
+        <w:rPr>
+          <w:b/>
+        </w:rPr>
+        <w:t xml:space="preserve"> del 2026 a 20 de Marzo del 2026)</w:t>
+      </w:r>
+    </w:p>
+    <w:p>
+      <w:pPr>
+        <w:jc w:val="both"/>
+      </w:pPr>
+      <w:r>
+        <w:t xml:space="preserve">El 17 de </w:t>
+      </w:r>
+      <w:proofErr w:type="gramStart"/>
+      <w:r>
+        <w:t>Marzo</w:t>
+      </w:r>
+      <w:proofErr w:type="gramEnd"/>
+      <w:r>
+        <w:t xml:space="preserve"> se comenzó con la implementación de un sistema de cuenta regresiva para el comienzo de las rondas de enemigos; la idea es hacer que se inicie con una cuenta regresiva </w:t>
       </w:r>
       <w:r>
         <w:lastRenderedPageBreak/>
@@ -174,10 +551,42 @@
         <w:t xml:space="preserve">. </w:t>
       </w:r>
       <w:r>
-        <w:t>El 18 de Marzo me encargué de juntar las escenas y completar la implementación del panel de “Continuar”</w:t>
-      </w:r>
-      <w:r>
-        <w:t>. El 19 de Marzo mejoré el comportamiento y los Spawners de los enemigos. El 20 de Marzo,</w:t>
+        <w:t xml:space="preserve">El 18 de </w:t>
+      </w:r>
+      <w:proofErr w:type="gramStart"/>
+      <w:r>
+        <w:t>Marzo</w:t>
+      </w:r>
+      <w:proofErr w:type="gramEnd"/>
+      <w:r>
+        <w:t xml:space="preserve"> me encargué de juntar las escenas y completar la implementación del panel de “Continuar”</w:t>
+      </w:r>
+      <w:r>
+        <w:t xml:space="preserve">. El 19 de </w:t>
+      </w:r>
+      <w:proofErr w:type="gramStart"/>
+      <w:r>
+        <w:t>Marzo</w:t>
+      </w:r>
+      <w:proofErr w:type="gramEnd"/>
+      <w:r>
+        <w:t xml:space="preserve"> mejoré el comportamiento y los </w:t>
+      </w:r>
+      <w:proofErr w:type="spellStart"/>
+      <w:r>
+        <w:t>Spawners</w:t>
+      </w:r>
+      <w:proofErr w:type="spellEnd"/>
+      <w:r>
+        <w:t xml:space="preserve"> de los enemigos. El 20 de </w:t>
+      </w:r>
+      <w:proofErr w:type="gramStart"/>
+      <w:r>
+        <w:t>Marzo</w:t>
+      </w:r>
+      <w:proofErr w:type="gramEnd"/>
+      <w:r>
+        <w:t>,</w:t>
       </w:r>
       <w:r>
         <w:t xml:space="preserve"> comencé a implementar diferentes niveles en caso de que el paciente necesite hacer ejercicios específicos.</w:t>
@@ -194,70 +603,210 @@
         <w:rPr>
           <w:b/>
         </w:rPr>
-        <w:t>Semana 7 (23 de Marzo del 2026 a 28 de Marzo del 2026)</w:t>
-      </w:r>
-    </w:p>
-    <w:p>
-      <w:pPr>
-        <w:jc w:val="both"/>
-      </w:pPr>
-      <w:r>
-        <w:t>El 23 de Marzo, por indicaciones de Yoás, se cambió el enfoque de los enemigos. Estos aparecerán y rodearán al Jugador como si estuvieran en un domo o semicírculo; dicho semicírculo variará su tamaño en base a la distancia máxima que el Jugador pueda estirar su brazo sano. Esa lógica también se implementó.</w:t>
-      </w:r>
-      <w:r>
-        <w:t xml:space="preserve"> El 24 de Marzo me dediqué a hacer la solicitud de tesis.</w:t>
-      </w:r>
-      <w:r>
-        <w:t xml:space="preserve"> El 25 de Marzo, Yoás revisó los avances, donde debo cambiar la orientación del domo y agregar más parámetros a ser modificados por el terapeuta, así como un flujo de trabajo.</w:t>
-      </w:r>
-      <w:r>
-        <w:t xml:space="preserve"> 26 y 27 de Marzo estuve configurando la nueva orientación del domo y el comportamiento de los enemigos.</w:t>
-      </w:r>
-      <w:r>
-        <w:t xml:space="preserve"> El 28 de Marzo conecté las escenas.</w:t>
-      </w:r>
-    </w:p>
-    <w:p>
-      <w:pPr>
-        <w:jc w:val="both"/>
-        <w:rPr>
-          <w:b/>
-        </w:rPr>
-      </w:pPr>
-      <w:r>
-        <w:rPr>
-          <w:b/>
-        </w:rPr>
-        <w:t>Semana 8 (06 de Abril del 2026 a 10 de Abril del 2026)</w:t>
-      </w:r>
-    </w:p>
-    <w:p>
-      <w:pPr>
-        <w:jc w:val="both"/>
-      </w:pPr>
-      <w:r>
-        <w:t xml:space="preserve">El 06 de Abril comencé con la implementación </w:t>
-      </w:r>
-      <w:r>
-        <w:t>de la selección de los enemigos; Yoas me encomendó hacer un modo de realidad mixta.</w:t>
-      </w:r>
-      <w:r>
-        <w:t xml:space="preserve"> 07 de Abril detecté que hay problemas con el cable de conexión, debo buscar un USB 3.0.</w:t>
+        <w:t xml:space="preserve">Semana 7 (23 de </w:t>
+      </w:r>
+      <w:proofErr w:type="gramStart"/>
+      <w:r>
+        <w:rPr>
+          <w:b/>
+        </w:rPr>
+        <w:t>Marzo</w:t>
+      </w:r>
+      <w:proofErr w:type="gramEnd"/>
+      <w:r>
+        <w:rPr>
+          <w:b/>
+        </w:rPr>
+        <w:t xml:space="preserve"> del 2026 a 28 de Marzo del 2026)</w:t>
+      </w:r>
+    </w:p>
+    <w:p>
+      <w:pPr>
+        <w:jc w:val="both"/>
+      </w:pPr>
+      <w:r>
+        <w:t xml:space="preserve">El 23 de </w:t>
+      </w:r>
+      <w:proofErr w:type="gramStart"/>
+      <w:r>
+        <w:t>Marzo</w:t>
+      </w:r>
+      <w:proofErr w:type="gramEnd"/>
+      <w:r>
+        <w:t xml:space="preserve">, por indicaciones de </w:t>
+      </w:r>
+      <w:proofErr w:type="spellStart"/>
+      <w:r>
+        <w:t>Yoás</w:t>
+      </w:r>
+      <w:proofErr w:type="spellEnd"/>
+      <w:r>
+        <w:t>, se cambió el enfoque de los enemigos. Estos aparecerán y rodearán al Jugador como si estuvieran en un domo o semicírculo; dicho semicírculo variará su tamaño en base a la distancia máxima que el Jugador pueda estirar su brazo sano. Esa lógica también se implementó.</w:t>
+      </w:r>
+      <w:r>
+        <w:t xml:space="preserve"> El 24 de </w:t>
+      </w:r>
+      <w:proofErr w:type="gramStart"/>
+      <w:r>
+        <w:t>Marzo</w:t>
+      </w:r>
+      <w:proofErr w:type="gramEnd"/>
+      <w:r>
+        <w:t xml:space="preserve"> me dediqué a hacer la solicitud de tesis.</w:t>
+      </w:r>
+      <w:r>
+        <w:t xml:space="preserve"> El 25 de </w:t>
+      </w:r>
+      <w:proofErr w:type="gramStart"/>
+      <w:r>
+        <w:t>Marzo</w:t>
+      </w:r>
+      <w:proofErr w:type="gramEnd"/>
+      <w:r>
+        <w:t xml:space="preserve">, </w:t>
+      </w:r>
+      <w:proofErr w:type="spellStart"/>
+      <w:r>
+        <w:t>Yoás</w:t>
+      </w:r>
+      <w:proofErr w:type="spellEnd"/>
+      <w:r>
+        <w:t xml:space="preserve"> revisó los avances, donde debo cambiar la orientación del domo y agregar más parámetros a ser modificados por el terapeuta, así como un flujo de trabajo.</w:t>
+      </w:r>
+      <w:r>
+        <w:t xml:space="preserve"> 26 y 27 de </w:t>
+      </w:r>
+      <w:proofErr w:type="gramStart"/>
+      <w:r>
+        <w:t>Marzo</w:t>
+      </w:r>
+      <w:proofErr w:type="gramEnd"/>
+      <w:r>
+        <w:t xml:space="preserve"> estuve configurando la nueva orientación del domo y el comportamiento de los enemigos.</w:t>
+      </w:r>
+      <w:r>
+        <w:t xml:space="preserve"> El 28 de </w:t>
+      </w:r>
+      <w:proofErr w:type="gramStart"/>
+      <w:r>
+        <w:t>Marzo</w:t>
+      </w:r>
+      <w:proofErr w:type="gramEnd"/>
+      <w:r>
+        <w:t xml:space="preserve"> conecté las escenas.</w:t>
+      </w:r>
+    </w:p>
+    <w:p>
+      <w:pPr>
+        <w:jc w:val="both"/>
+        <w:rPr>
+          <w:b/>
+        </w:rPr>
+      </w:pPr>
+      <w:r>
+        <w:rPr>
+          <w:b/>
+        </w:rPr>
+        <w:t xml:space="preserve">Semana 8 (06 de </w:t>
+      </w:r>
+      <w:proofErr w:type="gramStart"/>
+      <w:r>
+        <w:rPr>
+          <w:b/>
+        </w:rPr>
+        <w:t>Abril</w:t>
+      </w:r>
+      <w:proofErr w:type="gramEnd"/>
+      <w:r>
+        <w:rPr>
+          <w:b/>
+        </w:rPr>
+        <w:t xml:space="preserve"> del 2026 a 10 de Abril del 2026)</w:t>
+      </w:r>
+    </w:p>
+    <w:p>
+      <w:pPr>
+        <w:jc w:val="both"/>
+      </w:pPr>
+      <w:r>
+        <w:t xml:space="preserve">El 06 de </w:t>
+      </w:r>
+      <w:proofErr w:type="gramStart"/>
+      <w:r>
+        <w:t>Abril</w:t>
+      </w:r>
+      <w:proofErr w:type="gramEnd"/>
+      <w:r>
+        <w:t xml:space="preserve"> comencé con la implementación </w:t>
+      </w:r>
+      <w:r>
+        <w:t xml:space="preserve">de la selección de los enemigos; </w:t>
+      </w:r>
+      <w:proofErr w:type="spellStart"/>
+      <w:r>
+        <w:t>Yoas</w:t>
+      </w:r>
+      <w:proofErr w:type="spellEnd"/>
+      <w:r>
+        <w:t xml:space="preserve"> me encomendó hacer un modo de realidad mixta.</w:t>
+      </w:r>
+      <w:r>
+        <w:t xml:space="preserve"> 07 de </w:t>
+      </w:r>
+      <w:proofErr w:type="gramStart"/>
+      <w:r>
+        <w:t>Abril</w:t>
+      </w:r>
+      <w:proofErr w:type="gramEnd"/>
+      <w:r>
+        <w:t xml:space="preserve"> detecté que hay problemas con el cable de conexión, debo buscar un USB 3.0.</w:t>
       </w:r>
       <w:r>
         <w:t xml:space="preserve"> </w:t>
       </w:r>
       <w:r>
-        <w:t xml:space="preserve">El 08 de Abril, después de registrar el Meta Quest 3S a la cuenta de desarrollador y arreglar un </w:t>
+        <w:t xml:space="preserve">El 08 de </w:t>
+      </w:r>
+      <w:proofErr w:type="gramStart"/>
+      <w:r>
+        <w:t>Abril</w:t>
+      </w:r>
+      <w:proofErr w:type="gramEnd"/>
+      <w:r>
+        <w:t xml:space="preserve">, después de registrar el Meta </w:t>
+      </w:r>
+      <w:proofErr w:type="spellStart"/>
+      <w:r>
+        <w:t>Quest</w:t>
+      </w:r>
+      <w:proofErr w:type="spellEnd"/>
+      <w:r>
+        <w:t xml:space="preserve"> 3S a la cuenta de desarrollador y arreglar un </w:t>
       </w:r>
       <w:r>
         <w:t>problema</w:t>
       </w:r>
       <w:r>
-        <w:t xml:space="preserve"> con el Canvas, se pudo conectar y completar la Realidad Mixta.</w:t>
-      </w:r>
-      <w:r>
-        <w:t xml:space="preserve"> El 10 de Abril se continuó con la implementación del seleccionador de Enemigos, ahora falta esperar por los modelos.</w:t>
+        <w:t xml:space="preserve"> con el </w:t>
+      </w:r>
+      <w:proofErr w:type="spellStart"/>
+      <w:r>
+        <w:t>Canvas</w:t>
+      </w:r>
+      <w:proofErr w:type="spellEnd"/>
+      <w:r>
+        <w:t>, se pudo conectar y completar la Realidad Mixta.</w:t>
+      </w:r>
+      <w:r>
+        <w:t xml:space="preserve"> El 10 de </w:t>
+      </w:r>
+      <w:proofErr w:type="gramStart"/>
+      <w:r>
+        <w:t>Abril</w:t>
+      </w:r>
+      <w:proofErr w:type="gramEnd"/>
+      <w:r>
+        <w:t xml:space="preserve"> se continuó con la implementación del seleccionador de Enemigos, ahora falta esperar por los modelos.</w:t>
       </w:r>
     </w:p>
     <w:p>
@@ -277,7 +826,21 @@
         <w:rPr>
           <w:b/>
         </w:rPr>
-        <w:t>na 9 (13 de Abril del 2026 al 17</w:t>
+        <w:t xml:space="preserve">na 9 (13 de </w:t>
+      </w:r>
+      <w:proofErr w:type="gramStart"/>
+      <w:r>
+        <w:rPr>
+          <w:b/>
+        </w:rPr>
+        <w:t>Abril</w:t>
+      </w:r>
+      <w:proofErr w:type="gramEnd"/>
+      <w:r>
+        <w:rPr>
+          <w:b/>
+        </w:rPr>
+        <w:t xml:space="preserve"> del 2026 al 17</w:t>
       </w:r>
       <w:r>
         <w:rPr>
@@ -291,50 +854,181 @@
         <w:jc w:val="both"/>
       </w:pPr>
       <w:r>
-        <w:t>El 13 de Abril, comencé a trabajar con los modelos de las naves; debo configurarlos para una actividad que se tendrá por parte de Amerike.</w:t>
-      </w:r>
-      <w:r>
-        <w:t xml:space="preserve"> El 14 de Abril terminé de configurar los modelos y limpié un poco el código y los Assets para la muestra del día siguiente.</w:t>
-      </w:r>
-      <w:r>
-        <w:t xml:space="preserve"> El 15 de Abril realicé unos ajustes a la cámara del jugador y alisté todo para la muestra de Amerike</w:t>
-      </w:r>
-      <w:r>
-        <w:t>. El 16 de Abril fue la muestra, hubo problemas con la Etiqueta Player, ya fue solucionado pero al menos en la muestra se tuvo ese problema. El 17 de Abril se comenzó a probar las mecánicas del segundo minijuego, este toma en cuenta la rotación de la muñeca del jugador para poder rotar las piezas del rompecabezas.</w:t>
-      </w:r>
-    </w:p>
-    <w:p>
-      <w:pPr>
-        <w:jc w:val="both"/>
-        <w:rPr>
-          <w:b/>
-        </w:rPr>
-      </w:pPr>
-      <w:r>
-        <w:rPr>
-          <w:b/>
-        </w:rPr>
-        <w:t>Semana 10 (20 de Abril del 2026 al 24 de Abril del 2026)</w:t>
-      </w:r>
-    </w:p>
-    <w:p>
-      <w:pPr>
-        <w:jc w:val="both"/>
-      </w:pPr>
-      <w:r>
-        <w:t>El 20 de Abril, comencé a trabajar en el sistema para confirmar que el rompecabezas esté formado, pero por los modelos que estoy usando, no sé exactamente si está funcionando hasta que tenga los modelos correctos.</w:t>
-      </w:r>
-      <w:r>
-        <w:t xml:space="preserve"> El 21 de Abril hubo retroalimentación por parte de Yoás, para las runas no hay que aplicar los botones, pero el sistema de victoria está bien, ahora hay que idear una forma para implementar las puertas.</w:t>
-      </w:r>
-      <w:r>
-        <w:t xml:space="preserve"> El 22 de Abril se comenzó la implementación de las puertas, las cuales funcionarán como forma de medir el progreso del jugador.</w:t>
-      </w:r>
-      <w:r>
-        <w:t xml:space="preserve"> El 23 de Abril se comenzó a implementar el contador para finalizar el nivel.</w:t>
-      </w:r>
-      <w:r>
-        <w:t xml:space="preserve"> El 24 de Abril se arregló la funcionalidad del contador, además de que se activan interfaces en base al resultado de las rotaciones. La siguiente semana comienzo a implementar un objeto que aumente la intensidad </w:t>
+        <w:t xml:space="preserve">El 13 de </w:t>
+      </w:r>
+      <w:proofErr w:type="gramStart"/>
+      <w:r>
+        <w:t>Abril</w:t>
+      </w:r>
+      <w:proofErr w:type="gramEnd"/>
+      <w:r>
+        <w:t xml:space="preserve">, comencé a trabajar con los modelos de las naves; debo configurarlos para una actividad que se tendrá por parte de </w:t>
+      </w:r>
+      <w:proofErr w:type="spellStart"/>
+      <w:r>
+        <w:t>Amerike</w:t>
+      </w:r>
+      <w:proofErr w:type="spellEnd"/>
+      <w:r>
+        <w:t>.</w:t>
+      </w:r>
+      <w:r>
+        <w:t xml:space="preserve"> El 14 de </w:t>
+      </w:r>
+      <w:proofErr w:type="gramStart"/>
+      <w:r>
+        <w:t>Abril</w:t>
+      </w:r>
+      <w:proofErr w:type="gramEnd"/>
+      <w:r>
+        <w:t xml:space="preserve"> terminé de configurar los modelos y limpié un poco el código y los </w:t>
+      </w:r>
+      <w:proofErr w:type="spellStart"/>
+      <w:r>
+        <w:t>Assets</w:t>
+      </w:r>
+      <w:proofErr w:type="spellEnd"/>
+      <w:r>
+        <w:t xml:space="preserve"> para la muestra del día siguiente.</w:t>
+      </w:r>
+      <w:r>
+        <w:t xml:space="preserve"> El 15 de </w:t>
+      </w:r>
+      <w:proofErr w:type="gramStart"/>
+      <w:r>
+        <w:t>Abril</w:t>
+      </w:r>
+      <w:proofErr w:type="gramEnd"/>
+      <w:r>
+        <w:t xml:space="preserve"> realicé unos ajustes a la cámara del jugador y alisté todo para la muestra de </w:t>
+      </w:r>
+      <w:proofErr w:type="spellStart"/>
+      <w:r>
+        <w:t>Amerike</w:t>
+      </w:r>
+      <w:proofErr w:type="spellEnd"/>
+      <w:r>
+        <w:t xml:space="preserve">. El 16 de </w:t>
+      </w:r>
+      <w:proofErr w:type="gramStart"/>
+      <w:r>
+        <w:t>Abril</w:t>
+      </w:r>
+      <w:proofErr w:type="gramEnd"/>
+      <w:r>
+        <w:t xml:space="preserve"> fue la muestra, hubo problemas con la Etiqueta Player, ya fue solucionado pero al menos en la muestra se tuvo ese problema. El 17 de </w:t>
+      </w:r>
+      <w:proofErr w:type="gramStart"/>
+      <w:r>
+        <w:t>Abril</w:t>
+      </w:r>
+      <w:proofErr w:type="gramEnd"/>
+      <w:r>
+        <w:t xml:space="preserve"> se comenzó a probar las mecánicas del segundo </w:t>
+      </w:r>
+      <w:proofErr w:type="spellStart"/>
+      <w:r>
+        <w:t>minijuego</w:t>
+      </w:r>
+      <w:proofErr w:type="spellEnd"/>
+      <w:r>
+        <w:t>, este toma en cuenta la rotación de la muñeca del jugador para poder rotar las piezas del rompecabezas.</w:t>
+      </w:r>
+    </w:p>
+    <w:p>
+      <w:pPr>
+        <w:jc w:val="both"/>
+        <w:rPr>
+          <w:b/>
+        </w:rPr>
+      </w:pPr>
+      <w:r>
+        <w:rPr>
+          <w:b/>
+        </w:rPr>
+        <w:t xml:space="preserve">Semana 10 (20 de </w:t>
+      </w:r>
+      <w:proofErr w:type="gramStart"/>
+      <w:r>
+        <w:rPr>
+          <w:b/>
+        </w:rPr>
+        <w:t>Abril</w:t>
+      </w:r>
+      <w:proofErr w:type="gramEnd"/>
+      <w:r>
+        <w:rPr>
+          <w:b/>
+        </w:rPr>
+        <w:t xml:space="preserve"> del 2026 al 24 de Abril del 2026)</w:t>
+      </w:r>
+    </w:p>
+    <w:p>
+      <w:pPr>
+        <w:jc w:val="both"/>
+      </w:pPr>
+      <w:r>
+        <w:t xml:space="preserve">El 20 de </w:t>
+      </w:r>
+      <w:proofErr w:type="gramStart"/>
+      <w:r>
+        <w:t>Abril</w:t>
+      </w:r>
+      <w:proofErr w:type="gramEnd"/>
+      <w:r>
+        <w:t>, comencé a trabajar en el sistema para confirmar que el rompecabezas esté formado, pero por los modelos que estoy usando, no sé exactamente si está funcionando hasta que tenga los modelos correctos.</w:t>
+      </w:r>
+      <w:r>
+        <w:t xml:space="preserve"> El 21 de </w:t>
+      </w:r>
+      <w:proofErr w:type="gramStart"/>
+      <w:r>
+        <w:t>Abril</w:t>
+      </w:r>
+      <w:proofErr w:type="gramEnd"/>
+      <w:r>
+        <w:t xml:space="preserve"> hubo retroalimentación por parte de </w:t>
+      </w:r>
+      <w:proofErr w:type="spellStart"/>
+      <w:r>
+        <w:t>Yoás</w:t>
+      </w:r>
+      <w:proofErr w:type="spellEnd"/>
+      <w:r>
+        <w:t>, para las runas no hay que aplicar los botones, pero el sistema de victoria está bien, ahora hay que idear una forma para implementar las puertas.</w:t>
+      </w:r>
+      <w:r>
+        <w:t xml:space="preserve"> El 22 de </w:t>
+      </w:r>
+      <w:proofErr w:type="gramStart"/>
+      <w:r>
+        <w:t>Abril</w:t>
+      </w:r>
+      <w:proofErr w:type="gramEnd"/>
+      <w:r>
+        <w:t xml:space="preserve"> se comenzó la implementación de las puertas, las cuales funcionarán como forma de medir el progreso del jugador.</w:t>
+      </w:r>
+      <w:r>
+        <w:t xml:space="preserve"> El 23 de </w:t>
+      </w:r>
+      <w:proofErr w:type="gramStart"/>
+      <w:r>
+        <w:t>Abril</w:t>
+      </w:r>
+      <w:proofErr w:type="gramEnd"/>
+      <w:r>
+        <w:t xml:space="preserve"> se comenzó a implementar el contador para finalizar el nivel.</w:t>
+      </w:r>
+      <w:r>
+        <w:t xml:space="preserve"> El 24 de </w:t>
+      </w:r>
+      <w:proofErr w:type="gramStart"/>
+      <w:r>
+        <w:t>Abril</w:t>
+      </w:r>
+      <w:proofErr w:type="gramEnd"/>
+      <w:r>
+        <w:t xml:space="preserve"> se arregló la funcionalidad del contador, además de que se activan interfaces en base al resultado de las rotaciones. La siguiente semana comienzo a implementar un objeto que aumente la intensidad </w:t>
       </w:r>
       <w:r>
         <w:lastRenderedPageBreak/>
@@ -352,7 +1046,21 @@
         <w:rPr>
           <w:b/>
         </w:rPr>
-        <w:t>Semana 11 (27 de Abril del 2026 al 30 de Abril</w:t>
+        <w:t xml:space="preserve">Semana 11 (27 de </w:t>
+      </w:r>
+      <w:proofErr w:type="gramStart"/>
+      <w:r>
+        <w:rPr>
+          <w:b/>
+        </w:rPr>
+        <w:t>Abril</w:t>
+      </w:r>
+      <w:proofErr w:type="gramEnd"/>
+      <w:r>
+        <w:rPr>
+          <w:b/>
+        </w:rPr>
+        <w:t xml:space="preserve"> del 2026 al 30 de Abril</w:t>
       </w:r>
       <w:r>
         <w:rPr>
@@ -372,44 +1080,130 @@
         <w:jc w:val="both"/>
       </w:pPr>
       <w:r>
-        <w:t>El 27 de Abril, comencé a implementar la iluminación de un objeto para darle un efecto de premio.</w:t>
-      </w:r>
-      <w:r>
-        <w:t xml:space="preserve"> El 28 de Abril, comencé a hacer ajustes para la interfaz, en la semana debo ver si cuando el jugador pierda, se reinicia toda la partida o solo el escenario.</w:t>
-      </w:r>
-      <w:r>
-        <w:t xml:space="preserve"> El 30 de Abril recibí comentarios de Yoas para continuar con mi implementación de las piezas del rompecabezas por separada en lugar de juntas, así como poner limitaciones para las piezas.</w:t>
-      </w:r>
-    </w:p>
-    <w:p>
-      <w:pPr>
-        <w:jc w:val="both"/>
-        <w:rPr>
-          <w:b/>
-        </w:rPr>
-      </w:pPr>
-      <w:r>
-        <w:rPr>
-          <w:b/>
-        </w:rPr>
-        <w:t>Semana 12 (04 de Mayo del 2026 al 08 de Mayo del 2026)</w:t>
-      </w:r>
-    </w:p>
-    <w:p>
-      <w:pPr>
-        <w:jc w:val="both"/>
-      </w:pPr>
-      <w:r>
-        <w:t>El 04 de Mayo implementé los botones para continuar la partida o reiniciar el nivel en caso de que termine el tiempo.</w:t>
-      </w:r>
-      <w:r>
-        <w:t xml:space="preserve"> El 05 de Mayo implementé un límite de rotación para cada pieza del rompecabezas para que el paciente tenga que interactuar varias veces y pueda trabajar en la rotación de su muñeca.</w:t>
-      </w:r>
-      <w:r>
-        <w:t xml:space="preserve"> El 06 de Mayo implementé un menú general para los 4 minijuegos.</w:t>
-      </w:r>
-      <w:r>
-        <w:t xml:space="preserve"> El 7 y 8 de Mayo </w:t>
+        <w:t xml:space="preserve">El 27 de </w:t>
+      </w:r>
+      <w:proofErr w:type="gramStart"/>
+      <w:r>
+        <w:t>Abril</w:t>
+      </w:r>
+      <w:proofErr w:type="gramEnd"/>
+      <w:r>
+        <w:t>, comencé a implementar la iluminación de un objeto para darle un efecto de premio.</w:t>
+      </w:r>
+      <w:r>
+        <w:t xml:space="preserve"> El 28 de </w:t>
+      </w:r>
+      <w:proofErr w:type="gramStart"/>
+      <w:r>
+        <w:t>Abril</w:t>
+      </w:r>
+      <w:proofErr w:type="gramEnd"/>
+      <w:r>
+        <w:t>, comencé a hacer ajustes para la interfaz, en la semana debo ver si cuando el jugador pierda, se reinicia toda la partida o solo el escenario.</w:t>
+      </w:r>
+      <w:r>
+        <w:t xml:space="preserve"> El 30 de </w:t>
+      </w:r>
+      <w:proofErr w:type="gramStart"/>
+      <w:r>
+        <w:t>Abril</w:t>
+      </w:r>
+      <w:proofErr w:type="gramEnd"/>
+      <w:r>
+        <w:t xml:space="preserve"> recibí comentarios de </w:t>
+      </w:r>
+      <w:proofErr w:type="spellStart"/>
+      <w:r>
+        <w:t>Yoas</w:t>
+      </w:r>
+      <w:proofErr w:type="spellEnd"/>
+      <w:r>
+        <w:t xml:space="preserve"> para continuar con mi implementación de las piezas del rompecabezas por separada en lugar de juntas, así como poner limitaciones para las piezas.</w:t>
+      </w:r>
+    </w:p>
+    <w:p>
+      <w:pPr>
+        <w:jc w:val="both"/>
+        <w:rPr>
+          <w:b/>
+        </w:rPr>
+      </w:pPr>
+      <w:r>
+        <w:rPr>
+          <w:b/>
+        </w:rPr>
+        <w:t xml:space="preserve">Semana 12 (04 de </w:t>
+      </w:r>
+      <w:proofErr w:type="gramStart"/>
+      <w:r>
+        <w:rPr>
+          <w:b/>
+        </w:rPr>
+        <w:t>Mayo</w:t>
+      </w:r>
+      <w:proofErr w:type="gramEnd"/>
+      <w:r>
+        <w:rPr>
+          <w:b/>
+        </w:rPr>
+        <w:t xml:space="preserve"> del 2026 al 08 de Mayo del 2026)</w:t>
+      </w:r>
+    </w:p>
+    <w:p>
+      <w:pPr>
+        <w:jc w:val="both"/>
+      </w:pPr>
+      <w:r>
+        <w:t xml:space="preserve">El 04 de </w:t>
+      </w:r>
+      <w:proofErr w:type="gramStart"/>
+      <w:r>
+        <w:t>Mayo</w:t>
+      </w:r>
+      <w:proofErr w:type="gramEnd"/>
+      <w:r>
+        <w:t xml:space="preserve"> implementé los botones para continuar la partida o reiniciar el nivel en caso de que termine el tiempo.</w:t>
+      </w:r>
+      <w:r>
+        <w:t xml:space="preserve"> El 05 de </w:t>
+      </w:r>
+      <w:proofErr w:type="gramStart"/>
+      <w:r>
+        <w:t>Mayo</w:t>
+      </w:r>
+      <w:proofErr w:type="gramEnd"/>
+      <w:r>
+        <w:t xml:space="preserve"> implementé un límite de rotación para cada pieza del rompecabezas para que el paciente tenga que interactuar varias veces y pueda trabajar en la rotación de su muñeca.</w:t>
+      </w:r>
+      <w:r>
+        <w:t xml:space="preserve"> El 06 de </w:t>
+      </w:r>
+      <w:proofErr w:type="gramStart"/>
+      <w:r>
+        <w:t>Mayo</w:t>
+      </w:r>
+      <w:proofErr w:type="gramEnd"/>
+      <w:r>
+        <w:t xml:space="preserve"> implementé un menú general para los 4 </w:t>
+      </w:r>
+      <w:proofErr w:type="spellStart"/>
+      <w:r>
+        <w:t>minijuegos</w:t>
+      </w:r>
+      <w:proofErr w:type="spellEnd"/>
+      <w:r>
+        <w:t>.</w:t>
+      </w:r>
+      <w:r>
+        <w:t xml:space="preserve"> El 7 y 8 de </w:t>
+      </w:r>
+      <w:proofErr w:type="gramStart"/>
+      <w:r>
+        <w:t>Mayo</w:t>
+      </w:r>
+      <w:proofErr w:type="gramEnd"/>
+      <w:r>
+        <w:t xml:space="preserve"> </w:t>
       </w:r>
       <w:r>
         <w:t>continué</w:t>
@@ -421,91 +1215,261 @@
         <w:t>do</w:t>
       </w:r>
       <w:r>
-        <w:t xml:space="preserve"> el menú de los 4 minijuegos, procuré que el paciente tenga la opción de girar a otros lados para cambiar entre realidad aumentada y mixta.</w:t>
-      </w:r>
-    </w:p>
-    <w:p>
-      <w:pPr>
-        <w:jc w:val="both"/>
-        <w:rPr>
-          <w:b/>
-        </w:rPr>
-      </w:pPr>
-      <w:r>
-        <w:rPr>
-          <w:b/>
-        </w:rPr>
-        <w:t>Semana 13 (11 de Mayo del 2026 al 14 de Mayo del 2026)</w:t>
-      </w:r>
-    </w:p>
-    <w:p>
-      <w:pPr>
-        <w:jc w:val="both"/>
-      </w:pPr>
-      <w:r>
-        <w:t>El 11 de Mayo terminé la implementación del botón para alternar de realidad desde el menú general; comenzaré a ver el prototipo del tercer minijuego.</w:t>
-      </w:r>
-      <w:r>
-        <w:t xml:space="preserve"> El 12 de Mayo comencé a implementar una forma para que la dificultad de los niveles aumente en base al tiempo que tarda el paciente en resolver el rompecabezas.</w:t>
-      </w:r>
-      <w:r>
-        <w:t xml:space="preserve"> El 14 de Mayo mejoré los Colliders de las Naves y añadí las nuevas texturas que hizo mi compañera Yael.</w:t>
-      </w:r>
-    </w:p>
-    <w:p>
-      <w:pPr>
-        <w:jc w:val="both"/>
-        <w:rPr>
-          <w:b/>
-        </w:rPr>
-      </w:pPr>
-      <w:r>
-        <w:rPr>
-          <w:b/>
-        </w:rPr>
-        <w:t>Semana 14 (18 de Mayo del 2026 al 22 de Mayo del 2026)</w:t>
-      </w:r>
-    </w:p>
-    <w:p>
-      <w:pPr>
-        <w:jc w:val="both"/>
-      </w:pPr>
-      <w:r>
-        <w:t>El 18 de Mayo comencé a ver las animaciones de las naves destruidas para el primer minijuego.</w:t>
-      </w:r>
-      <w:r>
-        <w:t xml:space="preserve"> El 19 de Mayo implementé las animaciones de las naves destruidas así como su comportamiento al momento de que el paciente interactúa con ellas.</w:t>
-      </w:r>
-      <w:r>
-        <w:t xml:space="preserve"> El 20 de Mayo comencé a implementar un mensaje continuo para animar y recordarle al paciente lo que debe hacer.</w:t>
-      </w:r>
-      <w:r>
-        <w:t xml:space="preserve"> El 21 de Mayo se implementó el mensaje continuo en el segundo minijuego.</w:t>
-      </w:r>
-      <w:r>
-        <w:t xml:space="preserve"> El 22 de Mayo se comenzaron a implementar sonidos para los primeros minijuegos.</w:t>
-      </w:r>
-    </w:p>
-    <w:p>
-      <w:pPr>
-        <w:jc w:val="both"/>
-        <w:rPr>
-          <w:b/>
-        </w:rPr>
-      </w:pPr>
-      <w:r>
-        <w:rPr>
-          <w:b/>
-        </w:rPr>
-        <w:t>Semana 15 (25 de Mayo del 2026 al 29 de Mayo del 2026)</w:t>
-      </w:r>
-    </w:p>
-    <w:p>
-      <w:pPr>
-        <w:jc w:val="both"/>
-      </w:pPr>
-      <w:r>
-        <w:t>El 25 de Mayo comencé a implementar efecto</w:t>
+        <w:t xml:space="preserve"> el menú de los 4 </w:t>
+      </w:r>
+      <w:proofErr w:type="spellStart"/>
+      <w:r>
+        <w:t>minijuegos</w:t>
+      </w:r>
+      <w:proofErr w:type="spellEnd"/>
+      <w:r>
+        <w:t>, procuré que el paciente tenga la opción de girar a otros lados para cambiar entre realidad aumentada y mixta.</w:t>
+      </w:r>
+    </w:p>
+    <w:p>
+      <w:pPr>
+        <w:jc w:val="both"/>
+        <w:rPr>
+          <w:b/>
+        </w:rPr>
+      </w:pPr>
+      <w:r>
+        <w:rPr>
+          <w:b/>
+        </w:rPr>
+        <w:t xml:space="preserve">Semana 13 (11 de </w:t>
+      </w:r>
+      <w:proofErr w:type="gramStart"/>
+      <w:r>
+        <w:rPr>
+          <w:b/>
+        </w:rPr>
+        <w:t>Mayo</w:t>
+      </w:r>
+      <w:proofErr w:type="gramEnd"/>
+      <w:r>
+        <w:rPr>
+          <w:b/>
+        </w:rPr>
+        <w:t xml:space="preserve"> del 2026 al 14 de Mayo del 2026)</w:t>
+      </w:r>
+    </w:p>
+    <w:p>
+      <w:pPr>
+        <w:jc w:val="both"/>
+      </w:pPr>
+      <w:r>
+        <w:t xml:space="preserve">El 11 de </w:t>
+      </w:r>
+      <w:proofErr w:type="gramStart"/>
+      <w:r>
+        <w:t>Mayo</w:t>
+      </w:r>
+      <w:proofErr w:type="gramEnd"/>
+      <w:r>
+        <w:t xml:space="preserve"> terminé la implementación del botón para alternar de realidad desde el menú general; comenzaré a ver el prototipo del tercer </w:t>
+      </w:r>
+      <w:proofErr w:type="spellStart"/>
+      <w:r>
+        <w:t>minijuego</w:t>
+      </w:r>
+      <w:proofErr w:type="spellEnd"/>
+      <w:r>
+        <w:t>.</w:t>
+      </w:r>
+      <w:r>
+        <w:t xml:space="preserve"> El 12 de </w:t>
+      </w:r>
+      <w:proofErr w:type="gramStart"/>
+      <w:r>
+        <w:t>Mayo</w:t>
+      </w:r>
+      <w:proofErr w:type="gramEnd"/>
+      <w:r>
+        <w:t xml:space="preserve"> comencé a implementar una forma para que la dificultad de los niveles aumente en base al tiempo que tarda el paciente en resolver el rompecabezas.</w:t>
+      </w:r>
+      <w:r>
+        <w:t xml:space="preserve"> El 14 de </w:t>
+      </w:r>
+      <w:proofErr w:type="gramStart"/>
+      <w:r>
+        <w:t>Mayo</w:t>
+      </w:r>
+      <w:proofErr w:type="gramEnd"/>
+      <w:r>
+        <w:t xml:space="preserve"> mejoré los </w:t>
+      </w:r>
+      <w:proofErr w:type="spellStart"/>
+      <w:r>
+        <w:t>Colliders</w:t>
+      </w:r>
+      <w:proofErr w:type="spellEnd"/>
+      <w:r>
+        <w:t xml:space="preserve"> de las Naves y añadí las nuevas texturas que hizo mi compañera </w:t>
+      </w:r>
+      <w:proofErr w:type="spellStart"/>
+      <w:r>
+        <w:t>Yael</w:t>
+      </w:r>
+      <w:proofErr w:type="spellEnd"/>
+      <w:r>
+        <w:t>.</w:t>
+      </w:r>
+    </w:p>
+    <w:p>
+      <w:pPr>
+        <w:jc w:val="both"/>
+        <w:rPr>
+          <w:b/>
+        </w:rPr>
+      </w:pPr>
+      <w:r>
+        <w:rPr>
+          <w:b/>
+        </w:rPr>
+        <w:t xml:space="preserve">Semana 14 (18 de </w:t>
+      </w:r>
+      <w:proofErr w:type="gramStart"/>
+      <w:r>
+        <w:rPr>
+          <w:b/>
+        </w:rPr>
+        <w:t>Mayo</w:t>
+      </w:r>
+      <w:proofErr w:type="gramEnd"/>
+      <w:r>
+        <w:rPr>
+          <w:b/>
+        </w:rPr>
+        <w:t xml:space="preserve"> del 2026 al 22 de Mayo del 2026)</w:t>
+      </w:r>
+    </w:p>
+    <w:p>
+      <w:pPr>
+        <w:jc w:val="both"/>
+      </w:pPr>
+      <w:r>
+        <w:t xml:space="preserve">El 18 de </w:t>
+      </w:r>
+      <w:proofErr w:type="gramStart"/>
+      <w:r>
+        <w:t>Mayo</w:t>
+      </w:r>
+      <w:proofErr w:type="gramEnd"/>
+      <w:r>
+        <w:t xml:space="preserve"> comencé a ver las animaciones de las naves destruidas para el primer </w:t>
+      </w:r>
+      <w:proofErr w:type="spellStart"/>
+      <w:r>
+        <w:t>minijuego</w:t>
+      </w:r>
+      <w:proofErr w:type="spellEnd"/>
+      <w:r>
+        <w:t>.</w:t>
+      </w:r>
+      <w:r>
+        <w:t xml:space="preserve"> El 19 de </w:t>
+      </w:r>
+      <w:proofErr w:type="gramStart"/>
+      <w:r>
+        <w:t>Mayo</w:t>
+      </w:r>
+      <w:proofErr w:type="gramEnd"/>
+      <w:r>
+        <w:t xml:space="preserve"> implementé las animaciones de las naves destruidas así como su comportamiento al momento de que el paciente interactúa con ellas.</w:t>
+      </w:r>
+      <w:r>
+        <w:t xml:space="preserve"> El 20 de </w:t>
+      </w:r>
+      <w:proofErr w:type="gramStart"/>
+      <w:r>
+        <w:t>Mayo</w:t>
+      </w:r>
+      <w:proofErr w:type="gramEnd"/>
+      <w:r>
+        <w:t xml:space="preserve"> comencé a implementar un mensaje continuo para animar y recordarle al paciente lo que debe hacer.</w:t>
+      </w:r>
+      <w:r>
+        <w:t xml:space="preserve"> El 21 de </w:t>
+      </w:r>
+      <w:proofErr w:type="gramStart"/>
+      <w:r>
+        <w:t>Mayo</w:t>
+      </w:r>
+      <w:proofErr w:type="gramEnd"/>
+      <w:r>
+        <w:t xml:space="preserve"> se implementó el mensaje continuo en el segundo </w:t>
+      </w:r>
+      <w:proofErr w:type="spellStart"/>
+      <w:r>
+        <w:t>minijuego</w:t>
+      </w:r>
+      <w:proofErr w:type="spellEnd"/>
+      <w:r>
+        <w:t>.</w:t>
+      </w:r>
+      <w:r>
+        <w:t xml:space="preserve"> El 22 de </w:t>
+      </w:r>
+      <w:proofErr w:type="gramStart"/>
+      <w:r>
+        <w:t>Mayo</w:t>
+      </w:r>
+      <w:proofErr w:type="gramEnd"/>
+      <w:r>
+        <w:t xml:space="preserve"> se comenzaron a implementar sonidos para los primeros </w:t>
+      </w:r>
+      <w:proofErr w:type="spellStart"/>
+      <w:r>
+        <w:t>minijuegos</w:t>
+      </w:r>
+      <w:proofErr w:type="spellEnd"/>
+      <w:r>
+        <w:t>.</w:t>
+      </w:r>
+    </w:p>
+    <w:p>
+      <w:pPr>
+        <w:jc w:val="both"/>
+        <w:rPr>
+          <w:b/>
+        </w:rPr>
+      </w:pPr>
+      <w:r>
+        <w:rPr>
+          <w:b/>
+        </w:rPr>
+        <w:t xml:space="preserve">Semana 15 (25 de </w:t>
+      </w:r>
+      <w:proofErr w:type="gramStart"/>
+      <w:r>
+        <w:rPr>
+          <w:b/>
+        </w:rPr>
+        <w:t>Mayo</w:t>
+      </w:r>
+      <w:proofErr w:type="gramEnd"/>
+      <w:r>
+        <w:rPr>
+          <w:b/>
+        </w:rPr>
+        <w:t xml:space="preserve"> del 2026 al 29 de Mayo del 2026)</w:t>
+      </w:r>
+    </w:p>
+    <w:p>
+      <w:pPr>
+        <w:jc w:val="both"/>
+      </w:pPr>
+      <w:r>
+        <w:t xml:space="preserve">El 25 de </w:t>
+      </w:r>
+      <w:proofErr w:type="gramStart"/>
+      <w:r>
+        <w:t>Mayo</w:t>
+      </w:r>
+      <w:proofErr w:type="gramEnd"/>
+      <w:r>
+        <w:t xml:space="preserve"> comencé a implementar efecto</w:t>
       </w:r>
       <w:r>
         <w:t>s de sonido para los Enemigos, inicié</w:t>
@@ -514,54 +1478,164 @@
         <w:t xml:space="preserve"> la edi</w:t>
       </w:r>
       <w:r>
-        <w:t>ción de los iconos de las Naves y me encargué de implementar el nuevo diseño de los Puzzles.</w:t>
-      </w:r>
-      <w:r>
-        <w:t xml:space="preserve"> El 26 de Mayo completé la implementación de los iconos para la selección de Enemigos en el primer minijuego.</w:t>
-      </w:r>
-      <w:r>
-        <w:t xml:space="preserve"> El 27 de Mayo del 2026, comencé con la implementación del tercer minijuego.</w:t>
-      </w:r>
-      <w:r>
-        <w:t xml:space="preserve"> El 28 de Mayo arreglé los problemas que trajo consigo el nuevo modelo de las Runas, ya funcionan como deberían.</w:t>
-      </w:r>
-      <w:r>
-        <w:t xml:space="preserve"> El 28 de Mayo implementé un prototipo para la detección de flexión y extensión de la muñeca.</w:t>
-      </w:r>
-    </w:p>
-    <w:p>
-      <w:pPr>
-        <w:jc w:val="both"/>
-        <w:rPr>
-          <w:b/>
-        </w:rPr>
-      </w:pPr>
-      <w:r>
-        <w:rPr>
-          <w:b/>
-        </w:rPr>
-        <w:t>Semana 16 (01 de Junio del 2026 al 05 de Junio del 2026)</w:t>
-      </w:r>
-    </w:p>
-    <w:p>
-      <w:pPr>
-        <w:jc w:val="both"/>
-      </w:pPr>
-      <w:r>
-        <w:t xml:space="preserve">El 01 de Junio comencé a modificar las runas por una corrección por parte de Yoas. </w:t>
-      </w:r>
-      <w:r>
-        <w:t>El 02 de Junio implementé un mejor control para las Runas, aunque falta ajustar detalles de la puertas.</w:t>
-      </w:r>
-      <w:r>
-        <w:t xml:space="preserve"> El 03 de Junio mejoré el comportamiento de las puertas en base a la nueva estructura de las Runas.</w:t>
+        <w:t xml:space="preserve">ción de los iconos de las Naves y me encargué de implementar el nuevo diseño de los </w:t>
+      </w:r>
+      <w:proofErr w:type="spellStart"/>
+      <w:r>
+        <w:t>Puzzles</w:t>
+      </w:r>
+      <w:proofErr w:type="spellEnd"/>
+      <w:r>
+        <w:t>.</w:t>
+      </w:r>
+      <w:r>
+        <w:t xml:space="preserve"> El 26 de </w:t>
+      </w:r>
+      <w:proofErr w:type="gramStart"/>
+      <w:r>
+        <w:t>Mayo</w:t>
+      </w:r>
+      <w:proofErr w:type="gramEnd"/>
+      <w:r>
+        <w:t xml:space="preserve"> completé la implementación de los iconos para la selección de Enemigos en el primer </w:t>
+      </w:r>
+      <w:proofErr w:type="spellStart"/>
+      <w:r>
+        <w:t>minijuego</w:t>
+      </w:r>
+      <w:proofErr w:type="spellEnd"/>
+      <w:r>
+        <w:t>.</w:t>
+      </w:r>
+      <w:r>
+        <w:t xml:space="preserve"> El 27 de </w:t>
+      </w:r>
+      <w:proofErr w:type="gramStart"/>
+      <w:r>
+        <w:t>Mayo</w:t>
+      </w:r>
+      <w:proofErr w:type="gramEnd"/>
+      <w:r>
+        <w:t xml:space="preserve"> del 2026, comencé con la implementación del tercer </w:t>
+      </w:r>
+      <w:proofErr w:type="spellStart"/>
+      <w:r>
+        <w:t>minijuego</w:t>
+      </w:r>
+      <w:proofErr w:type="spellEnd"/>
+      <w:r>
+        <w:t>.</w:t>
+      </w:r>
+      <w:r>
+        <w:t xml:space="preserve"> El 28 de </w:t>
+      </w:r>
+      <w:proofErr w:type="gramStart"/>
+      <w:r>
+        <w:t>Mayo</w:t>
+      </w:r>
+      <w:proofErr w:type="gramEnd"/>
+      <w:r>
+        <w:t xml:space="preserve"> arreglé los problemas que trajo consigo el nuevo modelo de las Runas, ya funcionan como deberían.</w:t>
+      </w:r>
+      <w:r>
+        <w:t xml:space="preserve"> El 28 de </w:t>
+      </w:r>
+      <w:proofErr w:type="gramStart"/>
+      <w:r>
+        <w:t>Mayo</w:t>
+      </w:r>
+      <w:proofErr w:type="gramEnd"/>
+      <w:r>
+        <w:t xml:space="preserve"> implementé un prototipo para la detección de flexión y extensión de la muñeca.</w:t>
+      </w:r>
+    </w:p>
+    <w:p>
+      <w:pPr>
+        <w:jc w:val="both"/>
+        <w:rPr>
+          <w:b/>
+        </w:rPr>
+      </w:pPr>
+      <w:r>
+        <w:rPr>
+          <w:b/>
+        </w:rPr>
+        <w:t xml:space="preserve">Semana 16 (01 de </w:t>
+      </w:r>
+      <w:proofErr w:type="gramStart"/>
+      <w:r>
+        <w:rPr>
+          <w:b/>
+        </w:rPr>
+        <w:t>Junio</w:t>
+      </w:r>
+      <w:proofErr w:type="gramEnd"/>
+      <w:r>
+        <w:rPr>
+          <w:b/>
+        </w:rPr>
+        <w:t xml:space="preserve"> del 2026 al 05 de Junio del 2026)</w:t>
+      </w:r>
+    </w:p>
+    <w:p>
+      <w:pPr>
+        <w:jc w:val="both"/>
+      </w:pPr>
+      <w:r>
+        <w:t xml:space="preserve">El 01 de </w:t>
+      </w:r>
+      <w:proofErr w:type="gramStart"/>
+      <w:r>
+        <w:t>Junio</w:t>
+      </w:r>
+      <w:proofErr w:type="gramEnd"/>
+      <w:r>
+        <w:t xml:space="preserve"> comencé a modificar las runas por una corrección por parte de </w:t>
+      </w:r>
+      <w:proofErr w:type="spellStart"/>
+      <w:r>
+        <w:t>Yoas</w:t>
+      </w:r>
+      <w:proofErr w:type="spellEnd"/>
+      <w:r>
+        <w:t xml:space="preserve">. </w:t>
+      </w:r>
+      <w:r>
+        <w:t xml:space="preserve">El 02 de </w:t>
+      </w:r>
+      <w:proofErr w:type="gramStart"/>
+      <w:r>
+        <w:t>Junio</w:t>
+      </w:r>
+      <w:proofErr w:type="gramEnd"/>
+      <w:r>
+        <w:t xml:space="preserve"> implementé un mejor control para las Runas, aunque falta ajustar detalles de la puertas.</w:t>
+      </w:r>
+      <w:r>
+        <w:t xml:space="preserve"> El 03 de </w:t>
+      </w:r>
+      <w:proofErr w:type="gramStart"/>
+      <w:r>
+        <w:t>Junio</w:t>
+      </w:r>
+      <w:proofErr w:type="gramEnd"/>
+      <w:r>
+        <w:t xml:space="preserve"> mejoré el comportamiento de las puertas en base a la nueva estructura de las Runas.</w:t>
       </w:r>
       <w:r>
         <w:t xml:space="preserve"> </w:t>
       </w:r>
       <w:r>
         <w:lastRenderedPageBreak/>
-        <w:t>El 4 y 5 de Junio implementé una forma en que el paciente o el terapeuta pueda elegir c</w:t>
+        <w:t xml:space="preserve">El 4 y 5 de </w:t>
+      </w:r>
+      <w:proofErr w:type="gramStart"/>
+      <w:r>
+        <w:t>Junio</w:t>
+      </w:r>
+      <w:proofErr w:type="gramEnd"/>
+      <w:r>
+        <w:t xml:space="preserve"> implementé una forma en que el paciente o el terapeuta pueda elegir c</w:t>
       </w:r>
       <w:r>
         <w:t>on que brazo se trabajará en su</w:t>
@@ -581,7 +1655,21 @@
         <w:rPr>
           <w:b/>
         </w:rPr>
-        <w:t>Semana 17 (08 de Junio del 2026 al 12 de Junio del 2026)</w:t>
+        <w:t xml:space="preserve">Semana 17 (08 de </w:t>
+      </w:r>
+      <w:proofErr w:type="gramStart"/>
+      <w:r>
+        <w:rPr>
+          <w:b/>
+        </w:rPr>
+        <w:t>Junio</w:t>
+      </w:r>
+      <w:proofErr w:type="gramEnd"/>
+      <w:r>
+        <w:rPr>
+          <w:b/>
+        </w:rPr>
+        <w:t xml:space="preserve"> del 2026 al 12 de Junio del 2026)</w:t>
       </w:r>
     </w:p>
     <w:p>
@@ -603,33 +1691,174 @@
         <w:rPr>
           <w:b/>
         </w:rPr>
-        <w:t>Semana 28 (15 de Junio del 2026 al 19 de Junio del 2026)</w:t>
-      </w:r>
-    </w:p>
-    <w:p>
-      <w:pPr>
-        <w:jc w:val="both"/>
-      </w:pPr>
-      <w:r>
-        <w:t xml:space="preserve">El 15 de Junio comencé a implementar el </w:t>
-      </w:r>
-      <w:r>
-        <w:t>funcionamiento del sistema para el minijuego 3.</w:t>
-      </w:r>
-      <w:r>
-        <w:t xml:space="preserve"> El 16 de Junio se estuvo arreglando la interacción con las interfaces y las manos del paciente.</w:t>
-      </w:r>
-      <w:r>
-        <w:t xml:space="preserve"> El 17 de Junio se mejoró el sistema de juego para que se detecte las flexiones y extensiones de mano.</w:t>
-      </w:r>
-      <w:r>
-        <w:t xml:space="preserve"> El 18 de Junio implementé un método de calibración para la posición de la cámara del paciente, este cambio ayuda a que ya no haya saltos de altura entre escenas o cuando se apaga y enciende el visor.</w:t>
-      </w:r>
-      <w:r>
-        <w:t xml:space="preserve"> El 19 de Junio se mejoró el sistema de cambio de escenas, ya es imperceptible el cambio de escena, ahora se trata de implementar una varita mágica para una mejor experiencia inmersiva.</w:t>
+        <w:t xml:space="preserve">Semana 28 (15 de </w:t>
+      </w:r>
+      <w:proofErr w:type="gramStart"/>
+      <w:r>
+        <w:rPr>
+          <w:b/>
+        </w:rPr>
+        <w:t>Junio</w:t>
+      </w:r>
+      <w:proofErr w:type="gramEnd"/>
+      <w:r>
+        <w:rPr>
+          <w:b/>
+        </w:rPr>
+        <w:t xml:space="preserve"> del 2026 al 19 de Junio del 2026)</w:t>
+      </w:r>
+    </w:p>
+    <w:p>
+      <w:pPr>
+        <w:jc w:val="both"/>
+      </w:pPr>
+      <w:r>
+        <w:t xml:space="preserve">El 15 de </w:t>
+      </w:r>
+      <w:proofErr w:type="gramStart"/>
+      <w:r>
+        <w:t>Junio</w:t>
+      </w:r>
+      <w:proofErr w:type="gramEnd"/>
+      <w:r>
+        <w:t xml:space="preserve"> comencé a implementar el </w:t>
+      </w:r>
+      <w:r>
+        <w:t xml:space="preserve">funcionamiento del sistema para el </w:t>
+      </w:r>
+      <w:proofErr w:type="spellStart"/>
+      <w:r>
+        <w:t>minijuego</w:t>
+      </w:r>
+      <w:proofErr w:type="spellEnd"/>
+      <w:r>
+        <w:t xml:space="preserve"> 3.</w:t>
+      </w:r>
+      <w:r>
+        <w:t xml:space="preserve"> El 16 de </w:t>
+      </w:r>
+      <w:proofErr w:type="gramStart"/>
+      <w:r>
+        <w:t>Junio</w:t>
+      </w:r>
+      <w:proofErr w:type="gramEnd"/>
+      <w:r>
+        <w:t xml:space="preserve"> se estuvo arreglando la interacción con las interfaces y las manos del paciente.</w:t>
+      </w:r>
+      <w:r>
+        <w:t xml:space="preserve"> El 17 de </w:t>
+      </w:r>
+      <w:proofErr w:type="gramStart"/>
+      <w:r>
+        <w:t>Junio</w:t>
+      </w:r>
+      <w:proofErr w:type="gramEnd"/>
+      <w:r>
+        <w:t xml:space="preserve"> se mejoró el sistema de juego para que se detecte las flexiones y extensiones de mano.</w:t>
+      </w:r>
+      <w:r>
+        <w:t xml:space="preserve"> El 18 de </w:t>
+      </w:r>
+      <w:proofErr w:type="gramStart"/>
+      <w:r>
+        <w:t>Junio</w:t>
+      </w:r>
+      <w:proofErr w:type="gramEnd"/>
+      <w:r>
+        <w:t xml:space="preserve"> implementé un método de calibración para la posición de la cámara del paciente, este cambio ayuda a que ya no haya saltos de altura entre escenas o cuando se apag</w:t>
       </w:r>
       <w:bookmarkStart w:id="0" w:name="_GoBack"/>
       <w:bookmarkEnd w:id="0"/>
+      <w:r>
+        <w:t>a y enciende el visor.</w:t>
+      </w:r>
+      <w:r>
+        <w:t xml:space="preserve"> El 19 de </w:t>
+      </w:r>
+      <w:proofErr w:type="gramStart"/>
+      <w:r>
+        <w:t>Junio</w:t>
+      </w:r>
+      <w:proofErr w:type="gramEnd"/>
+      <w:r>
+        <w:t xml:space="preserve"> se mejoró el sistema de cambio de escenas, ya es imperceptible el cambio de escena, ahora se trata de implementar una varita mágica para una mejor experiencia </w:t>
+      </w:r>
+      <w:proofErr w:type="spellStart"/>
+      <w:r>
+        <w:t>inmersiva</w:t>
+      </w:r>
+      <w:proofErr w:type="spellEnd"/>
+      <w:r>
+        <w:t>.</w:t>
+      </w:r>
+    </w:p>
+    <w:p>
+      <w:pPr>
+        <w:jc w:val="both"/>
+        <w:rPr>
+          <w:b/>
+        </w:rPr>
+      </w:pPr>
+      <w:r>
+        <w:rPr>
+          <w:b/>
+        </w:rPr>
+        <w:t xml:space="preserve">Semana 29 (22 de </w:t>
+      </w:r>
+      <w:proofErr w:type="gramStart"/>
+      <w:r>
+        <w:rPr>
+          <w:b/>
+        </w:rPr>
+        <w:t>Junio</w:t>
+      </w:r>
+      <w:proofErr w:type="gramEnd"/>
+      <w:r>
+        <w:rPr>
+          <w:b/>
+        </w:rPr>
+        <w:t xml:space="preserve"> del 2026 al 26 de Junio del 2026)</w:t>
+      </w:r>
+    </w:p>
+    <w:p>
+      <w:pPr>
+        <w:jc w:val="both"/>
+      </w:pPr>
+      <w:r>
+        <w:t xml:space="preserve">El 22 de </w:t>
+      </w:r>
+      <w:proofErr w:type="gramStart"/>
+      <w:r>
+        <w:t>Junio</w:t>
+      </w:r>
+      <w:proofErr w:type="gramEnd"/>
+      <w:r>
+        <w:t xml:space="preserve">, por retroalimentación de </w:t>
+      </w:r>
+      <w:proofErr w:type="spellStart"/>
+      <w:r>
+        <w:t>Yoás</w:t>
+      </w:r>
+      <w:proofErr w:type="spellEnd"/>
+      <w:r>
+        <w:t xml:space="preserve">, se comenzaron a implementar cambios en la retroalimentación del </w:t>
+      </w:r>
+      <w:proofErr w:type="spellStart"/>
+      <w:r>
+        <w:t>minujuego</w:t>
+      </w:r>
+      <w:proofErr w:type="spellEnd"/>
+      <w:r>
+        <w:t xml:space="preserve"> 2 y </w:t>
+      </w:r>
+      <w:proofErr w:type="spellStart"/>
+      <w:r>
+        <w:t>minijuego</w:t>
+      </w:r>
+      <w:proofErr w:type="spellEnd"/>
+      <w:r>
+        <w:t xml:space="preserve"> 3, además, se añadirán pantallas de calibración para un sistema más dinámico en los límites de movimiento de algunos objetos</w:t>
+      </w:r>
     </w:p>
     <w:sectPr>
       <w:pgSz w:w="11906" w:h="16838"/>
@@ -1331,7 +2560,7 @@
 </file>
 
 <file path=customXml/itemProps1.xml><?xml version="1.0" encoding="utf-8"?>
-<ds:datastoreItem xmlns:ds="http://schemas.openxmlformats.org/officeDocument/2006/customXml" ds:itemID="{2B15BA7C-706C-487E-9603-35818BAE16D9}">
+<ds:datastoreItem xmlns:ds="http://schemas.openxmlformats.org/officeDocument/2006/customXml" ds:itemID="{4A044DA2-FD67-41DD-8B74-89A9E30534EA}">
   <ds:schemaRefs>
     <ds:schemaRef ds:uri="http://schemas.openxmlformats.org/officeDocument/2006/bibliography"/>
   </ds:schemaRefs>

</xml_diff>

<commit_message>
Se agrega una calibracion para los puzzles
</commit_message>
<xml_diff>
--- a/ReporteActividades.docx
+++ b/ReporteActividades.docx
@@ -652,6 +652,9 @@
       </w:r>
       <w:r>
         <w:t>. El 23 de Junio se agregaron luces para las runas que indican el éxito de los movimientos.</w:t>
+      </w:r>
+      <w:r>
+        <w:t xml:space="preserve"> El 24 de Junio se agregó una escena para calibrar el movimiento de las Runas.</w:t>
       </w:r>
       <w:bookmarkStart w:id="0" w:name="_GoBack"/>
       <w:bookmarkEnd w:id="0"/>
@@ -1356,7 +1359,7 @@
 </file>
 
 <file path=customXml/itemProps1.xml><?xml version="1.0" encoding="utf-8"?>
-<ds:datastoreItem xmlns:ds="http://schemas.openxmlformats.org/officeDocument/2006/customXml" ds:itemID="{7E57FB69-D1EA-47BC-B9E2-50A0AEF0593F}">
+<ds:datastoreItem xmlns:ds="http://schemas.openxmlformats.org/officeDocument/2006/customXml" ds:itemID="{03121C20-49E2-482B-8381-49824319018E}">
   <ds:schemaRefs>
     <ds:schemaRef ds:uri="http://schemas.openxmlformats.org/officeDocument/2006/bibliography"/>
   </ds:schemaRefs>

</xml_diff>

<commit_message>
Se agrega una escena para la calibracion del tercer minijuego ademas de un ajuste para la calibracion del segundo minijuego
</commit_message>
<xml_diff>
--- a/ReporteActividades.docx
+++ b/ReporteActividades.docx
@@ -655,6 +655,9 @@
       </w:r>
       <w:r>
         <w:t xml:space="preserve"> El 24 de Junio se agregó una escena para calibrar el movimiento de las Runas.</w:t>
+      </w:r>
+      <w:r>
+        <w:t xml:space="preserve"> El 25 de Junio se implementó una escena para la calibración de los limites de flexión y extensión de la muñeca para el tercer minijuego.</w:t>
       </w:r>
       <w:bookmarkStart w:id="0" w:name="_GoBack"/>
       <w:bookmarkEnd w:id="0"/>
@@ -1359,7 +1362,7 @@
 </file>
 
 <file path=customXml/itemProps1.xml><?xml version="1.0" encoding="utf-8"?>
-<ds:datastoreItem xmlns:ds="http://schemas.openxmlformats.org/officeDocument/2006/customXml" ds:itemID="{03121C20-49E2-482B-8381-49824319018E}">
+<ds:datastoreItem xmlns:ds="http://schemas.openxmlformats.org/officeDocument/2006/customXml" ds:itemID="{EC39F685-7B7A-4A46-B024-1620C539D110}">
   <ds:schemaRefs>
     <ds:schemaRef ds:uri="http://schemas.openxmlformats.org/officeDocument/2006/bibliography"/>
   </ds:schemaRefs>

</xml_diff>

<commit_message>
Se mejora el sistema de calibracion para el primer minijuego, ya no es necesario pellizcar para aceptar la configuracion
</commit_message>
<xml_diff>
--- a/ReporteActividades.docx
+++ b/ReporteActividades.docx
@@ -658,6 +658,9 @@
       </w:r>
       <w:r>
         <w:t xml:space="preserve"> El 25 de Junio se implementó una escena para la calibración de los limites de flexión y extensión de la muñeca para el tercer minijuego.</w:t>
+      </w:r>
+      <w:r>
+        <w:t xml:space="preserve"> El 25 de Junio se implementó de mejor manera la calibración para el primer minijuego.</w:t>
       </w:r>
       <w:bookmarkStart w:id="0" w:name="_GoBack"/>
       <w:bookmarkEnd w:id="0"/>
@@ -1362,7 +1365,7 @@
 </file>
 
 <file path=customXml/itemProps1.xml><?xml version="1.0" encoding="utf-8"?>
-<ds:datastoreItem xmlns:ds="http://schemas.openxmlformats.org/officeDocument/2006/customXml" ds:itemID="{EC39F685-7B7A-4A46-B024-1620C539D110}">
+<ds:datastoreItem xmlns:ds="http://schemas.openxmlformats.org/officeDocument/2006/customXml" ds:itemID="{3108F7AA-40E7-4DBB-A53D-B08BFA4DA7D1}">
   <ds:schemaRefs>
     <ds:schemaRef ds:uri="http://schemas.openxmlformats.org/officeDocument/2006/bibliography"/>
   </ds:schemaRefs>

</xml_diff>

<commit_message>
Se agrega el sistema de selección de varitas magicas, falta probarlo
</commit_message>
<xml_diff>
--- a/ReporteActividades.docx
+++ b/ReporteActividades.docx
@@ -1691,7 +1691,13 @@
         <w:rPr>
           <w:b/>
         </w:rPr>
-        <w:t xml:space="preserve">Semana 28 (15 de </w:t>
+        <w:t>Semana 1</w:t>
+      </w:r>
+      <w:r>
+        <w:rPr>
+          <w:b/>
+        </w:rPr>
+        <w:t xml:space="preserve">8 (15 de </w:t>
       </w:r>
       <w:proofErr w:type="gramStart"/>
       <w:r>
@@ -1798,7 +1804,13 @@
         <w:rPr>
           <w:b/>
         </w:rPr>
-        <w:t xml:space="preserve">Semana 29 (22 de </w:t>
+        <w:t>Semana 1</w:t>
+      </w:r>
+      <w:r>
+        <w:rPr>
+          <w:b/>
+        </w:rPr>
+        <w:t xml:space="preserve">9 (22 de </w:t>
       </w:r>
       <w:proofErr w:type="gramStart"/>
       <w:r>
@@ -1934,7 +1946,13 @@
         <w:rPr>
           <w:b/>
         </w:rPr>
-        <w:t xml:space="preserve">Semana 30 (29 de </w:t>
+        <w:t>Semana 2</w:t>
+      </w:r>
+      <w:r>
+        <w:rPr>
+          <w:b/>
+        </w:rPr>
+        <w:t xml:space="preserve">0 (29 de </w:t>
       </w:r>
       <w:proofErr w:type="gramStart"/>
       <w:r>
@@ -1956,7 +1974,34 @@
         <w:jc w:val="both"/>
       </w:pPr>
       <w:r>
-        <w:t xml:space="preserve">El 29 de Junio comencé la implementación de una pantalla </w:t>
+        <w:t xml:space="preserve">El 29 de </w:t>
+      </w:r>
+      <w:proofErr w:type="gramStart"/>
+      <w:r>
+        <w:t>Junio</w:t>
+      </w:r>
+      <w:proofErr w:type="gramEnd"/>
+      <w:r>
+        <w:t xml:space="preserve"> comencé la implementación de una pantalla </w:t>
+      </w:r>
+      <w:r>
+        <w:t xml:space="preserve">para seleccionar la varita mágica para el </w:t>
+      </w:r>
+      <w:proofErr w:type="spellStart"/>
+      <w:r>
+        <w:t>minijuego</w:t>
+      </w:r>
+      <w:proofErr w:type="spellEnd"/>
+      <w:r>
+        <w:t xml:space="preserve"> 3. El 30 de </w:t>
+      </w:r>
+      <w:proofErr w:type="gramStart"/>
+      <w:r>
+        <w:t>Junio</w:t>
+      </w:r>
+      <w:proofErr w:type="gramEnd"/>
+      <w:r>
+        <w:t xml:space="preserve"> preparé todo para probar la selección y asignación del modelo de varita.</w:t>
       </w:r>
       <w:bookmarkStart w:id="0" w:name="_GoBack"/>
       <w:bookmarkEnd w:id="0"/>
@@ -2661,7 +2706,7 @@
 </file>
 
 <file path=customXml/itemProps1.xml><?xml version="1.0" encoding="utf-8"?>
-<ds:datastoreItem xmlns:ds="http://schemas.openxmlformats.org/officeDocument/2006/customXml" ds:itemID="{7C01D6B4-2C46-4D34-9528-03A60E13E0DD}">
+<ds:datastoreItem xmlns:ds="http://schemas.openxmlformats.org/officeDocument/2006/customXml" ds:itemID="{CEABB9BE-BC2C-4AF6-A9E6-64D10C181E33}">
   <ds:schemaRefs>
     <ds:schemaRef ds:uri="http://schemas.openxmlformats.org/officeDocument/2006/bibliography"/>
   </ds:schemaRefs>

</xml_diff>

<commit_message>
Se arregla un pequeño bug que habia con la seleccion de varitas
</commit_message>
<xml_diff>
--- a/ReporteActividades.docx
+++ b/ReporteActividades.docx
@@ -707,6 +707,9 @@
       </w:r>
       <w:r>
         <w:t xml:space="preserve"> El 02 de Julio completé la implementación de la selección de Varitas, esto con modelos preliminares.</w:t>
+      </w:r>
+      <w:r>
+        <w:t xml:space="preserve"> El 03 de Julio solucioné un problema que había con un script de calibración.</w:t>
       </w:r>
       <w:bookmarkStart w:id="0" w:name="_GoBack"/>
       <w:bookmarkEnd w:id="0"/>
@@ -1411,7 +1414,7 @@
 </file>
 
 <file path=customXml/itemProps1.xml><?xml version="1.0" encoding="utf-8"?>
-<ds:datastoreItem xmlns:ds="http://schemas.openxmlformats.org/officeDocument/2006/customXml" ds:itemID="{D33BE3B3-52B5-44BF-8979-85713EE7D185}">
+<ds:datastoreItem xmlns:ds="http://schemas.openxmlformats.org/officeDocument/2006/customXml" ds:itemID="{73A699C5-1B3C-403D-BE14-D4B8F677DE7B}">
   <ds:schemaRefs>
     <ds:schemaRef ds:uri="http://schemas.openxmlformats.org/officeDocument/2006/bibliography"/>
   </ds:schemaRefs>

</xml_diff>

<commit_message>
Se agregan nuevos indicadores visuales en el segundo minijuego
</commit_message>
<xml_diff>
--- a/ReporteActividades.docx
+++ b/ReporteActividades.docx
@@ -709,10 +709,16 @@
         <w:t xml:space="preserve"> El 02 de Julio completé la implementación de la selección de Varitas, esto con modelos preliminares.</w:t>
       </w:r>
       <w:r>
-        <w:t xml:space="preserve"> El 03 de Julio solucioné un problema que había con un script de calibración.</w:t>
+        <w:t xml:space="preserve"> El 03 de Julio solucioné un problema que había con un script de calibración</w:t>
+      </w:r>
+      <w:r>
+        <w:t xml:space="preserve"> del tercer minijuego y agregué nuevos indicadores visuales al minijuego2</w:t>
       </w:r>
       <w:bookmarkStart w:id="0" w:name="_GoBack"/>
       <w:bookmarkEnd w:id="0"/>
+      <w:r>
+        <w:t>.</w:t>
+      </w:r>
     </w:p>
     <w:sectPr>
       <w:pgSz w:w="11906" w:h="16838"/>
@@ -1414,7 +1420,7 @@
 </file>
 
 <file path=customXml/itemProps1.xml><?xml version="1.0" encoding="utf-8"?>
-<ds:datastoreItem xmlns:ds="http://schemas.openxmlformats.org/officeDocument/2006/customXml" ds:itemID="{73A699C5-1B3C-403D-BE14-D4B8F677DE7B}">
+<ds:datastoreItem xmlns:ds="http://schemas.openxmlformats.org/officeDocument/2006/customXml" ds:itemID="{BF15C13B-608C-443A-9A29-F32BBA495DA7}">
   <ds:schemaRefs>
     <ds:schemaRef ds:uri="http://schemas.openxmlformats.org/officeDocument/2006/bibliography"/>
   </ds:schemaRefs>

</xml_diff>

<commit_message>
Se agrega un script que ayudara con la interaccion de los robots, tambien se importaron nuevos modelos
</commit_message>
<xml_diff>
--- a/ReporteActividades.docx
+++ b/ReporteActividades.docx
@@ -752,7 +752,13 @@
         <w:t>El 27 de Julio comencé con la implementación del minijuego 4, por lo que primero comencé con la calibración de la pinza; Yoás comentó que debe cerrarse el puño.</w:t>
       </w:r>
       <w:r>
-        <w:t xml:space="preserve"> Se arregló el movimiento de pinza a movimiento de puño, también se corrigió el comportamiento del minijuego 3.</w:t>
+        <w:t xml:space="preserve"> El 28 de Julio s</w:t>
+      </w:r>
+      <w:r>
+        <w:t>e arregló el movimiento de pinza a movimiento de puño, también se corrigió el comportamiento del minijuego 3.</w:t>
+      </w:r>
+      <w:r>
+        <w:t xml:space="preserve"> El 29 de Julio se implementó el script para que el paciente pueda sujetar a los robots, también se importaron los modelos con sus materiales.</w:t>
       </w:r>
       <w:bookmarkStart w:id="0" w:name="_GoBack"/>
       <w:bookmarkEnd w:id="0"/>
@@ -1457,7 +1463,7 @@
 </file>
 
 <file path=customXml/itemProps1.xml><?xml version="1.0" encoding="utf-8"?>
-<ds:datastoreItem xmlns:ds="http://schemas.openxmlformats.org/officeDocument/2006/customXml" ds:itemID="{C8AE5B41-CD20-46BD-BBC5-8FDF4789F8D6}">
+<ds:datastoreItem xmlns:ds="http://schemas.openxmlformats.org/officeDocument/2006/customXml" ds:itemID="{4A88692C-EB5B-49DF-95B4-6AC0D3371ACE}">
   <ds:schemaRefs>
     <ds:schemaRef ds:uri="http://schemas.openxmlformats.org/officeDocument/2006/bibliography"/>
   </ds:schemaRefs>

</xml_diff>

<commit_message>
Se ajustan los modelos de los robots para comenzar a implementar las mecanicas
</commit_message>
<xml_diff>
--- a/ReporteActividades.docx
+++ b/ReporteActividades.docx
@@ -759,6 +759,9 @@
       </w:r>
       <w:r>
         <w:t xml:space="preserve"> El 29 de Julio se implementó el script para que el paciente pueda sujetar a los robots, también se importaron los modelos con sus materiales.</w:t>
+      </w:r>
+      <w:r>
+        <w:t xml:space="preserve"> El 30 de Julio se ajustaron los 20 robots para que pudieran ser interactuables con el usuario; se comenzó con la implementación de la mecánica de juego.</w:t>
       </w:r>
       <w:bookmarkStart w:id="0" w:name="_GoBack"/>
       <w:bookmarkEnd w:id="0"/>
@@ -1463,7 +1466,7 @@
 </file>
 
 <file path=customXml/itemProps1.xml><?xml version="1.0" encoding="utf-8"?>
-<ds:datastoreItem xmlns:ds="http://schemas.openxmlformats.org/officeDocument/2006/customXml" ds:itemID="{4A88692C-EB5B-49DF-95B4-6AC0D3371ACE}">
+<ds:datastoreItem xmlns:ds="http://schemas.openxmlformats.org/officeDocument/2006/customXml" ds:itemID="{3F9EAC13-8982-45A6-B659-CD1D6E9926BE}">
   <ds:schemaRefs>
     <ds:schemaRef ds:uri="http://schemas.openxmlformats.org/officeDocument/2006/bibliography"/>
   </ds:schemaRefs>

</xml_diff>

<commit_message>
Se ajustan colliders de robots y se agrega el cambio de escena por interacciones
</commit_message>
<xml_diff>
--- a/ReporteActividades.docx
+++ b/ReporteActividades.docx
@@ -762,6 +762,23 @@
       </w:r>
       <w:r>
         <w:t xml:space="preserve"> El 30 de Julio se ajustaron los 20 robots para que pudieran ser interactuables con el usuario; se comenzó con la implementación de la mecánica de juego.</w:t>
+      </w:r>
+      <w:r>
+        <w:t xml:space="preserve"> Se ajustaron los Colliders de los robots y se implementaron los botones de cambio de escena.</w:t>
+      </w:r>
+    </w:p>
+    <w:p>
+      <w:pPr>
+        <w:jc w:val="both"/>
+        <w:rPr>
+          <w:b/>
+        </w:rPr>
+      </w:pPr>
+      <w:r>
+        <w:rPr>
+          <w:b/>
+        </w:rPr>
+        <w:t>Semana 22 (03 de Agosto del 2026 al 07 de Agosto del 2026)</w:t>
       </w:r>
       <w:bookmarkStart w:id="0" w:name="_GoBack"/>
       <w:bookmarkEnd w:id="0"/>
@@ -1466,7 +1483,7 @@
 </file>
 
 <file path=customXml/itemProps1.xml><?xml version="1.0" encoding="utf-8"?>
-<ds:datastoreItem xmlns:ds="http://schemas.openxmlformats.org/officeDocument/2006/customXml" ds:itemID="{3F9EAC13-8982-45A6-B659-CD1D6E9926BE}">
+<ds:datastoreItem xmlns:ds="http://schemas.openxmlformats.org/officeDocument/2006/customXml" ds:itemID="{29E6669B-1358-4EB1-B32A-C5E25F96AC73}">
   <ds:schemaRefs>
     <ds:schemaRef ds:uri="http://schemas.openxmlformats.org/officeDocument/2006/bibliography"/>
   </ds:schemaRefs>

</xml_diff>

<commit_message>
Se comienza el Script de comportamiento de los Robots y la mecanicas del minijuego4
</commit_message>
<xml_diff>
--- a/ReporteActividades.docx
+++ b/ReporteActividades.docx
@@ -764,7 +764,13 @@
         <w:t xml:space="preserve"> El 30 de Julio se ajustaron los 20 robots para que pudieran ser interactuables con el usuario; se comenzó con la implementación de la mecánica de juego.</w:t>
       </w:r>
       <w:r>
-        <w:t xml:space="preserve"> Se ajustaron los Colliders de los robots y se implementaron los botones de cambio de escena.</w:t>
+        <w:t xml:space="preserve"> </w:t>
+      </w:r>
+      <w:r>
+        <w:t>El 31 de Julio s</w:t>
+      </w:r>
+      <w:r>
+        <w:t>e ajustaron los Colliders de los robots y se implementaron los botones de cambio de escena.</w:t>
       </w:r>
     </w:p>
     <w:p>
@@ -779,6 +785,14 @@
           <w:b/>
         </w:rPr>
         <w:t>Semana 22 (03 de Agosto del 2026 al 07 de Agosto del 2026)</w:t>
+      </w:r>
+    </w:p>
+    <w:p>
+      <w:pPr>
+        <w:jc w:val="both"/>
+      </w:pPr>
+      <w:r>
+        <w:t>El 03 de Agosto se inició el Script de Spawn y rutinas del minijuego4.</w:t>
       </w:r>
       <w:bookmarkStart w:id="0" w:name="_GoBack"/>
       <w:bookmarkEnd w:id="0"/>
@@ -1483,7 +1497,7 @@
 </file>
 
 <file path=customXml/itemProps1.xml><?xml version="1.0" encoding="utf-8"?>
-<ds:datastoreItem xmlns:ds="http://schemas.openxmlformats.org/officeDocument/2006/customXml" ds:itemID="{29E6669B-1358-4EB1-B32A-C5E25F96AC73}">
+<ds:datastoreItem xmlns:ds="http://schemas.openxmlformats.org/officeDocument/2006/customXml" ds:itemID="{71AA0446-4F52-4861-9C76-B077E2EDFA9D}">
   <ds:schemaRefs>
     <ds:schemaRef ds:uri="http://schemas.openxmlformats.org/officeDocument/2006/bibliography"/>
   </ds:schemaRefs>

</xml_diff>

<commit_message>
Se continua con la implementacion de las mecanicas del juego
</commit_message>
<xml_diff>
--- a/ReporteActividades.docx
+++ b/ReporteActividades.docx
@@ -793,6 +793,9 @@
       </w:pPr>
       <w:r>
         <w:t>El 03 de Agosto se inició el Script de Spawn y rutinas del minijuego4.</w:t>
+      </w:r>
+      <w:r>
+        <w:t xml:space="preserve"> El 04 de Agosto se continuó con el comportamiento del juego.</w:t>
       </w:r>
       <w:bookmarkStart w:id="0" w:name="_GoBack"/>
       <w:bookmarkEnd w:id="0"/>
@@ -1497,7 +1500,7 @@
 </file>
 
 <file path=customXml/itemProps1.xml><?xml version="1.0" encoding="utf-8"?>
-<ds:datastoreItem xmlns:ds="http://schemas.openxmlformats.org/officeDocument/2006/customXml" ds:itemID="{71AA0446-4F52-4861-9C76-B077E2EDFA9D}">
+<ds:datastoreItem xmlns:ds="http://schemas.openxmlformats.org/officeDocument/2006/customXml" ds:itemID="{56266048-C332-48B1-8276-BCA64A71DC09}">
   <ds:schemaRefs>
     <ds:schemaRef ds:uri="http://schemas.openxmlformats.org/officeDocument/2006/bibliography"/>
   </ds:schemaRefs>

</xml_diff>

<commit_message>
Se completa la implementacion de las mecanicas
</commit_message>
<xml_diff>
--- a/ReporteActividades.docx
+++ b/ReporteActividades.docx
@@ -792,10 +792,14 @@
         <w:jc w:val="both"/>
       </w:pPr>
       <w:r>
+        <w:lastRenderedPageBreak/>
         <w:t>El 03 de Agosto se inició el Script de Spawn y rutinas del minijuego4.</w:t>
       </w:r>
       <w:r>
         <w:t xml:space="preserve"> El 04 de Agosto se continuó con el comportamiento del juego.</w:t>
+      </w:r>
+      <w:r>
+        <w:t xml:space="preserve"> El 05 de Agosto se completó la implementación de las mecánicas.</w:t>
       </w:r>
       <w:bookmarkStart w:id="0" w:name="_GoBack"/>
       <w:bookmarkEnd w:id="0"/>
@@ -1500,7 +1504,7 @@
 </file>
 
 <file path=customXml/itemProps1.xml><?xml version="1.0" encoding="utf-8"?>
-<ds:datastoreItem xmlns:ds="http://schemas.openxmlformats.org/officeDocument/2006/customXml" ds:itemID="{56266048-C332-48B1-8276-BCA64A71DC09}">
+<ds:datastoreItem xmlns:ds="http://schemas.openxmlformats.org/officeDocument/2006/customXml" ds:itemID="{B891E12B-1D3D-4EDA-A2B3-9528B24CE247}">
   <ds:schemaRefs>
     <ds:schemaRef ds:uri="http://schemas.openxmlformats.org/officeDocument/2006/bibliography"/>
   </ds:schemaRefs>

</xml_diff>

<commit_message>
Se mejora el comportamiento del juego
</commit_message>
<xml_diff>
--- a/ReporteActividades.docx
+++ b/ReporteActividades.docx
@@ -800,6 +800,9 @@
       </w:r>
       <w:r>
         <w:t xml:space="preserve"> El 05 de Agosto se completó la implementación de las mecánicas.</w:t>
+      </w:r>
+      <w:r>
+        <w:t xml:space="preserve"> El 05 y 06 de Agosto se mejoró el comportamiento de la plataforma que recibe a los robots antes de que sean recogidos por el paciente, también se implementó un comportamiento en caso de que el paciente los deje caer y el contenedor se mueva en base a la dificultad.</w:t>
       </w:r>
       <w:bookmarkStart w:id="0" w:name="_GoBack"/>
       <w:bookmarkEnd w:id="0"/>
@@ -1504,7 +1507,7 @@
 </file>
 
 <file path=customXml/itemProps1.xml><?xml version="1.0" encoding="utf-8"?>
-<ds:datastoreItem xmlns:ds="http://schemas.openxmlformats.org/officeDocument/2006/customXml" ds:itemID="{B891E12B-1D3D-4EDA-A2B3-9528B24CE247}">
+<ds:datastoreItem xmlns:ds="http://schemas.openxmlformats.org/officeDocument/2006/customXml" ds:itemID="{5DF82CBA-DBA6-4F27-9959-3D0ED53B71DB}">
   <ds:schemaRefs>
     <ds:schemaRef ds:uri="http://schemas.openxmlformats.org/officeDocument/2006/bibliography"/>
   </ds:schemaRefs>

</xml_diff>

<commit_message>
Se mejora el comportamiento del contendor, Yoas comento algunos detalles a mejorar
</commit_message>
<xml_diff>
--- a/ReporteActividades.docx
+++ b/ReporteActividades.docx
@@ -792,17 +792,42 @@
         <w:jc w:val="both"/>
       </w:pPr>
       <w:r>
+        <w:t>El 03 de Agosto se inició el Script de Spawn y rutinas del minijuego4.</w:t>
+      </w:r>
+      <w:r>
+        <w:t xml:space="preserve"> El 04 de Agosto se continuó con el comportamiento del juego.</w:t>
+      </w:r>
+      <w:r>
+        <w:t xml:space="preserve"> El 05 de Agosto se completó la implementación de las </w:t>
+      </w:r>
+      <w:r>
         <w:lastRenderedPageBreak/>
-        <w:t>El 03 de Agosto se inició el Script de Spawn y rutinas del minijuego4.</w:t>
-      </w:r>
-      <w:r>
-        <w:t xml:space="preserve"> El 04 de Agosto se continuó con el comportamiento del juego.</w:t>
-      </w:r>
-      <w:r>
-        <w:t xml:space="preserve"> El 05 de Agosto se completó la implementación de las mecánicas.</w:t>
+        <w:t>mecánicas.</w:t>
       </w:r>
       <w:r>
         <w:t xml:space="preserve"> El 05 y 06 de Agosto se mejoró el comportamiento de la plataforma que recibe a los robots antes de que sean recogidos por el paciente, también se implementó un comportamiento en caso de que el paciente los deje caer y el contenedor se mueva en base a la dificultad.</w:t>
+      </w:r>
+    </w:p>
+    <w:p>
+      <w:pPr>
+        <w:jc w:val="both"/>
+        <w:rPr>
+          <w:b/>
+        </w:rPr>
+      </w:pPr>
+      <w:r>
+        <w:rPr>
+          <w:b/>
+        </w:rPr>
+        <w:t>Semana 23 (10 de Agosto del 2026 al 14 de Agosto del 2026)</w:t>
+      </w:r>
+    </w:p>
+    <w:p>
+      <w:pPr>
+        <w:jc w:val="both"/>
+      </w:pPr>
+      <w:r>
+        <w:t>El 10 de Agosto se mejoró el movimiento del contenedor, Yoás revisó el avance y comentó modificar la manera en que se muestran los robots acumulados: no mostrarlos, solo mantener el contador de aciertos. También incluir un contador de robots que se hayan caído. Debo preguntar si mejor se mantienen discretos, para mejorar la experiencia del paciente.</w:t>
       </w:r>
       <w:bookmarkStart w:id="0" w:name="_GoBack"/>
       <w:bookmarkEnd w:id="0"/>
@@ -1507,7 +1532,7 @@
 </file>
 
 <file path=customXml/itemProps1.xml><?xml version="1.0" encoding="utf-8"?>
-<ds:datastoreItem xmlns:ds="http://schemas.openxmlformats.org/officeDocument/2006/customXml" ds:itemID="{5DF82CBA-DBA6-4F27-9959-3D0ED53B71DB}">
+<ds:datastoreItem xmlns:ds="http://schemas.openxmlformats.org/officeDocument/2006/customXml" ds:itemID="{80D74A96-1344-4D70-9ADC-FB9ECC3697BC}">
   <ds:schemaRefs>
     <ds:schemaRef ds:uri="http://schemas.openxmlformats.org/officeDocument/2006/bibliography"/>
   </ds:schemaRefs>

</xml_diff>

<commit_message>
Se agrega interaccion desde la PC del terapeuta
</commit_message>
<xml_diff>
--- a/ReporteActividades.docx
+++ b/ReporteActividades.docx
@@ -827,7 +827,10 @@
         <w:jc w:val="both"/>
       </w:pPr>
       <w:r>
-        <w:t>El 10 de Agosto se mejoró el movimiento del contenedor, Yoás revisó el avance y comentó modificar la manera en que se muestran los robots acumulados: no mostrarlos, solo mantener el contador de aciertos. También incluir un contador de robots que se hayan caído. Debo preguntar si mejor se mantienen discretos, para mejorar la experiencia del paciente.</w:t>
+        <w:t>El 10 de Agosto se mejoró el movimiento del contenedor, Yoás revisó el avance y comentó modificar la manera en que se muestran los robots acumulados: no mostrarlos, solo mantener el contador de aciertos. También incluir un contador de robots que se hayan caído. Debo preguntar si mejor se mantienen discretos, para mejo</w:t>
+      </w:r>
+      <w:r>
+        <w:t>rar la experiencia del paciente. El 12 de Agosto se logró hacer una Build donde el terapeuta ajusto los parámetros de dificultad y la selección de Naves desde su PC.</w:t>
       </w:r>
       <w:bookmarkStart w:id="0" w:name="_GoBack"/>
       <w:bookmarkEnd w:id="0"/>
@@ -1532,7 +1535,7 @@
 </file>
 
 <file path=customXml/itemProps1.xml><?xml version="1.0" encoding="utf-8"?>
-<ds:datastoreItem xmlns:ds="http://schemas.openxmlformats.org/officeDocument/2006/customXml" ds:itemID="{80D74A96-1344-4D70-9ADC-FB9ECC3697BC}">
+<ds:datastoreItem xmlns:ds="http://schemas.openxmlformats.org/officeDocument/2006/customXml" ds:itemID="{81C51DC1-11A2-4BE1-B703-63C8B86BB146}">
   <ds:schemaRefs>
     <ds:schemaRef ds:uri="http://schemas.openxmlformats.org/officeDocument/2006/bibliography"/>
   </ds:schemaRefs>

</xml_diff>

<commit_message>
Se cambian las interacciones de los menus y las pantallas de fin de la partida, aunque se consultara a Yoas dicho cambio
</commit_message>
<xml_diff>
--- a/ReporteActividades.docx
+++ b/ReporteActividades.docx
@@ -831,6 +831,9 @@
       </w:r>
       <w:r>
         <w:t>rar la experiencia del paciente. El 12 de Agosto se logró hacer una Build donde el terapeuta ajusto los parámetros de dificultad y la selección de Naves desde su PC.</w:t>
+      </w:r>
+      <w:r>
+        <w:t xml:space="preserve"> El 13 de Agosto cambié la interacción de los menús de cada juego así como en las pantallas de continuar o finalizar la partida, esto para que el terapeuta tenga un mejor control de las actividades; falta que Yoás autorice esta nueva implementación después de que le plantee el ciclo de trabajo de la aplicación.</w:t>
       </w:r>
       <w:bookmarkStart w:id="0" w:name="_GoBack"/>
       <w:bookmarkEnd w:id="0"/>
@@ -1535,7 +1538,7 @@
 </file>
 
 <file path=customXml/itemProps1.xml><?xml version="1.0" encoding="utf-8"?>
-<ds:datastoreItem xmlns:ds="http://schemas.openxmlformats.org/officeDocument/2006/customXml" ds:itemID="{81C51DC1-11A2-4BE1-B703-63C8B86BB146}">
+<ds:datastoreItem xmlns:ds="http://schemas.openxmlformats.org/officeDocument/2006/customXml" ds:itemID="{13832856-54BE-4180-837F-F7E1D8EC0AFD}">
   <ds:schemaRefs>
     <ds:schemaRef ds:uri="http://schemas.openxmlformats.org/officeDocument/2006/bibliography"/>
   </ds:schemaRefs>

</xml_diff>

<commit_message>
Se agrega la actualizacion del reporte de actividades de esta semana
</commit_message>
<xml_diff>
--- a/ReporteActividades.docx
+++ b/ReporteActividades.docx
@@ -834,6 +834,9 @@
       </w:r>
       <w:r>
         <w:t xml:space="preserve"> El 13 de Agosto cambié la interacción de los menús de cada juego así como en las pantallas de continuar o finalizar la partida, esto para que el terapeuta tenga un mejor control de las actividades; falta que Yoás autorice esta nueva implementación después de que le plantee el ciclo de trabajo de la aplicación.</w:t>
+      </w:r>
+      <w:r>
+        <w:t xml:space="preserve"> El 14 de Agosto Yoás me confirmó los cambios que implementé para la interacción del terapeuta desde la PC y agregó nuevos comentarios a revisar, entre las que se encuentra mejorar la pantalla de resultados después de cada partida, poner indicadores para la Realidad Virtual y la Realidad Mixta, encender o iluminar a los Robots y agregar parámetros en el minijuego 4, entre otros.</w:t>
       </w:r>
       <w:bookmarkStart w:id="0" w:name="_GoBack"/>
       <w:bookmarkEnd w:id="0"/>
@@ -1538,7 +1541,7 @@
 </file>
 
 <file path=customXml/itemProps1.xml><?xml version="1.0" encoding="utf-8"?>
-<ds:datastoreItem xmlns:ds="http://schemas.openxmlformats.org/officeDocument/2006/customXml" ds:itemID="{13832856-54BE-4180-837F-F7E1D8EC0AFD}">
+<ds:datastoreItem xmlns:ds="http://schemas.openxmlformats.org/officeDocument/2006/customXml" ds:itemID="{81D46327-24A1-4A62-BE28-037E67083808}">
   <ds:schemaRefs>
     <ds:schemaRef ds:uri="http://schemas.openxmlformats.org/officeDocument/2006/bibliography"/>
   </ds:schemaRefs>

</xml_diff>

<commit_message>
Se agregan indicadores de Realidad Virtual y Realidad Mixta, se comienzan a modificar las pantallas de victoria
</commit_message>
<xml_diff>
--- a/ReporteActividades.docx
+++ b/ReporteActividades.docx
@@ -837,6 +837,34 @@
       </w:r>
       <w:r>
         <w:t xml:space="preserve"> El 14 de Agosto Yoás me confirmó los cambios que implementé para la interacción del terapeuta desde la PC y agregó nuevos comentarios a revisar, entre las que se encuentra mejorar la pantalla de resultados después de cada partida, poner indicadores para la Realidad Virtual y la Realidad Mixta, encender o iluminar a los Robots y agregar parámetros en el minijuego 4, entre otros.</w:t>
+      </w:r>
+    </w:p>
+    <w:p>
+      <w:pPr>
+        <w:jc w:val="both"/>
+        <w:rPr>
+          <w:b/>
+        </w:rPr>
+      </w:pPr>
+      <w:r>
+        <w:rPr>
+          <w:b/>
+        </w:rPr>
+        <w:t>Semana 24 (17 de Agosto del 2026 al 21 de Agosto del 2026)</w:t>
+      </w:r>
+    </w:p>
+    <w:p>
+      <w:pPr>
+        <w:jc w:val="both"/>
+      </w:pPr>
+      <w:r>
+        <w:t>El 17 de Agosto cambié la rutina de rounds del minijuego 3 y puse una señal en cada escena que indica si está activado el modo Realidad Virtual o Realidad Mixta.</w:t>
+      </w:r>
+      <w:r>
+        <w:t xml:space="preserve"> El 18 de Agosto comencé con la implementación de las nuevas pantallas de Victoria</w:t>
+      </w:r>
+      <w:r>
+        <w:t>, así mismo, se implementó un mejor control para los medidores de tiempo.</w:t>
       </w:r>
       <w:bookmarkStart w:id="0" w:name="_GoBack"/>
       <w:bookmarkEnd w:id="0"/>
@@ -1541,7 +1569,7 @@
 </file>
 
 <file path=customXml/itemProps1.xml><?xml version="1.0" encoding="utf-8"?>
-<ds:datastoreItem xmlns:ds="http://schemas.openxmlformats.org/officeDocument/2006/customXml" ds:itemID="{81D46327-24A1-4A62-BE28-037E67083808}">
+<ds:datastoreItem xmlns:ds="http://schemas.openxmlformats.org/officeDocument/2006/customXml" ds:itemID="{27AA4829-6DBD-4344-BC2A-196DB1180E2E}">
   <ds:schemaRefs>
     <ds:schemaRef ds:uri="http://schemas.openxmlformats.org/officeDocument/2006/bibliography"/>
   </ds:schemaRefs>

</xml_diff>

<commit_message>
Se completa la implementacion de los controladores de tiempo y se añade retroalimentacion visual para el minijuego 4
</commit_message>
<xml_diff>
--- a/ReporteActividades.docx
+++ b/ReporteActividades.docx
@@ -871,6 +871,9 @@
       </w:r>
       <w:r>
         <w:t xml:space="preserve"> El 19 de Agosto continué con esas implementaciones ya que había que cambiar el sistema de juego de los primeros 2 minijuegos para que se viera reflejado el tiempo.</w:t>
+      </w:r>
+      <w:r>
+        <w:t xml:space="preserve"> El 20 de Agosto se completó la implementación de los controles de tiempo, se inició la implementación de una mejor retroalimentación para cuando el paciente agarre un Robot en el minijuego 4.</w:t>
       </w:r>
       <w:bookmarkStart w:id="0" w:name="_GoBack"/>
       <w:bookmarkEnd w:id="0"/>
@@ -1575,7 +1578,7 @@
 </file>
 
 <file path=customXml/itemProps1.xml><?xml version="1.0" encoding="utf-8"?>
-<ds:datastoreItem xmlns:ds="http://schemas.openxmlformats.org/officeDocument/2006/customXml" ds:itemID="{2B34CED1-30FD-4446-BC70-1A87FCA1D136}">
+<ds:datastoreItem xmlns:ds="http://schemas.openxmlformats.org/officeDocument/2006/customXml" ds:itemID="{B73CB348-DD74-4AC7-A2D7-307B1192DDB5}">
   <ds:schemaRefs>
     <ds:schemaRef ds:uri="http://schemas.openxmlformats.org/officeDocument/2006/bibliography"/>
   </ds:schemaRefs>

</xml_diff>

<commit_message>
Se ajustan los BoxCollidders de los Robots del minijuego 4 asi como la implementacion de una pantalla de resultados donde se toma el promedio de tiempos de agarre y cuando tiempo se tarda en agarrar un Robot
</commit_message>
<xml_diff>
--- a/ReporteActividades.docx
+++ b/ReporteActividades.docx
@@ -874,6 +874,12 @@
       </w:r>
       <w:r>
         <w:t xml:space="preserve"> El 20 de Agosto se completó la implementación de los controles de tiempo, se inició la implementación de una mejor retroalimentación para cuando el paciente agarre un Robot en el minijuego 4.</w:t>
+      </w:r>
+      <w:r>
+        <w:t xml:space="preserve"> El 21 de Agosto se completó la retroalimentación: los Robots se iluminan cuando el paciente los sujeta, también se completó la primer pantalla de Resultados tomando en cuenta el tiempo de agarre y el tiempo que tarda en </w:t>
+      </w:r>
+      <w:r>
+        <w:t>agarrar a uno, así como un ajuste en los BoxColliders de los Robots.</w:t>
       </w:r>
       <w:bookmarkStart w:id="0" w:name="_GoBack"/>
       <w:bookmarkEnd w:id="0"/>
@@ -1578,7 +1584,7 @@
 </file>
 
 <file path=customXml/itemProps1.xml><?xml version="1.0" encoding="utf-8"?>
-<ds:datastoreItem xmlns:ds="http://schemas.openxmlformats.org/officeDocument/2006/customXml" ds:itemID="{B73CB348-DD74-4AC7-A2D7-307B1192DDB5}">
+<ds:datastoreItem xmlns:ds="http://schemas.openxmlformats.org/officeDocument/2006/customXml" ds:itemID="{24092EAD-9567-48E5-A770-324B45DD514E}">
   <ds:schemaRefs>
     <ds:schemaRef ds:uri="http://schemas.openxmlformats.org/officeDocument/2006/bibliography"/>
   </ds:schemaRefs>

</xml_diff>

<commit_message>
Se ajustaron las pantallas con nuevos parametros a medir, esperamos la autorizacion de Yoas para su implementacion. Se cambio el sistema de juego del minijuego 2, de dificultad dinamica a dificultad lineal
</commit_message>
<xml_diff>
--- a/ReporteActividades.docx
+++ b/ReporteActividades.docx
@@ -880,6 +880,31 @@
       </w:r>
       <w:r>
         <w:t>agarrar a uno, así como un ajuste en los BoxColliders de los Robots.</w:t>
+      </w:r>
+    </w:p>
+    <w:p>
+      <w:pPr>
+        <w:jc w:val="both"/>
+        <w:rPr>
+          <w:b/>
+        </w:rPr>
+      </w:pPr>
+      <w:r>
+        <w:rPr>
+          <w:b/>
+        </w:rPr>
+        <w:t>Semana 25 (24 de Agosto del 2026 al 28 de Agosto del 2026)</w:t>
+      </w:r>
+    </w:p>
+    <w:p>
+      <w:pPr>
+        <w:jc w:val="both"/>
+      </w:pPr>
+      <w:r>
+        <w:t>El 24 de Agosto ajusté las pantallas de Victoria con diferentes parámetros, falta esperar la autorización de Yoás para comenzar con su implementación.</w:t>
+      </w:r>
+      <w:r>
+        <w:t xml:space="preserve"> El 25 de Agosto se cambió todo el sistema de juego de Puzzle, paso de tener una dificultad dinámica a una dificultad lineal.</w:t>
       </w:r>
       <w:bookmarkStart w:id="0" w:name="_GoBack"/>
       <w:bookmarkEnd w:id="0"/>
@@ -1584,7 +1609,7 @@
 </file>
 
 <file path=customXml/itemProps1.xml><?xml version="1.0" encoding="utf-8"?>
-<ds:datastoreItem xmlns:ds="http://schemas.openxmlformats.org/officeDocument/2006/customXml" ds:itemID="{24092EAD-9567-48E5-A770-324B45DD514E}">
+<ds:datastoreItem xmlns:ds="http://schemas.openxmlformats.org/officeDocument/2006/customXml" ds:itemID="{40B0C970-D0B2-4FF9-8881-EA9FEA87F11B}">
   <ds:schemaRefs>
     <ds:schemaRef ds:uri="http://schemas.openxmlformats.org/officeDocument/2006/bibliography"/>
   </ds:schemaRefs>

</xml_diff>

<commit_message>
Se comienza la implementacion de los nuevos cambios autorizados por Yoas; habra que modificar el sistema de dificultad del minijuego 1 y las rotaciones del nivel 2
</commit_message>
<xml_diff>
--- a/ReporteActividades.docx
+++ b/ReporteActividades.docx
@@ -904,7 +904,22 @@
         <w:t>El 24 de Agosto ajusté las pantallas de Victoria con diferentes parámetros, falta esperar la autorización de Yoás para comenzar con su implementación.</w:t>
       </w:r>
       <w:r>
-        <w:t xml:space="preserve"> El 25 de Agosto se cambió todo el sistema de juego de Puzzle, paso de tener una dificultad dinámica a una dificultad lineal.</w:t>
+        <w:t xml:space="preserve"> El 25 de Agosto se cambió todo el sistema de juego de Puzzle, paso de tener una dificultad dinámica a una dificultad lineal</w:t>
+      </w:r>
+      <w:r>
+        <w:t>, también se comenzó a ver una forma de medir el ángulo del brazo para el minijuego 1.</w:t>
+      </w:r>
+      <w:r>
+        <w:t xml:space="preserve"> El 26 de Agosto </w:t>
+      </w:r>
+      <w:r>
+        <w:t xml:space="preserve">se comenzó con la implementación de los nuevos parámetros autorizados por Yoás, entre los que destaca un tiempo de reacción general, promedios y máximos de los movimientos a evaluar, en el minijuego 4 el número total de agarres, también hay que hacer </w:t>
+      </w:r>
+      <w:r>
+        <w:t>ajustes en los minijuegos 1 y 2, en el primero se debe tener una dificultad dinámica, es decir, que la dificultad aumente en tiempo real y no entre Rounds, en el segundo debo hacer que independientemente del ángulo del paciente, se debe</w:t>
+      </w:r>
+      <w:r>
+        <w:t xml:space="preserve"> girar un ángulo predeterminado; así como un limite en caso de que el giro final se pase.</w:t>
       </w:r>
       <w:bookmarkStart w:id="0" w:name="_GoBack"/>
       <w:bookmarkEnd w:id="0"/>
@@ -1609,7 +1624,7 @@
 </file>
 
 <file path=customXml/itemProps1.xml><?xml version="1.0" encoding="utf-8"?>
-<ds:datastoreItem xmlns:ds="http://schemas.openxmlformats.org/officeDocument/2006/customXml" ds:itemID="{40B0C970-D0B2-4FF9-8881-EA9FEA87F11B}">
+<ds:datastoreItem xmlns:ds="http://schemas.openxmlformats.org/officeDocument/2006/customXml" ds:itemID="{914AC937-ECBA-4858-ABBE-60D90B99624D}">
   <ds:schemaRefs>
     <ds:schemaRef ds:uri="http://schemas.openxmlformats.org/officeDocument/2006/bibliography"/>
   </ds:schemaRefs>

</xml_diff>

<commit_message>
Se continua con las implementaciones
</commit_message>
<xml_diff>
--- a/ReporteActividades.docx
+++ b/ReporteActividades.docx
@@ -916,13 +916,19 @@
         <w:t xml:space="preserve">se comenzó con la implementación de los nuevos parámetros autorizados por Yoás, entre los que destaca un tiempo de reacción general, promedios y máximos de los movimientos a evaluar, en el minijuego 4 el número total de agarres, también hay que hacer </w:t>
       </w:r>
       <w:r>
-        <w:t>ajustes en los minijuegos 1 y 2, en el primero se debe tener una dificultad dinámica, es decir, que la dificultad aumente en tiempo real y no entre Rounds, en el segundo debo hacer que independientemente del ángulo del paciente, se debe</w:t>
-      </w:r>
-      <w:r>
-        <w:t xml:space="preserve"> girar un ángulo predeterminado; así como un limite en caso de que el giro final se pase.</w:t>
+        <w:t>ajustes en los minijuegos 1 y 2, en el primero se debe tener una dificultad dinámica, es decir, que la dificultad aumente en tiempo real y no entre Rounds</w:t>
+      </w:r>
+      <w:r>
+        <w:t xml:space="preserve"> pero sí que se traslade esa nueva dificultad entre Rounds</w:t>
       </w:r>
       <w:bookmarkStart w:id="0" w:name="_GoBack"/>
       <w:bookmarkEnd w:id="0"/>
+      <w:r>
+        <w:t>, en el segundo debo hacer que independientemente del ángulo del paciente, se debe</w:t>
+      </w:r>
+      <w:r>
+        <w:t xml:space="preserve"> girar un ángulo predeterminado; así como un limite en caso de que el giro final se pase.</w:t>
+      </w:r>
     </w:p>
     <w:sectPr>
       <w:pgSz w:w="11906" w:h="16838"/>
@@ -1624,7 +1630,7 @@
 </file>
 
 <file path=customXml/itemProps1.xml><?xml version="1.0" encoding="utf-8"?>
-<ds:datastoreItem xmlns:ds="http://schemas.openxmlformats.org/officeDocument/2006/customXml" ds:itemID="{914AC937-ECBA-4858-ABBE-60D90B99624D}">
+<ds:datastoreItem xmlns:ds="http://schemas.openxmlformats.org/officeDocument/2006/customXml" ds:itemID="{7409D4DF-E9F9-42DF-B072-45405E9D524F}">
   <ds:schemaRefs>
     <ds:schemaRef ds:uri="http://schemas.openxmlformats.org/officeDocument/2006/bibliography"/>
   </ds:schemaRefs>

</xml_diff>

<commit_message>
Se cambio la forma en que aumentaba la dificultad en el minijuego 1, ahora aumenta durante el Round y no entre Rounds, falta ajustar el aumento del radio del paciente
</commit_message>
<xml_diff>
--- a/ReporteActividades.docx
+++ b/ReporteActividades.docx
@@ -921,14 +921,17 @@
       <w:r>
         <w:t xml:space="preserve"> pero sí que se traslade esa nueva dificultad entre Rounds</w:t>
       </w:r>
+      <w:r>
+        <w:t>, en el segundo debo hacer que independientemente del ángulo del paciente, se debe</w:t>
+      </w:r>
+      <w:r>
+        <w:t xml:space="preserve"> girar un ángulo predeterminado; así como un limite en caso de que el giro final se pase.</w:t>
+      </w:r>
+      <w:r>
+        <w:t xml:space="preserve"> El 27 de Agosto se continuó con las implementaciones anteriormente mencionadas)</w:t>
+      </w:r>
       <w:bookmarkStart w:id="0" w:name="_GoBack"/>
       <w:bookmarkEnd w:id="0"/>
-      <w:r>
-        <w:t>, en el segundo debo hacer que independientemente del ángulo del paciente, se debe</w:t>
-      </w:r>
-      <w:r>
-        <w:t xml:space="preserve"> girar un ángulo predeterminado; así como un limite en caso de que el giro final se pase.</w:t>
-      </w:r>
     </w:p>
     <w:sectPr>
       <w:pgSz w:w="11906" w:h="16838"/>
@@ -1630,7 +1633,7 @@
 </file>
 
 <file path=customXml/itemProps1.xml><?xml version="1.0" encoding="utf-8"?>
-<ds:datastoreItem xmlns:ds="http://schemas.openxmlformats.org/officeDocument/2006/customXml" ds:itemID="{7409D4DF-E9F9-42DF-B072-45405E9D524F}">
+<ds:datastoreItem xmlns:ds="http://schemas.openxmlformats.org/officeDocument/2006/customXml" ds:itemID="{D3032F81-34E0-4909-9A73-EEBCB73799B2}">
   <ds:schemaRefs>
     <ds:schemaRef ds:uri="http://schemas.openxmlformats.org/officeDocument/2006/bibliography"/>
   </ds:schemaRefs>

</xml_diff>

<commit_message>
Se ajusta el angulo del codo
</commit_message>
<xml_diff>
--- a/ReporteActividades.docx
+++ b/ReporteActividades.docx
@@ -959,7 +959,11 @@
         <w:jc w:val="both"/>
       </w:pPr>
       <w:r>
+        <w:lastRenderedPageBreak/>
         <w:t>El 31 de Agosto se completó las nuevas implementaciones en los 4 minijuegos.</w:t>
+      </w:r>
+      <w:r>
+        <w:t xml:space="preserve"> El 01 de Septiembre se hicieron algunos ajustes para la medición del ángulo del codo; queda esperar a que Yoás me pase los scripts para el registro del paciente y sus parámetros.</w:t>
       </w:r>
       <w:bookmarkStart w:id="0" w:name="_GoBack"/>
       <w:bookmarkEnd w:id="0"/>
@@ -1664,7 +1668,7 @@
 </file>
 
 <file path=customXml/itemProps1.xml><?xml version="1.0" encoding="utf-8"?>
-<ds:datastoreItem xmlns:ds="http://schemas.openxmlformats.org/officeDocument/2006/customXml" ds:itemID="{2A531DF5-7D0B-41DB-BBBD-4093D086A3C0}">
+<ds:datastoreItem xmlns:ds="http://schemas.openxmlformats.org/officeDocument/2006/customXml" ds:itemID="{0DD1FB62-F183-45CB-8780-66300131069C}">
   <ds:schemaRefs>
     <ds:schemaRef ds:uri="http://schemas.openxmlformats.org/officeDocument/2006/bibliography"/>
   </ds:schemaRefs>

</xml_diff>

<commit_message>
Se ajusta el angulo del codo; se inician los bocetos para los modelos del minijuego 3
</commit_message>
<xml_diff>
--- a/ReporteActividades.docx
+++ b/ReporteActividades.docx
@@ -964,6 +964,9 @@
       </w:r>
       <w:r>
         <w:t xml:space="preserve"> El 01 de Septiembre se hicieron algunos ajustes para la medición del ángulo del codo; queda esperar a que Yoás me pase los scripts para el registro del paciente y sus parámetros.</w:t>
+      </w:r>
+      <w:r>
+        <w:t xml:space="preserve"> El 02 de Septiembre se ajustaron detalles para la medición del ángulo del codo, también se comenzaron con los bocetos para los modelos que estaré trabajando en Blender.</w:t>
       </w:r>
       <w:bookmarkStart w:id="0" w:name="_GoBack"/>
       <w:bookmarkEnd w:id="0"/>
@@ -1668,7 +1671,7 @@
 </file>
 
 <file path=customXml/itemProps1.xml><?xml version="1.0" encoding="utf-8"?>
-<ds:datastoreItem xmlns:ds="http://schemas.openxmlformats.org/officeDocument/2006/customXml" ds:itemID="{0DD1FB62-F183-45CB-8780-66300131069C}">
+<ds:datastoreItem xmlns:ds="http://schemas.openxmlformats.org/officeDocument/2006/customXml" ds:itemID="{259960AE-3B9E-42A6-A29A-A31EEFCDEA35}">
   <ds:schemaRefs>
     <ds:schemaRef ds:uri="http://schemas.openxmlformats.org/officeDocument/2006/bibliography"/>
   </ds:schemaRefs>

</xml_diff>

<commit_message>
Se comienza a implementar nuevos cambios solicitados por Yoas: parametros para la fecha y hora de la terapia, los brazos trabajados y un cambio en el minujuego 1, ahora el paciente jugara con ambas manos
</commit_message>
<xml_diff>
--- a/ReporteActividades.docx
+++ b/ReporteActividades.docx
@@ -967,6 +967,15 @@
       </w:r>
       <w:r>
         <w:t xml:space="preserve"> El 02 de Septiembre se ajustaron detalles para la medición del ángulo del codo, también se comenzaron con los bocetos para los modelos que estaré trabajando en Blender.</w:t>
+      </w:r>
+      <w:r>
+        <w:t xml:space="preserve"> El 03 de Septiembre se continuaron con </w:t>
+      </w:r>
+      <w:r>
+        <w:t>los bocetos para el minijuego 3, también sigo en la espera de una confirmación de Yoás en cuanto a los parámetros de las pantallas de Victoria.</w:t>
+      </w:r>
+      <w:r>
+        <w:t xml:space="preserve"> El 04 de Septiembre se recibió nueva retroalimentación por parte de Yoás: hay que agregar parámetros para la fecha y hora de inicio de la ronda, así como uno donde se guarde el lado del brazo trabajado; el minijuego 1 debe jugarse con ambas manos, no solo con una.</w:t>
       </w:r>
       <w:bookmarkStart w:id="0" w:name="_GoBack"/>
       <w:bookmarkEnd w:id="0"/>
@@ -1671,7 +1680,7 @@
 </file>
 
 <file path=customXml/itemProps1.xml><?xml version="1.0" encoding="utf-8"?>
-<ds:datastoreItem xmlns:ds="http://schemas.openxmlformats.org/officeDocument/2006/customXml" ds:itemID="{259960AE-3B9E-42A6-A29A-A31EEFCDEA35}">
+<ds:datastoreItem xmlns:ds="http://schemas.openxmlformats.org/officeDocument/2006/customXml" ds:itemID="{293B6776-70A7-4557-B00D-2F37AA67AD2E}">
   <ds:schemaRefs>
     <ds:schemaRef ds:uri="http://schemas.openxmlformats.org/officeDocument/2006/bibliography"/>
   </ds:schemaRefs>

</xml_diff>

<commit_message>
Se agregan nuevas pantallas de resultados para minijuego 1, falta implementar la toma de la fecha y hora de inicio del round; ademas de que se cambiara la forma de calibrar ambos brazos para el minijuego 1
</commit_message>
<xml_diff>
--- a/ReporteActividades.docx
+++ b/ReporteActividades.docx
@@ -976,6 +976,28 @@
       </w:r>
       <w:r>
         <w:t xml:space="preserve"> El 04 de Septiembre se recibió nueva retroalimentación por parte de Yoás: hay que agregar parámetros para la fecha y hora de inicio de la ronda, así como uno donde se guarde el lado del brazo trabajado; el minijuego 1 debe jugarse con ambas manos, no solo con una.</w:t>
+      </w:r>
+    </w:p>
+    <w:p>
+      <w:pPr>
+        <w:jc w:val="both"/>
+        <w:rPr>
+          <w:b/>
+        </w:rPr>
+      </w:pPr>
+      <w:r>
+        <w:rPr>
+          <w:b/>
+        </w:rPr>
+        <w:t>Semana 27 (07 de Septiembre del 2026 al 11 de Septiembre del 2026)</w:t>
+      </w:r>
+    </w:p>
+    <w:p>
+      <w:pPr>
+        <w:jc w:val="both"/>
+      </w:pPr>
+      <w:r>
+        <w:t>El 07 de Septiembre se implementaron diferentes pantallas para los resultados del minijuego 1, procuré dividir los resultados en base a los parámetros de cada brazo y los resultados generales. Habrá que cambiar la manera en que se calibran ambos brazos, estaba pensando en algo con un botón. Falta calibrar la hora de inicio y la fecha de la sesión de terapia.</w:t>
       </w:r>
       <w:bookmarkStart w:id="0" w:name="_GoBack"/>
       <w:bookmarkEnd w:id="0"/>
@@ -1680,7 +1702,7 @@
 </file>
 
 <file path=customXml/itemProps1.xml><?xml version="1.0" encoding="utf-8"?>
-<ds:datastoreItem xmlns:ds="http://schemas.openxmlformats.org/officeDocument/2006/customXml" ds:itemID="{293B6776-70A7-4557-B00D-2F37AA67AD2E}">
+<ds:datastoreItem xmlns:ds="http://schemas.openxmlformats.org/officeDocument/2006/customXml" ds:itemID="{60534D1A-2112-4EB6-989D-9FD92CEC231F}">
   <ds:schemaRefs>
     <ds:schemaRef ds:uri="http://schemas.openxmlformats.org/officeDocument/2006/bibliography"/>
   </ds:schemaRefs>

</xml_diff>

<commit_message>
Se implementó un sistema de calibracion para el minijuego 1 donde primero se calibra el brazo izquierdo y despues el brazo derecho
</commit_message>
<xml_diff>
--- a/ReporteActividades.docx
+++ b/ReporteActividades.docx
@@ -998,6 +998,9 @@
       </w:pPr>
       <w:r>
         <w:t>El 07 de Septiembre se implementaron diferentes pantallas para los resultados del minijuego 1, procuré dividir los resultados en base a los parámetros de cada brazo y los resultados generales. Habrá que cambiar la manera en que se calibran ambos brazos, estaba pensando en algo con un botón. Falta calibrar la hora de inicio y la fecha de la sesión de terapia.</w:t>
+      </w:r>
+      <w:r>
+        <w:t xml:space="preserve"> El 08 de Septiembre se implementó un diferente sistema para la calibración: primero se calibra el brazo izquierdo y después el brazo derecho.</w:t>
       </w:r>
       <w:bookmarkStart w:id="0" w:name="_GoBack"/>
       <w:bookmarkEnd w:id="0"/>
@@ -1702,7 +1705,7 @@
 </file>
 
 <file path=customXml/itemProps1.xml><?xml version="1.0" encoding="utf-8"?>
-<ds:datastoreItem xmlns:ds="http://schemas.openxmlformats.org/officeDocument/2006/customXml" ds:itemID="{60534D1A-2112-4EB6-989D-9FD92CEC231F}">
+<ds:datastoreItem xmlns:ds="http://schemas.openxmlformats.org/officeDocument/2006/customXml" ds:itemID="{120C6C98-12BB-4B89-A965-04695C29033C}">
   <ds:schemaRefs>
     <ds:schemaRef ds:uri="http://schemas.openxmlformats.org/officeDocument/2006/bibliography"/>
   </ds:schemaRefs>

</xml_diff>

<commit_message>
Se optimizaron y depuraron los scripts
</commit_message>
<xml_diff>
--- a/ReporteActividades.docx
+++ b/ReporteActividades.docx
@@ -1001,6 +1001,9 @@
       </w:r>
       <w:r>
         <w:t xml:space="preserve"> El 08 de Septiembre se implementó un diferente sistema para la calibración: primero se calibra el brazo izquierdo y después el brazo derecho.</w:t>
+      </w:r>
+      <w:r>
+        <w:t xml:space="preserve"> El 09 de Septiembre se estuvo optimizando todos los scripts.</w:t>
       </w:r>
       <w:bookmarkStart w:id="0" w:name="_GoBack"/>
       <w:bookmarkEnd w:id="0"/>
@@ -1705,7 +1708,7 @@
 </file>
 
 <file path=customXml/itemProps1.xml><?xml version="1.0" encoding="utf-8"?>
-<ds:datastoreItem xmlns:ds="http://schemas.openxmlformats.org/officeDocument/2006/customXml" ds:itemID="{120C6C98-12BB-4B89-A965-04695C29033C}">
+<ds:datastoreItem xmlns:ds="http://schemas.openxmlformats.org/officeDocument/2006/customXml" ds:itemID="{A9BF0012-F94C-4DA1-88EF-7BB7CED294C1}">
   <ds:schemaRefs>
     <ds:schemaRef ds:uri="http://schemas.openxmlformats.org/officeDocument/2006/bibliography"/>
   </ds:schemaRefs>

</xml_diff>